<commit_message>
Deploying to gh-pages from @ Morrison-Lab/psw@487786f9e35ab8cac28958c41394df8a8461c2c8 🚀
</commit_message>
<xml_diff>
--- a/chapters/notation.docx
+++ b/chapters/notation.docx
@@ -15,7 +15,7 @@
         <w:pStyle w:val="Date"/>
       </w:pPr>
       <w:r>
-        <w:t xml:space="preserve">Last modified: 2026-10-05 09:07:36 (UTC)</w:t>
+        <w:t xml:space="preserve">Last modified: 2026-10-05 09:12:29 (UTC)</w:t>
       </w:r>
     </w:p>
     <w:tbl>
@@ -2913,6 +2913,611 @@
         </w:numPr>
       </w:pPr>
       <w:r>
+        <w:t xml:space="preserve">canceling</w:t>
+      </w:r>
+      <w:r>
+        <w:t xml:space="preserve"> </w:t>
+      </w:r>
+      <m:oMath>
+        <m:r>
+          <m:t>a</m:t>
+        </m:r>
+      </m:oMath>
+      <w:r>
+        <w:t xml:space="preserve"> </w:t>
+      </w:r>
+      <w:r>
+        <w:t xml:space="preserve">in</w:t>
+      </w:r>
+      <w:r>
+        <w:t xml:space="preserve"> </w:t>
+      </w:r>
+      <m:oMath>
+        <m:r>
+          <m:t>a</m:t>
+        </m:r>
+        <m:r>
+          <m:rPr>
+            <m:sty m:val="p"/>
+          </m:rPr>
+          <m:t>+</m:t>
+        </m:r>
+        <m:r>
+          <m:rPr>
+            <m:sty m:val="p"/>
+          </m:rPr>
+          <m:t>(</m:t>
+        </m:r>
+        <m:r>
+          <m:t>b</m:t>
+        </m:r>
+        <m:r>
+          <m:rPr>
+            <m:sty m:val="p"/>
+          </m:rPr>
+          <m:t>−</m:t>
+        </m:r>
+        <m:r>
+          <m:t>a</m:t>
+        </m:r>
+        <m:r>
+          <m:rPr>
+            <m:sty m:val="p"/>
+          </m:rPr>
+          <m:t>)</m:t>
+        </m:r>
+      </m:oMath>
+      <w:r>
+        <w:t xml:space="preserve"> </w:t>
+      </w:r>
+      <w:r>
+        <w:t xml:space="preserve">removes the parentheses (</w:t>
+      </w:r>
+      <m:oMath>
+        <m:r>
+          <m:t>a</m:t>
+        </m:r>
+        <m:r>
+          <m:rPr>
+            <m:sty m:val="p"/>
+          </m:rPr>
+          <m:t>+</m:t>
+        </m:r>
+        <m:r>
+          <m:t>b</m:t>
+        </m:r>
+        <m:r>
+          <m:rPr>
+            <m:sty m:val="p"/>
+          </m:rPr>
+          <m:t>−</m:t>
+        </m:r>
+        <m:r>
+          <m:t>a</m:t>
+        </m:r>
+      </m:oMath>
+      <w:r>
+        <w:t xml:space="preserve">),</w:t>
+      </w:r>
+      <w:r>
+        <w:t xml:space="preserve"> </w:t>
+      </w:r>
+      <w:r>
+        <w:t xml:space="preserve">reorders the terms (</w:t>
+      </w:r>
+      <m:oMath>
+        <m:r>
+          <m:t>b</m:t>
+        </m:r>
+        <m:r>
+          <m:rPr>
+            <m:sty m:val="p"/>
+          </m:rPr>
+          <m:t>+</m:t>
+        </m:r>
+        <m:r>
+          <m:t>a</m:t>
+        </m:r>
+        <m:r>
+          <m:rPr>
+            <m:sty m:val="p"/>
+          </m:rPr>
+          <m:t>−</m:t>
+        </m:r>
+        <m:r>
+          <m:t>a</m:t>
+        </m:r>
+      </m:oMath>
+      <w:r>
+        <w:t xml:space="preserve">),</w:t>
+      </w:r>
+      <w:r>
+        <w:t xml:space="preserve"> </w:t>
+      </w:r>
+      <w:r>
+        <w:t xml:space="preserve">groups the two that cancel (</w:t>
+      </w:r>
+      <m:oMath>
+        <m:r>
+          <m:t>b</m:t>
+        </m:r>
+        <m:r>
+          <m:rPr>
+            <m:sty m:val="p"/>
+          </m:rPr>
+          <m:t>+</m:t>
+        </m:r>
+        <m:r>
+          <m:rPr>
+            <m:sty m:val="p"/>
+          </m:rPr>
+          <m:t>(</m:t>
+        </m:r>
+        <m:r>
+          <m:t>a</m:t>
+        </m:r>
+        <m:r>
+          <m:rPr>
+            <m:sty m:val="p"/>
+          </m:rPr>
+          <m:t>−</m:t>
+        </m:r>
+        <m:r>
+          <m:t>a</m:t>
+        </m:r>
+        <m:r>
+          <m:rPr>
+            <m:sty m:val="p"/>
+          </m:rPr>
+          <m:t>)</m:t>
+        </m:r>
+      </m:oMath>
+      <w:r>
+        <w:t xml:space="preserve">),</w:t>
+      </w:r>
+      <w:r>
+        <w:t xml:space="preserve"> </w:t>
+      </w:r>
+      <w:r>
+        <w:t xml:space="preserve">replaces</w:t>
+      </w:r>
+      <w:r>
+        <w:t xml:space="preserve"> </w:t>
+      </w:r>
+      <m:oMath>
+        <m:r>
+          <m:t>a</m:t>
+        </m:r>
+        <m:r>
+          <m:rPr>
+            <m:sty m:val="p"/>
+          </m:rPr>
+          <m:t>−</m:t>
+        </m:r>
+        <m:r>
+          <m:t>a</m:t>
+        </m:r>
+      </m:oMath>
+      <w:r>
+        <w:t xml:space="preserve"> </w:t>
+      </w:r>
+      <w:r>
+        <w:t xml:space="preserve">with</w:t>
+      </w:r>
+      <w:r>
+        <w:t xml:space="preserve"> </w:t>
+      </w:r>
+      <m:oMath>
+        <m:r>
+          <m:t>0</m:t>
+        </m:r>
+      </m:oMath>
+      <w:r>
+        <w:t xml:space="preserve"> </w:t>
+      </w:r>
+      <w:r>
+        <w:t xml:space="preserve">(</w:t>
+      </w:r>
+      <m:oMath>
+        <m:r>
+          <m:t>b</m:t>
+        </m:r>
+        <m:r>
+          <m:rPr>
+            <m:sty m:val="p"/>
+          </m:rPr>
+          <m:t>+</m:t>
+        </m:r>
+        <m:r>
+          <m:t>0</m:t>
+        </m:r>
+      </m:oMath>
+      <w:r>
+        <w:t xml:space="preserve">),</w:t>
+      </w:r>
+      <w:r>
+        <w:t xml:space="preserve"> </w:t>
+      </w:r>
+      <w:r>
+        <w:t xml:space="preserve">and drops the</w:t>
+      </w:r>
+      <w:r>
+        <w:t xml:space="preserve"> </w:t>
+      </w:r>
+      <m:oMath>
+        <m:r>
+          <m:rPr>
+            <m:sty m:val="p"/>
+          </m:rPr>
+          <m:t>+</m:t>
+        </m:r>
+        <m:r>
+          <m:t>0</m:t>
+        </m:r>
+      </m:oMath>
+      <w:r>
+        <w:t xml:space="preserve">;</w:t>
+      </w:r>
+    </w:p>
+    <w:p>
+      <w:pPr>
+        <w:pStyle w:val="Compact"/>
+        <w:numPr>
+          <w:ilvl w:val="0"/>
+          <w:numId w:val="1002"/>
+        </w:numPr>
+      </w:pPr>
+      <w:r>
+        <w:t xml:space="preserve">canceling</w:t>
+      </w:r>
+      <w:r>
+        <w:t xml:space="preserve"> </w:t>
+      </w:r>
+      <m:oMath>
+        <m:r>
+          <m:t>n</m:t>
+        </m:r>
+      </m:oMath>
+      <w:r>
+        <w:t xml:space="preserve"> </w:t>
+      </w:r>
+      <w:r>
+        <w:t xml:space="preserve">in</w:t>
+      </w:r>
+      <w:r>
+        <w:t xml:space="preserve"> </w:t>
+      </w:r>
+      <m:oMath>
+        <m:r>
+          <m:t>n</m:t>
+        </m:r>
+        <m:r>
+          <m:rPr>
+            <m:sty m:val="p"/>
+          </m:rPr>
+          <m:t>⋅</m:t>
+        </m:r>
+        <m:f>
+          <m:fPr>
+            <m:type m:val="bar"/>
+          </m:fPr>
+          <m:num>
+            <m:r>
+              <m:t>b</m:t>
+            </m:r>
+          </m:num>
+          <m:den>
+            <m:r>
+              <m:t>n</m:t>
+            </m:r>
+          </m:den>
+        </m:f>
+      </m:oMath>
+      <w:r>
+        <w:t xml:space="preserve"> </w:t>
+      </w:r>
+      <w:r>
+        <w:t xml:space="preserve">rewrites the division as multiplication by a reciprocal (</w:t>
+      </w:r>
+      <m:oMath>
+        <m:r>
+          <m:t>n</m:t>
+        </m:r>
+        <m:r>
+          <m:rPr>
+            <m:sty m:val="p"/>
+          </m:rPr>
+          <m:t>⋅</m:t>
+        </m:r>
+        <m:r>
+          <m:rPr>
+            <m:sty m:val="p"/>
+          </m:rPr>
+          <m:t>(</m:t>
+        </m:r>
+        <m:r>
+          <m:t>b</m:t>
+        </m:r>
+        <m:r>
+          <m:rPr>
+            <m:sty m:val="p"/>
+          </m:rPr>
+          <m:t>⋅</m:t>
+        </m:r>
+        <m:f>
+          <m:fPr>
+            <m:type m:val="bar"/>
+          </m:fPr>
+          <m:num>
+            <m:r>
+              <m:t>1</m:t>
+            </m:r>
+          </m:num>
+          <m:den>
+            <m:r>
+              <m:t>n</m:t>
+            </m:r>
+          </m:den>
+        </m:f>
+        <m:r>
+          <m:rPr>
+            <m:sty m:val="p"/>
+          </m:rPr>
+          <m:t>)</m:t>
+        </m:r>
+      </m:oMath>
+      <w:r>
+        <w:t xml:space="preserve">),</w:t>
+      </w:r>
+      <w:r>
+        <w:t xml:space="preserve"> </w:t>
+      </w:r>
+      <w:r>
+        <w:t xml:space="preserve">removes the parentheses (</w:t>
+      </w:r>
+      <m:oMath>
+        <m:r>
+          <m:t>n</m:t>
+        </m:r>
+        <m:r>
+          <m:rPr>
+            <m:sty m:val="p"/>
+          </m:rPr>
+          <m:t>⋅</m:t>
+        </m:r>
+        <m:r>
+          <m:t>b</m:t>
+        </m:r>
+        <m:r>
+          <m:rPr>
+            <m:sty m:val="p"/>
+          </m:rPr>
+          <m:t>⋅</m:t>
+        </m:r>
+        <m:f>
+          <m:fPr>
+            <m:type m:val="bar"/>
+          </m:fPr>
+          <m:num>
+            <m:r>
+              <m:t>1</m:t>
+            </m:r>
+          </m:num>
+          <m:den>
+            <m:r>
+              <m:t>n</m:t>
+            </m:r>
+          </m:den>
+        </m:f>
+      </m:oMath>
+      <w:r>
+        <w:t xml:space="preserve">),</w:t>
+      </w:r>
+      <w:r>
+        <w:t xml:space="preserve"> </w:t>
+      </w:r>
+      <w:r>
+        <w:t xml:space="preserve">reorders the factors (</w:t>
+      </w:r>
+      <m:oMath>
+        <m:r>
+          <m:t>b</m:t>
+        </m:r>
+        <m:r>
+          <m:rPr>
+            <m:sty m:val="p"/>
+          </m:rPr>
+          <m:t>⋅</m:t>
+        </m:r>
+        <m:r>
+          <m:t>n</m:t>
+        </m:r>
+        <m:r>
+          <m:rPr>
+            <m:sty m:val="p"/>
+          </m:rPr>
+          <m:t>⋅</m:t>
+        </m:r>
+        <m:f>
+          <m:fPr>
+            <m:type m:val="bar"/>
+          </m:fPr>
+          <m:num>
+            <m:r>
+              <m:t>1</m:t>
+            </m:r>
+          </m:num>
+          <m:den>
+            <m:r>
+              <m:t>n</m:t>
+            </m:r>
+          </m:den>
+        </m:f>
+      </m:oMath>
+      <w:r>
+        <w:t xml:space="preserve">),</w:t>
+      </w:r>
+      <w:r>
+        <w:t xml:space="preserve"> </w:t>
+      </w:r>
+      <w:r>
+        <w:t xml:space="preserve">groups the two that cancel (</w:t>
+      </w:r>
+      <m:oMath>
+        <m:r>
+          <m:t>b</m:t>
+        </m:r>
+        <m:r>
+          <m:rPr>
+            <m:sty m:val="p"/>
+          </m:rPr>
+          <m:t>⋅</m:t>
+        </m:r>
+        <m:r>
+          <m:rPr>
+            <m:sty m:val="p"/>
+          </m:rPr>
+          <m:t>(</m:t>
+        </m:r>
+        <m:r>
+          <m:t>n</m:t>
+        </m:r>
+        <m:r>
+          <m:rPr>
+            <m:sty m:val="p"/>
+          </m:rPr>
+          <m:t>⋅</m:t>
+        </m:r>
+        <m:f>
+          <m:fPr>
+            <m:type m:val="bar"/>
+          </m:fPr>
+          <m:num>
+            <m:r>
+              <m:t>1</m:t>
+            </m:r>
+          </m:num>
+          <m:den>
+            <m:r>
+              <m:t>n</m:t>
+            </m:r>
+          </m:den>
+        </m:f>
+        <m:r>
+          <m:rPr>
+            <m:sty m:val="p"/>
+          </m:rPr>
+          <m:t>)</m:t>
+        </m:r>
+      </m:oMath>
+      <w:r>
+        <w:t xml:space="preserve">),</w:t>
+      </w:r>
+      <w:r>
+        <w:t xml:space="preserve"> </w:t>
+      </w:r>
+      <w:r>
+        <w:t xml:space="preserve">replaces</w:t>
+      </w:r>
+      <w:r>
+        <w:t xml:space="preserve"> </w:t>
+      </w:r>
+      <m:oMath>
+        <m:r>
+          <m:t>n</m:t>
+        </m:r>
+        <m:r>
+          <m:rPr>
+            <m:sty m:val="p"/>
+          </m:rPr>
+          <m:t>⋅</m:t>
+        </m:r>
+        <m:f>
+          <m:fPr>
+            <m:type m:val="bar"/>
+          </m:fPr>
+          <m:num>
+            <m:r>
+              <m:t>1</m:t>
+            </m:r>
+          </m:num>
+          <m:den>
+            <m:r>
+              <m:t>n</m:t>
+            </m:r>
+          </m:den>
+        </m:f>
+      </m:oMath>
+      <w:r>
+        <w:t xml:space="preserve"> </w:t>
+      </w:r>
+      <w:r>
+        <w:t xml:space="preserve">with</w:t>
+      </w:r>
+      <w:r>
+        <w:t xml:space="preserve"> </w:t>
+      </w:r>
+      <m:oMath>
+        <m:r>
+          <m:t>1</m:t>
+        </m:r>
+      </m:oMath>
+      <w:r>
+        <w:t xml:space="preserve"> </w:t>
+      </w:r>
+      <w:r>
+        <w:t xml:space="preserve">(</w:t>
+      </w:r>
+      <m:oMath>
+        <m:r>
+          <m:t>b</m:t>
+        </m:r>
+        <m:r>
+          <m:rPr>
+            <m:sty m:val="p"/>
+          </m:rPr>
+          <m:t>⋅</m:t>
+        </m:r>
+        <m:r>
+          <m:t>1</m:t>
+        </m:r>
+      </m:oMath>
+      <w:r>
+        <w:t xml:space="preserve">),</w:t>
+      </w:r>
+      <w:r>
+        <w:t xml:space="preserve"> </w:t>
+      </w:r>
+      <w:r>
+        <w:t xml:space="preserve">and drops the</w:t>
+      </w:r>
+      <w:r>
+        <w:t xml:space="preserve"> </w:t>
+      </w:r>
+      <m:oMath>
+        <m:r>
+          <m:rPr>
+            <m:sty m:val="p"/>
+          </m:rPr>
+          <m:t>⋅</m:t>
+        </m:r>
+        <m:r>
+          <m:t>1</m:t>
+        </m:r>
+      </m:oMath>
+      <w:r>
+        <w:t xml:space="preserve">;</w:t>
+      </w:r>
+    </w:p>
+    <w:p>
+      <w:pPr>
+        <w:pStyle w:val="Compact"/>
+        <w:numPr>
+          <w:ilvl w:val="0"/>
+          <w:numId w:val="1002"/>
+        </w:numPr>
+      </w:pPr>
+      <w:r>
         <w:t xml:space="preserve">writing</w:t>
       </w:r>
       <w:r>
@@ -3198,6 +3803,1166 @@
     </w:p>
     <w:bookmarkEnd w:id="19"/>
     <w:bookmarkEnd w:id="20"/>
+    <w:bookmarkStart w:id="22" w:name="functions-and-their-values"/>
+    <w:p>
+      <w:pPr>
+        <w:pStyle w:val="Heading2"/>
+      </w:pPr>
+      <w:r>
+        <w:t xml:space="preserve">3 Functions and their values</w:t>
+      </w:r>
+    </w:p>
+    <w:p>
+      <w:pPr>
+        <w:pStyle w:val="FirstParagraph"/>
+      </w:pPr>
+      <w:r>
+        <w:t xml:space="preserve">A function and its value at a point are different objects.</w:t>
+      </w:r>
+      <w:r>
+        <w:t xml:space="preserve"> </w:t>
+      </w:r>
+      <w:r>
+        <w:t xml:space="preserve">In</w:t>
+      </w:r>
+      <w:r>
+        <w:t xml:space="preserve"> </w:t>
+      </w:r>
+      <m:oMath>
+        <m:sSub>
+          <m:e>
+            <m:r>
+              <m:t>μ</m:t>
+            </m:r>
+          </m:e>
+          <m:sub>
+            <m:r>
+              <m:t>i</m:t>
+            </m:r>
+          </m:sub>
+        </m:sSub>
+        <m:r>
+          <m:rPr>
+            <m:sty m:val="p"/>
+          </m:rPr>
+          <m:t>=</m:t>
+        </m:r>
+        <m:r>
+          <m:t>μ</m:t>
+        </m:r>
+        <m:r>
+          <m:rPr>
+            <m:sty m:val="p"/>
+          </m:rPr>
+          <m:t>(</m:t>
+        </m:r>
+        <m:sSub>
+          <m:e>
+            <m:r>
+              <m:t>x</m:t>
+            </m:r>
+          </m:e>
+          <m:sub>
+            <m:r>
+              <m:t>i</m:t>
+            </m:r>
+          </m:sub>
+        </m:sSub>
+        <m:r>
+          <m:rPr>
+            <m:sty m:val="p"/>
+          </m:rPr>
+          <m:t>)</m:t>
+        </m:r>
+      </m:oMath>
+      <w:r>
+        <w:t xml:space="preserve">,</w:t>
+      </w:r>
+      <w:r>
+        <w:t xml:space="preserve"> </w:t>
+      </w:r>
+      <m:oMath>
+        <m:r>
+          <m:t>μ</m:t>
+        </m:r>
+      </m:oMath>
+      <w:r>
+        <w:t xml:space="preserve"> </w:t>
+      </w:r>
+      <w:r>
+        <w:t xml:space="preserve">is a function,</w:t>
+      </w:r>
+      <w:r>
+        <w:t xml:space="preserve"> </w:t>
+      </w:r>
+      <w:r>
+        <w:t xml:space="preserve">and</w:t>
+      </w:r>
+      <w:r>
+        <w:t xml:space="preserve"> </w:t>
+      </w:r>
+      <m:oMath>
+        <m:r>
+          <m:t>μ</m:t>
+        </m:r>
+        <m:r>
+          <m:rPr>
+            <m:sty m:val="p"/>
+          </m:rPr>
+          <m:t>(</m:t>
+        </m:r>
+        <m:sSub>
+          <m:e>
+            <m:r>
+              <m:t>x</m:t>
+            </m:r>
+          </m:e>
+          <m:sub>
+            <m:r>
+              <m:t>i</m:t>
+            </m:r>
+          </m:sub>
+        </m:sSub>
+        <m:r>
+          <m:rPr>
+            <m:sty m:val="p"/>
+          </m:rPr>
+          <m:t>)</m:t>
+        </m:r>
+      </m:oMath>
+      <w:r>
+        <w:t xml:space="preserve"> </w:t>
+      </w:r>
+      <w:r>
+        <w:t xml:space="preserve">is a number:</w:t>
+      </w:r>
+      <w:r>
+        <w:t xml:space="preserve"> </w:t>
+      </w:r>
+      <w:r>
+        <w:t xml:space="preserve">the value of</w:t>
+      </w:r>
+      <w:r>
+        <w:t xml:space="preserve"> </w:t>
+      </w:r>
+      <m:oMath>
+        <m:r>
+          <m:t>μ</m:t>
+        </m:r>
+      </m:oMath>
+      <w:r>
+        <w:t xml:space="preserve"> </w:t>
+      </w:r>
+      <w:r>
+        <w:t xml:space="preserve">at</w:t>
+      </w:r>
+      <w:r>
+        <w:t xml:space="preserve"> </w:t>
+      </w:r>
+      <m:oMath>
+        <m:sSub>
+          <m:e>
+            <m:r>
+              <m:t>x</m:t>
+            </m:r>
+          </m:e>
+          <m:sub>
+            <m:r>
+              <m:t>i</m:t>
+            </m:r>
+          </m:sub>
+        </m:sSub>
+      </m:oMath>
+      <w:r>
+        <w:t xml:space="preserve">.</w:t>
+      </w:r>
+      <w:r>
+        <w:t xml:space="preserve"> </w:t>
+      </w:r>
+      <w:r>
+        <w:t xml:space="preserve">Written with its placeholder argument,</w:t>
+      </w:r>
+      <w:r>
+        <w:t xml:space="preserve"> </w:t>
+      </w:r>
+      <m:oMath>
+        <m:r>
+          <m:t>μ</m:t>
+        </m:r>
+        <m:r>
+          <m:rPr>
+            <m:sty m:val="p"/>
+          </m:rPr>
+          <m:t>(</m:t>
+        </m:r>
+        <m:r>
+          <m:t>x</m:t>
+        </m:r>
+        <m:r>
+          <m:rPr>
+            <m:sty m:val="p"/>
+          </m:rPr>
+          <m:t>)</m:t>
+        </m:r>
+      </m:oMath>
+      <w:r>
+        <w:t xml:space="preserve"> </w:t>
+      </w:r>
+      <w:r>
+        <w:t xml:space="preserve">already denotes a value,</w:t>
+      </w:r>
+      <w:r>
+        <w:t xml:space="preserve"> </w:t>
+      </w:r>
+      <w:r>
+        <w:t xml:space="preserve">so</w:t>
+      </w:r>
+      <w:r>
+        <w:t xml:space="preserve"> </w:t>
+      </w:r>
+      <w:r>
+        <w:t xml:space="preserve">“the value of</w:t>
+      </w:r>
+      <w:r>
+        <w:t xml:space="preserve"> </w:t>
+      </w:r>
+      <m:oMath>
+        <m:r>
+          <m:t>μ</m:t>
+        </m:r>
+        <m:r>
+          <m:rPr>
+            <m:sty m:val="p"/>
+          </m:rPr>
+          <m:t>(</m:t>
+        </m:r>
+        <m:r>
+          <m:t>x</m:t>
+        </m:r>
+        <m:r>
+          <m:rPr>
+            <m:sty m:val="p"/>
+          </m:rPr>
+          <m:t>)</m:t>
+        </m:r>
+      </m:oMath>
+      <w:r>
+        <w:t xml:space="preserve"> </w:t>
+      </w:r>
+      <w:r>
+        <w:t xml:space="preserve">at</w:t>
+      </w:r>
+      <w:r>
+        <w:t xml:space="preserve"> </w:t>
+      </w:r>
+      <m:oMath>
+        <m:sSub>
+          <m:e>
+            <m:r>
+              <m:t>x</m:t>
+            </m:r>
+          </m:e>
+          <m:sub>
+            <m:r>
+              <m:t>i</m:t>
+            </m:r>
+          </m:sub>
+        </m:sSub>
+      </m:oMath>
+      <w:r>
+        <w:t xml:space="preserve">”</w:t>
+      </w:r>
+      <w:r>
+        <w:t xml:space="preserve"> </w:t>
+      </w:r>
+      <w:r>
+        <w:t xml:space="preserve">reads as a value of a value.</w:t>
+      </w:r>
+      <w:r>
+        <w:t xml:space="preserve"> </w:t>
+      </w:r>
+      <w:r>
+        <w:t xml:space="preserve">Either drop the placeholder and write</w:t>
+      </w:r>
+      <w:r>
+        <w:t xml:space="preserve"> </w:t>
+      </w:r>
+      <w:r>
+        <w:t xml:space="preserve">“the value of</w:t>
+      </w:r>
+      <w:r>
+        <w:t xml:space="preserve"> </w:t>
+      </w:r>
+      <m:oMath>
+        <m:r>
+          <m:t>μ</m:t>
+        </m:r>
+      </m:oMath>
+      <w:r>
+        <w:t xml:space="preserve"> </w:t>
+      </w:r>
+      <w:r>
+        <w:t xml:space="preserve">at</w:t>
+      </w:r>
+      <w:r>
+        <w:t xml:space="preserve"> </w:t>
+      </w:r>
+      <m:oMath>
+        <m:sSub>
+          <m:e>
+            <m:r>
+              <m:t>x</m:t>
+            </m:r>
+          </m:e>
+          <m:sub>
+            <m:r>
+              <m:t>i</m:t>
+            </m:r>
+          </m:sub>
+        </m:sSub>
+      </m:oMath>
+      <w:r>
+        <w:t xml:space="preserve">”</w:t>
+      </w:r>
+      <w:r>
+        <w:t xml:space="preserve">,</w:t>
+      </w:r>
+      <w:r>
+        <w:t xml:space="preserve"> </w:t>
+      </w:r>
+      <w:r>
+        <w:t xml:space="preserve">or keep the placeholder and name the substitution:</w:t>
+      </w:r>
+      <w:r>
+        <w:t xml:space="preserve"> </w:t>
+      </w:r>
+      <w:r>
+        <w:t xml:space="preserve">“</w:t>
+      </w:r>
+      <m:oMath>
+        <m:r>
+          <m:t>μ</m:t>
+        </m:r>
+        <m:r>
+          <m:rPr>
+            <m:sty m:val="p"/>
+          </m:rPr>
+          <m:t>(</m:t>
+        </m:r>
+        <m:r>
+          <m:t>x</m:t>
+        </m:r>
+        <m:r>
+          <m:rPr>
+            <m:sty m:val="p"/>
+          </m:rPr>
+          <m:t>)</m:t>
+        </m:r>
+      </m:oMath>
+      <w:r>
+        <w:t xml:space="preserve"> </w:t>
+      </w:r>
+      <w:r>
+        <w:t xml:space="preserve">evaluated at</w:t>
+      </w:r>
+      <w:r>
+        <w:t xml:space="preserve"> </w:t>
+      </w:r>
+      <m:oMath>
+        <m:sSub>
+          <m:e>
+            <m:r>
+              <m:t>x</m:t>
+            </m:r>
+          </m:e>
+          <m:sub>
+            <m:r>
+              <m:t>i</m:t>
+            </m:r>
+          </m:sub>
+        </m:sSub>
+      </m:oMath>
+      <w:r>
+        <w:t xml:space="preserve">”</w:t>
+      </w:r>
+      <w:r>
+        <w:t xml:space="preserve">.</w:t>
+      </w:r>
+    </w:p>
+    <w:bookmarkStart w:id="21" w:name="exm-function-evaluated-at"/>
+    <w:p>
+      <w:pPr>
+        <w:pStyle w:val="BodyText"/>
+      </w:pPr>
+      <w:r>
+        <w:rPr>
+          <w:b/>
+          <w:bCs/>
+        </w:rPr>
+        <w:t xml:space="preserve">Example 4 (Saying where a function is evaluated)</w:t>
+      </w:r>
+      <w:r>
+        <w:t xml:space="preserve"> </w:t>
+      </w:r>
+      <w:r>
+        <w:t xml:space="preserve"> </w:t>
+      </w:r>
+    </w:p>
+    <w:p>
+      <w:pPr>
+        <w:pStyle w:val="BlockText"/>
+      </w:pPr>
+      <w:r>
+        <w:t xml:space="preserve">❌ Each outcome is centered on the value of a mean function</w:t>
+      </w:r>
+      <w:r>
+        <w:t xml:space="preserve"> </w:t>
+      </w:r>
+      <m:oMath>
+        <m:r>
+          <m:t>μ</m:t>
+        </m:r>
+        <m:r>
+          <m:rPr>
+            <m:sty m:val="p"/>
+          </m:rPr>
+          <m:t>(</m:t>
+        </m:r>
+        <m:r>
+          <m:t>x</m:t>
+        </m:r>
+        <m:r>
+          <m:rPr>
+            <m:sty m:val="p"/>
+          </m:rPr>
+          <m:t>)</m:t>
+        </m:r>
+      </m:oMath>
+      <w:r>
+        <w:t xml:space="preserve"> </w:t>
+      </w:r>
+      <w:r>
+        <w:t xml:space="preserve">at its own covariate values.</w:t>
+      </w:r>
+    </w:p>
+    <w:p>
+      <w:pPr>
+        <w:pStyle w:val="BlockText"/>
+      </w:pPr>
+      <w:r>
+        <w:t xml:space="preserve">✅ Each outcome is centered on a mean function</w:t>
+      </w:r>
+      <w:r>
+        <w:t xml:space="preserve"> </w:t>
+      </w:r>
+      <m:oMath>
+        <m:r>
+          <m:t>μ</m:t>
+        </m:r>
+        <m:r>
+          <m:rPr>
+            <m:sty m:val="p"/>
+          </m:rPr>
+          <m:t>(</m:t>
+        </m:r>
+        <m:r>
+          <m:t>x</m:t>
+        </m:r>
+        <m:r>
+          <m:rPr>
+            <m:sty m:val="p"/>
+          </m:rPr>
+          <m:t>)</m:t>
+        </m:r>
+      </m:oMath>
+      <w:r>
+        <w:t xml:space="preserve"> </w:t>
+      </w:r>
+      <w:r>
+        <w:t xml:space="preserve">evaluated at that outcome’s covariate values.</w:t>
+      </w:r>
+    </w:p>
+    <w:p>
+      <w:pPr>
+        <w:pStyle w:val="BlockText"/>
+      </w:pPr>
+      <w:r>
+        <w:t xml:space="preserve">❌ the value of the density</w:t>
+      </w:r>
+      <w:r>
+        <w:t xml:space="preserve"> </w:t>
+      </w:r>
+      <m:oMath>
+        <m:r>
+          <m:t>f</m:t>
+        </m:r>
+        <m:r>
+          <m:rPr>
+            <m:sty m:val="p"/>
+          </m:rPr>
+          <m:t>(</m:t>
+        </m:r>
+        <m:r>
+          <m:t>x</m:t>
+        </m:r>
+        <m:r>
+          <m:rPr>
+            <m:sty m:val="p"/>
+          </m:rPr>
+          <m:t>)</m:t>
+        </m:r>
+      </m:oMath>
+      <w:r>
+        <w:t xml:space="preserve"> </w:t>
+      </w:r>
+      <w:r>
+        <w:t xml:space="preserve">at 0</w:t>
+      </w:r>
+    </w:p>
+    <w:p>
+      <w:pPr>
+        <w:pStyle w:val="BlockText"/>
+      </w:pPr>
+      <w:r>
+        <w:t xml:space="preserve">✅ the value of</w:t>
+      </w:r>
+      <w:r>
+        <w:t xml:space="preserve"> </w:t>
+      </w:r>
+      <m:oMath>
+        <m:r>
+          <m:t>f</m:t>
+        </m:r>
+      </m:oMath>
+      <w:r>
+        <w:t xml:space="preserve"> </w:t>
+      </w:r>
+      <w:r>
+        <w:t xml:space="preserve">at 0, or</w:t>
+      </w:r>
+      <w:r>
+        <w:t xml:space="preserve"> </w:t>
+      </w:r>
+      <m:oMath>
+        <m:r>
+          <m:t>f</m:t>
+        </m:r>
+        <m:r>
+          <m:rPr>
+            <m:sty m:val="p"/>
+          </m:rPr>
+          <m:t>(</m:t>
+        </m:r>
+        <m:r>
+          <m:t>0</m:t>
+        </m:r>
+        <m:r>
+          <m:rPr>
+            <m:sty m:val="p"/>
+          </m:rPr>
+          <m:t>)</m:t>
+        </m:r>
+      </m:oMath>
+    </w:p>
+    <w:p>
+      <w:pPr>
+        <w:pStyle w:val="BlockText"/>
+      </w:pPr>
+      <w:r>
+        <w:t xml:space="preserve">❌ the likelihood</w:t>
+      </w:r>
+      <w:r>
+        <w:t xml:space="preserve"> </w:t>
+      </w:r>
+      <m:oMath>
+        <m:r>
+          <m:t>L</m:t>
+        </m:r>
+        <m:r>
+          <m:rPr>
+            <m:sty m:val="p"/>
+          </m:rPr>
+          <m:t>(</m:t>
+        </m:r>
+        <m:r>
+          <m:t>θ</m:t>
+        </m:r>
+        <m:r>
+          <m:rPr>
+            <m:sty m:val="p"/>
+          </m:rPr>
+          <m:t>)</m:t>
+        </m:r>
+      </m:oMath>
+      <w:r>
+        <w:t xml:space="preserve"> </w:t>
+      </w:r>
+      <w:r>
+        <w:t xml:space="preserve">at</w:t>
+      </w:r>
+      <w:r>
+        <w:t xml:space="preserve"> </w:t>
+      </w:r>
+      <m:oMath>
+        <m:acc>
+          <m:accPr>
+            <m:chr m:val="̂"/>
+          </m:accPr>
+          <m:e>
+            <m:r>
+              <m:t>θ</m:t>
+            </m:r>
+          </m:e>
+        </m:acc>
+      </m:oMath>
+    </w:p>
+    <w:p>
+      <w:pPr>
+        <w:pStyle w:val="BlockText"/>
+      </w:pPr>
+      <w:r>
+        <w:t xml:space="preserve">✅</w:t>
+      </w:r>
+      <w:r>
+        <w:t xml:space="preserve"> </w:t>
+      </w:r>
+      <m:oMath>
+        <m:r>
+          <m:t>L</m:t>
+        </m:r>
+        <m:r>
+          <m:rPr>
+            <m:sty m:val="p"/>
+          </m:rPr>
+          <m:t>(</m:t>
+        </m:r>
+        <m:r>
+          <m:t>θ</m:t>
+        </m:r>
+        <m:r>
+          <m:rPr>
+            <m:sty m:val="p"/>
+          </m:rPr>
+          <m:t>)</m:t>
+        </m:r>
+      </m:oMath>
+      <w:r>
+        <w:t xml:space="preserve"> </w:t>
+      </w:r>
+      <w:r>
+        <w:t xml:space="preserve">evaluated at</w:t>
+      </w:r>
+      <w:r>
+        <w:t xml:space="preserve"> </w:t>
+      </w:r>
+      <m:oMath>
+        <m:acc>
+          <m:accPr>
+            <m:chr m:val="̂"/>
+          </m:accPr>
+          <m:e>
+            <m:r>
+              <m:t>θ</m:t>
+            </m:r>
+          </m:e>
+        </m:acc>
+      </m:oMath>
+      <w:r>
+        <w:t xml:space="preserve">, or</w:t>
+      </w:r>
+      <w:r>
+        <w:t xml:space="preserve"> </w:t>
+      </w:r>
+      <m:oMath>
+        <m:r>
+          <m:t>L</m:t>
+        </m:r>
+        <m:r>
+          <m:rPr>
+            <m:sty m:val="p"/>
+          </m:rPr>
+          <m:t>(</m:t>
+        </m:r>
+        <m:acc>
+          <m:accPr>
+            <m:chr m:val="̂"/>
+          </m:accPr>
+          <m:e>
+            <m:r>
+              <m:t>θ</m:t>
+            </m:r>
+          </m:e>
+        </m:acc>
+        <m:r>
+          <m:rPr>
+            <m:sty m:val="p"/>
+          </m:rPr>
+          <m:t>)</m:t>
+        </m:r>
+      </m:oMath>
+    </w:p>
+    <w:p>
+      <w:pPr>
+        <w:pStyle w:val="FirstParagraph"/>
+      </w:pPr>
+      <w:r>
+        <w:t xml:space="preserve">In each ❌ version,</w:t>
+      </w:r>
+      <w:r>
+        <w:t xml:space="preserve"> </w:t>
+      </w:r>
+      <w:r>
+        <w:t xml:space="preserve">“the value of”</w:t>
+      </w:r>
+      <w:r>
+        <w:t xml:space="preserve"> </w:t>
+      </w:r>
+      <w:r>
+        <w:t xml:space="preserve">or</w:t>
+      </w:r>
+      <w:r>
+        <w:t xml:space="preserve"> </w:t>
+      </w:r>
+      <w:r>
+        <w:t xml:space="preserve">“at”</w:t>
+      </w:r>
+      <w:r>
+        <w:t xml:space="preserve"> </w:t>
+      </w:r>
+      <w:r>
+        <w:t xml:space="preserve">sits next to a placeholder argument,</w:t>
+      </w:r>
+      <w:r>
+        <w:t xml:space="preserve"> </w:t>
+      </w:r>
+      <w:r>
+        <w:t xml:space="preserve">so the reader has to decide whether</w:t>
+      </w:r>
+      <w:r>
+        <w:t xml:space="preserve"> </w:t>
+      </w:r>
+      <m:oMath>
+        <m:r>
+          <m:t>μ</m:t>
+        </m:r>
+        <m:r>
+          <m:rPr>
+            <m:sty m:val="p"/>
+          </m:rPr>
+          <m:t>(</m:t>
+        </m:r>
+        <m:r>
+          <m:t>x</m:t>
+        </m:r>
+        <m:r>
+          <m:rPr>
+            <m:sty m:val="p"/>
+          </m:rPr>
+          <m:t>)</m:t>
+        </m:r>
+      </m:oMath>
+      <w:r>
+        <w:t xml:space="preserve">,</w:t>
+      </w:r>
+      <w:r>
+        <w:t xml:space="preserve"> </w:t>
+      </w:r>
+      <m:oMath>
+        <m:r>
+          <m:t>f</m:t>
+        </m:r>
+        <m:r>
+          <m:rPr>
+            <m:sty m:val="p"/>
+          </m:rPr>
+          <m:t>(</m:t>
+        </m:r>
+        <m:r>
+          <m:t>x</m:t>
+        </m:r>
+        <m:r>
+          <m:rPr>
+            <m:sty m:val="p"/>
+          </m:rPr>
+          <m:t>)</m:t>
+        </m:r>
+      </m:oMath>
+      <w:r>
+        <w:t xml:space="preserve"> </w:t>
+      </w:r>
+      <w:r>
+        <w:t xml:space="preserve">or</w:t>
+      </w:r>
+      <w:r>
+        <w:t xml:space="preserve"> </w:t>
+      </w:r>
+      <m:oMath>
+        <m:r>
+          <m:t>L</m:t>
+        </m:r>
+        <m:r>
+          <m:rPr>
+            <m:sty m:val="p"/>
+          </m:rPr>
+          <m:t>(</m:t>
+        </m:r>
+        <m:r>
+          <m:t>θ</m:t>
+        </m:r>
+        <m:r>
+          <m:rPr>
+            <m:sty m:val="p"/>
+          </m:rPr>
+          <m:t>)</m:t>
+        </m:r>
+      </m:oMath>
+      <w:r>
+        <w:t xml:space="preserve"> </w:t>
+      </w:r>
+      <w:r>
+        <w:t xml:space="preserve">means the function or one of its values.</w:t>
+      </w:r>
+      <w:r>
+        <w:t xml:space="preserve"> </w:t>
+      </w:r>
+      <w:r>
+        <w:t xml:space="preserve">The first ❌ version also has an ambiguous</w:t>
+      </w:r>
+      <w:r>
+        <w:t xml:space="preserve"> </w:t>
+      </w:r>
+      <w:r>
+        <w:t xml:space="preserve">“its”</w:t>
+      </w:r>
+      <w:r>
+        <w:t xml:space="preserve">:</w:t>
+      </w:r>
+      <w:r>
+        <w:t xml:space="preserve"> </w:t>
+      </w:r>
+      <w:r>
+        <w:t xml:space="preserve">the nearest candidate is the mean function, not the outcome.</w:t>
+      </w:r>
+    </w:p>
+    <w:bookmarkEnd w:id="21"/>
+    <w:p>
+      <w:pPr>
+        <w:pStyle w:val="BodyText"/>
+      </w:pPr>
+      <w:r>
+        <w:t xml:space="preserve">Use the notation to match:</w:t>
+      </w:r>
+    </w:p>
+    <w:p>
+      <w:pPr>
+        <w:pStyle w:val="Compact"/>
+        <w:numPr>
+          <w:ilvl w:val="0"/>
+          <w:numId w:val="1003"/>
+        </w:numPr>
+      </w:pPr>
+      <w:r>
+        <w:t xml:space="preserve">Write</w:t>
+      </w:r>
+      <w:r>
+        <w:t xml:space="preserve"> </w:t>
+      </w:r>
+      <m:oMath>
+        <m:r>
+          <m:t>μ</m:t>
+        </m:r>
+      </m:oMath>
+      <w:r>
+        <w:t xml:space="preserve">, or</w:t>
+      </w:r>
+      <w:r>
+        <w:t xml:space="preserve"> </w:t>
+      </w:r>
+      <w:r>
+        <w:t xml:space="preserve">“the mean function”</w:t>
+      </w:r>
+      <w:r>
+        <w:t xml:space="preserve">, for the function itself.</w:t>
+      </w:r>
+    </w:p>
+    <w:p>
+      <w:pPr>
+        <w:pStyle w:val="Compact"/>
+        <w:numPr>
+          <w:ilvl w:val="0"/>
+          <w:numId w:val="1003"/>
+        </w:numPr>
+      </w:pPr>
+      <w:r>
+        <w:t xml:space="preserve">Write</w:t>
+      </w:r>
+      <w:r>
+        <w:t xml:space="preserve"> </w:t>
+      </w:r>
+      <m:oMath>
+        <m:r>
+          <m:t>μ</m:t>
+        </m:r>
+        <m:r>
+          <m:rPr>
+            <m:sty m:val="p"/>
+          </m:rPr>
+          <m:t>(</m:t>
+        </m:r>
+        <m:r>
+          <m:t>x</m:t>
+        </m:r>
+        <m:r>
+          <m:rPr>
+            <m:sty m:val="p"/>
+          </m:rPr>
+          <m:t>)</m:t>
+        </m:r>
+      </m:oMath>
+      <w:r>
+        <w:t xml:space="preserve"> </w:t>
+      </w:r>
+      <w:r>
+        <w:t xml:space="preserve">with a placeholder argument</w:t>
+      </w:r>
+      <w:r>
+        <w:t xml:space="preserve"> </w:t>
+      </w:r>
+      <w:r>
+        <w:t xml:space="preserve">where you introduce or define the function,</w:t>
+      </w:r>
+      <w:r>
+        <w:t xml:space="preserve"> </w:t>
+      </w:r>
+      <w:r>
+        <w:t xml:space="preserve">to show what its argument is,</w:t>
+      </w:r>
+      <w:r>
+        <w:t xml:space="preserve"> </w:t>
+      </w:r>
+      <w:r>
+        <w:t xml:space="preserve">as in</w:t>
+      </w:r>
+      <w:r>
+        <w:t xml:space="preserve"> </w:t>
+      </w:r>
+      <w:r>
+        <w:t xml:space="preserve">“a mean function</w:t>
+      </w:r>
+      <w:r>
+        <w:t xml:space="preserve"> </w:t>
+      </w:r>
+      <m:oMath>
+        <m:r>
+          <m:t>μ</m:t>
+        </m:r>
+        <m:r>
+          <m:rPr>
+            <m:sty m:val="p"/>
+          </m:rPr>
+          <m:t>(</m:t>
+        </m:r>
+        <m:r>
+          <m:t>x</m:t>
+        </m:r>
+        <m:r>
+          <m:rPr>
+            <m:sty m:val="p"/>
+          </m:rPr>
+          <m:t>)</m:t>
+        </m:r>
+      </m:oMath>
+      <w:r>
+        <w:t xml:space="preserve">”</w:t>
+      </w:r>
+      <w:r>
+        <w:t xml:space="preserve"> </w:t>
+      </w:r>
+      <w:r>
+        <w:t xml:space="preserve">or</w:t>
+      </w:r>
+      <w:r>
+        <w:t xml:space="preserve"> </w:t>
+      </w:r>
+      <m:oMath>
+        <m:r>
+          <m:t>μ</m:t>
+        </m:r>
+        <m:r>
+          <m:rPr>
+            <m:sty m:val="p"/>
+          </m:rPr>
+          <m:t>(</m:t>
+        </m:r>
+        <m:r>
+          <m:t>x</m:t>
+        </m:r>
+        <m:r>
+          <m:rPr>
+            <m:sty m:val="p"/>
+          </m:rPr>
+          <m:t>)</m:t>
+        </m:r>
+        <m:box>
+          <m:boxPr>
+            <m:opEmu m:val="on"/>
+          </m:boxPr>
+          <m:e>
+            <m:r>
+              <m:rPr>
+                <m:sty m:val="p"/>
+              </m:rPr>
+              <m:t>:=</m:t>
+            </m:r>
+          </m:e>
+        </m:box>
+        <m:sSub>
+          <m:e>
+            <m:r>
+              <m:t>β</m:t>
+            </m:r>
+          </m:e>
+          <m:sub>
+            <m:r>
+              <m:t>0</m:t>
+            </m:r>
+          </m:sub>
+        </m:sSub>
+        <m:r>
+          <m:rPr>
+            <m:sty m:val="p"/>
+          </m:rPr>
+          <m:t>+</m:t>
+        </m:r>
+        <m:sSub>
+          <m:e>
+            <m:r>
+              <m:t>β</m:t>
+            </m:r>
+          </m:e>
+          <m:sub>
+            <m:r>
+              <m:t>x</m:t>
+            </m:r>
+          </m:sub>
+        </m:sSub>
+        <m:r>
+          <m:t>x</m:t>
+        </m:r>
+      </m:oMath>
+      <w:r>
+        <w:t xml:space="preserve">,</w:t>
+      </w:r>
+      <w:r>
+        <w:t xml:space="preserve"> </w:t>
+      </w:r>
+      <w:r>
+        <w:t xml:space="preserve">and say</w:t>
+      </w:r>
+      <w:r>
+        <w:t xml:space="preserve"> </w:t>
+      </w:r>
+      <w:r>
+        <w:t xml:space="preserve">“evaluated at”</w:t>
+      </w:r>
+      <w:r>
+        <w:t xml:space="preserve"> </w:t>
+      </w:r>
+      <w:r>
+        <w:t xml:space="preserve">when you substitute a point into it.</w:t>
+      </w:r>
+    </w:p>
+    <w:p>
+      <w:pPr>
+        <w:pStyle w:val="Compact"/>
+        <w:numPr>
+          <w:ilvl w:val="0"/>
+          <w:numId w:val="1003"/>
+        </w:numPr>
+      </w:pPr>
+      <w:r>
+        <w:t xml:space="preserve">Write</w:t>
+      </w:r>
+      <w:r>
+        <w:t xml:space="preserve"> </w:t>
+      </w:r>
+      <m:oMath>
+        <m:r>
+          <m:t>μ</m:t>
+        </m:r>
+        <m:r>
+          <m:rPr>
+            <m:sty m:val="p"/>
+          </m:rPr>
+          <m:t>(</m:t>
+        </m:r>
+        <m:sSub>
+          <m:e>
+            <m:r>
+              <m:t>x</m:t>
+            </m:r>
+          </m:e>
+          <m:sub>
+            <m:r>
+              <m:t>i</m:t>
+            </m:r>
+          </m:sub>
+        </m:sSub>
+        <m:r>
+          <m:rPr>
+            <m:sty m:val="p"/>
+          </m:rPr>
+          <m:t>)</m:t>
+        </m:r>
+      </m:oMath>
+      <w:r>
+        <w:t xml:space="preserve">, or</w:t>
+      </w:r>
+      <w:r>
+        <w:t xml:space="preserve"> </w:t>
+      </w:r>
+      <w:r>
+        <w:t xml:space="preserve">“the value of</w:t>
+      </w:r>
+      <w:r>
+        <w:t xml:space="preserve"> </w:t>
+      </w:r>
+      <m:oMath>
+        <m:r>
+          <m:t>μ</m:t>
+        </m:r>
+      </m:oMath>
+      <w:r>
+        <w:t xml:space="preserve"> </w:t>
+      </w:r>
+      <w:r>
+        <w:t xml:space="preserve">at</w:t>
+      </w:r>
+      <w:r>
+        <w:t xml:space="preserve"> </w:t>
+      </w:r>
+      <m:oMath>
+        <m:sSub>
+          <m:e>
+            <m:r>
+              <m:t>x</m:t>
+            </m:r>
+          </m:e>
+          <m:sub>
+            <m:r>
+              <m:t>i</m:t>
+            </m:r>
+          </m:sub>
+        </m:sSub>
+      </m:oMath>
+      <w:r>
+        <w:t xml:space="preserve">”</w:t>
+      </w:r>
+      <w:r>
+        <w:t xml:space="preserve">, for a value.</w:t>
+      </w:r>
+    </w:p>
+    <w:bookmarkEnd w:id="22"/>
     <w:sectPr>
       <w:footnotePr>
         <w:numRestart w:val="eachSect"/>
@@ -3418,6 +5183,9 @@
     <w:abstractNumId w:val="991"/>
   </w:num>
   <w:num w:numId="1002">
+    <w:abstractNumId w:val="991"/>
+  </w:num>
+  <w:num w:numId="1003">
     <w:abstractNumId w:val="991"/>
   </w:num>
 </w:numbering>

</xml_diff>

<commit_message>
Deploying to gh-pages from @ Morrison-Lab/psw@72ee2e301fdb2d895f2682f50f6f6309228a5217 🚀
</commit_message>
<xml_diff>
--- a/chapters/notation.docx
+++ b/chapters/notation.docx
@@ -15,7 +15,7 @@
         <w:pStyle w:val="Date"/>
       </w:pPr>
       <w:r>
-        <w:t xml:space="preserve">Last modified: 2026-10-05 10:08:24 (UTC)</w:t>
+        <w:t xml:space="preserve">Last modified: 2026-10-05 10:12:22 (UTC)</w:t>
       </w:r>
     </w:p>
     <w:tbl>
@@ -4963,6 +4963,1055 @@
       </w:r>
     </w:p>
     <w:bookmarkEnd w:id="22"/>
+    <w:bookmarkStart w:id="25" w:name="writing-out-notational-shorthands"/>
+    <w:p>
+      <w:pPr>
+        <w:pStyle w:val="Heading2"/>
+      </w:pPr>
+      <w:r>
+        <w:t xml:space="preserve">4 Writing out notational shorthands</w:t>
+      </w:r>
+    </w:p>
+    <w:p>
+      <w:pPr>
+        <w:pStyle w:val="FirstParagraph"/>
+      </w:pPr>
+      <w:r>
+        <w:t xml:space="preserve">A notational shorthand drops part of an expression</w:t>
+      </w:r>
+      <w:r>
+        <w:t xml:space="preserve"> </w:t>
+      </w:r>
+      <w:r>
+        <w:t xml:space="preserve">that the writer expects the reader to fill in.</w:t>
+      </w:r>
+      <w:r>
+        <w:t xml:space="preserve"> </w:t>
+      </w:r>
+      <w:r>
+        <w:t xml:space="preserve">The commonest case is leaving the limits off a sum, product, or integral,</w:t>
+      </w:r>
+      <w:r>
+        <w:t xml:space="preserve"> </w:t>
+      </w:r>
+      <w:r>
+        <w:t xml:space="preserve">as in</w:t>
+      </w:r>
+      <w:r>
+        <w:t xml:space="preserve"> </w:t>
+      </w:r>
+      <m:oMath>
+        <m:nary>
+          <m:naryPr>
+            <m:chr m:val="∑"/>
+            <m:limLoc m:val="undOvr"/>
+            <m:subHide m:val="off"/>
+            <m:supHide m:val="on"/>
+          </m:naryPr>
+          <m:sub>
+            <m:r>
+              <m:t>x</m:t>
+            </m:r>
+          </m:sub>
+          <m:sup>
+            <m:r>
+              <m:t>​</m:t>
+            </m:r>
+          </m:sup>
+          <m:e>
+            <m:r>
+              <m:t>f</m:t>
+            </m:r>
+          </m:e>
+        </m:nary>
+        <m:r>
+          <m:rPr>
+            <m:sty m:val="p"/>
+          </m:rPr>
+          <m:t>(</m:t>
+        </m:r>
+        <m:r>
+          <m:t>x</m:t>
+        </m:r>
+        <m:r>
+          <m:rPr>
+            <m:sty m:val="p"/>
+          </m:rPr>
+          <m:t>)</m:t>
+        </m:r>
+      </m:oMath>
+      <w:r>
+        <w:t xml:space="preserve">.</w:t>
+      </w:r>
+      <w:r>
+        <w:t xml:space="preserve"> </w:t>
+      </w:r>
+      <w:r>
+        <w:t xml:space="preserve">In permanent writing (notes, papers, and published slides),</w:t>
+      </w:r>
+      <w:r>
+        <w:t xml:space="preserve"> </w:t>
+      </w:r>
+      <w:r>
+        <w:t xml:space="preserve">write the full form instead:</w:t>
+      </w:r>
+      <w:r>
+        <w:t xml:space="preserve"> </w:t>
+      </w:r>
+      <m:oMath>
+        <m:nary>
+          <m:naryPr>
+            <m:chr m:val="∑"/>
+            <m:limLoc m:val="undOvr"/>
+            <m:subHide m:val="off"/>
+            <m:supHide m:val="on"/>
+          </m:naryPr>
+          <m:sub>
+            <m:r>
+              <m:t>x</m:t>
+            </m:r>
+            <m:r>
+              <m:rPr>
+                <m:sty m:val="p"/>
+              </m:rPr>
+              <m:t>∈</m:t>
+            </m:r>
+            <m:r>
+              <m:rPr>
+                <m:scr m:val="script"/>
+                <m:sty m:val="p"/>
+              </m:rPr>
+              <m:t>R</m:t>
+            </m:r>
+            <m:r>
+              <m:rPr>
+                <m:sty m:val="p"/>
+              </m:rPr>
+              <m:t>(</m:t>
+            </m:r>
+            <m:r>
+              <m:t>X</m:t>
+            </m:r>
+            <m:r>
+              <m:rPr>
+                <m:sty m:val="p"/>
+              </m:rPr>
+              <m:t>)</m:t>
+            </m:r>
+          </m:sub>
+          <m:sup>
+            <m:r>
+              <m:t>​</m:t>
+            </m:r>
+          </m:sup>
+          <m:e>
+            <m:r>
+              <m:t>f</m:t>
+            </m:r>
+          </m:e>
+        </m:nary>
+        <m:r>
+          <m:rPr>
+            <m:sty m:val="p"/>
+          </m:rPr>
+          <m:t>(</m:t>
+        </m:r>
+        <m:r>
+          <m:t>x</m:t>
+        </m:r>
+        <m:r>
+          <m:rPr>
+            <m:sty m:val="p"/>
+          </m:rPr>
+          <m:t>)</m:t>
+        </m:r>
+      </m:oMath>
+      <w:r>
+        <w:t xml:space="preserve">,</w:t>
+      </w:r>
+      <w:r>
+        <w:t xml:space="preserve"> </w:t>
+      </w:r>
+      <w:r>
+        <w:t xml:space="preserve">where</w:t>
+      </w:r>
+      <w:r>
+        <w:t xml:space="preserve"> </w:t>
+      </w:r>
+      <m:oMath>
+        <m:r>
+          <m:rPr>
+            <m:scr m:val="script"/>
+            <m:sty m:val="p"/>
+          </m:rPr>
+          <m:t>R</m:t>
+        </m:r>
+        <m:r>
+          <m:rPr>
+            <m:sty m:val="p"/>
+          </m:rPr>
+          <m:t>(</m:t>
+        </m:r>
+        <m:r>
+          <m:t>X</m:t>
+        </m:r>
+        <m:r>
+          <m:rPr>
+            <m:sty m:val="p"/>
+          </m:rPr>
+          <m:t>)</m:t>
+        </m:r>
+      </m:oMath>
+      <w:r>
+        <w:t xml:space="preserve"> </w:t>
+      </w:r>
+      <w:r>
+        <w:t xml:space="preserve">is the set of values that</w:t>
+      </w:r>
+      <w:r>
+        <w:t xml:space="preserve"> </w:t>
+      </w:r>
+      <m:oMath>
+        <m:r>
+          <m:t>X</m:t>
+        </m:r>
+      </m:oMath>
+      <w:r>
+        <w:t xml:space="preserve"> </w:t>
+      </w:r>
+      <w:r>
+        <w:t xml:space="preserve">can take.</w:t>
+      </w:r>
+    </w:p>
+    <w:p>
+      <w:pPr>
+        <w:pStyle w:val="BodyText"/>
+      </w:pPr>
+      <w:r>
+        <w:t xml:space="preserve">The full form costs the writer a few characters</w:t>
+      </w:r>
+      <w:r>
+        <w:t xml:space="preserve"> </w:t>
+      </w:r>
+      <w:r>
+        <w:t xml:space="preserve">and saves every reader a guess.</w:t>
+      </w:r>
+      <w:r>
+        <w:t xml:space="preserve"> </w:t>
+      </w:r>
+      <w:r>
+        <w:t xml:space="preserve">A reader who sees</w:t>
+      </w:r>
+      <w:r>
+        <w:t xml:space="preserve"> </w:t>
+      </w:r>
+      <m:oMath>
+        <m:nary>
+          <m:naryPr>
+            <m:chr m:val="∑"/>
+            <m:limLoc m:val="undOvr"/>
+            <m:subHide m:val="off"/>
+            <m:supHide m:val="on"/>
+          </m:naryPr>
+          <m:sub>
+            <m:r>
+              <m:t>x</m:t>
+            </m:r>
+          </m:sub>
+          <m:sup>
+            <m:r>
+              <m:t>​</m:t>
+            </m:r>
+          </m:sup>
+          <m:e>
+            <m:r>
+              <m:t>​</m:t>
+            </m:r>
+          </m:e>
+        </m:nary>
+      </m:oMath>
+      <w:r>
+        <w:t xml:space="preserve"> </w:t>
+      </w:r>
+      <w:r>
+        <w:t xml:space="preserve">has to work out which values of</w:t>
+      </w:r>
+      <w:r>
+        <w:t xml:space="preserve"> </w:t>
+      </w:r>
+      <m:oMath>
+        <m:r>
+          <m:t>x</m:t>
+        </m:r>
+      </m:oMath>
+      <w:r>
+        <w:t xml:space="preserve"> </w:t>
+      </w:r>
+      <w:r>
+        <w:t xml:space="preserve">the sum runs over,</w:t>
+      </w:r>
+      <w:r>
+        <w:t xml:space="preserve"> </w:t>
+      </w:r>
+      <w:r>
+        <w:t xml:space="preserve">and readers who work out different answers</w:t>
+      </w:r>
+      <w:r>
+        <w:t xml:space="preserve"> </w:t>
+      </w:r>
+      <w:r>
+        <w:t xml:space="preserve">will disagree about what the expression means.</w:t>
+      </w:r>
+      <w:r>
+        <w:t xml:space="preserve"> </w:t>
+      </w:r>
+      <w:r>
+        <w:t xml:space="preserve">The full form also exposes mistakes.</w:t>
+      </w:r>
+      <w:r>
+        <w:t xml:space="preserve"> </w:t>
+      </w:r>
+      <w:r>
+        <w:t xml:space="preserve">If a count variable takes only non-negative values,</w:t>
+      </w:r>
+      <w:r>
+        <w:t xml:space="preserve"> </w:t>
+      </w:r>
+      <w:r>
+        <w:t xml:space="preserve">a sum written as</w:t>
+      </w:r>
+      <w:r>
+        <w:t xml:space="preserve"> </w:t>
+      </w:r>
+      <m:oMath>
+        <m:nary>
+          <m:naryPr>
+            <m:chr m:val="∑"/>
+            <m:limLoc m:val="undOvr"/>
+            <m:subHide m:val="off"/>
+            <m:supHide m:val="on"/>
+          </m:naryPr>
+          <m:sub>
+            <m:r>
+              <m:t>x</m:t>
+            </m:r>
+            <m:r>
+              <m:rPr>
+                <m:sty m:val="p"/>
+              </m:rPr>
+              <m:t>∈</m:t>
+            </m:r>
+            <m:r>
+              <m:rPr>
+                <m:scr m:val="double-struck"/>
+                <m:sty m:val="p"/>
+              </m:rPr>
+              <m:t>Z</m:t>
+            </m:r>
+          </m:sub>
+          <m:sup>
+            <m:r>
+              <m:t>​</m:t>
+            </m:r>
+          </m:sup>
+          <m:e>
+            <m:r>
+              <m:t>​</m:t>
+            </m:r>
+          </m:e>
+        </m:nary>
+      </m:oMath>
+      <w:r>
+        <w:t xml:space="preserve"> </w:t>
+      </w:r>
+      <w:r>
+        <w:t xml:space="preserve">shows the wrong set at a glance,</w:t>
+      </w:r>
+      <w:r>
+        <w:t xml:space="preserve"> </w:t>
+      </w:r>
+      <w:r>
+        <w:t xml:space="preserve">while</w:t>
+      </w:r>
+      <w:r>
+        <w:t xml:space="preserve"> </w:t>
+      </w:r>
+      <m:oMath>
+        <m:nary>
+          <m:naryPr>
+            <m:chr m:val="∑"/>
+            <m:limLoc m:val="undOvr"/>
+            <m:subHide m:val="off"/>
+            <m:supHide m:val="on"/>
+          </m:naryPr>
+          <m:sub>
+            <m:r>
+              <m:t>x</m:t>
+            </m:r>
+          </m:sub>
+          <m:sup>
+            <m:r>
+              <m:t>​</m:t>
+            </m:r>
+          </m:sup>
+          <m:e>
+            <m:r>
+              <m:t>​</m:t>
+            </m:r>
+          </m:e>
+        </m:nary>
+      </m:oMath>
+      <w:r>
+        <w:t xml:space="preserve"> </w:t>
+      </w:r>
+      <w:r>
+        <w:t xml:space="preserve">hides the same mistake.</w:t>
+      </w:r>
+    </w:p>
+    <w:p>
+      <w:pPr>
+        <w:pStyle w:val="BodyText"/>
+      </w:pPr>
+      <w:r>
+        <w:t xml:space="preserve">Give the limits of every sum, product, and integral,</w:t>
+      </w:r>
+      <w:r>
+        <w:t xml:space="preserve"> </w:t>
+      </w:r>
+      <w:r>
+        <w:t xml:space="preserve">and state the set that any other index runs over.</w:t>
+      </w:r>
+      <w:r>
+        <w:t xml:space="preserve"> </w:t>
+      </w:r>
+      <w:r>
+        <w:t xml:space="preserve">Board work during a lecture is often less complete,</w:t>
+      </w:r>
+      <w:r>
+        <w:t xml:space="preserve"> </w:t>
+      </w:r>
+      <w:r>
+        <w:t xml:space="preserve">but it should still aim for the full form.</w:t>
+      </w:r>
+      <w:r>
+        <w:t xml:space="preserve"> </w:t>
+      </w:r>
+      <w:r>
+        <w:t xml:space="preserve">The</w:t>
+      </w:r>
+      <w:r>
+        <w:t xml:space="preserve"> </w:t>
+      </w:r>
+      <w:hyperlink r:id="rId23">
+        <w:r>
+          <w:rPr>
+            <w:rStyle w:val="Hyperlink"/>
+          </w:rPr>
+          <w:t xml:space="preserve">notation page of the</w:t>
+        </w:r>
+        <w:r>
+          <w:rPr>
+            <w:rStyle w:val="Hyperlink"/>
+          </w:rPr>
+          <w:t xml:space="preserve"> </w:t>
+        </w:r>
+        <w:r>
+          <w:rPr>
+            <w:rStyle w:val="Hyperlink"/>
+            <w:i/>
+            <w:iCs/>
+          </w:rPr>
+          <w:t xml:space="preserve">Math for Data Science</w:t>
+        </w:r>
+        <w:r>
+          <w:rPr>
+            <w:rStyle w:val="Hyperlink"/>
+          </w:rPr>
+          <w:t xml:space="preserve"> </w:t>
+        </w:r>
+        <w:r>
+          <w:rPr>
+            <w:rStyle w:val="Hyperlink"/>
+          </w:rPr>
+          <w:t xml:space="preserve">notes</w:t>
+        </w:r>
+      </w:hyperlink>
+      <w:r>
+        <w:t xml:space="preserve"> </w:t>
+      </w:r>
+      <w:r>
+        <w:t xml:space="preserve">catalogs common shorthands and their full forms.</w:t>
+      </w:r>
+    </w:p>
+    <w:bookmarkStart w:id="24" w:name="exm-notational-shorthand"/>
+    <w:p>
+      <w:pPr>
+        <w:pStyle w:val="BodyText"/>
+      </w:pPr>
+      <w:r>
+        <w:rPr>
+          <w:b/>
+          <w:bCs/>
+        </w:rPr>
+        <w:t xml:space="preserve">Example 5 (Writing out the limits of a sum and the range of an index)</w:t>
+      </w:r>
+      <w:r>
+        <w:t xml:space="preserve"> </w:t>
+      </w:r>
+      <w:r>
+        <w:t xml:space="preserve">For a discrete random variable</w:t>
+      </w:r>
+      <w:r>
+        <w:t xml:space="preserve"> </w:t>
+      </w:r>
+      <m:oMath>
+        <m:r>
+          <m:t>X</m:t>
+        </m:r>
+      </m:oMath>
+      <w:r>
+        <w:t xml:space="preserve">:</w:t>
+      </w:r>
+    </w:p>
+    <w:p>
+      <w:pPr>
+        <w:pStyle w:val="BlockText"/>
+      </w:pPr>
+      <w:r>
+        <w:t xml:space="preserve">❌</w:t>
+      </w:r>
+      <w:r>
+        <w:t xml:space="preserve"> </w:t>
+      </w:r>
+      <m:oMath>
+        <m:r>
+          <m:rPr>
+            <m:nor/>
+            <m:sty m:val="p"/>
+          </m:rPr>
+          <m:t>E</m:t>
+        </m:r>
+        <m:r>
+          <m:rPr>
+            <m:sty m:val="p"/>
+          </m:rPr>
+          <m:t>[</m:t>
+        </m:r>
+        <m:r>
+          <m:t>X</m:t>
+        </m:r>
+        <m:r>
+          <m:rPr>
+            <m:sty m:val="p"/>
+          </m:rPr>
+          <m:t>]</m:t>
+        </m:r>
+        <m:r>
+          <m:rPr>
+            <m:sty m:val="p"/>
+          </m:rPr>
+          <m:t>=</m:t>
+        </m:r>
+        <m:nary>
+          <m:naryPr>
+            <m:chr m:val="∑"/>
+            <m:limLoc m:val="undOvr"/>
+            <m:subHide m:val="off"/>
+            <m:supHide m:val="on"/>
+          </m:naryPr>
+          <m:sub>
+            <m:r>
+              <m:t>x</m:t>
+            </m:r>
+          </m:sub>
+          <m:sup>
+            <m:r>
+              <m:t>​</m:t>
+            </m:r>
+          </m:sup>
+          <m:e>
+            <m:r>
+              <m:t>x</m:t>
+            </m:r>
+          </m:e>
+        </m:nary>
+        <m:r>
+          <m:rPr>
+            <m:sty m:val="p"/>
+          </m:rPr>
+          <m:t>Pr</m:t>
+        </m:r>
+        <m:r>
+          <m:rPr>
+            <m:sty m:val="p"/>
+          </m:rPr>
+          <m:t>(</m:t>
+        </m:r>
+        <m:r>
+          <m:t>X</m:t>
+        </m:r>
+        <m:r>
+          <m:rPr>
+            <m:sty m:val="p"/>
+          </m:rPr>
+          <m:t>=</m:t>
+        </m:r>
+        <m:r>
+          <m:t>x</m:t>
+        </m:r>
+        <m:r>
+          <m:rPr>
+            <m:sty m:val="p"/>
+          </m:rPr>
+          <m:t>)</m:t>
+        </m:r>
+      </m:oMath>
+    </w:p>
+    <w:p>
+      <w:pPr>
+        <w:pStyle w:val="BlockText"/>
+      </w:pPr>
+      <w:r>
+        <w:t xml:space="preserve">✅</w:t>
+      </w:r>
+      <w:r>
+        <w:t xml:space="preserve"> </w:t>
+      </w:r>
+      <m:oMath>
+        <m:r>
+          <m:rPr>
+            <m:nor/>
+            <m:sty m:val="p"/>
+          </m:rPr>
+          <m:t>E</m:t>
+        </m:r>
+        <m:r>
+          <m:rPr>
+            <m:sty m:val="p"/>
+          </m:rPr>
+          <m:t>[</m:t>
+        </m:r>
+        <m:r>
+          <m:t>X</m:t>
+        </m:r>
+        <m:r>
+          <m:rPr>
+            <m:sty m:val="p"/>
+          </m:rPr>
+          <m:t>]</m:t>
+        </m:r>
+        <m:r>
+          <m:rPr>
+            <m:sty m:val="p"/>
+          </m:rPr>
+          <m:t>=</m:t>
+        </m:r>
+        <m:nary>
+          <m:naryPr>
+            <m:chr m:val="∑"/>
+            <m:limLoc m:val="undOvr"/>
+            <m:subHide m:val="off"/>
+            <m:supHide m:val="on"/>
+          </m:naryPr>
+          <m:sub>
+            <m:r>
+              <m:t>x</m:t>
+            </m:r>
+            <m:r>
+              <m:rPr>
+                <m:sty m:val="p"/>
+              </m:rPr>
+              <m:t>∈</m:t>
+            </m:r>
+            <m:r>
+              <m:rPr>
+                <m:scr m:val="script"/>
+                <m:sty m:val="p"/>
+              </m:rPr>
+              <m:t>R</m:t>
+            </m:r>
+            <m:r>
+              <m:rPr>
+                <m:sty m:val="p"/>
+              </m:rPr>
+              <m:t>(</m:t>
+            </m:r>
+            <m:r>
+              <m:t>X</m:t>
+            </m:r>
+            <m:r>
+              <m:rPr>
+                <m:sty m:val="p"/>
+              </m:rPr>
+              <m:t>)</m:t>
+            </m:r>
+          </m:sub>
+          <m:sup>
+            <m:r>
+              <m:t>​</m:t>
+            </m:r>
+          </m:sup>
+          <m:e>
+            <m:r>
+              <m:t>x</m:t>
+            </m:r>
+          </m:e>
+        </m:nary>
+        <m:r>
+          <m:rPr>
+            <m:sty m:val="p"/>
+          </m:rPr>
+          <m:t>Pr</m:t>
+        </m:r>
+        <m:r>
+          <m:rPr>
+            <m:sty m:val="p"/>
+          </m:rPr>
+          <m:t>(</m:t>
+        </m:r>
+        <m:r>
+          <m:t>X</m:t>
+        </m:r>
+        <m:r>
+          <m:rPr>
+            <m:sty m:val="p"/>
+          </m:rPr>
+          <m:t>=</m:t>
+        </m:r>
+        <m:r>
+          <m:t>x</m:t>
+        </m:r>
+        <m:r>
+          <m:rPr>
+            <m:sty m:val="p"/>
+          </m:rPr>
+          <m:t>)</m:t>
+        </m:r>
+      </m:oMath>
+    </w:p>
+    <w:p>
+      <w:pPr>
+        <w:pStyle w:val="FirstParagraph"/>
+      </w:pPr>
+      <w:r>
+        <w:t xml:space="preserve">For the likelihood of</w:t>
+      </w:r>
+      <w:r>
+        <w:t xml:space="preserve"> </w:t>
+      </w:r>
+      <m:oMath>
+        <m:r>
+          <m:t>n</m:t>
+        </m:r>
+      </m:oMath>
+      <w:r>
+        <w:t xml:space="preserve"> </w:t>
+      </w:r>
+      <w:r>
+        <w:t xml:space="preserve">independent observations</w:t>
+      </w:r>
+      <w:r>
+        <w:t xml:space="preserve"> </w:t>
+      </w:r>
+      <m:oMath>
+        <m:sSub>
+          <m:e>
+            <m:r>
+              <m:t>x</m:t>
+            </m:r>
+          </m:e>
+          <m:sub>
+            <m:r>
+              <m:t>1</m:t>
+            </m:r>
+          </m:sub>
+        </m:sSub>
+        <m:r>
+          <m:rPr>
+            <m:sty m:val="p"/>
+          </m:rPr>
+          <m:t>,</m:t>
+        </m:r>
+        <m:r>
+          <m:rPr>
+            <m:sty m:val="p"/>
+          </m:rPr>
+          <m:t>…</m:t>
+        </m:r>
+        <m:r>
+          <m:rPr>
+            <m:sty m:val="p"/>
+          </m:rPr>
+          <m:t>,</m:t>
+        </m:r>
+        <m:sSub>
+          <m:e>
+            <m:r>
+              <m:t>x</m:t>
+            </m:r>
+          </m:e>
+          <m:sub>
+            <m:r>
+              <m:t>n</m:t>
+            </m:r>
+          </m:sub>
+        </m:sSub>
+      </m:oMath>
+      <w:r>
+        <w:t xml:space="preserve">:</w:t>
+      </w:r>
+    </w:p>
+    <w:p>
+      <w:pPr>
+        <w:pStyle w:val="BlockText"/>
+      </w:pPr>
+      <w:r>
+        <w:t xml:space="preserve">❌</w:t>
+      </w:r>
+      <w:r>
+        <w:t xml:space="preserve"> </w:t>
+      </w:r>
+      <m:oMath>
+        <m:r>
+          <m:t>L</m:t>
+        </m:r>
+        <m:r>
+          <m:rPr>
+            <m:sty m:val="p"/>
+          </m:rPr>
+          <m:t>(</m:t>
+        </m:r>
+        <m:r>
+          <m:t>θ</m:t>
+        </m:r>
+        <m:r>
+          <m:rPr>
+            <m:sty m:val="p"/>
+          </m:rPr>
+          <m:t>)</m:t>
+        </m:r>
+        <m:r>
+          <m:rPr>
+            <m:sty m:val="p"/>
+          </m:rPr>
+          <m:t>=</m:t>
+        </m:r>
+        <m:nary>
+          <m:naryPr>
+            <m:chr m:val="∏"/>
+            <m:limLoc m:val="undOvr"/>
+            <m:subHide m:val="off"/>
+            <m:supHide m:val="on"/>
+          </m:naryPr>
+          <m:sub>
+            <m:r>
+              <m:t>i</m:t>
+            </m:r>
+          </m:sub>
+          <m:sup>
+            <m:r>
+              <m:t>​</m:t>
+            </m:r>
+          </m:sup>
+          <m:e>
+            <m:r>
+              <m:t>f</m:t>
+            </m:r>
+          </m:e>
+        </m:nary>
+        <m:r>
+          <m:rPr>
+            <m:sty m:val="p"/>
+          </m:rPr>
+          <m:t>(</m:t>
+        </m:r>
+        <m:sSub>
+          <m:e>
+            <m:r>
+              <m:t>x</m:t>
+            </m:r>
+          </m:e>
+          <m:sub>
+            <m:r>
+              <m:t>i</m:t>
+            </m:r>
+          </m:sub>
+        </m:sSub>
+        <m:r>
+          <m:rPr>
+            <m:sty m:val="p"/>
+          </m:rPr>
+          <m:t>;</m:t>
+        </m:r>
+        <m:r>
+          <m:t>θ</m:t>
+        </m:r>
+        <m:r>
+          <m:rPr>
+            <m:sty m:val="p"/>
+          </m:rPr>
+          <m:t>)</m:t>
+        </m:r>
+      </m:oMath>
+    </w:p>
+    <w:p>
+      <w:pPr>
+        <w:pStyle w:val="BlockText"/>
+      </w:pPr>
+      <w:r>
+        <w:t xml:space="preserve">✅</w:t>
+      </w:r>
+      <w:r>
+        <w:t xml:space="preserve"> </w:t>
+      </w:r>
+      <m:oMath>
+        <m:r>
+          <m:t>L</m:t>
+        </m:r>
+        <m:r>
+          <m:rPr>
+            <m:sty m:val="p"/>
+          </m:rPr>
+          <m:t>(</m:t>
+        </m:r>
+        <m:r>
+          <m:t>θ</m:t>
+        </m:r>
+        <m:r>
+          <m:rPr>
+            <m:sty m:val="p"/>
+          </m:rPr>
+          <m:t>)</m:t>
+        </m:r>
+        <m:r>
+          <m:rPr>
+            <m:sty m:val="p"/>
+          </m:rPr>
+          <m:t>=</m:t>
+        </m:r>
+        <m:nary>
+          <m:naryPr>
+            <m:chr m:val="∏"/>
+            <m:limLoc m:val="undOvr"/>
+            <m:subHide m:val="off"/>
+            <m:supHide m:val="off"/>
+          </m:naryPr>
+          <m:sub>
+            <m:r>
+              <m:t>i</m:t>
+            </m:r>
+            <m:r>
+              <m:rPr>
+                <m:sty m:val="p"/>
+              </m:rPr>
+              <m:t>=</m:t>
+            </m:r>
+            <m:r>
+              <m:t>1</m:t>
+            </m:r>
+          </m:sub>
+          <m:sup>
+            <m:r>
+              <m:t>n</m:t>
+            </m:r>
+          </m:sup>
+          <m:e>
+            <m:r>
+              <m:t>f</m:t>
+            </m:r>
+          </m:e>
+        </m:nary>
+        <m:r>
+          <m:rPr>
+            <m:sty m:val="p"/>
+          </m:rPr>
+          <m:t>(</m:t>
+        </m:r>
+        <m:sSub>
+          <m:e>
+            <m:r>
+              <m:t>x</m:t>
+            </m:r>
+          </m:e>
+          <m:sub>
+            <m:r>
+              <m:t>i</m:t>
+            </m:r>
+          </m:sub>
+        </m:sSub>
+        <m:r>
+          <m:rPr>
+            <m:sty m:val="p"/>
+          </m:rPr>
+          <m:t>;</m:t>
+        </m:r>
+        <m:r>
+          <m:t>θ</m:t>
+        </m:r>
+        <m:r>
+          <m:rPr>
+            <m:sty m:val="p"/>
+          </m:rPr>
+          <m:t>)</m:t>
+        </m:r>
+      </m:oMath>
+    </w:p>
+    <w:p>
+      <w:pPr>
+        <w:pStyle w:val="FirstParagraph"/>
+      </w:pPr>
+      <w:r>
+        <w:t xml:space="preserve">Each full form tells the reader</w:t>
+      </w:r>
+      <w:r>
+        <w:t xml:space="preserve"> </w:t>
+      </w:r>
+      <w:r>
+        <w:t xml:space="preserve">the set the operator runs over:</w:t>
+      </w:r>
+      <w:r>
+        <w:t xml:space="preserve"> </w:t>
+      </w:r>
+      <w:r>
+        <w:t xml:space="preserve">the values</w:t>
+      </w:r>
+      <w:r>
+        <w:t xml:space="preserve"> </w:t>
+      </w:r>
+      <m:oMath>
+        <m:r>
+          <m:t>X</m:t>
+        </m:r>
+      </m:oMath>
+      <w:r>
+        <w:t xml:space="preserve"> </w:t>
+      </w:r>
+      <w:r>
+        <w:t xml:space="preserve">can take,</w:t>
+      </w:r>
+      <w:r>
+        <w:t xml:space="preserve"> </w:t>
+      </w:r>
+      <w:r>
+        <w:t xml:space="preserve">and the indices of the</w:t>
+      </w:r>
+      <w:r>
+        <w:t xml:space="preserve"> </w:t>
+      </w:r>
+      <m:oMath>
+        <m:r>
+          <m:t>n</m:t>
+        </m:r>
+      </m:oMath>
+      <w:r>
+        <w:t xml:space="preserve"> </w:t>
+      </w:r>
+      <w:r>
+        <w:t xml:space="preserve">observations.</w:t>
+      </w:r>
+    </w:p>
+    <w:bookmarkEnd w:id="24"/>
+    <w:bookmarkEnd w:id="25"/>
     <w:sectPr>
       <w:footnotePr>
         <w:numRestart w:val="eachSect"/>

</xml_diff>

<commit_message>
Deploying to gh-pages from @ Morrison-Lab/psw@228498d1ff4267decb488565cd498221956d5dfc 🚀
</commit_message>
<xml_diff>
--- a/chapters/notation.docx
+++ b/chapters/notation.docx
@@ -15,7 +15,7 @@
         <w:pStyle w:val="Date"/>
       </w:pPr>
       <w:r>
-        <w:t xml:space="preserve">Last modified: 2026-10-08 09:16:48 (UTC)</w:t>
+        <w:t xml:space="preserve">Last modified: 2026-10-08 20:29:29 (UTC)</w:t>
       </w:r>
     </w:p>
     <w:tbl>
@@ -4963,13 +4963,658 @@
       </w:r>
     </w:p>
     <w:bookmarkEnd w:id="22"/>
-    <w:bookmarkStart w:id="25" w:name="writing-out-notational-shorthands"/>
+    <w:bookmarkStart w:id="25" w:name="matching-names-and-notation"/>
     <w:p>
       <w:pPr>
         <w:pStyle w:val="Heading2"/>
       </w:pPr>
       <w:r>
-        <w:t xml:space="preserve">4 Writing out notational shorthands</w:t>
+        <w:t xml:space="preserve">4 Matching names and notation</w:t>
+      </w:r>
+    </w:p>
+    <w:p>
+      <w:pPr>
+        <w:pStyle w:val="FirstParagraph"/>
+      </w:pPr>
+      <w:r>
+        <w:t xml:space="preserve">A name and its notation must describe the same object.</w:t>
+      </w:r>
+      <w:r>
+        <w:t xml:space="preserve"> </w:t>
+      </w:r>
+      <w:r>
+        <w:t xml:space="preserve">When you name a quantity in words and also show it in symbols,</w:t>
+      </w:r>
+      <w:r>
+        <w:t xml:space="preserve"> </w:t>
+      </w:r>
+      <w:r>
+        <w:t xml:space="preserve">use the symbols that go with that name.</w:t>
+      </w:r>
+      <w:r>
+        <w:t xml:space="preserve"> </w:t>
+      </w:r>
+      <w:r>
+        <w:t xml:space="preserve">A reader who sees the name</w:t>
+      </w:r>
+      <w:r>
+        <w:t xml:space="preserve"> </w:t>
+      </w:r>
+      <w:r>
+        <w:t xml:space="preserve">“inner product”</w:t>
+      </w:r>
+      <w:r>
+        <w:t xml:space="preserve"> </w:t>
+      </w:r>
+      <w:r>
+        <w:t xml:space="preserve">expects to see the notation for an inner product.</w:t>
+      </w:r>
+      <w:r>
+        <w:t xml:space="preserve"> </w:t>
+      </w:r>
+      <w:r>
+        <w:t xml:space="preserve">If the symbols look like a different operation,</w:t>
+      </w:r>
+      <w:r>
+        <w:t xml:space="preserve"> </w:t>
+      </w:r>
+      <w:r>
+        <w:t xml:space="preserve">the reader has to work out whether the name or the symbols is wrong.</w:t>
+      </w:r>
+    </w:p>
+    <w:p>
+      <w:pPr>
+        <w:pStyle w:val="BodyText"/>
+      </w:pPr>
+      <w:r>
+        <w:t xml:space="preserve">Keep the pairing the same everywhere the quantity appears.</w:t>
+      </w:r>
+      <w:r>
+        <w:t xml:space="preserve"> </w:t>
+      </w:r>
+      <w:r>
+        <w:t xml:space="preserve">Notes, assignments, solutions and slides in one course</w:t>
+      </w:r>
+      <w:r>
+        <w:t xml:space="preserve"> </w:t>
+      </w:r>
+      <w:r>
+        <w:t xml:space="preserve">should use one name and one notation for each quantity.</w:t>
+      </w:r>
+      <w:r>
+        <w:t xml:space="preserve"> </w:t>
+      </w:r>
+      <w:r>
+        <w:t xml:space="preserve">When two fields call one idea by different names,</w:t>
+      </w:r>
+      <w:r>
+        <w:t xml:space="preserve"> </w:t>
+      </w:r>
+      <w:r>
+        <w:t xml:space="preserve">choose one name,</w:t>
+      </w:r>
+      <w:r>
+        <w:t xml:space="preserve"> </w:t>
+      </w:r>
+      <w:r>
+        <w:t xml:space="preserve">list the other names where you define the idea,</w:t>
+      </w:r>
+      <w:r>
+        <w:t xml:space="preserve"> </w:t>
+      </w:r>
+      <w:r>
+        <w:t xml:space="preserve">and use only the chosen name afterward</w:t>
+      </w:r>
+      <w:r>
+        <w:t xml:space="preserve"> </w:t>
+      </w:r>
+      <w:r>
+        <w:t xml:space="preserve">(see</w:t>
+      </w:r>
+      <w:r>
+        <w:t xml:space="preserve"> </w:t>
+      </w:r>
+      <w:hyperlink r:id="rId23">
+        <w:r>
+          <w:rPr>
+            <w:rStyle w:val="Hyperlink"/>
+          </w:rPr>
+          <w:t xml:space="preserve">Name the synonyms</w:t>
+        </w:r>
+      </w:hyperlink>
+      <w:r>
+        <w:t xml:space="preserve">).</w:t>
+      </w:r>
+    </w:p>
+    <w:bookmarkStart w:id="24" w:name="exm-name-matches-notation"/>
+    <w:p>
+      <w:pPr>
+        <w:pStyle w:val="BodyText"/>
+      </w:pPr>
+      <w:r>
+        <w:rPr>
+          <w:b/>
+          <w:bCs/>
+        </w:rPr>
+        <w:t xml:space="preserve">Example 5 (Matching a name to its notation)</w:t>
+      </w:r>
+      <w:r>
+        <w:t xml:space="preserve"> </w:t>
+      </w:r>
+      <w:r>
+        <w:t xml:space="preserve"> </w:t>
+      </w:r>
+    </w:p>
+    <w:p>
+      <w:pPr>
+        <w:pStyle w:val="BlockText"/>
+      </w:pPr>
+      <w:r>
+        <w:t xml:space="preserve">❌ Compute the inner product</w:t>
+      </w:r>
+      <w:r>
+        <w:t xml:space="preserve"> </w:t>
+      </w:r>
+      <m:oMath>
+        <m:sSup>
+          <m:e>
+            <m:acc>
+              <m:accPr>
+                <m:chr m:val="̃"/>
+              </m:accPr>
+              <m:e>
+                <m:r>
+                  <m:t>a</m:t>
+                </m:r>
+              </m:e>
+            </m:acc>
+          </m:e>
+          <m:sup>
+            <m:r>
+              <m:rPr>
+                <m:sty m:val="p"/>
+              </m:rPr>
+              <m:t>′</m:t>
+            </m:r>
+          </m:sup>
+        </m:sSup>
+        <m:acc>
+          <m:accPr>
+            <m:chr m:val="̃"/>
+          </m:accPr>
+          <m:e>
+            <m:r>
+              <m:t>b</m:t>
+            </m:r>
+          </m:e>
+        </m:acc>
+      </m:oMath>
+      <w:r>
+        <w:t xml:space="preserve">.</w:t>
+      </w:r>
+    </w:p>
+    <w:p>
+      <w:pPr>
+        <w:pStyle w:val="BlockText"/>
+      </w:pPr>
+      <w:r>
+        <w:t xml:space="preserve">✅ Compute the inner product</w:t>
+      </w:r>
+      <w:r>
+        <w:t xml:space="preserve"> </w:t>
+      </w:r>
+      <m:oMath>
+        <m:r>
+          <m:rPr>
+            <m:sty m:val="p"/>
+          </m:rPr>
+          <m:t>⟨</m:t>
+        </m:r>
+        <m:acc>
+          <m:accPr>
+            <m:chr m:val="̃"/>
+          </m:accPr>
+          <m:e>
+            <m:r>
+              <m:t>a</m:t>
+            </m:r>
+          </m:e>
+        </m:acc>
+        <m:r>
+          <m:rPr>
+            <m:sty m:val="p"/>
+          </m:rPr>
+          <m:t>,</m:t>
+        </m:r>
+        <m:acc>
+          <m:accPr>
+            <m:chr m:val="̃"/>
+          </m:accPr>
+          <m:e>
+            <m:r>
+              <m:t>b</m:t>
+            </m:r>
+          </m:e>
+        </m:acc>
+        <m:r>
+          <m:rPr>
+            <m:sty m:val="p"/>
+          </m:rPr>
+          <m:t>⟩</m:t>
+        </m:r>
+      </m:oMath>
+      <w:r>
+        <w:t xml:space="preserve">.</w:t>
+      </w:r>
+    </w:p>
+    <w:p>
+      <w:pPr>
+        <w:pStyle w:val="FirstParagraph"/>
+      </w:pPr>
+      <w:r>
+        <w:t xml:space="preserve">The ❌ version names an inner product but writes a matrix product with a transpose.</w:t>
+      </w:r>
+      <w:r>
+        <w:t xml:space="preserve"> </w:t>
+      </w:r>
+      <w:r>
+        <w:t xml:space="preserve">The two are equal for column vectors,</w:t>
+      </w:r>
+      <w:r>
+        <w:t xml:space="preserve"> </w:t>
+      </w:r>
+      <w:r>
+        <w:t xml:space="preserve">but the reader sees two names for one quantity.</w:t>
+      </w:r>
+      <w:r>
+        <w:t xml:space="preserve"> </w:t>
+      </w:r>
+      <w:r>
+        <w:t xml:space="preserve">If you want to show that they are equal,</w:t>
+      </w:r>
+      <w:r>
+        <w:t xml:space="preserve"> </w:t>
+      </w:r>
+      <w:r>
+        <w:t xml:space="preserve">say so in a sentence, as in</w:t>
+      </w:r>
+      <w:r>
+        <w:t xml:space="preserve"> </w:t>
+      </w:r>
+      <w:r>
+        <w:t xml:space="preserve">“the inner product</w:t>
+      </w:r>
+      <w:r>
+        <w:t xml:space="preserve"> </w:t>
+      </w:r>
+      <m:oMath>
+        <m:r>
+          <m:rPr>
+            <m:sty m:val="p"/>
+          </m:rPr>
+          <m:t>⟨</m:t>
+        </m:r>
+        <m:acc>
+          <m:accPr>
+            <m:chr m:val="̃"/>
+          </m:accPr>
+          <m:e>
+            <m:r>
+              <m:t>a</m:t>
+            </m:r>
+          </m:e>
+        </m:acc>
+        <m:r>
+          <m:rPr>
+            <m:sty m:val="p"/>
+          </m:rPr>
+          <m:t>,</m:t>
+        </m:r>
+        <m:acc>
+          <m:accPr>
+            <m:chr m:val="̃"/>
+          </m:accPr>
+          <m:e>
+            <m:r>
+              <m:t>b</m:t>
+            </m:r>
+          </m:e>
+        </m:acc>
+        <m:r>
+          <m:rPr>
+            <m:sty m:val="p"/>
+          </m:rPr>
+          <m:t>⟩</m:t>
+        </m:r>
+      </m:oMath>
+      <w:r>
+        <w:t xml:space="preserve"> </w:t>
+      </w:r>
+      <w:r>
+        <w:t xml:space="preserve">equals the matrix product</w:t>
+      </w:r>
+      <w:r>
+        <w:t xml:space="preserve"> </w:t>
+      </w:r>
+      <m:oMath>
+        <m:sSup>
+          <m:e>
+            <m:acc>
+              <m:accPr>
+                <m:chr m:val="̃"/>
+              </m:accPr>
+              <m:e>
+                <m:r>
+                  <m:t>a</m:t>
+                </m:r>
+              </m:e>
+            </m:acc>
+          </m:e>
+          <m:sup>
+            <m:r>
+              <m:rPr>
+                <m:sty m:val="p"/>
+              </m:rPr>
+              <m:t>′</m:t>
+            </m:r>
+          </m:sup>
+        </m:sSup>
+        <m:acc>
+          <m:accPr>
+            <m:chr m:val="̃"/>
+          </m:accPr>
+          <m:e>
+            <m:r>
+              <m:t>b</m:t>
+            </m:r>
+          </m:e>
+        </m:acc>
+      </m:oMath>
+      <w:r>
+        <w:t xml:space="preserve">”</w:t>
+      </w:r>
+      <w:r>
+        <w:t xml:space="preserve">.</w:t>
+      </w:r>
+    </w:p>
+    <w:p>
+      <w:pPr>
+        <w:pStyle w:val="BodyText"/>
+      </w:pPr>
+      <w:r>
+        <w:t xml:space="preserve">In a course that writes regression in statistical notation:</w:t>
+      </w:r>
+    </w:p>
+    <w:p>
+      <w:pPr>
+        <w:pStyle w:val="BlockText"/>
+      </w:pPr>
+      <w:r>
+        <w:t xml:space="preserve">❌ Consider the model</w:t>
+      </w:r>
+      <w:r>
+        <w:t xml:space="preserve"> </w:t>
+      </w:r>
+      <m:oMath>
+        <m:r>
+          <m:t>h</m:t>
+        </m:r>
+        <m:r>
+          <m:rPr>
+            <m:sty m:val="p"/>
+          </m:rPr>
+          <m:t>(</m:t>
+        </m:r>
+        <m:r>
+          <m:t>x</m:t>
+        </m:r>
+        <m:r>
+          <m:rPr>
+            <m:sty m:val="p"/>
+          </m:rPr>
+          <m:t>)</m:t>
+        </m:r>
+        <m:r>
+          <m:rPr>
+            <m:sty m:val="p"/>
+          </m:rPr>
+          <m:t>=</m:t>
+        </m:r>
+        <m:r>
+          <m:t>w</m:t>
+        </m:r>
+        <m:r>
+          <m:t>x</m:t>
+        </m:r>
+        <m:r>
+          <m:rPr>
+            <m:sty m:val="p"/>
+          </m:rPr>
+          <m:t>+</m:t>
+        </m:r>
+        <m:r>
+          <m:t>b</m:t>
+        </m:r>
+      </m:oMath>
+      <w:r>
+        <w:t xml:space="preserve">.</w:t>
+      </w:r>
+    </w:p>
+    <w:p>
+      <w:pPr>
+        <w:pStyle w:val="BlockText"/>
+      </w:pPr>
+      <w:r>
+        <w:t xml:space="preserve">✅ Consider the mean function</w:t>
+      </w:r>
+      <w:r>
+        <w:t xml:space="preserve"> </w:t>
+      </w:r>
+      <m:oMath>
+        <m:r>
+          <m:t>μ</m:t>
+        </m:r>
+        <m:r>
+          <m:rPr>
+            <m:sty m:val="p"/>
+          </m:rPr>
+          <m:t>(</m:t>
+        </m:r>
+        <m:r>
+          <m:t>x</m:t>
+        </m:r>
+        <m:r>
+          <m:rPr>
+            <m:sty m:val="p"/>
+          </m:rPr>
+          <m:t>)</m:t>
+        </m:r>
+        <m:r>
+          <m:rPr>
+            <m:sty m:val="p"/>
+          </m:rPr>
+          <m:t>=</m:t>
+        </m:r>
+        <m:sSub>
+          <m:e>
+            <m:r>
+              <m:t>β</m:t>
+            </m:r>
+          </m:e>
+          <m:sub>
+            <m:r>
+              <m:t>0</m:t>
+            </m:r>
+          </m:sub>
+        </m:sSub>
+        <m:r>
+          <m:rPr>
+            <m:sty m:val="p"/>
+          </m:rPr>
+          <m:t>+</m:t>
+        </m:r>
+        <m:sSub>
+          <m:e>
+            <m:r>
+              <m:t>β</m:t>
+            </m:r>
+          </m:e>
+          <m:sub>
+            <m:r>
+              <m:t>x</m:t>
+            </m:r>
+          </m:sub>
+        </m:sSub>
+        <m:r>
+          <m:t>x</m:t>
+        </m:r>
+      </m:oMath>
+      <w:r>
+        <w:t xml:space="preserve">.</w:t>
+      </w:r>
+    </w:p>
+    <w:p>
+      <w:pPr>
+        <w:pStyle w:val="FirstParagraph"/>
+      </w:pPr>
+      <w:r>
+        <w:t xml:space="preserve">The ❌ version names the same quantity as the rest of the course</w:t>
+      </w:r>
+      <w:r>
+        <w:t xml:space="preserve"> </w:t>
+      </w:r>
+      <w:r>
+        <w:t xml:space="preserve">with a different word and different symbols.</w:t>
+      </w:r>
+      <w:r>
+        <w:t xml:space="preserve"> </w:t>
+      </w:r>
+      <w:r>
+        <w:t xml:space="preserve">A student then has to learn that</w:t>
+      </w:r>
+      <w:r>
+        <w:t xml:space="preserve"> </w:t>
+      </w:r>
+      <m:oMath>
+        <m:r>
+          <m:t>h</m:t>
+        </m:r>
+      </m:oMath>
+      <w:r>
+        <w:t xml:space="preserve">,</w:t>
+      </w:r>
+      <w:r>
+        <w:t xml:space="preserve"> </w:t>
+      </w:r>
+      <m:oMath>
+        <m:r>
+          <m:t>w</m:t>
+        </m:r>
+      </m:oMath>
+      <w:r>
+        <w:t xml:space="preserve"> </w:t>
+      </w:r>
+      <w:r>
+        <w:t xml:space="preserve">and</w:t>
+      </w:r>
+      <w:r>
+        <w:t xml:space="preserve"> </w:t>
+      </w:r>
+      <m:oMath>
+        <m:r>
+          <m:t>b</m:t>
+        </m:r>
+      </m:oMath>
+      <w:r>
+        <w:t xml:space="preserve"> </w:t>
+      </w:r>
+      <w:r>
+        <w:t xml:space="preserve">are</w:t>
+      </w:r>
+      <w:r>
+        <w:t xml:space="preserve"> </w:t>
+      </w:r>
+      <m:oMath>
+        <m:r>
+          <m:t>μ</m:t>
+        </m:r>
+      </m:oMath>
+      <w:r>
+        <w:t xml:space="preserve">,</w:t>
+      </w:r>
+      <w:r>
+        <w:t xml:space="preserve"> </w:t>
+      </w:r>
+      <m:oMath>
+        <m:sSub>
+          <m:e>
+            <m:r>
+              <m:t>β</m:t>
+            </m:r>
+          </m:e>
+          <m:sub>
+            <m:r>
+              <m:t>x</m:t>
+            </m:r>
+          </m:sub>
+        </m:sSub>
+      </m:oMath>
+      <w:r>
+        <w:t xml:space="preserve"> </w:t>
+      </w:r>
+      <w:r>
+        <w:t xml:space="preserve">and</w:t>
+      </w:r>
+      <w:r>
+        <w:t xml:space="preserve"> </w:t>
+      </w:r>
+      <m:oMath>
+        <m:sSub>
+          <m:e>
+            <m:r>
+              <m:t>β</m:t>
+            </m:r>
+          </m:e>
+          <m:sub>
+            <m:r>
+              <m:t>0</m:t>
+            </m:r>
+          </m:sub>
+        </m:sSub>
+      </m:oMath>
+      <w:r>
+        <w:t xml:space="preserve">.</w:t>
+      </w:r>
+    </w:p>
+    <w:bookmarkEnd w:id="24"/>
+    <w:p>
+      <w:pPr>
+        <w:pStyle w:val="BodyText"/>
+      </w:pPr>
+      <w:r>
+        <w:t xml:space="preserve">Before you release a document that reuses a quantity from another one,</w:t>
+      </w:r>
+      <w:r>
+        <w:t xml:space="preserve"> </w:t>
+      </w:r>
+      <w:r>
+        <w:t xml:space="preserve">search both for its name and its symbols,</w:t>
+      </w:r>
+      <w:r>
+        <w:t xml:space="preserve"> </w:t>
+      </w:r>
+      <w:r>
+        <w:t xml:space="preserve">and make them agree.</w:t>
+      </w:r>
+    </w:p>
+    <w:bookmarkEnd w:id="25"/>
+    <w:bookmarkStart w:id="28" w:name="writing-out-notational-shorthands"/>
+    <w:p>
+      <w:pPr>
+        <w:pStyle w:val="Heading2"/>
+      </w:pPr>
+      <w:r>
+        <w:t xml:space="preserve">5 Writing out notational shorthands</w:t>
       </w:r>
     </w:p>
     <w:p>
@@ -5402,7 +6047,7 @@
       <w:r>
         <w:t xml:space="preserve"> </w:t>
       </w:r>
-      <w:hyperlink r:id="rId23">
+      <w:hyperlink r:id="rId26">
         <w:r>
           <w:rPr>
             <w:rStyle w:val="Hyperlink"/>
@@ -5443,7 +6088,7 @@
         <w:t xml:space="preserve">catalogs common shorthands and their full forms.</w:t>
       </w:r>
     </w:p>
-    <w:bookmarkStart w:id="24" w:name="exm-notational-shorthand"/>
+    <w:bookmarkStart w:id="27" w:name="exm-notational-shorthand"/>
     <w:p>
       <w:pPr>
         <w:pStyle w:val="BodyText"/>
@@ -5453,7 +6098,7 @@
           <w:b/>
           <w:bCs/>
         </w:rPr>
-        <w:t xml:space="preserve">Example 5 (Writing out the limits of a sum and the range of an index)</w:t>
+        <w:t xml:space="preserve">Example 6 (Writing out the limits of a sum and the range of an index)</w:t>
       </w:r>
       <w:r>
         <w:t xml:space="preserve"> </w:t>
@@ -6010,8 +6655,8 @@
         <w:t xml:space="preserve">observations.</w:t>
       </w:r>
     </w:p>
-    <w:bookmarkEnd w:id="24"/>
-    <w:bookmarkEnd w:id="25"/>
+    <w:bookmarkEnd w:id="27"/>
+    <w:bookmarkEnd w:id="28"/>
     <w:sectPr>
       <w:footnotePr>
         <w:numRestart w:val="eachSect"/>

</xml_diff>

<commit_message>
Deploying to gh-pages from @ Morrison-Lab/psw@69e0c95e6d17f3889a7852e8c7e976196966f55b 🚀
</commit_message>
<xml_diff>
--- a/chapters/notation.docx
+++ b/chapters/notation.docx
@@ -15,7 +15,7 @@
         <w:pStyle w:val="Date"/>
       </w:pPr>
       <w:r>
-        <w:t xml:space="preserve">Last modified: 2026-10-08 20:29:29 (UTC)</w:t>
+        <w:t xml:space="preserve">Last modified: 2026-10-08 20:44:46 (UTC)</w:t>
       </w:r>
     </w:p>
     <w:tbl>
@@ -5608,13 +5608,261 @@
       </w:r>
     </w:p>
     <w:bookmarkEnd w:id="25"/>
-    <w:bookmarkStart w:id="28" w:name="writing-out-notational-shorthands"/>
+    <w:bookmarkStart w:id="27" w:name="using-shared-macros"/>
     <w:p>
       <w:pPr>
         <w:pStyle w:val="Heading2"/>
       </w:pPr>
       <w:r>
-        <w:t xml:space="preserve">5 Writing out notational shorthands</w:t>
+        <w:t xml:space="preserve">5 Using shared macros</w:t>
+      </w:r>
+    </w:p>
+    <w:p>
+      <w:pPr>
+        <w:pStyle w:val="FirstParagraph"/>
+      </w:pPr>
+      <w:r>
+        <w:t xml:space="preserve">Write each symbol through a shared macro file,</w:t>
+      </w:r>
+      <w:r>
+        <w:t xml:space="preserve"> </w:t>
+      </w:r>
+      <w:r>
+        <w:t xml:space="preserve">and write the macro everywhere the symbol appears.</w:t>
+      </w:r>
+      <w:r>
+        <w:t xml:space="preserve"> </w:t>
+      </w:r>
+      <w:r>
+        <w:t xml:space="preserve">A group that writes the same quantity in raw LaTeX in one document</w:t>
+      </w:r>
+      <w:r>
+        <w:t xml:space="preserve"> </w:t>
+      </w:r>
+      <w:r>
+        <w:t xml:space="preserve">and with a macro in another ends up with two notations for one quantity.</w:t>
+      </w:r>
+      <w:r>
+        <w:t xml:space="preserve"> </w:t>
+      </w:r>
+      <w:r>
+        <w:t xml:space="preserve">Changing a convention then means editing every document by hand.</w:t>
+      </w:r>
+    </w:p>
+    <w:p>
+      <w:pPr>
+        <w:pStyle w:val="BodyText"/>
+      </w:pPr>
+      <w:r>
+        <w:t xml:space="preserve">Before you write any symbol,</w:t>
+      </w:r>
+      <w:r>
+        <w:t xml:space="preserve"> </w:t>
+      </w:r>
+      <w:r>
+        <w:t xml:space="preserve">search the group’s shared macro file for the concept it names.</w:t>
+      </w:r>
+      <w:r>
+        <w:t xml:space="preserve"> </w:t>
+      </w:r>
+      <w:r>
+        <w:t xml:space="preserve">If a macro names the concept, use it.</w:t>
+      </w:r>
+      <w:r>
+        <w:t xml:space="preserve"> </w:t>
+      </w:r>
+      <w:r>
+        <w:t xml:space="preserve">If none does, add one to the shared file before you use the symbol,</w:t>
+      </w:r>
+      <w:r>
+        <w:t xml:space="preserve"> </w:t>
+      </w:r>
+      <w:r>
+        <w:t xml:space="preserve">so the next document finds it.</w:t>
+      </w:r>
+    </w:p>
+    <w:bookmarkStart w:id="26" w:name="exm-use-shared-macro"/>
+    <w:p>
+      <w:pPr>
+        <w:pStyle w:val="BodyText"/>
+      </w:pPr>
+      <w:r>
+        <w:rPr>
+          <w:b/>
+          <w:bCs/>
+        </w:rPr>
+        <w:t xml:space="preserve">Example 6 (Using a shared macro)</w:t>
+      </w:r>
+      <w:r>
+        <w:t xml:space="preserve"> </w:t>
+      </w:r>
+      <w:r>
+        <w:t xml:space="preserve">This example compares the source you type,</w:t>
+      </w:r>
+      <w:r>
+        <w:t xml:space="preserve"> </w:t>
+      </w:r>
+      <w:r>
+        <w:t xml:space="preserve">so both versions appear as code.</w:t>
+      </w:r>
+    </w:p>
+    <w:p>
+      <w:pPr>
+        <w:pStyle w:val="BlockText"/>
+      </w:pPr>
+      <w:r>
+        <w:t xml:space="preserve">❌ Source:</w:t>
+      </w:r>
+      <w:r>
+        <w:t xml:space="preserve"> </w:t>
+      </w:r>
+      <w:r>
+        <w:rPr>
+          <w:rStyle w:val="VerbatimChar"/>
+        </w:rPr>
+        <w:t xml:space="preserve">Let $\beta_1$ be the slope and write the sum as $\sum_{i=1}^n$.</w:t>
+      </w:r>
+    </w:p>
+    <w:p>
+      <w:pPr>
+        <w:pStyle w:val="BlockText"/>
+      </w:pPr>
+      <w:r>
+        <w:t xml:space="preserve">✅ Source:</w:t>
+      </w:r>
+      <w:r>
+        <w:t xml:space="preserve"> </w:t>
+      </w:r>
+      <w:r>
+        <w:rPr>
+          <w:rStyle w:val="VerbatimChar"/>
+        </w:rPr>
+        <w:t xml:space="preserve">Let $\coef{1}$ be the slope and write the sum as $\sumin$.</w:t>
+      </w:r>
+    </w:p>
+    <w:p>
+      <w:pPr>
+        <w:pStyle w:val="FirstParagraph"/>
+      </w:pPr>
+      <w:r>
+        <w:t xml:space="preserve">The ❌ version writes the slope and the sum in raw LaTeX.</w:t>
+      </w:r>
+      <w:r>
+        <w:t xml:space="preserve"> </w:t>
+      </w:r>
+      <w:r>
+        <w:t xml:space="preserve">The ✅ version names each concept once, in the shared file.</w:t>
+      </w:r>
+      <w:r>
+        <w:t xml:space="preserve"> </w:t>
+      </w:r>
+      <w:r>
+        <w:t xml:space="preserve">When the group changes how it prints a coefficient or a sum,</w:t>
+      </w:r>
+      <w:r>
+        <w:t xml:space="preserve"> </w:t>
+      </w:r>
+      <w:r>
+        <w:t xml:space="preserve">every document that uses the macro changes with it.</w:t>
+      </w:r>
+    </w:p>
+    <w:bookmarkEnd w:id="26"/>
+    <w:p>
+      <w:pPr>
+        <w:pStyle w:val="BodyText"/>
+      </w:pPr>
+      <w:r>
+        <w:t xml:space="preserve">The same rule covers these quantities:</w:t>
+      </w:r>
+    </w:p>
+    <w:p>
+      <w:pPr>
+        <w:pStyle w:val="Compact"/>
+        <w:numPr>
+          <w:ilvl w:val="0"/>
+          <w:numId w:val="1004"/>
+        </w:numPr>
+      </w:pPr>
+      <w:r>
+        <w:t xml:space="preserve">transposes</w:t>
+      </w:r>
+    </w:p>
+    <w:p>
+      <w:pPr>
+        <w:pStyle w:val="Compact"/>
+        <w:numPr>
+          <w:ilvl w:val="0"/>
+          <w:numId w:val="1004"/>
+        </w:numPr>
+      </w:pPr>
+      <w:r>
+        <w:t xml:space="preserve">hats on estimates</w:t>
+      </w:r>
+    </w:p>
+    <w:p>
+      <w:pPr>
+        <w:pStyle w:val="Compact"/>
+        <w:numPr>
+          <w:ilvl w:val="0"/>
+          <w:numId w:val="1004"/>
+        </w:numPr>
+      </w:pPr>
+      <w:r>
+        <w:t xml:space="preserve">expectations</w:t>
+      </w:r>
+    </w:p>
+    <w:p>
+      <w:pPr>
+        <w:pStyle w:val="Compact"/>
+        <w:numPr>
+          <w:ilvl w:val="0"/>
+          <w:numId w:val="1004"/>
+        </w:numPr>
+      </w:pPr>
+      <w:r>
+        <w:t xml:space="preserve">variances</w:t>
+      </w:r>
+    </w:p>
+    <w:p>
+      <w:pPr>
+        <w:pStyle w:val="Compact"/>
+        <w:numPr>
+          <w:ilvl w:val="0"/>
+          <w:numId w:val="1004"/>
+        </w:numPr>
+      </w:pPr>
+      <w:r>
+        <w:t xml:space="preserve">probabilities</w:t>
+      </w:r>
+    </w:p>
+    <w:p>
+      <w:pPr>
+        <w:pStyle w:val="Compact"/>
+        <w:numPr>
+          <w:ilvl w:val="0"/>
+          <w:numId w:val="1004"/>
+        </w:numPr>
+      </w:pPr>
+      <w:r>
+        <w:t xml:space="preserve">vectors</w:t>
+      </w:r>
+    </w:p>
+    <w:p>
+      <w:pPr>
+        <w:pStyle w:val="FirstParagraph"/>
+      </w:pPr>
+      <w:r>
+        <w:t xml:space="preserve">A quantity that has a macro keeps the same symbol in every document.</w:t>
+      </w:r>
+    </w:p>
+    <w:bookmarkEnd w:id="27"/>
+    <w:bookmarkStart w:id="30" w:name="writing-out-notational-shorthands"/>
+    <w:p>
+      <w:pPr>
+        <w:pStyle w:val="Heading2"/>
+      </w:pPr>
+      <w:r>
+        <w:t xml:space="preserve">6 Writing out notational shorthands</w:t>
       </w:r>
     </w:p>
     <w:p>
@@ -6047,7 +6295,7 @@
       <w:r>
         <w:t xml:space="preserve"> </w:t>
       </w:r>
-      <w:hyperlink r:id="rId26">
+      <w:hyperlink r:id="rId28">
         <w:r>
           <w:rPr>
             <w:rStyle w:val="Hyperlink"/>
@@ -6088,7 +6336,7 @@
         <w:t xml:space="preserve">catalogs common shorthands and their full forms.</w:t>
       </w:r>
     </w:p>
-    <w:bookmarkStart w:id="27" w:name="exm-notational-shorthand"/>
+    <w:bookmarkStart w:id="29" w:name="exm-notational-shorthand"/>
     <w:p>
       <w:pPr>
         <w:pStyle w:val="BodyText"/>
@@ -6098,7 +6346,7 @@
           <w:b/>
           <w:bCs/>
         </w:rPr>
-        <w:t xml:space="preserve">Example 6 (Writing out the limits of a sum and the range of an index)</w:t>
+        <w:t xml:space="preserve">Example 7 (Writing out the limits of a sum and the range of an index)</w:t>
       </w:r>
       <w:r>
         <w:t xml:space="preserve"> </w:t>
@@ -6655,8 +6903,8 @@
         <w:t xml:space="preserve">observations.</w:t>
       </w:r>
     </w:p>
-    <w:bookmarkEnd w:id="27"/>
-    <w:bookmarkEnd w:id="28"/>
+    <w:bookmarkEnd w:id="29"/>
+    <w:bookmarkEnd w:id="30"/>
     <w:sectPr>
       <w:footnotePr>
         <w:numRestart w:val="eachSect"/>
@@ -6880,6 +7128,9 @@
     <w:abstractNumId w:val="991"/>
   </w:num>
   <w:num w:numId="1003">
+    <w:abstractNumId w:val="991"/>
+  </w:num>
+  <w:num w:numId="1004">
     <w:abstractNumId w:val="991"/>
   </w:num>
 </w:numbering>

</xml_diff>

<commit_message>
Deploying to gh-pages from @ Morrison-Lab/psw@7def6c5b466d0a81cc8f8ed9d88128ce5533c0eb 🚀
</commit_message>
<xml_diff>
--- a/chapters/notation.docx
+++ b/chapters/notation.docx
@@ -15,7 +15,7 @@
         <w:pStyle w:val="Date"/>
       </w:pPr>
       <w:r>
-        <w:t xml:space="preserve">Last modified: 2026-10-08 20:44:46 (UTC)</w:t>
+        <w:t xml:space="preserve">Last modified: 2026-10-08 22:39:27 (UTC)</w:t>
       </w:r>
     </w:p>
     <w:tbl>
@@ -5001,13 +5001,13 @@
         <w:t xml:space="preserve"> </w:t>
       </w:r>
       <w:r>
-        <w:t xml:space="preserve">“inner product”</w:t>
-      </w:r>
-      <w:r>
-        <w:t xml:space="preserve"> </w:t>
-      </w:r>
-      <w:r>
-        <w:t xml:space="preserve">expects to see the notation for an inner product.</w:t>
+        <w:t xml:space="preserve">“dot product”</w:t>
+      </w:r>
+      <w:r>
+        <w:t xml:space="preserve"> </w:t>
+      </w:r>
+      <w:r>
+        <w:t xml:space="preserve">expects to see the notation for a dot product.</w:t>
       </w:r>
       <w:r>
         <w:t xml:space="preserve"> </w:t>
@@ -5110,7 +5110,7 @@
         <w:pStyle w:val="BlockText"/>
       </w:pPr>
       <w:r>
-        <w:t xml:space="preserve">❌ Compute the inner product</w:t>
+        <w:t xml:space="preserve">❌ Compute the dot product</w:t>
       </w:r>
       <w:r>
         <w:t xml:space="preserve"> </w:t>
@@ -5158,18 +5158,12 @@
         <w:pStyle w:val="BlockText"/>
       </w:pPr>
       <w:r>
-        <w:t xml:space="preserve">✅ Compute the inner product</w:t>
-      </w:r>
-      <w:r>
-        <w:t xml:space="preserve"> </w:t>
-      </w:r>
-      <m:oMath>
-        <m:r>
-          <m:rPr>
-            <m:sty m:val="p"/>
-          </m:rPr>
-          <m:t>⟨</m:t>
-        </m:r>
+        <w:t xml:space="preserve">✅ Compute the dot product</w:t>
+      </w:r>
+      <w:r>
+        <w:t xml:space="preserve"> </w:t>
+      </w:r>
+      <m:oMath>
         <m:acc>
           <m:accPr>
             <m:chr m:val="̃"/>
@@ -5184,7 +5178,7 @@
           <m:rPr>
             <m:sty m:val="p"/>
           </m:rPr>
-          <m:t>,</m:t>
+          <m:t>⋅</m:t>
         </m:r>
         <m:acc>
           <m:accPr>
@@ -5196,12 +5190,6 @@
             </m:r>
           </m:e>
         </m:acc>
-        <m:r>
-          <m:rPr>
-            <m:sty m:val="p"/>
-          </m:rPr>
-          <m:t>⟩</m:t>
-        </m:r>
       </m:oMath>
       <w:r>
         <w:t xml:space="preserve">.</w:t>
@@ -5212,7 +5200,7 @@
         <w:pStyle w:val="FirstParagraph"/>
       </w:pPr>
       <w:r>
-        <w:t xml:space="preserve">The ❌ version names an inner product but writes a matrix product with a transpose.</w:t>
+        <w:t xml:space="preserve">The ❌ version names a dot product but writes a matrix product with a transpose.</w:t>
       </w:r>
       <w:r>
         <w:t xml:space="preserve"> </w:t>
@@ -5242,18 +5230,12 @@
         <w:t xml:space="preserve"> </w:t>
       </w:r>
       <w:r>
-        <w:t xml:space="preserve">“the inner product</w:t>
-      </w:r>
-      <w:r>
-        <w:t xml:space="preserve"> </w:t>
-      </w:r>
-      <m:oMath>
-        <m:r>
-          <m:rPr>
-            <m:sty m:val="p"/>
-          </m:rPr>
-          <m:t>⟨</m:t>
-        </m:r>
+        <w:t xml:space="preserve">“the dot product</w:t>
+      </w:r>
+      <w:r>
+        <w:t xml:space="preserve"> </w:t>
+      </w:r>
+      <m:oMath>
         <m:acc>
           <m:accPr>
             <m:chr m:val="̃"/>
@@ -5268,7 +5250,7 @@
           <m:rPr>
             <m:sty m:val="p"/>
           </m:rPr>
-          <m:t>,</m:t>
+          <m:t>⋅</m:t>
         </m:r>
         <m:acc>
           <m:accPr>
@@ -5280,12 +5262,6 @@
             </m:r>
           </m:e>
         </m:acc>
-        <m:r>
-          <m:rPr>
-            <m:sty m:val="p"/>
-          </m:rPr>
-          <m:t>⟩</m:t>
-        </m:r>
       </m:oMath>
       <w:r>
         <w:t xml:space="preserve"> </w:t>
@@ -5336,6 +5312,23 @@
       <w:r>
         <w:t xml:space="preserve">.</w:t>
       </w:r>
+      <w:r>
+        <w:t xml:space="preserve"> </w:t>
+      </w:r>
+      <w:hyperlink w:anchor="writing-dot-products">
+        <w:r>
+          <w:rPr>
+            <w:rStyle w:val="Hyperlink"/>
+          </w:rPr>
+          <w:t xml:space="preserve">Writing dot products</w:t>
+        </w:r>
+      </w:hyperlink>
+      <w:r>
+        <w:t xml:space="preserve"> </w:t>
+      </w:r>
+      <w:r>
+        <w:t xml:space="preserve">says when to use each form.</w:t>
+      </w:r>
     </w:p>
     <w:p>
       <w:pPr>
@@ -5856,13 +5849,575 @@
       </w:r>
     </w:p>
     <w:bookmarkEnd w:id="27"/>
-    <w:bookmarkStart w:id="30" w:name="writing-out-notational-shorthands"/>
+    <w:bookmarkStart w:id="29" w:name="writing-dot-products"/>
     <w:p>
       <w:pPr>
         <w:pStyle w:val="Heading2"/>
       </w:pPr>
       <w:r>
-        <w:t xml:space="preserve">6 Writing out notational shorthands</w:t>
+        <w:t xml:space="preserve">6 Writing dot products</w:t>
+      </w:r>
+    </w:p>
+    <w:p>
+      <w:pPr>
+        <w:pStyle w:val="FirstParagraph"/>
+      </w:pPr>
+      <w:r>
+        <w:t xml:space="preserve">When two vectors multiply to give a number,</w:t>
+      </w:r>
+      <w:r>
+        <w:t xml:space="preserve"> </w:t>
+      </w:r>
+      <w:r>
+        <w:t xml:space="preserve">write the product as a dot product,</w:t>
+      </w:r>
+      <w:r>
+        <w:t xml:space="preserve"> </w:t>
+      </w:r>
+      <m:oMath>
+        <m:acc>
+          <m:accPr>
+            <m:chr m:val="̃"/>
+          </m:accPr>
+          <m:e>
+            <m:r>
+              <m:t>x</m:t>
+            </m:r>
+          </m:e>
+        </m:acc>
+        <m:r>
+          <m:rPr>
+            <m:sty m:val="p"/>
+          </m:rPr>
+          <m:t>⋅</m:t>
+        </m:r>
+        <m:acc>
+          <m:accPr>
+            <m:chr m:val="̃"/>
+          </m:accPr>
+          <m:e>
+            <m:r>
+              <m:t>β</m:t>
+            </m:r>
+          </m:e>
+        </m:acc>
+      </m:oMath>
+      <w:r>
+        <w:t xml:space="preserve">.</w:t>
+      </w:r>
+      <w:r>
+        <w:t xml:space="preserve"> </w:t>
+      </w:r>
+      <w:r>
+        <w:t xml:space="preserve">Do not write it as a transpose product,</w:t>
+      </w:r>
+      <w:r>
+        <w:t xml:space="preserve"> </w:t>
+      </w:r>
+      <m:oMath>
+        <m:sSup>
+          <m:e>
+            <m:acc>
+              <m:accPr>
+                <m:chr m:val="̃"/>
+              </m:accPr>
+              <m:e>
+                <m:r>
+                  <m:t>x</m:t>
+                </m:r>
+              </m:e>
+            </m:acc>
+          </m:e>
+          <m:sup>
+            <m:r>
+              <m:rPr>
+                <m:sty m:val="p"/>
+              </m:rPr>
+              <m:t>′</m:t>
+            </m:r>
+          </m:sup>
+        </m:sSup>
+        <m:acc>
+          <m:accPr>
+            <m:chr m:val="̃"/>
+          </m:accPr>
+          <m:e>
+            <m:r>
+              <m:t>β</m:t>
+            </m:r>
+          </m:e>
+        </m:acc>
+      </m:oMath>
+      <w:r>
+        <w:t xml:space="preserve">,</w:t>
+      </w:r>
+      <w:r>
+        <w:t xml:space="preserve"> </w:t>
+      </w:r>
+      <w:r>
+        <w:t xml:space="preserve">or with inner-product brackets,</w:t>
+      </w:r>
+      <w:r>
+        <w:t xml:space="preserve"> </w:t>
+      </w:r>
+      <m:oMath>
+        <m:r>
+          <m:rPr>
+            <m:sty m:val="p"/>
+          </m:rPr>
+          <m:t>⟨</m:t>
+        </m:r>
+        <m:acc>
+          <m:accPr>
+            <m:chr m:val="̃"/>
+          </m:accPr>
+          <m:e>
+            <m:r>
+              <m:t>x</m:t>
+            </m:r>
+          </m:e>
+        </m:acc>
+        <m:r>
+          <m:rPr>
+            <m:sty m:val="p"/>
+          </m:rPr>
+          <m:t>,</m:t>
+        </m:r>
+        <m:acc>
+          <m:accPr>
+            <m:chr m:val="̃"/>
+          </m:accPr>
+          <m:e>
+            <m:r>
+              <m:t>β</m:t>
+            </m:r>
+          </m:e>
+        </m:acc>
+        <m:r>
+          <m:rPr>
+            <m:sty m:val="p"/>
+          </m:rPr>
+          <m:t>⟩</m:t>
+        </m:r>
+      </m:oMath>
+      <w:r>
+        <w:t xml:space="preserve">.</w:t>
+      </w:r>
+      <w:r>
+        <w:t xml:space="preserve"> </w:t>
+      </w:r>
+      <w:r>
+        <w:t xml:space="preserve">The dot shows one operation on two vectors.</w:t>
+      </w:r>
+      <w:r>
+        <w:t xml:space="preserve"> </w:t>
+      </w:r>
+      <w:r>
+        <w:t xml:space="preserve">A transpose product asks the reader to picture a row vector times a column vector</w:t>
+      </w:r>
+      <w:r>
+        <w:t xml:space="preserve"> </w:t>
+      </w:r>
+      <w:r>
+        <w:t xml:space="preserve">and to work out that the result is a single number.</w:t>
+      </w:r>
+    </w:p>
+    <w:bookmarkStart w:id="28" w:name="exm-dot-product"/>
+    <w:p>
+      <w:pPr>
+        <w:pStyle w:val="BodyText"/>
+      </w:pPr>
+      <w:r>
+        <w:rPr>
+          <w:b/>
+          <w:bCs/>
+        </w:rPr>
+        <w:t xml:space="preserve">Example 7 (Writing a dot product)</w:t>
+      </w:r>
+      <w:r>
+        <w:t xml:space="preserve"> </w:t>
+      </w:r>
+      <w:r>
+        <w:t xml:space="preserve"> </w:t>
+      </w:r>
+    </w:p>
+    <w:p>
+      <w:pPr>
+        <w:pStyle w:val="BlockText"/>
+      </w:pPr>
+      <w:r>
+        <w:t xml:space="preserve">❌ The model is</w:t>
+      </w:r>
+      <w:r>
+        <w:t xml:space="preserve"> </w:t>
+      </w:r>
+      <m:oMath>
+        <m:r>
+          <m:t>f</m:t>
+        </m:r>
+        <m:r>
+          <m:rPr>
+            <m:sty m:val="p"/>
+          </m:rPr>
+          <m:t>(</m:t>
+        </m:r>
+        <m:acc>
+          <m:accPr>
+            <m:chr m:val="̃"/>
+          </m:accPr>
+          <m:e>
+            <m:r>
+              <m:t>x</m:t>
+            </m:r>
+          </m:e>
+        </m:acc>
+        <m:r>
+          <m:rPr>
+            <m:sty m:val="p"/>
+          </m:rPr>
+          <m:t>)</m:t>
+        </m:r>
+        <m:r>
+          <m:rPr>
+            <m:sty m:val="p"/>
+          </m:rPr>
+          <m:t>=</m:t>
+        </m:r>
+        <m:sSup>
+          <m:e>
+            <m:acc>
+              <m:accPr>
+                <m:chr m:val="̃"/>
+              </m:accPr>
+              <m:e>
+                <m:r>
+                  <m:t>x</m:t>
+                </m:r>
+              </m:e>
+            </m:acc>
+          </m:e>
+          <m:sup>
+            <m:r>
+              <m:rPr>
+                <m:sty m:val="p"/>
+              </m:rPr>
+              <m:t>′</m:t>
+            </m:r>
+          </m:sup>
+        </m:sSup>
+        <m:acc>
+          <m:accPr>
+            <m:chr m:val="̃"/>
+          </m:accPr>
+          <m:e>
+            <m:r>
+              <m:t>β</m:t>
+            </m:r>
+          </m:e>
+        </m:acc>
+      </m:oMath>
+      <w:r>
+        <w:t xml:space="preserve">.</w:t>
+      </w:r>
+    </w:p>
+    <w:p>
+      <w:pPr>
+        <w:pStyle w:val="BlockText"/>
+      </w:pPr>
+      <w:r>
+        <w:t xml:space="preserve">✅ The model is</w:t>
+      </w:r>
+      <w:r>
+        <w:t xml:space="preserve"> </w:t>
+      </w:r>
+      <m:oMath>
+        <m:r>
+          <m:t>f</m:t>
+        </m:r>
+        <m:r>
+          <m:rPr>
+            <m:sty m:val="p"/>
+          </m:rPr>
+          <m:t>(</m:t>
+        </m:r>
+        <m:acc>
+          <m:accPr>
+            <m:chr m:val="̃"/>
+          </m:accPr>
+          <m:e>
+            <m:r>
+              <m:t>x</m:t>
+            </m:r>
+          </m:e>
+        </m:acc>
+        <m:r>
+          <m:rPr>
+            <m:sty m:val="p"/>
+          </m:rPr>
+          <m:t>)</m:t>
+        </m:r>
+        <m:r>
+          <m:rPr>
+            <m:sty m:val="p"/>
+          </m:rPr>
+          <m:t>=</m:t>
+        </m:r>
+        <m:acc>
+          <m:accPr>
+            <m:chr m:val="̃"/>
+          </m:accPr>
+          <m:e>
+            <m:r>
+              <m:t>x</m:t>
+            </m:r>
+          </m:e>
+        </m:acc>
+        <m:r>
+          <m:rPr>
+            <m:sty m:val="p"/>
+          </m:rPr>
+          <m:t>⋅</m:t>
+        </m:r>
+        <m:acc>
+          <m:accPr>
+            <m:chr m:val="̃"/>
+          </m:accPr>
+          <m:e>
+            <m:r>
+              <m:t>β</m:t>
+            </m:r>
+          </m:e>
+        </m:acc>
+      </m:oMath>
+      <w:r>
+        <w:t xml:space="preserve">.</w:t>
+      </w:r>
+    </w:p>
+    <w:p>
+      <w:pPr>
+        <w:pStyle w:val="FirstParagraph"/>
+      </w:pPr>
+      <w:r>
+        <w:t xml:space="preserve">Both versions give the same number.</w:t>
+      </w:r>
+      <w:r>
+        <w:t xml:space="preserve"> </w:t>
+      </w:r>
+      <w:r>
+        <w:t xml:space="preserve">The ✅ version shows it as one product of two vectors.</w:t>
+      </w:r>
+      <w:r>
+        <w:t xml:space="preserve"> </w:t>
+      </w:r>
+      <w:r>
+        <w:t xml:space="preserve">In a group that uses shared macros (see</w:t>
+      </w:r>
+      <w:r>
+        <w:t xml:space="preserve"> </w:t>
+      </w:r>
+      <w:hyperlink w:anchor="using-shared-macros">
+        <w:r>
+          <w:rPr>
+            <w:rStyle w:val="Hyperlink"/>
+          </w:rPr>
+          <w:t xml:space="preserve">Using shared macros</w:t>
+        </w:r>
+      </w:hyperlink>
+      <w:r>
+        <w:t xml:space="preserve">),</w:t>
+      </w:r>
+      <w:r>
+        <w:t xml:space="preserve"> </w:t>
+      </w:r>
+      <w:r>
+        <w:t xml:space="preserve">write the ✅ version with the dot-product macro,</w:t>
+      </w:r>
+      <w:r>
+        <w:t xml:space="preserve"> </w:t>
+      </w:r>
+      <w:r>
+        <w:t xml:space="preserve">for example</w:t>
+      </w:r>
+      <w:r>
+        <w:t xml:space="preserve"> </w:t>
+      </w:r>
+      <w:r>
+        <w:rPr>
+          <w:rStyle w:val="VerbatimChar"/>
+        </w:rPr>
+        <w:t xml:space="preserve">$\dprod{\vx}{\vbeta}$</w:t>
+      </w:r>
+      <w:r>
+        <w:t xml:space="preserve">.</w:t>
+      </w:r>
+    </w:p>
+    <w:bookmarkEnd w:id="28"/>
+    <w:p>
+      <w:pPr>
+        <w:pStyle w:val="BodyText"/>
+      </w:pPr>
+      <w:r>
+        <w:t xml:space="preserve">Keep the transpose where the product is not a dot product of two vectors:</w:t>
+      </w:r>
+    </w:p>
+    <w:p>
+      <w:pPr>
+        <w:pStyle w:val="Compact"/>
+        <w:numPr>
+          <w:ilvl w:val="0"/>
+          <w:numId w:val="1005"/>
+        </w:numPr>
+      </w:pPr>
+      <w:r>
+        <w:t xml:space="preserve">a product of matrices, such as</w:t>
+      </w:r>
+      <w:r>
+        <w:t xml:space="preserve"> </w:t>
+      </w:r>
+      <m:oMath>
+        <m:sSup>
+          <m:e>
+            <m:r>
+              <m:t>X</m:t>
+            </m:r>
+          </m:e>
+          <m:sup>
+            <m:r>
+              <m:rPr>
+                <m:sty m:val="p"/>
+              </m:rPr>
+              <m:t>′</m:t>
+            </m:r>
+          </m:sup>
+        </m:sSup>
+        <m:r>
+          <m:t>X</m:t>
+        </m:r>
+      </m:oMath>
+    </w:p>
+    <w:p>
+      <w:pPr>
+        <w:pStyle w:val="Compact"/>
+        <w:numPr>
+          <w:ilvl w:val="0"/>
+          <w:numId w:val="1005"/>
+        </w:numPr>
+      </w:pPr>
+      <w:r>
+        <w:t xml:space="preserve">an outer product, such as</w:t>
+      </w:r>
+      <w:r>
+        <w:t xml:space="preserve"> </w:t>
+      </w:r>
+      <m:oMath>
+        <m:acc>
+          <m:accPr>
+            <m:chr m:val="̃"/>
+          </m:accPr>
+          <m:e>
+            <m:r>
+              <m:t>x</m:t>
+            </m:r>
+          </m:e>
+        </m:acc>
+        <m:sSup>
+          <m:e>
+            <m:acc>
+              <m:accPr>
+                <m:chr m:val="̃"/>
+              </m:accPr>
+              <m:e>
+                <m:r>
+                  <m:t>x</m:t>
+                </m:r>
+              </m:e>
+            </m:acc>
+          </m:e>
+          <m:sup>
+            <m:r>
+              <m:rPr>
+                <m:sty m:val="p"/>
+              </m:rPr>
+              <m:t>′</m:t>
+            </m:r>
+          </m:sup>
+        </m:sSup>
+      </m:oMath>
+    </w:p>
+    <w:p>
+      <w:pPr>
+        <w:pStyle w:val="Compact"/>
+        <w:numPr>
+          <w:ilvl w:val="0"/>
+          <w:numId w:val="1005"/>
+        </w:numPr>
+      </w:pPr>
+      <w:r>
+        <w:t xml:space="preserve">a quadratic form, such as</w:t>
+      </w:r>
+      <w:r>
+        <w:t xml:space="preserve"> </w:t>
+      </w:r>
+      <m:oMath>
+        <m:sSup>
+          <m:e>
+            <m:acc>
+              <m:accPr>
+                <m:chr m:val="̃"/>
+              </m:accPr>
+              <m:e>
+                <m:r>
+                  <m:t>x</m:t>
+                </m:r>
+              </m:e>
+            </m:acc>
+          </m:e>
+          <m:sup>
+            <m:r>
+              <m:rPr>
+                <m:sty m:val="p"/>
+              </m:rPr>
+              <m:t>′</m:t>
+            </m:r>
+          </m:sup>
+        </m:sSup>
+        <m:r>
+          <m:t>A</m:t>
+        </m:r>
+        <m:acc>
+          <m:accPr>
+            <m:chr m:val="̃"/>
+          </m:accPr>
+          <m:e>
+            <m:r>
+              <m:t>x</m:t>
+            </m:r>
+          </m:e>
+        </m:acc>
+      </m:oMath>
+    </w:p>
+    <w:p>
+      <w:pPr>
+        <w:pStyle w:val="FirstParagraph"/>
+      </w:pPr>
+      <w:r>
+        <w:t xml:space="preserve">Keep the inner-product brackets where the text means any inner product,</w:t>
+      </w:r>
+      <w:r>
+        <w:t xml:space="preserve"> </w:t>
+      </w:r>
+      <w:r>
+        <w:t xml:space="preserve">such as a definition of an inner product space.</w:t>
+      </w:r>
+    </w:p>
+    <w:bookmarkEnd w:id="29"/>
+    <w:bookmarkStart w:id="32" w:name="writing-out-notational-shorthands"/>
+    <w:p>
+      <w:pPr>
+        <w:pStyle w:val="Heading2"/>
+      </w:pPr>
+      <w:r>
+        <w:t xml:space="preserve">7 Writing out notational shorthands</w:t>
       </w:r>
     </w:p>
     <w:p>
@@ -6295,7 +6850,7 @@
       <w:r>
         <w:t xml:space="preserve"> </w:t>
       </w:r>
-      <w:hyperlink r:id="rId28">
+      <w:hyperlink r:id="rId30">
         <w:r>
           <w:rPr>
             <w:rStyle w:val="Hyperlink"/>
@@ -6336,7 +6891,7 @@
         <w:t xml:space="preserve">catalogs common shorthands and their full forms.</w:t>
       </w:r>
     </w:p>
-    <w:bookmarkStart w:id="29" w:name="exm-notational-shorthand"/>
+    <w:bookmarkStart w:id="31" w:name="exm-notational-shorthand"/>
     <w:p>
       <w:pPr>
         <w:pStyle w:val="BodyText"/>
@@ -6346,7 +6901,7 @@
           <w:b/>
           <w:bCs/>
         </w:rPr>
-        <w:t xml:space="preserve">Example 7 (Writing out the limits of a sum and the range of an index)</w:t>
+        <w:t xml:space="preserve">Example 8 (Writing out the limits of a sum and the range of an index)</w:t>
       </w:r>
       <w:r>
         <w:t xml:space="preserve"> </w:t>
@@ -6903,8 +7458,8 @@
         <w:t xml:space="preserve">observations.</w:t>
       </w:r>
     </w:p>
-    <w:bookmarkEnd w:id="29"/>
-    <w:bookmarkEnd w:id="30"/>
+    <w:bookmarkEnd w:id="31"/>
+    <w:bookmarkEnd w:id="32"/>
     <w:sectPr>
       <w:footnotePr>
         <w:numRestart w:val="eachSect"/>
@@ -7131,6 +7686,9 @@
     <w:abstractNumId w:val="991"/>
   </w:num>
   <w:num w:numId="1004">
+    <w:abstractNumId w:val="991"/>
+  </w:num>
+  <w:num w:numId="1005">
     <w:abstractNumId w:val="991"/>
   </w:num>
 </w:numbering>

</xml_diff>

<commit_message>
Deploying to gh-pages from @ Morrison-Lab/psw@226ceca4089fb9b7343d39e5f9b8382f5a9875fc 🚀
</commit_message>
<xml_diff>
--- a/chapters/notation.docx
+++ b/chapters/notation.docx
@@ -15,7 +15,7 @@
         <w:pStyle w:val="Date"/>
       </w:pPr>
       <w:r>
-        <w:t xml:space="preserve">Last modified: 2026-10-08 22:39:27 (UTC)</w:t>
+        <w:t xml:space="preserve">Last modified: 2026-10-08 22:39:48 (UTC)</w:t>
       </w:r>
     </w:p>
     <w:tbl>
@@ -5601,7 +5601,7 @@
       </w:r>
     </w:p>
     <w:bookmarkEnd w:id="25"/>
-    <w:bookmarkStart w:id="27" w:name="using-shared-macros"/>
+    <w:bookmarkStart w:id="28" w:name="using-shared-macros"/>
     <w:p>
       <w:pPr>
         <w:pStyle w:val="Heading2"/>
@@ -5848,8 +5848,209 @@
         <w:t xml:space="preserve">A quantity that has a macro keeps the same symbol in every document.</w:t>
       </w:r>
     </w:p>
+    <w:p>
+      <w:pPr>
+        <w:pStyle w:val="BodyText"/>
+      </w:pPr>
+      <w:r>
+        <w:t xml:space="preserve">Name a macro for what the symbol means, not for the letter it prints.</w:t>
+      </w:r>
+      <w:r>
+        <w:t xml:space="preserve"> </w:t>
+      </w:r>
+      <w:r>
+        <w:t xml:space="preserve">A macro such as</w:t>
+      </w:r>
+      <w:r>
+        <w:t xml:space="preserve"> </w:t>
+      </w:r>
+      <w:r>
+        <w:rPr>
+          <w:rStyle w:val="VerbatimChar"/>
+        </w:rPr>
+        <w:t xml:space="preserve">\vdelta</w:t>
+      </w:r>
+      <w:r>
+        <w:t xml:space="preserve"> </w:t>
+      </w:r>
+      <w:r>
+        <w:t xml:space="preserve">or</w:t>
+      </w:r>
+      <w:r>
+        <w:t xml:space="preserve"> </w:t>
+      </w:r>
+      <w:r>
+        <w:rPr>
+          <w:rStyle w:val="VerbatimChar"/>
+        </w:rPr>
+        <w:t xml:space="preserve">\hbeta</w:t>
+      </w:r>
+      <w:r>
+        <w:t xml:space="preserve"> </w:t>
+      </w:r>
+      <w:r>
+        <w:t xml:space="preserve">only spells a Greek letter,</w:t>
+      </w:r>
+      <w:r>
+        <w:t xml:space="preserve"> </w:t>
+      </w:r>
+      <w:r>
+        <w:t xml:space="preserve">so it names no concept,</w:t>
+      </w:r>
+      <w:r>
+        <w:t xml:space="preserve"> </w:t>
+      </w:r>
+      <w:r>
+        <w:t xml:space="preserve">and changing the symbol for that concept still means editing every use.</w:t>
+      </w:r>
+      <w:r>
+        <w:t xml:space="preserve"> </w:t>
+      </w:r>
+      <w:r>
+        <w:t xml:space="preserve">Outside a passage that discusses the notation itself,</w:t>
+      </w:r>
+      <w:r>
+        <w:t xml:space="preserve"> </w:t>
+      </w:r>
+      <w:r>
+        <w:t xml:space="preserve">do not write a Greek letter in a math expression,</w:t>
+      </w:r>
+      <w:r>
+        <w:t xml:space="preserve"> </w:t>
+      </w:r>
+      <w:r>
+        <w:t xml:space="preserve">either as a raw command such as</w:t>
+      </w:r>
+      <w:r>
+        <w:t xml:space="preserve"> </w:t>
+      </w:r>
+      <w:r>
+        <w:rPr>
+          <w:rStyle w:val="VerbatimChar"/>
+        </w:rPr>
+        <w:t xml:space="preserve">\delta</w:t>
+      </w:r>
+      <w:r>
+        <w:t xml:space="preserve"> </w:t>
+      </w:r>
+      <w:r>
+        <w:t xml:space="preserve">or inside a letter-named macro such as</w:t>
+      </w:r>
+      <w:r>
+        <w:t xml:space="preserve"> </w:t>
+      </w:r>
+      <w:r>
+        <w:rPr>
+          <w:rStyle w:val="VerbatimChar"/>
+        </w:rPr>
+        <w:t xml:space="preserve">\vdelta</w:t>
+      </w:r>
+      <w:r>
+        <w:t xml:space="preserve">.</w:t>
+      </w:r>
+    </w:p>
+    <w:bookmarkStart w:id="27" w:name="exm-semantic-macro-name"/>
+    <w:p>
+      <w:pPr>
+        <w:pStyle w:val="BodyText"/>
+      </w:pPr>
+      <w:r>
+        <w:rPr>
+          <w:b/>
+          <w:bCs/>
+        </w:rPr>
+        <w:t xml:space="preserve">Example 7 (Naming a macro for its meaning)</w:t>
+      </w:r>
+      <w:r>
+        <w:t xml:space="preserve"> </w:t>
+      </w:r>
+      <w:r>
+        <w:t xml:space="preserve"> </w:t>
+      </w:r>
+    </w:p>
+    <w:p>
+      <w:pPr>
+        <w:pStyle w:val="BlockText"/>
+      </w:pPr>
+      <w:r>
+        <w:t xml:space="preserve">❌ Source:</w:t>
+      </w:r>
+      <w:r>
+        <w:t xml:space="preserve"> </w:t>
+      </w:r>
+      <w:r>
+        <w:rPr>
+          <w:rStyle w:val="VerbatimChar"/>
+        </w:rPr>
+        <w:t xml:space="preserve">The error at layer $\ell$ is $\vdelta^{(\ell)}$, and the step size is $\eta$.</w:t>
+      </w:r>
+    </w:p>
+    <w:p>
+      <w:pPr>
+        <w:pStyle w:val="BlockText"/>
+      </w:pPr>
+      <w:r>
+        <w:t xml:space="preserve">✅ Source:</w:t>
+      </w:r>
+      <w:r>
+        <w:t xml:space="preserve"> </w:t>
+      </w:r>
+      <w:r>
+        <w:rPr>
+          <w:rStyle w:val="VerbatimChar"/>
+        </w:rPr>
+        <w:t xml:space="preserve">The error at layer $\ell$ is $\backerr^{(\ell)}$, and the step size is $\learnrate$.</w:t>
+      </w:r>
+    </w:p>
+    <w:p>
+      <w:pPr>
+        <w:pStyle w:val="FirstParagraph"/>
+      </w:pPr>
+      <w:r>
+        <w:t xml:space="preserve">Both versions print the same symbols.</w:t>
+      </w:r>
+      <w:r>
+        <w:t xml:space="preserve"> </w:t>
+      </w:r>
+      <w:r>
+        <w:t xml:space="preserve">In the ✅ version, a reader of the source sees what each symbol stands for,</w:t>
+      </w:r>
+      <w:r>
+        <w:t xml:space="preserve"> </w:t>
+      </w:r>
+      <w:r>
+        <w:t xml:space="preserve">and a group that changes the symbol for the step size</w:t>
+      </w:r>
+      <w:r>
+        <w:t xml:space="preserve"> </w:t>
+      </w:r>
+      <w:r>
+        <w:t xml:space="preserve">changes one line in the shared file.</w:t>
+      </w:r>
+    </w:p>
     <w:bookmarkEnd w:id="27"/>
-    <w:bookmarkStart w:id="29" w:name="writing-dot-products"/>
+    <w:p>
+      <w:pPr>
+        <w:pStyle w:val="BodyText"/>
+      </w:pPr>
+      <w:r>
+        <w:t xml:space="preserve">A passage about the notation itself,</w:t>
+      </w:r>
+      <w:r>
+        <w:t xml:space="preserve"> </w:t>
+      </w:r>
+      <w:r>
+        <w:t xml:space="preserve">such as a table that lists each symbol and what it means,</w:t>
+      </w:r>
+      <w:r>
+        <w:t xml:space="preserve"> </w:t>
+      </w:r>
+      <w:r>
+        <w:t xml:space="preserve">may write the letters directly.</w:t>
+      </w:r>
+    </w:p>
+    <w:bookmarkEnd w:id="28"/>
+    <w:bookmarkStart w:id="30" w:name="writing-dot-products"/>
     <w:p>
       <w:pPr>
         <w:pStyle w:val="Heading2"/>
@@ -6022,7 +6223,7 @@
         <w:t xml:space="preserve">and to work out that the result is a single number.</w:t>
       </w:r>
     </w:p>
-    <w:bookmarkStart w:id="28" w:name="exm-dot-product"/>
+    <w:bookmarkStart w:id="29" w:name="exm-dot-product"/>
     <w:p>
       <w:pPr>
         <w:pStyle w:val="BodyText"/>
@@ -6032,7 +6233,7 @@
           <w:b/>
           <w:bCs/>
         </w:rPr>
-        <w:t xml:space="preserve">Example 7 (Writing a dot product)</w:t>
+        <w:t xml:space="preserve">Example 8 (Writing a dot product)</w:t>
       </w:r>
       <w:r>
         <w:t xml:space="preserve"> </w:t>
@@ -6251,7 +6452,7 @@
         <w:t xml:space="preserve">.</w:t>
       </w:r>
     </w:p>
-    <w:bookmarkEnd w:id="28"/>
+    <w:bookmarkEnd w:id="29"/>
     <w:p>
       <w:pPr>
         <w:pStyle w:val="BodyText"/>
@@ -6410,8 +6611,8 @@
         <w:t xml:space="preserve">such as a definition of an inner product space.</w:t>
       </w:r>
     </w:p>
-    <w:bookmarkEnd w:id="29"/>
-    <w:bookmarkStart w:id="32" w:name="writing-out-notational-shorthands"/>
+    <w:bookmarkEnd w:id="30"/>
+    <w:bookmarkStart w:id="33" w:name="writing-out-notational-shorthands"/>
     <w:p>
       <w:pPr>
         <w:pStyle w:val="Heading2"/>
@@ -6850,7 +7051,7 @@
       <w:r>
         <w:t xml:space="preserve"> </w:t>
       </w:r>
-      <w:hyperlink r:id="rId30">
+      <w:hyperlink r:id="rId31">
         <w:r>
           <w:rPr>
             <w:rStyle w:val="Hyperlink"/>
@@ -6891,7 +7092,7 @@
         <w:t xml:space="preserve">catalogs common shorthands and their full forms.</w:t>
       </w:r>
     </w:p>
-    <w:bookmarkStart w:id="31" w:name="exm-notational-shorthand"/>
+    <w:bookmarkStart w:id="32" w:name="exm-notational-shorthand"/>
     <w:p>
       <w:pPr>
         <w:pStyle w:val="BodyText"/>
@@ -6901,7 +7102,7 @@
           <w:b/>
           <w:bCs/>
         </w:rPr>
-        <w:t xml:space="preserve">Example 8 (Writing out the limits of a sum and the range of an index)</w:t>
+        <w:t xml:space="preserve">Example 9 (Writing out the limits of a sum and the range of an index)</w:t>
       </w:r>
       <w:r>
         <w:t xml:space="preserve"> </w:t>
@@ -7458,8 +7659,8 @@
         <w:t xml:space="preserve">observations.</w:t>
       </w:r>
     </w:p>
-    <w:bookmarkEnd w:id="31"/>
     <w:bookmarkEnd w:id="32"/>
+    <w:bookmarkEnd w:id="33"/>
     <w:sectPr>
       <w:footnotePr>
         <w:numRestart w:val="eachSect"/>

</xml_diff>

<commit_message>
Deploying to gh-pages from @ Morrison-Lab/psw@a84f20b600378881c616ffc6afa917243d994d05 🚀
</commit_message>
<xml_diff>
--- a/chapters/notation.docx
+++ b/chapters/notation.docx
@@ -15,7 +15,7 @@
         <w:pStyle w:val="Date"/>
       </w:pPr>
       <w:r>
-        <w:t xml:space="preserve">Last modified: 2026-10-08 18:54:45 (PDT)</w:t>
+        <w:t xml:space="preserve">Last modified: 2026-10-08 19:04:55 (PDT)</w:t>
       </w:r>
     </w:p>
     <w:tbl>
@@ -5601,7 +5601,7 @@
       </w:r>
     </w:p>
     <w:bookmarkEnd w:id="25"/>
-    <w:bookmarkStart w:id="28" w:name="using-shared-macros"/>
+    <w:bookmarkStart w:id="29" w:name="using-shared-macros"/>
     <w:p>
       <w:pPr>
         <w:pStyle w:val="Heading2"/>
@@ -6049,8 +6049,198 @@
         <w:t xml:space="preserve">may write the letters directly.</w:t>
       </w:r>
     </w:p>
+    <w:p>
+      <w:pPr>
+        <w:pStyle w:val="BodyText"/>
+      </w:pPr>
+      <w:r>
+        <w:t xml:space="preserve">The same reasoning applies to decorators.</w:t>
+      </w:r>
+      <w:r>
+        <w:t xml:space="preserve"> </w:t>
+      </w:r>
+      <w:r>
+        <w:t xml:space="preserve">A hat, a tilde or a bar says how a symbol is drawn, not what it means.</w:t>
+      </w:r>
+      <w:r>
+        <w:t xml:space="preserve"> </w:t>
+      </w:r>
+      <w:r>
+        <w:t xml:space="preserve">A hat can mark an estimate, a fitted value or a Fourier transform,</w:t>
+      </w:r>
+      <w:r>
+        <w:t xml:space="preserve"> </w:t>
+      </w:r>
+      <w:r>
+        <w:t xml:space="preserve">so</w:t>
+      </w:r>
+      <w:r>
+        <w:t xml:space="preserve"> </w:t>
+      </w:r>
+      <w:r>
+        <w:rPr>
+          <w:rStyle w:val="VerbatimChar"/>
+        </w:rPr>
+        <w:t xml:space="preserve">\hat</w:t>
+      </w:r>
+      <w:r>
+        <w:t xml:space="preserve"> </w:t>
+      </w:r>
+      <w:r>
+        <w:t xml:space="preserve">names no concept either.</w:t>
+      </w:r>
+      <w:r>
+        <w:t xml:space="preserve"> </w:t>
+      </w:r>
+      <w:r>
+        <w:t xml:space="preserve">Write the macro that names the role instead,</w:t>
+      </w:r>
+      <w:r>
+        <w:t xml:space="preserve"> </w:t>
+      </w:r>
+      <w:r>
+        <w:t xml:space="preserve">such as</w:t>
+      </w:r>
+      <w:r>
+        <w:t xml:space="preserve"> </w:t>
+      </w:r>
+      <w:r>
+        <w:rPr>
+          <w:rStyle w:val="VerbatimChar"/>
+        </w:rPr>
+        <w:t xml:space="preserve">\est{}</w:t>
+      </w:r>
+      <w:r>
+        <w:t xml:space="preserve"> </w:t>
+      </w:r>
+      <w:r>
+        <w:t xml:space="preserve">for an estimate,</w:t>
+      </w:r>
+      <w:r>
+        <w:t xml:space="preserve"> </w:t>
+      </w:r>
+      <w:r>
+        <w:t xml:space="preserve">and keep</w:t>
+      </w:r>
+      <w:r>
+        <w:t xml:space="preserve"> </w:t>
+      </w:r>
+      <w:r>
+        <w:rPr>
+          <w:rStyle w:val="VerbatimChar"/>
+        </w:rPr>
+        <w:t xml:space="preserve">\hat</w:t>
+      </w:r>
+      <w:r>
+        <w:t xml:space="preserve"> </w:t>
+      </w:r>
+      <w:r>
+        <w:t xml:space="preserve">for passages that discuss the notation itself.</w:t>
+      </w:r>
+      <w:r>
+        <w:t xml:space="preserve"> </w:t>
+      </w:r>
+      <w:r>
+        <w:t xml:space="preserve">New math follows this now;</w:t>
+      </w:r>
+      <w:r>
+        <w:t xml:space="preserve"> </w:t>
+      </w:r>
+      <w:r>
+        <w:t xml:space="preserve">existing hats are converted in separate sweeps.</w:t>
+      </w:r>
+    </w:p>
+    <w:bookmarkStart w:id="28" w:name="exm-semantic-decorator"/>
+    <w:p>
+      <w:pPr>
+        <w:pStyle w:val="BodyText"/>
+      </w:pPr>
+      <w:r>
+        <w:rPr>
+          <w:b/>
+          <w:bCs/>
+        </w:rPr>
+        <w:t xml:space="preserve">Example 8 (Naming a decorator for its meaning)</w:t>
+      </w:r>
+      <w:r>
+        <w:t xml:space="preserve"> </w:t>
+      </w:r>
+      <w:r>
+        <w:t xml:space="preserve"> </w:t>
+      </w:r>
+    </w:p>
+    <w:p>
+      <w:pPr>
+        <w:pStyle w:val="BlockText"/>
+      </w:pPr>
+      <w:r>
+        <w:t xml:space="preserve">❌ Source:</w:t>
+      </w:r>
+      <w:r>
+        <w:t xml:space="preserve"> </w:t>
+      </w:r>
+      <w:r>
+        <w:rPr>
+          <w:rStyle w:val="VerbatimChar"/>
+        </w:rPr>
+        <w:t xml:space="preserve">The estimate $\hat{\mean}$ is close to $\mean$.</w:t>
+      </w:r>
+    </w:p>
+    <w:p>
+      <w:pPr>
+        <w:pStyle w:val="BlockText"/>
+      </w:pPr>
+      <w:r>
+        <w:t xml:space="preserve">✅ Source:</w:t>
+      </w:r>
+      <w:r>
+        <w:t xml:space="preserve"> </w:t>
+      </w:r>
+      <w:r>
+        <w:rPr>
+          <w:rStyle w:val="VerbatimChar"/>
+        </w:rPr>
+        <w:t xml:space="preserve">The estimate $\est{\mean}$ is close to $\mean$.</w:t>
+      </w:r>
+    </w:p>
+    <w:p>
+      <w:pPr>
+        <w:pStyle w:val="FirstParagraph"/>
+      </w:pPr>
+      <w:r>
+        <w:t xml:space="preserve">Both versions print the same hat.</w:t>
+      </w:r>
+      <w:r>
+        <w:t xml:space="preserve"> </w:t>
+      </w:r>
+      <w:r>
+        <w:t xml:space="preserve">If the group later marks estimates some other way,</w:t>
+      </w:r>
+      <w:r>
+        <w:t xml:space="preserve"> </w:t>
+      </w:r>
+      <w:r>
+        <w:t xml:space="preserve">only the definition of</w:t>
+      </w:r>
+      <w:r>
+        <w:t xml:space="preserve"> </w:t>
+      </w:r>
+      <w:r>
+        <w:rPr>
+          <w:rStyle w:val="VerbatimChar"/>
+        </w:rPr>
+        <w:t xml:space="preserve">\est</w:t>
+      </w:r>
+      <w:r>
+        <w:t xml:space="preserve"> </w:t>
+      </w:r>
+      <w:r>
+        <w:t xml:space="preserve">changes.</w:t>
+      </w:r>
+    </w:p>
     <w:bookmarkEnd w:id="28"/>
-    <w:bookmarkStart w:id="30" w:name="writing-dot-products"/>
+    <w:bookmarkEnd w:id="29"/>
+    <w:bookmarkStart w:id="31" w:name="writing-dot-products"/>
     <w:p>
       <w:pPr>
         <w:pStyle w:val="Heading2"/>
@@ -6223,7 +6413,7 @@
         <w:t xml:space="preserve">and to work out that the result is a single number.</w:t>
       </w:r>
     </w:p>
-    <w:bookmarkStart w:id="29" w:name="exm-dot-product"/>
+    <w:bookmarkStart w:id="30" w:name="exm-dot-product"/>
     <w:p>
       <w:pPr>
         <w:pStyle w:val="BodyText"/>
@@ -6233,7 +6423,7 @@
           <w:b/>
           <w:bCs/>
         </w:rPr>
-        <w:t xml:space="preserve">Example 8 (Writing a dot product)</w:t>
+        <w:t xml:space="preserve">Example 9 (Writing a dot product)</w:t>
       </w:r>
       <w:r>
         <w:t xml:space="preserve"> </w:t>
@@ -6452,7 +6642,7 @@
         <w:t xml:space="preserve">.</w:t>
       </w:r>
     </w:p>
-    <w:bookmarkEnd w:id="29"/>
+    <w:bookmarkEnd w:id="30"/>
     <w:p>
       <w:pPr>
         <w:pStyle w:val="BodyText"/>
@@ -6611,8 +6801,8 @@
         <w:t xml:space="preserve">such as a definition of an inner product space.</w:t>
       </w:r>
     </w:p>
-    <w:bookmarkEnd w:id="30"/>
-    <w:bookmarkStart w:id="33" w:name="writing-out-notational-shorthands"/>
+    <w:bookmarkEnd w:id="31"/>
+    <w:bookmarkStart w:id="34" w:name="writing-out-notational-shorthands"/>
     <w:p>
       <w:pPr>
         <w:pStyle w:val="Heading2"/>
@@ -7051,7 +7241,7 @@
       <w:r>
         <w:t xml:space="preserve"> </w:t>
       </w:r>
-      <w:hyperlink r:id="rId31">
+      <w:hyperlink r:id="rId32">
         <w:r>
           <w:rPr>
             <w:rStyle w:val="Hyperlink"/>
@@ -7092,7 +7282,7 @@
         <w:t xml:space="preserve">catalogs common shorthands and their full forms.</w:t>
       </w:r>
     </w:p>
-    <w:bookmarkStart w:id="32" w:name="exm-notational-shorthand"/>
+    <w:bookmarkStart w:id="33" w:name="exm-notational-shorthand"/>
     <w:p>
       <w:pPr>
         <w:pStyle w:val="BodyText"/>
@@ -7102,7 +7292,7 @@
           <w:b/>
           <w:bCs/>
         </w:rPr>
-        <w:t xml:space="preserve">Example 9 (Writing out the limits of a sum and the range of an index)</w:t>
+        <w:t xml:space="preserve">Example 10 (Writing out the limits of a sum and the range of an index)</w:t>
       </w:r>
       <w:r>
         <w:t xml:space="preserve"> </w:t>
@@ -7659,8 +7849,8 @@
         <w:t xml:space="preserve">observations.</w:t>
       </w:r>
     </w:p>
-    <w:bookmarkEnd w:id="32"/>
     <w:bookmarkEnd w:id="33"/>
+    <w:bookmarkEnd w:id="34"/>
     <w:sectPr>
       <w:footnotePr>
         <w:numRestart w:val="eachSect"/>

</xml_diff>

<commit_message>
Deploying to gh-pages from @ Morrison-Lab/psw@8435cd850d1d21bc8d05824df49637b7855f29c1 🚀
</commit_message>
<xml_diff>
--- a/chapters/notation.docx
+++ b/chapters/notation.docx
@@ -15,7 +15,7 @@
         <w:pStyle w:val="Date"/>
       </w:pPr>
       <w:r>
-        <w:t xml:space="preserve">Last modified: 2026-10-08 19:04:55 (PDT)</w:t>
+        <w:t xml:space="preserve">Last modified: 2026-10-08 21:22:09 (PDT)</w:t>
       </w:r>
     </w:p>
     <w:tbl>
@@ -5601,7 +5601,7 @@
       </w:r>
     </w:p>
     <w:bookmarkEnd w:id="25"/>
-    <w:bookmarkStart w:id="29" w:name="using-shared-macros"/>
+    <w:bookmarkStart w:id="31" w:name="using-shared-macros"/>
     <w:p>
       <w:pPr>
         <w:pStyle w:val="Heading2"/>
@@ -6239,8 +6239,544 @@
       </w:r>
     </w:p>
     <w:bookmarkEnd w:id="28"/>
+    <w:p>
+      <w:pPr>
+        <w:pStyle w:val="BodyText"/>
+      </w:pPr>
+      <w:r>
+        <w:t xml:space="preserve">Latin letters with a fixed role follow the same rule.</w:t>
+      </w:r>
+      <w:r>
+        <w:t xml:space="preserve"> </w:t>
+      </w:r>
+      <w:r>
+        <w:t xml:space="preserve">In a regression or prediction model, use these macros:</w:t>
+      </w:r>
+    </w:p>
+    <w:p>
+      <w:pPr>
+        <w:pStyle w:val="Compact"/>
+        <w:numPr>
+          <w:ilvl w:val="0"/>
+          <w:numId w:val="1005"/>
+        </w:numPr>
+      </w:pPr>
+      <w:r>
+        <w:rPr>
+          <w:rStyle w:val="VerbatimChar"/>
+        </w:rPr>
+        <w:t xml:space="preserve">\outvar</w:t>
+      </w:r>
+      <w:r>
+        <w:t xml:space="preserve"> </w:t>
+      </w:r>
+      <w:r>
+        <w:t xml:space="preserve">for the outcome variable, instead of a bare</w:t>
+      </w:r>
+      <w:r>
+        <w:t xml:space="preserve"> </w:t>
+      </w:r>
+      <w:r>
+        <w:rPr>
+          <w:rStyle w:val="VerbatimChar"/>
+        </w:rPr>
+        <w:t xml:space="preserve">y</w:t>
+      </w:r>
+      <w:r>
+        <w:t xml:space="preserve">;</w:t>
+      </w:r>
+    </w:p>
+    <w:p>
+      <w:pPr>
+        <w:pStyle w:val="Compact"/>
+        <w:numPr>
+          <w:ilvl w:val="0"/>
+          <w:numId w:val="1005"/>
+        </w:numPr>
+      </w:pPr>
+      <w:r>
+        <w:rPr>
+          <w:rStyle w:val="VerbatimChar"/>
+        </w:rPr>
+        <w:t xml:space="preserve">\eoutvar</w:t>
+      </w:r>
+      <w:r>
+        <w:t xml:space="preserve"> </w:t>
+      </w:r>
+      <w:r>
+        <w:t xml:space="preserve">for a predicted outcome;</w:t>
+      </w:r>
+    </w:p>
+    <w:p>
+      <w:pPr>
+        <w:pStyle w:val="Compact"/>
+        <w:numPr>
+          <w:ilvl w:val="0"/>
+          <w:numId w:val="1005"/>
+        </w:numPr>
+      </w:pPr>
+      <w:r>
+        <w:rPr>
+          <w:rStyle w:val="VerbatimChar"/>
+        </w:rPr>
+        <w:t xml:space="preserve">\predvar</w:t>
+      </w:r>
+      <w:r>
+        <w:t xml:space="preserve"> </w:t>
+      </w:r>
+      <w:r>
+        <w:t xml:space="preserve">for a predictor, instead of a bare</w:t>
+      </w:r>
+      <w:r>
+        <w:t xml:space="preserve"> </w:t>
+      </w:r>
+      <w:r>
+        <w:rPr>
+          <w:rStyle w:val="VerbatimChar"/>
+        </w:rPr>
+        <w:t xml:space="preserve">x</w:t>
+      </w:r>
+      <w:r>
+        <w:t xml:space="preserve">;</w:t>
+      </w:r>
+    </w:p>
+    <w:p>
+      <w:pPr>
+        <w:pStyle w:val="Compact"/>
+        <w:numPr>
+          <w:ilvl w:val="0"/>
+          <w:numId w:val="1005"/>
+        </w:numPr>
+      </w:pPr>
+      <w:r>
+        <w:rPr>
+          <w:rStyle w:val="VerbatimChar"/>
+        </w:rPr>
+        <w:t xml:space="preserve">\resid</w:t>
+      </w:r>
+      <w:r>
+        <w:t xml:space="preserve"> </w:t>
+      </w:r>
+      <w:r>
+        <w:t xml:space="preserve">for a residual, the observed minus the predicted outcome;</w:t>
+      </w:r>
+    </w:p>
+    <w:p>
+      <w:pPr>
+        <w:pStyle w:val="Compact"/>
+        <w:numPr>
+          <w:ilvl w:val="0"/>
+          <w:numId w:val="1005"/>
+        </w:numPr>
+      </w:pPr>
+      <w:r>
+        <w:rPr>
+          <w:rStyle w:val="VerbatimChar"/>
+        </w:rPr>
+        <w:t xml:space="preserve">\prederr</w:t>
+      </w:r>
+      <w:r>
+        <w:t xml:space="preserve"> </w:t>
+      </w:r>
+      <w:r>
+        <w:t xml:space="preserve">for a prediction error, the predicted minus the observed outcome.</w:t>
+      </w:r>
+    </w:p>
+    <w:p>
+      <w:pPr>
+        <w:pStyle w:val="FirstParagraph"/>
+      </w:pPr>
+      <w:r>
+        <w:t xml:space="preserve">For an observation used to fit the model,</w:t>
+      </w:r>
+      <w:r>
+        <w:t xml:space="preserve"> </w:t>
+      </w:r>
+      <w:r>
+        <w:t xml:space="preserve">the residual is the negative of the prediction error.</w:t>
+      </w:r>
+      <w:r>
+        <w:t xml:space="preserve"> </w:t>
+      </w:r>
+      <w:r>
+        <w:t xml:space="preserve">Write</w:t>
+      </w:r>
+      <w:r>
+        <w:t xml:space="preserve"> </w:t>
+      </w:r>
+      <w:r>
+        <w:rPr>
+          <w:rStyle w:val="VerbatimChar"/>
+        </w:rPr>
+        <w:t xml:space="preserve">\resid</w:t>
+      </w:r>
+      <w:r>
+        <w:t xml:space="preserve"> </w:t>
+      </w:r>
+      <w:r>
+        <w:t xml:space="preserve">for the observed minus the predicted outcome</w:t>
+      </w:r>
+      <w:r>
+        <w:t xml:space="preserve"> </w:t>
+      </w:r>
+      <w:r>
+        <w:t xml:space="preserve">and</w:t>
+      </w:r>
+      <w:r>
+        <w:t xml:space="preserve"> </w:t>
+      </w:r>
+      <w:r>
+        <w:rPr>
+          <w:rStyle w:val="VerbatimChar"/>
+        </w:rPr>
+        <w:t xml:space="preserve">\prederr</w:t>
+      </w:r>
+      <w:r>
+        <w:t xml:space="preserve"> </w:t>
+      </w:r>
+      <w:r>
+        <w:t xml:space="preserve">for the predicted minus the observed outcome,</w:t>
+      </w:r>
+      <w:r>
+        <w:t xml:space="preserve"> </w:t>
+      </w:r>
+      <w:r>
+        <w:t xml:space="preserve">never one for the other.</w:t>
+      </w:r>
+      <w:r>
+        <w:t xml:space="preserve"> </w:t>
+      </w:r>
+      <w:r>
+        <w:t xml:space="preserve">For an estimate of a parameter,</w:t>
+      </w:r>
+      <w:r>
+        <w:t xml:space="preserve"> </w:t>
+      </w:r>
+      <w:r>
+        <w:rPr>
+          <w:rStyle w:val="VerbatimChar"/>
+        </w:rPr>
+        <w:t xml:space="preserve">\erf{\eparam}</w:t>
+      </w:r>
+      <w:r>
+        <w:t xml:space="preserve"> </w:t>
+      </w:r>
+      <w:r>
+        <w:t xml:space="preserve">is the estimation error, the estimate minus the true value;</w:t>
+      </w:r>
+      <w:r>
+        <w:t xml:space="preserve"> </w:t>
+      </w:r>
+      <w:r>
+        <w:t xml:space="preserve">it prints</w:t>
+      </w:r>
+      <w:r>
+        <w:t xml:space="preserve"> </w:t>
+      </w:r>
+      <m:oMath>
+        <m:r>
+          <m:t>ε</m:t>
+        </m:r>
+      </m:oMath>
+      <w:r>
+        <w:t xml:space="preserve">, the symbol the shared macros use for an error.</w:t>
+      </w:r>
+      <w:r>
+        <w:t xml:space="preserve"> </w:t>
+      </w:r>
+      <w:r>
+        <w:t xml:space="preserve">These macros need a version of the shared macros that includes them,</w:t>
+      </w:r>
+      <w:r>
+        <w:t xml:space="preserve"> </w:t>
+      </w:r>
+      <w:r>
+        <w:t xml:space="preserve">so update a repository’s copy before using them there.</w:t>
+      </w:r>
+      <w:r>
+        <w:t xml:space="preserve"> </w:t>
+      </w:r>
+      <w:r>
+        <w:t xml:space="preserve">The outcome, predictor and residual macros also have random-variable and vector forms,</w:t>
+      </w:r>
+      <w:r>
+        <w:t xml:space="preserve"> </w:t>
+      </w:r>
+      <w:r>
+        <w:t xml:space="preserve">such as</w:t>
+      </w:r>
+      <w:r>
+        <w:t xml:space="preserve"> </w:t>
+      </w:r>
+      <w:r>
+        <w:rPr>
+          <w:rStyle w:val="VerbatimChar"/>
+        </w:rPr>
+        <w:t xml:space="preserve">\Outvar</w:t>
+      </w:r>
+      <w:r>
+        <w:t xml:space="preserve">,</w:t>
+      </w:r>
+      <w:r>
+        <w:t xml:space="preserve"> </w:t>
+      </w:r>
+      <w:r>
+        <w:rPr>
+          <w:rStyle w:val="VerbatimChar"/>
+        </w:rPr>
+        <w:t xml:space="preserve">\voutvar</w:t>
+      </w:r>
+      <w:r>
+        <w:t xml:space="preserve"> </w:t>
+      </w:r>
+      <w:r>
+        <w:t xml:space="preserve">and</w:t>
+      </w:r>
+      <w:r>
+        <w:t xml:space="preserve"> </w:t>
+      </w:r>
+      <w:r>
+        <w:rPr>
+          <w:rStyle w:val="VerbatimChar"/>
+        </w:rPr>
+        <w:t xml:space="preserve">\vresid</w:t>
+      </w:r>
+      <w:r>
+        <w:t xml:space="preserve">.</w:t>
+      </w:r>
+    </w:p>
+    <w:bookmarkStart w:id="29" w:name="exm-semantic-latin-letter"/>
+    <w:p>
+      <w:pPr>
+        <w:pStyle w:val="BodyText"/>
+      </w:pPr>
+      <w:r>
+        <w:rPr>
+          <w:b/>
+          <w:bCs/>
+        </w:rPr>
+        <w:t xml:space="preserve">Example 9 (Naming a variable for its role)</w:t>
+      </w:r>
+      <w:r>
+        <w:t xml:space="preserve"> </w:t>
+      </w:r>
+      <w:r>
+        <w:t xml:space="preserve"> </w:t>
+      </w:r>
+    </w:p>
+    <w:p>
+      <w:pPr>
+        <w:pStyle w:val="BlockText"/>
+      </w:pPr>
+      <w:r>
+        <w:t xml:space="preserve">❌ Source:</w:t>
+      </w:r>
+      <w:r>
+        <w:t xml:space="preserve"> </w:t>
+      </w:r>
+      <w:r>
+        <w:rPr>
+          <w:rStyle w:val="VerbatimChar"/>
+        </w:rPr>
+        <w:t xml:space="preserve">The residual is $e_i = y_i - \hat{y}_i$.</w:t>
+      </w:r>
+    </w:p>
+    <w:p>
+      <w:pPr>
+        <w:pStyle w:val="BlockText"/>
+      </w:pPr>
+      <w:r>
+        <w:t xml:space="preserve">✅ Source:</w:t>
+      </w:r>
+      <w:r>
+        <w:t xml:space="preserve"> </w:t>
+      </w:r>
+      <w:r>
+        <w:rPr>
+          <w:rStyle w:val="VerbatimChar"/>
+        </w:rPr>
+        <w:t xml:space="preserve">The residual is $\resid_i = \outvar_i - \eoutvar_i$.</w:t>
+      </w:r>
+    </w:p>
+    <w:p>
+      <w:pPr>
+        <w:pStyle w:val="FirstParagraph"/>
+      </w:pPr>
+      <w:r>
+        <w:t xml:space="preserve">The ✅ version prints the residual as</w:t>
+      </w:r>
+      <w:r>
+        <w:t xml:space="preserve"> </w:t>
+      </w:r>
+      <m:oMath>
+        <m:r>
+          <m:t>r</m:t>
+        </m:r>
+      </m:oMath>
+      <w:r>
+        <w:t xml:space="preserve">, the symbol the shared macros use for it;</w:t>
+      </w:r>
+      <w:r>
+        <w:t xml:space="preserve"> </w:t>
+      </w:r>
+      <w:r>
+        <w:t xml:space="preserve">the other letters are the same in both.</w:t>
+      </w:r>
+      <w:r>
+        <w:t xml:space="preserve"> </w:t>
+      </w:r>
+      <w:r>
+        <w:t xml:space="preserve">In the ✅ version, a reader of the source can tell</w:t>
+      </w:r>
+      <w:r>
+        <w:t xml:space="preserve"> </w:t>
+      </w:r>
+      <w:r>
+        <w:t xml:space="preserve">which letter is the outcome and which is the residual.</w:t>
+      </w:r>
+    </w:p>
     <w:bookmarkEnd w:id="29"/>
-    <w:bookmarkStart w:id="31" w:name="writing-dot-products"/>
+    <w:p>
+      <w:pPr>
+        <w:pStyle w:val="BodyText"/>
+      </w:pPr>
+      <w:r>
+        <w:t xml:space="preserve">Once a quantity has a name and a macro,</w:t>
+      </w:r>
+      <w:r>
+        <w:t xml:space="preserve"> </w:t>
+      </w:r>
+      <w:r>
+        <w:t xml:space="preserve">write the macro instead of the expression that defines it.</w:t>
+      </w:r>
+      <w:r>
+        <w:t xml:space="preserve"> </w:t>
+      </w:r>
+      <w:r>
+        <w:t xml:space="preserve">Each equation then stays short,</w:t>
+      </w:r>
+      <w:r>
+        <w:t xml:space="preserve"> </w:t>
+      </w:r>
+      <w:r>
+        <w:t xml:space="preserve">and a reader sees which quantity it is about.</w:t>
+      </w:r>
+    </w:p>
+    <w:bookmarkStart w:id="30" w:name="exm-named-quantity"/>
+    <w:p>
+      <w:pPr>
+        <w:pStyle w:val="BodyText"/>
+      </w:pPr>
+      <w:r>
+        <w:rPr>
+          <w:b/>
+          <w:bCs/>
+        </w:rPr>
+        <w:t xml:space="preserve">Example 10 (Writing a named quantity by its name)</w:t>
+      </w:r>
+      <w:r>
+        <w:t xml:space="preserve"> </w:t>
+      </w:r>
+      <w:r>
+        <w:t xml:space="preserve"> </w:t>
+      </w:r>
+    </w:p>
+    <w:p>
+      <w:pPr>
+        <w:pStyle w:val="BlockText"/>
+      </w:pPr>
+      <w:r>
+        <w:t xml:space="preserve">❌ Source:</w:t>
+      </w:r>
+      <w:r>
+        <w:t xml:space="preserve"> </w:t>
+      </w:r>
+      <w:r>
+        <w:rPr>
+          <w:rStyle w:val="VerbatimChar"/>
+        </w:rPr>
+        <w:t xml:space="preserve">The gradient of the mean squared error is $\frac{2}{n} \tp{\design} \paren{\design\vcoef - \vy}$.</w:t>
+      </w:r>
+    </w:p>
+    <w:p>
+      <w:pPr>
+        <w:pStyle w:val="BlockText"/>
+      </w:pPr>
+      <w:r>
+        <w:t xml:space="preserve">✅ Source:</w:t>
+      </w:r>
+      <w:r>
+        <w:t xml:space="preserve"> </w:t>
+      </w:r>
+      <w:r>
+        <w:rPr>
+          <w:rStyle w:val="VerbatimChar"/>
+        </w:rPr>
+        <w:t xml:space="preserve">The gradient of the mean squared error is $\frac{2}{n} \tp{\design} \vprederr$.</w:t>
+      </w:r>
+    </w:p>
+    <w:p>
+      <w:pPr>
+        <w:pStyle w:val="FirstParagraph"/>
+      </w:pPr>
+      <w:r>
+        <w:t xml:space="preserve">The macro</w:t>
+      </w:r>
+      <w:r>
+        <w:t xml:space="preserve"> </w:t>
+      </w:r>
+      <w:r>
+        <w:rPr>
+          <w:rStyle w:val="VerbatimChar"/>
+        </w:rPr>
+        <w:t xml:space="preserve">\vprederr</w:t>
+      </w:r>
+      <w:r>
+        <w:t xml:space="preserve"> </w:t>
+      </w:r>
+      <w:r>
+        <w:t xml:space="preserve">prints the vector of prediction errors.</w:t>
+      </w:r>
+      <w:r>
+        <w:t xml:space="preserve"> </w:t>
+      </w:r>
+      <w:r>
+        <w:t xml:space="preserve">The document defines it once, where the model is introduced,</w:t>
+      </w:r>
+      <w:r>
+        <w:t xml:space="preserve"> </w:t>
+      </w:r>
+      <w:r>
+        <w:t xml:space="preserve">as</w:t>
+      </w:r>
+      <w:r>
+        <w:t xml:space="preserve"> </w:t>
+      </w:r>
+      <w:r>
+        <w:rPr>
+          <w:rStyle w:val="VerbatimChar"/>
+        </w:rPr>
+        <w:t xml:space="preserve">\vprederr = \design\vcoef - \vy</w:t>
+      </w:r>
+      <w:r>
+        <w:t xml:space="preserve">.</w:t>
+      </w:r>
+      <w:r>
+        <w:t xml:space="preserve"> </w:t>
+      </w:r>
+      <w:r>
+        <w:t xml:space="preserve">The ✅ version has one fewer level of brackets,</w:t>
+      </w:r>
+      <w:r>
+        <w:t xml:space="preserve"> </w:t>
+      </w:r>
+      <w:r>
+        <w:t xml:space="preserve">and it names the quantity the gradient depends on.</w:t>
+      </w:r>
+    </w:p>
+    <w:bookmarkEnd w:id="30"/>
+    <w:bookmarkEnd w:id="31"/>
+    <w:bookmarkStart w:id="33" w:name="writing-dot-products"/>
     <w:p>
       <w:pPr>
         <w:pStyle w:val="Heading2"/>
@@ -6413,7 +6949,7 @@
         <w:t xml:space="preserve">and to work out that the result is a single number.</w:t>
       </w:r>
     </w:p>
-    <w:bookmarkStart w:id="30" w:name="exm-dot-product"/>
+    <w:bookmarkStart w:id="32" w:name="exm-dot-product"/>
     <w:p>
       <w:pPr>
         <w:pStyle w:val="BodyText"/>
@@ -6423,7 +6959,7 @@
           <w:b/>
           <w:bCs/>
         </w:rPr>
-        <w:t xml:space="preserve">Example 9 (Writing a dot product)</w:t>
+        <w:t xml:space="preserve">Example 11 (Writing a dot product)</w:t>
       </w:r>
       <w:r>
         <w:t xml:space="preserve"> </w:t>
@@ -6642,7 +7178,7 @@
         <w:t xml:space="preserve">.</w:t>
       </w:r>
     </w:p>
-    <w:bookmarkEnd w:id="30"/>
+    <w:bookmarkEnd w:id="32"/>
     <w:p>
       <w:pPr>
         <w:pStyle w:val="BodyText"/>
@@ -6656,7 +7192,7 @@
         <w:pStyle w:val="Compact"/>
         <w:numPr>
           <w:ilvl w:val="0"/>
-          <w:numId w:val="1005"/>
+          <w:numId w:val="1006"/>
         </w:numPr>
       </w:pPr>
       <w:r>
@@ -6691,7 +7227,7 @@
         <w:pStyle w:val="Compact"/>
         <w:numPr>
           <w:ilvl w:val="0"/>
-          <w:numId w:val="1005"/>
+          <w:numId w:val="1006"/>
         </w:numPr>
       </w:pPr>
       <w:r>
@@ -6740,7 +7276,7 @@
         <w:pStyle w:val="Compact"/>
         <w:numPr>
           <w:ilvl w:val="0"/>
-          <w:numId w:val="1005"/>
+          <w:numId w:val="1006"/>
         </w:numPr>
       </w:pPr>
       <w:r>
@@ -6801,8 +7337,8 @@
         <w:t xml:space="preserve">such as a definition of an inner product space.</w:t>
       </w:r>
     </w:p>
-    <w:bookmarkEnd w:id="31"/>
-    <w:bookmarkStart w:id="34" w:name="writing-out-notational-shorthands"/>
+    <w:bookmarkEnd w:id="33"/>
+    <w:bookmarkStart w:id="36" w:name="writing-out-notational-shorthands"/>
     <w:p>
       <w:pPr>
         <w:pStyle w:val="Heading2"/>
@@ -7241,7 +7777,7 @@
       <w:r>
         <w:t xml:space="preserve"> </w:t>
       </w:r>
-      <w:hyperlink r:id="rId32">
+      <w:hyperlink r:id="rId34">
         <w:r>
           <w:rPr>
             <w:rStyle w:val="Hyperlink"/>
@@ -7282,7 +7818,7 @@
         <w:t xml:space="preserve">catalogs common shorthands and their full forms.</w:t>
       </w:r>
     </w:p>
-    <w:bookmarkStart w:id="33" w:name="exm-notational-shorthand"/>
+    <w:bookmarkStart w:id="35" w:name="exm-notational-shorthand"/>
     <w:p>
       <w:pPr>
         <w:pStyle w:val="BodyText"/>
@@ -7292,7 +7828,7 @@
           <w:b/>
           <w:bCs/>
         </w:rPr>
-        <w:t xml:space="preserve">Example 10 (Writing out the limits of a sum and the range of an index)</w:t>
+        <w:t xml:space="preserve">Example 12 (Writing out the limits of a sum and the range of an index)</w:t>
       </w:r>
       <w:r>
         <w:t xml:space="preserve"> </w:t>
@@ -7849,8 +8385,8 @@
         <w:t xml:space="preserve">observations.</w:t>
       </w:r>
     </w:p>
-    <w:bookmarkEnd w:id="33"/>
-    <w:bookmarkEnd w:id="34"/>
+    <w:bookmarkEnd w:id="35"/>
+    <w:bookmarkEnd w:id="36"/>
     <w:sectPr>
       <w:footnotePr>
         <w:numRestart w:val="eachSect"/>
@@ -8080,6 +8616,9 @@
     <w:abstractNumId w:val="991"/>
   </w:num>
   <w:num w:numId="1005">
+    <w:abstractNumId w:val="991"/>
+  </w:num>
+  <w:num w:numId="1006">
     <w:abstractNumId w:val="991"/>
   </w:num>
 </w:numbering>

</xml_diff>

<commit_message>
Deploying to gh-pages from @ Morrison-Lab/psw@4ae15b955b334f2c90eedbac04d2fd095d050b6f 🚀
</commit_message>
<xml_diff>
--- a/chapters/notation.docx
+++ b/chapters/notation.docx
@@ -15,7 +15,7 @@
         <w:pStyle w:val="Date"/>
       </w:pPr>
       <w:r>
-        <w:t xml:space="preserve">Last modified: 2026-10-08 21:22:09 (PDT)</w:t>
+        <w:t xml:space="preserve">Last modified: 2026-10-08 22:20:34 (PDT)</w:t>
       </w:r>
     </w:p>
     <w:tbl>
@@ -1245,7 +1245,7 @@
     </w:p>
     <w:bookmarkEnd w:id="14"/>
     <w:bookmarkEnd w:id="15"/>
-    <w:bookmarkStart w:id="20" w:name="one-operation-per-step"/>
+    <w:bookmarkStart w:id="25" w:name="one-operation-per-step"/>
     <w:p>
       <w:pPr>
         <w:pStyle w:val="Heading2"/>
@@ -2859,13 +2859,27 @@
         </w:numPr>
       </w:pPr>
       <w:r>
-        <w:t xml:space="preserve">applying the rule for the derivative of a sum</w:t>
-      </w:r>
-      <w:r>
-        <w:t xml:space="preserve"> </w:t>
-      </w:r>
-      <w:r>
-        <w:t xml:space="preserve">and the chain rule in the same line;</w:t>
+        <w:t xml:space="preserve">substituting a definition and then applying a rule to it</w:t>
+      </w:r>
+      <w:r>
+        <w:t xml:space="preserve"> </w:t>
+      </w:r>
+      <w:r>
+        <w:t xml:space="preserve">(see</w:t>
+      </w:r>
+      <w:r>
+        <w:t xml:space="preserve"> </w:t>
+      </w:r>
+      <w:hyperlink w:anchor="applying-a-definition-is-a-step">
+        <w:r>
+          <w:rPr>
+            <w:rStyle w:val="Hyperlink"/>
+          </w:rPr>
+          <w:t xml:space="preserve">Applying a definition is a step</w:t>
+        </w:r>
+      </w:hyperlink>
+      <w:r>
+        <w:t xml:space="preserve">);</w:t>
       </w:r>
     </w:p>
     <w:p>
@@ -2877,7 +2891,13 @@
         </w:numPr>
       </w:pPr>
       <w:r>
-        <w:t xml:space="preserve">substituting a result and then simplifying it;</w:t>
+        <w:t xml:space="preserve">applying the rule for the derivative of a sum</w:t>
+      </w:r>
+      <w:r>
+        <w:t xml:space="preserve"> </w:t>
+      </w:r>
+      <w:r>
+        <w:t xml:space="preserve">and the chain rule in the same line;</w:t>
       </w:r>
     </w:p>
     <w:p>
@@ -2889,7 +2909,7 @@
         </w:numPr>
       </w:pPr>
       <w:r>
-        <w:t xml:space="preserve">multiplying constants and factoring them out of a sum;</w:t>
+        <w:t xml:space="preserve">substituting a result and then simplifying it;</w:t>
       </w:r>
     </w:p>
     <w:p>
@@ -2901,7 +2921,7 @@
         </w:numPr>
       </w:pPr>
       <w:r>
-        <w:t xml:space="preserve">expanding a product and collecting like terms;</w:t>
+        <w:t xml:space="preserve">multiplying constants and factoring them out of a sum;</w:t>
       </w:r>
     </w:p>
     <w:p>
@@ -2913,250 +2933,7 @@
         </w:numPr>
       </w:pPr>
       <w:r>
-        <w:t xml:space="preserve">canceling</w:t>
-      </w:r>
-      <w:r>
-        <w:t xml:space="preserve"> </w:t>
-      </w:r>
-      <m:oMath>
-        <m:r>
-          <m:t>a</m:t>
-        </m:r>
-      </m:oMath>
-      <w:r>
-        <w:t xml:space="preserve"> </w:t>
-      </w:r>
-      <w:r>
-        <w:t xml:space="preserve">in</w:t>
-      </w:r>
-      <w:r>
-        <w:t xml:space="preserve"> </w:t>
-      </w:r>
-      <m:oMath>
-        <m:r>
-          <m:t>a</m:t>
-        </m:r>
-        <m:r>
-          <m:rPr>
-            <m:sty m:val="p"/>
-          </m:rPr>
-          <m:t>+</m:t>
-        </m:r>
-        <m:r>
-          <m:rPr>
-            <m:sty m:val="p"/>
-          </m:rPr>
-          <m:t>(</m:t>
-        </m:r>
-        <m:r>
-          <m:t>b</m:t>
-        </m:r>
-        <m:r>
-          <m:rPr>
-            <m:sty m:val="p"/>
-          </m:rPr>
-          <m:t>−</m:t>
-        </m:r>
-        <m:r>
-          <m:t>a</m:t>
-        </m:r>
-        <m:r>
-          <m:rPr>
-            <m:sty m:val="p"/>
-          </m:rPr>
-          <m:t>)</m:t>
-        </m:r>
-      </m:oMath>
-      <w:r>
-        <w:t xml:space="preserve"> </w:t>
-      </w:r>
-      <w:r>
-        <w:t xml:space="preserve">removes the parentheses (</w:t>
-      </w:r>
-      <m:oMath>
-        <m:r>
-          <m:t>a</m:t>
-        </m:r>
-        <m:r>
-          <m:rPr>
-            <m:sty m:val="p"/>
-          </m:rPr>
-          <m:t>+</m:t>
-        </m:r>
-        <m:r>
-          <m:t>b</m:t>
-        </m:r>
-        <m:r>
-          <m:rPr>
-            <m:sty m:val="p"/>
-          </m:rPr>
-          <m:t>−</m:t>
-        </m:r>
-        <m:r>
-          <m:t>a</m:t>
-        </m:r>
-      </m:oMath>
-      <w:r>
-        <w:t xml:space="preserve">),</w:t>
-      </w:r>
-      <w:r>
-        <w:t xml:space="preserve"> </w:t>
-      </w:r>
-      <w:r>
-        <w:t xml:space="preserve">reorders the terms (</w:t>
-      </w:r>
-      <m:oMath>
-        <m:r>
-          <m:t>b</m:t>
-        </m:r>
-        <m:r>
-          <m:rPr>
-            <m:sty m:val="p"/>
-          </m:rPr>
-          <m:t>+</m:t>
-        </m:r>
-        <m:r>
-          <m:t>a</m:t>
-        </m:r>
-        <m:r>
-          <m:rPr>
-            <m:sty m:val="p"/>
-          </m:rPr>
-          <m:t>−</m:t>
-        </m:r>
-        <m:r>
-          <m:t>a</m:t>
-        </m:r>
-      </m:oMath>
-      <w:r>
-        <w:t xml:space="preserve">),</w:t>
-      </w:r>
-      <w:r>
-        <w:t xml:space="preserve"> </w:t>
-      </w:r>
-      <w:r>
-        <w:t xml:space="preserve">groups the two that cancel (</w:t>
-      </w:r>
-      <m:oMath>
-        <m:r>
-          <m:t>b</m:t>
-        </m:r>
-        <m:r>
-          <m:rPr>
-            <m:sty m:val="p"/>
-          </m:rPr>
-          <m:t>+</m:t>
-        </m:r>
-        <m:r>
-          <m:rPr>
-            <m:sty m:val="p"/>
-          </m:rPr>
-          <m:t>(</m:t>
-        </m:r>
-        <m:r>
-          <m:t>a</m:t>
-        </m:r>
-        <m:r>
-          <m:rPr>
-            <m:sty m:val="p"/>
-          </m:rPr>
-          <m:t>−</m:t>
-        </m:r>
-        <m:r>
-          <m:t>a</m:t>
-        </m:r>
-        <m:r>
-          <m:rPr>
-            <m:sty m:val="p"/>
-          </m:rPr>
-          <m:t>)</m:t>
-        </m:r>
-      </m:oMath>
-      <w:r>
-        <w:t xml:space="preserve">),</w:t>
-      </w:r>
-      <w:r>
-        <w:t xml:space="preserve"> </w:t>
-      </w:r>
-      <w:r>
-        <w:t xml:space="preserve">replaces</w:t>
-      </w:r>
-      <w:r>
-        <w:t xml:space="preserve"> </w:t>
-      </w:r>
-      <m:oMath>
-        <m:r>
-          <m:t>a</m:t>
-        </m:r>
-        <m:r>
-          <m:rPr>
-            <m:sty m:val="p"/>
-          </m:rPr>
-          <m:t>−</m:t>
-        </m:r>
-        <m:r>
-          <m:t>a</m:t>
-        </m:r>
-      </m:oMath>
-      <w:r>
-        <w:t xml:space="preserve"> </w:t>
-      </w:r>
-      <w:r>
-        <w:t xml:space="preserve">with</w:t>
-      </w:r>
-      <w:r>
-        <w:t xml:space="preserve"> </w:t>
-      </w:r>
-      <m:oMath>
-        <m:r>
-          <m:t>0</m:t>
-        </m:r>
-      </m:oMath>
-      <w:r>
-        <w:t xml:space="preserve"> </w:t>
-      </w:r>
-      <w:r>
-        <w:t xml:space="preserve">(</w:t>
-      </w:r>
-      <m:oMath>
-        <m:r>
-          <m:t>b</m:t>
-        </m:r>
-        <m:r>
-          <m:rPr>
-            <m:sty m:val="p"/>
-          </m:rPr>
-          <m:t>+</m:t>
-        </m:r>
-        <m:r>
-          <m:t>0</m:t>
-        </m:r>
-      </m:oMath>
-      <w:r>
-        <w:t xml:space="preserve">),</w:t>
-      </w:r>
-      <w:r>
-        <w:t xml:space="preserve"> </w:t>
-      </w:r>
-      <w:r>
-        <w:t xml:space="preserve">and drops the</w:t>
-      </w:r>
-      <w:r>
-        <w:t xml:space="preserve"> </w:t>
-      </w:r>
-      <m:oMath>
-        <m:r>
-          <m:rPr>
-            <m:sty m:val="p"/>
-          </m:rPr>
-          <m:t>+</m:t>
-        </m:r>
-        <m:r>
-          <m:t>0</m:t>
-        </m:r>
-      </m:oMath>
-      <w:r>
-        <w:t xml:space="preserve">;</w:t>
+        <w:t xml:space="preserve">expanding a product and collecting like terms;</w:t>
       </w:r>
     </w:p>
     <w:p>
@@ -3175,6 +2952,261 @@
       </w:r>
       <m:oMath>
         <m:r>
+          <m:t>a</m:t>
+        </m:r>
+      </m:oMath>
+      <w:r>
+        <w:t xml:space="preserve"> </w:t>
+      </w:r>
+      <w:r>
+        <w:t xml:space="preserve">in</w:t>
+      </w:r>
+      <w:r>
+        <w:t xml:space="preserve"> </w:t>
+      </w:r>
+      <m:oMath>
+        <m:r>
+          <m:t>a</m:t>
+        </m:r>
+        <m:r>
+          <m:rPr>
+            <m:sty m:val="p"/>
+          </m:rPr>
+          <m:t>+</m:t>
+        </m:r>
+        <m:r>
+          <m:rPr>
+            <m:sty m:val="p"/>
+          </m:rPr>
+          <m:t>(</m:t>
+        </m:r>
+        <m:r>
+          <m:t>b</m:t>
+        </m:r>
+        <m:r>
+          <m:rPr>
+            <m:sty m:val="p"/>
+          </m:rPr>
+          <m:t>−</m:t>
+        </m:r>
+        <m:r>
+          <m:t>a</m:t>
+        </m:r>
+        <m:r>
+          <m:rPr>
+            <m:sty m:val="p"/>
+          </m:rPr>
+          <m:t>)</m:t>
+        </m:r>
+      </m:oMath>
+      <w:r>
+        <w:t xml:space="preserve"> </w:t>
+      </w:r>
+      <w:r>
+        <w:t xml:space="preserve">removes the parentheses (</w:t>
+      </w:r>
+      <m:oMath>
+        <m:r>
+          <m:t>a</m:t>
+        </m:r>
+        <m:r>
+          <m:rPr>
+            <m:sty m:val="p"/>
+          </m:rPr>
+          <m:t>+</m:t>
+        </m:r>
+        <m:r>
+          <m:t>b</m:t>
+        </m:r>
+        <m:r>
+          <m:rPr>
+            <m:sty m:val="p"/>
+          </m:rPr>
+          <m:t>−</m:t>
+        </m:r>
+        <m:r>
+          <m:t>a</m:t>
+        </m:r>
+      </m:oMath>
+      <w:r>
+        <w:t xml:space="preserve">),</w:t>
+      </w:r>
+      <w:r>
+        <w:t xml:space="preserve"> </w:t>
+      </w:r>
+      <w:r>
+        <w:t xml:space="preserve">reorders the terms (</w:t>
+      </w:r>
+      <m:oMath>
+        <m:r>
+          <m:t>b</m:t>
+        </m:r>
+        <m:r>
+          <m:rPr>
+            <m:sty m:val="p"/>
+          </m:rPr>
+          <m:t>+</m:t>
+        </m:r>
+        <m:r>
+          <m:t>a</m:t>
+        </m:r>
+        <m:r>
+          <m:rPr>
+            <m:sty m:val="p"/>
+          </m:rPr>
+          <m:t>−</m:t>
+        </m:r>
+        <m:r>
+          <m:t>a</m:t>
+        </m:r>
+      </m:oMath>
+      <w:r>
+        <w:t xml:space="preserve">),</w:t>
+      </w:r>
+      <w:r>
+        <w:t xml:space="preserve"> </w:t>
+      </w:r>
+      <w:r>
+        <w:t xml:space="preserve">groups the two that cancel (</w:t>
+      </w:r>
+      <m:oMath>
+        <m:r>
+          <m:t>b</m:t>
+        </m:r>
+        <m:r>
+          <m:rPr>
+            <m:sty m:val="p"/>
+          </m:rPr>
+          <m:t>+</m:t>
+        </m:r>
+        <m:r>
+          <m:rPr>
+            <m:sty m:val="p"/>
+          </m:rPr>
+          <m:t>(</m:t>
+        </m:r>
+        <m:r>
+          <m:t>a</m:t>
+        </m:r>
+        <m:r>
+          <m:rPr>
+            <m:sty m:val="p"/>
+          </m:rPr>
+          <m:t>−</m:t>
+        </m:r>
+        <m:r>
+          <m:t>a</m:t>
+        </m:r>
+        <m:r>
+          <m:rPr>
+            <m:sty m:val="p"/>
+          </m:rPr>
+          <m:t>)</m:t>
+        </m:r>
+      </m:oMath>
+      <w:r>
+        <w:t xml:space="preserve">),</w:t>
+      </w:r>
+      <w:r>
+        <w:t xml:space="preserve"> </w:t>
+      </w:r>
+      <w:r>
+        <w:t xml:space="preserve">replaces</w:t>
+      </w:r>
+      <w:r>
+        <w:t xml:space="preserve"> </w:t>
+      </w:r>
+      <m:oMath>
+        <m:r>
+          <m:t>a</m:t>
+        </m:r>
+        <m:r>
+          <m:rPr>
+            <m:sty m:val="p"/>
+          </m:rPr>
+          <m:t>−</m:t>
+        </m:r>
+        <m:r>
+          <m:t>a</m:t>
+        </m:r>
+      </m:oMath>
+      <w:r>
+        <w:t xml:space="preserve"> </w:t>
+      </w:r>
+      <w:r>
+        <w:t xml:space="preserve">with</w:t>
+      </w:r>
+      <w:r>
+        <w:t xml:space="preserve"> </w:t>
+      </w:r>
+      <m:oMath>
+        <m:r>
+          <m:t>0</m:t>
+        </m:r>
+      </m:oMath>
+      <w:r>
+        <w:t xml:space="preserve"> </w:t>
+      </w:r>
+      <w:r>
+        <w:t xml:space="preserve">(</w:t>
+      </w:r>
+      <m:oMath>
+        <m:r>
+          <m:t>b</m:t>
+        </m:r>
+        <m:r>
+          <m:rPr>
+            <m:sty m:val="p"/>
+          </m:rPr>
+          <m:t>+</m:t>
+        </m:r>
+        <m:r>
+          <m:t>0</m:t>
+        </m:r>
+      </m:oMath>
+      <w:r>
+        <w:t xml:space="preserve">),</w:t>
+      </w:r>
+      <w:r>
+        <w:t xml:space="preserve"> </w:t>
+      </w:r>
+      <w:r>
+        <w:t xml:space="preserve">and drops the</w:t>
+      </w:r>
+      <w:r>
+        <w:t xml:space="preserve"> </w:t>
+      </w:r>
+      <m:oMath>
+        <m:r>
+          <m:rPr>
+            <m:sty m:val="p"/>
+          </m:rPr>
+          <m:t>+</m:t>
+        </m:r>
+        <m:r>
+          <m:t>0</m:t>
+        </m:r>
+      </m:oMath>
+      <w:r>
+        <w:t xml:space="preserve">;</w:t>
+      </w:r>
+    </w:p>
+    <w:p>
+      <w:pPr>
+        <w:pStyle w:val="Compact"/>
+        <w:numPr>
+          <w:ilvl w:val="0"/>
+          <w:numId w:val="1002"/>
+        </w:numPr>
+      </w:pPr>
+      <w:r>
+        <w:t xml:space="preserve">canceling</w:t>
+      </w:r>
+      <w:r>
+        <w:t xml:space="preserve"> </w:t>
+      </w:r>
+      <m:oMath>
+        <m:r>
           <m:t>n</m:t>
         </m:r>
       </m:oMath>
@@ -3559,13 +3591,13 @@
         <w:t xml:space="preserve">which hides two operations in a sentence.</w:t>
       </w:r>
     </w:p>
-    <w:bookmarkStart w:id="18" w:name="using-a-fact-the-reader-has-not-seen"/>
+    <w:bookmarkStart w:id="19" w:name="applying-a-definition-is-a-step"/>
     <w:p>
       <w:pPr>
         <w:pStyle w:val="Heading3"/>
       </w:pPr>
       <w:r>
-        <w:t xml:space="preserve">2.1 Using a fact the reader has not seen</w:t>
+        <w:t xml:space="preserve">2.1 Applying a definition is a step</w:t>
       </w:r>
     </w:p>
     <w:p>
@@ -3573,6 +3605,712 @@
         <w:pStyle w:val="FirstParagraph"/>
       </w:pPr>
       <w:r>
+        <w:t xml:space="preserve">Replacing a named quantity with its definition</w:t>
+      </w:r>
+      <w:r>
+        <w:t xml:space="preserve"> </w:t>
+      </w:r>
+      <w:r>
+        <w:t xml:space="preserve">is one of the most important steps in a derivation.</w:t>
+      </w:r>
+      <w:r>
+        <w:t xml:space="preserve"> </w:t>
+      </w:r>
+      <w:r>
+        <w:t xml:space="preserve">It is where the general rules meet the specific problem,</w:t>
+      </w:r>
+      <w:r>
+        <w:t xml:space="preserve"> </w:t>
+      </w:r>
+      <w:r>
+        <w:t xml:space="preserve">so never skip it or merge it into the next step.</w:t>
+      </w:r>
+      <w:r>
+        <w:t xml:space="preserve"> </w:t>
+      </w:r>
+      <w:r>
+        <w:t xml:space="preserve">Give it its own line, justified as</w:t>
+      </w:r>
+      <w:r>
+        <w:t xml:space="preserve"> </w:t>
+      </w:r>
+      <w:r>
+        <w:t xml:space="preserve">“definition of …”</w:t>
+      </w:r>
+      <w:r>
+        <w:t xml:space="preserve">.</w:t>
+      </w:r>
+      <w:r>
+        <w:t xml:space="preserve"> </w:t>
+      </w:r>
+      <w:r>
+        <w:t xml:space="preserve">The same holds for a result from an earlier part of the same problem:</w:t>
+      </w:r>
+      <w:r>
+        <w:t xml:space="preserve"> </w:t>
+      </w:r>
+      <w:r>
+        <w:t xml:space="preserve">substitute it on its own line, and cite the part.</w:t>
+      </w:r>
+    </w:p>
+    <w:bookmarkStart w:id="18" w:name="exm-apply-definition-step"/>
+    <w:p>
+      <w:pPr>
+        <w:pStyle w:val="BodyText"/>
+      </w:pPr>
+      <w:r>
+        <w:rPr>
+          <w:b/>
+          <w:bCs/>
+        </w:rPr>
+        <w:t xml:space="preserve">Example 4 (Applying the definition of a vector before differentiating it)</w:t>
+      </w:r>
+      <w:r>
+        <w:t xml:space="preserve"> </w:t>
+      </w:r>
+      <w:r>
+        <w:t xml:space="preserve">Suppose the prediction error vector is defined as</w:t>
+      </w:r>
+      <w:r>
+        <w:t xml:space="preserve"> </w:t>
+      </w:r>
+      <m:oMath>
+        <m:acc>
+          <m:accPr>
+            <m:chr m:val="̃"/>
+          </m:accPr>
+          <m:e>
+            <m:r>
+              <m:t>e</m:t>
+            </m:r>
+          </m:e>
+        </m:acc>
+        <m:r>
+          <m:rPr>
+            <m:sty m:val="p"/>
+          </m:rPr>
+          <m:t>=</m:t>
+        </m:r>
+        <m:r>
+          <m:rPr>
+            <m:sty m:val="p"/>
+          </m:rPr>
+          <m:t>Φ</m:t>
+        </m:r>
+        <m:acc>
+          <m:accPr>
+            <m:chr m:val="̃"/>
+          </m:accPr>
+          <m:e>
+            <m:r>
+              <m:t>β</m:t>
+            </m:r>
+          </m:e>
+        </m:acc>
+        <m:r>
+          <m:rPr>
+            <m:sty m:val="p"/>
+          </m:rPr>
+          <m:t>−</m:t>
+        </m:r>
+        <m:acc>
+          <m:accPr>
+            <m:chr m:val="̃"/>
+          </m:accPr>
+          <m:e>
+            <m:r>
+              <m:t>y</m:t>
+            </m:r>
+          </m:e>
+        </m:acc>
+      </m:oMath>
+      <w:r>
+        <w:t xml:space="preserve">,</w:t>
+      </w:r>
+      <w:r>
+        <w:t xml:space="preserve"> </w:t>
+      </w:r>
+      <w:r>
+        <w:t xml:space="preserve">and a derivation needs its derivative with respect to</w:t>
+      </w:r>
+      <w:r>
+        <w:t xml:space="preserve"> </w:t>
+      </w:r>
+      <m:oMath>
+        <m:acc>
+          <m:accPr>
+            <m:chr m:val="̃"/>
+          </m:accPr>
+          <m:e>
+            <m:r>
+              <m:t>β</m:t>
+            </m:r>
+          </m:e>
+        </m:acc>
+      </m:oMath>
+      <w:r>
+        <w:t xml:space="preserve">.</w:t>
+      </w:r>
+    </w:p>
+    <w:p>
+      <w:pPr>
+        <w:pStyle w:val="BlockText"/>
+      </w:pPr>
+      <w:r>
+        <w:t xml:space="preserve">❌</w:t>
+      </w:r>
+    </w:p>
+    <w:p>
+      <w:pPr>
+        <w:pStyle w:val="BlockText"/>
+      </w:pPr>
+      <m:oMathPara>
+        <m:oMathParaPr>
+          <m:jc m:val="center"/>
+        </m:oMathParaPr>
+        <m:oMath>
+          <m:eqArr>
+            <m:e>
+              <m:f>
+                <m:fPr>
+                  <m:type m:val="bar"/>
+                </m:fPr>
+                <m:num>
+                  <m:r>
+                    <m:rPr>
+                      <m:sty m:val="p"/>
+                    </m:rPr>
+                    <m:t>∂</m:t>
+                  </m:r>
+                </m:num>
+                <m:den>
+                  <m:r>
+                    <m:rPr>
+                      <m:sty m:val="p"/>
+                    </m:rPr>
+                    <m:t>∂</m:t>
+                  </m:r>
+                  <m:acc>
+                    <m:accPr>
+                      <m:chr m:val="̃"/>
+                    </m:accPr>
+                    <m:e>
+                      <m:r>
+                        <m:t>β</m:t>
+                      </m:r>
+                    </m:e>
+                  </m:acc>
+                </m:den>
+              </m:f>
+              <m:acc>
+                <m:accPr>
+                  <m:chr m:val="̃"/>
+                </m:accPr>
+                <m:e>
+                  <m:r>
+                    <m:t>e</m:t>
+                  </m:r>
+                </m:e>
+              </m:acc>
+              <m:r>
+                <m:t>&amp;</m:t>
+              </m:r>
+              <m:r>
+                <m:rPr>
+                  <m:sty m:val="p"/>
+                </m:rPr>
+                <m:t>=</m:t>
+              </m:r>
+              <m:f>
+                <m:fPr>
+                  <m:type m:val="bar"/>
+                </m:fPr>
+                <m:num>
+                  <m:r>
+                    <m:rPr>
+                      <m:sty m:val="p"/>
+                    </m:rPr>
+                    <m:t>∂</m:t>
+                  </m:r>
+                </m:num>
+                <m:den>
+                  <m:r>
+                    <m:rPr>
+                      <m:sty m:val="p"/>
+                    </m:rPr>
+                    <m:t>∂</m:t>
+                  </m:r>
+                  <m:acc>
+                    <m:accPr>
+                      <m:chr m:val="̃"/>
+                    </m:accPr>
+                    <m:e>
+                      <m:r>
+                        <m:t>β</m:t>
+                      </m:r>
+                    </m:e>
+                  </m:acc>
+                </m:den>
+              </m:f>
+              <m:r>
+                <m:rPr>
+                  <m:sty m:val="p"/>
+                </m:rPr>
+                <m:t>(</m:t>
+              </m:r>
+              <m:r>
+                <m:rPr>
+                  <m:sty m:val="p"/>
+                </m:rPr>
+                <m:t>Φ</m:t>
+              </m:r>
+              <m:acc>
+                <m:accPr>
+                  <m:chr m:val="̃"/>
+                </m:accPr>
+                <m:e>
+                  <m:r>
+                    <m:t>β</m:t>
+                  </m:r>
+                </m:e>
+              </m:acc>
+              <m:r>
+                <m:rPr>
+                  <m:sty m:val="p"/>
+                </m:rPr>
+                <m:t>)</m:t>
+              </m:r>
+              <m:r>
+                <m:rPr>
+                  <m:sty m:val="p"/>
+                </m:rPr>
+                <m:t>−</m:t>
+              </m:r>
+              <m:f>
+                <m:fPr>
+                  <m:type m:val="bar"/>
+                </m:fPr>
+                <m:num>
+                  <m:r>
+                    <m:rPr>
+                      <m:sty m:val="p"/>
+                    </m:rPr>
+                    <m:t>∂</m:t>
+                  </m:r>
+                </m:num>
+                <m:den>
+                  <m:r>
+                    <m:rPr>
+                      <m:sty m:val="p"/>
+                    </m:rPr>
+                    <m:t>∂</m:t>
+                  </m:r>
+                  <m:acc>
+                    <m:accPr>
+                      <m:chr m:val="̃"/>
+                    </m:accPr>
+                    <m:e>
+                      <m:r>
+                        <m:t>β</m:t>
+                      </m:r>
+                    </m:e>
+                  </m:acc>
+                </m:den>
+              </m:f>
+              <m:acc>
+                <m:accPr>
+                  <m:chr m:val="̃"/>
+                </m:accPr>
+                <m:e>
+                  <m:r>
+                    <m:t>y</m:t>
+                  </m:r>
+                </m:e>
+              </m:acc>
+              <m:r>
+                <m:t>&amp;</m:t>
+              </m:r>
+              <m:r>
+                <m:t>&amp;</m:t>
+              </m:r>
+              <m:r>
+                <m:rPr>
+                  <m:nor/>
+                  <m:sty m:val="p"/>
+                </m:rPr>
+                <m:t>(derivative of a difference)</m:t>
+              </m:r>
+            </m:e>
+          </m:eqArr>
+        </m:oMath>
+      </m:oMathPara>
+    </w:p>
+    <w:p>
+      <w:pPr>
+        <w:pStyle w:val="BlockText"/>
+      </w:pPr>
+      <w:r>
+        <w:t xml:space="preserve">✅</w:t>
+      </w:r>
+    </w:p>
+    <w:p>
+      <w:pPr>
+        <w:pStyle w:val="BlockText"/>
+      </w:pPr>
+      <m:oMathPara>
+        <m:oMathParaPr>
+          <m:jc m:val="center"/>
+        </m:oMathParaPr>
+        <m:oMath>
+          <m:eqArr>
+            <m:e>
+              <m:f>
+                <m:fPr>
+                  <m:type m:val="bar"/>
+                </m:fPr>
+                <m:num>
+                  <m:r>
+                    <m:rPr>
+                      <m:sty m:val="p"/>
+                    </m:rPr>
+                    <m:t>∂</m:t>
+                  </m:r>
+                </m:num>
+                <m:den>
+                  <m:r>
+                    <m:rPr>
+                      <m:sty m:val="p"/>
+                    </m:rPr>
+                    <m:t>∂</m:t>
+                  </m:r>
+                  <m:acc>
+                    <m:accPr>
+                      <m:chr m:val="̃"/>
+                    </m:accPr>
+                    <m:e>
+                      <m:r>
+                        <m:t>β</m:t>
+                      </m:r>
+                    </m:e>
+                  </m:acc>
+                </m:den>
+              </m:f>
+              <m:acc>
+                <m:accPr>
+                  <m:chr m:val="̃"/>
+                </m:accPr>
+                <m:e>
+                  <m:r>
+                    <m:t>e</m:t>
+                  </m:r>
+                </m:e>
+              </m:acc>
+              <m:r>
+                <m:t>&amp;</m:t>
+              </m:r>
+              <m:r>
+                <m:rPr>
+                  <m:sty m:val="p"/>
+                </m:rPr>
+                <m:t>=</m:t>
+              </m:r>
+              <m:f>
+                <m:fPr>
+                  <m:type m:val="bar"/>
+                </m:fPr>
+                <m:num>
+                  <m:r>
+                    <m:rPr>
+                      <m:sty m:val="p"/>
+                    </m:rPr>
+                    <m:t>∂</m:t>
+                  </m:r>
+                </m:num>
+                <m:den>
+                  <m:r>
+                    <m:rPr>
+                      <m:sty m:val="p"/>
+                    </m:rPr>
+                    <m:t>∂</m:t>
+                  </m:r>
+                  <m:acc>
+                    <m:accPr>
+                      <m:chr m:val="̃"/>
+                    </m:accPr>
+                    <m:e>
+                      <m:r>
+                        <m:t>β</m:t>
+                      </m:r>
+                    </m:e>
+                  </m:acc>
+                </m:den>
+              </m:f>
+              <m:r>
+                <m:rPr>
+                  <m:sty m:val="p"/>
+                </m:rPr>
+                <m:t>(</m:t>
+              </m:r>
+              <m:r>
+                <m:rPr>
+                  <m:sty m:val="p"/>
+                </m:rPr>
+                <m:t>Φ</m:t>
+              </m:r>
+              <m:acc>
+                <m:accPr>
+                  <m:chr m:val="̃"/>
+                </m:accPr>
+                <m:e>
+                  <m:r>
+                    <m:t>β</m:t>
+                  </m:r>
+                </m:e>
+              </m:acc>
+              <m:r>
+                <m:rPr>
+                  <m:sty m:val="p"/>
+                </m:rPr>
+                <m:t>−</m:t>
+              </m:r>
+              <m:acc>
+                <m:accPr>
+                  <m:chr m:val="̃"/>
+                </m:accPr>
+                <m:e>
+                  <m:r>
+                    <m:t>y</m:t>
+                  </m:r>
+                </m:e>
+              </m:acc>
+              <m:r>
+                <m:rPr>
+                  <m:sty m:val="p"/>
+                </m:rPr>
+                <m:t>)</m:t>
+              </m:r>
+              <m:r>
+                <m:t>&amp;</m:t>
+              </m:r>
+              <m:r>
+                <m:t>&amp;</m:t>
+              </m:r>
+              <m:r>
+                <m:rPr>
+                  <m:nor/>
+                  <m:sty m:val="p"/>
+                </m:rPr>
+                <m:t>(definition of </m:t>
+              </m:r>
+              <m:acc>
+                <m:accPr>
+                  <m:chr m:val="̃"/>
+                </m:accPr>
+                <m:e>
+                  <m:r>
+                    <m:t>e</m:t>
+                  </m:r>
+                </m:e>
+              </m:acc>
+              <m:r>
+                <m:rPr>
+                  <m:nor/>
+                  <m:sty m:val="p"/>
+                </m:rPr>
+                <m:t>)</m:t>
+              </m:r>
+            </m:e>
+            <m:e>
+              <m:r>
+                <m:t>&amp;</m:t>
+              </m:r>
+              <m:r>
+                <m:rPr>
+                  <m:sty m:val="p"/>
+                </m:rPr>
+                <m:t>=</m:t>
+              </m:r>
+              <m:f>
+                <m:fPr>
+                  <m:type m:val="bar"/>
+                </m:fPr>
+                <m:num>
+                  <m:r>
+                    <m:rPr>
+                      <m:sty m:val="p"/>
+                    </m:rPr>
+                    <m:t>∂</m:t>
+                  </m:r>
+                </m:num>
+                <m:den>
+                  <m:r>
+                    <m:rPr>
+                      <m:sty m:val="p"/>
+                    </m:rPr>
+                    <m:t>∂</m:t>
+                  </m:r>
+                  <m:acc>
+                    <m:accPr>
+                      <m:chr m:val="̃"/>
+                    </m:accPr>
+                    <m:e>
+                      <m:r>
+                        <m:t>β</m:t>
+                      </m:r>
+                    </m:e>
+                  </m:acc>
+                </m:den>
+              </m:f>
+              <m:r>
+                <m:rPr>
+                  <m:sty m:val="p"/>
+                </m:rPr>
+                <m:t>(</m:t>
+              </m:r>
+              <m:r>
+                <m:rPr>
+                  <m:sty m:val="p"/>
+                </m:rPr>
+                <m:t>Φ</m:t>
+              </m:r>
+              <m:acc>
+                <m:accPr>
+                  <m:chr m:val="̃"/>
+                </m:accPr>
+                <m:e>
+                  <m:r>
+                    <m:t>β</m:t>
+                  </m:r>
+                </m:e>
+              </m:acc>
+              <m:r>
+                <m:rPr>
+                  <m:sty m:val="p"/>
+                </m:rPr>
+                <m:t>)</m:t>
+              </m:r>
+              <m:r>
+                <m:rPr>
+                  <m:sty m:val="p"/>
+                </m:rPr>
+                <m:t>−</m:t>
+              </m:r>
+              <m:f>
+                <m:fPr>
+                  <m:type m:val="bar"/>
+                </m:fPr>
+                <m:num>
+                  <m:r>
+                    <m:rPr>
+                      <m:sty m:val="p"/>
+                    </m:rPr>
+                    <m:t>∂</m:t>
+                  </m:r>
+                </m:num>
+                <m:den>
+                  <m:r>
+                    <m:rPr>
+                      <m:sty m:val="p"/>
+                    </m:rPr>
+                    <m:t>∂</m:t>
+                  </m:r>
+                  <m:acc>
+                    <m:accPr>
+                      <m:chr m:val="̃"/>
+                    </m:accPr>
+                    <m:e>
+                      <m:r>
+                        <m:t>β</m:t>
+                      </m:r>
+                    </m:e>
+                  </m:acc>
+                </m:den>
+              </m:f>
+              <m:acc>
+                <m:accPr>
+                  <m:chr m:val="̃"/>
+                </m:accPr>
+                <m:e>
+                  <m:r>
+                    <m:t>y</m:t>
+                  </m:r>
+                </m:e>
+              </m:acc>
+              <m:r>
+                <m:t>&amp;</m:t>
+              </m:r>
+              <m:r>
+                <m:t>&amp;</m:t>
+              </m:r>
+              <m:r>
+                <m:rPr>
+                  <m:nor/>
+                  <m:sty m:val="p"/>
+                </m:rPr>
+                <m:t>(derivative of a difference)</m:t>
+              </m:r>
+            </m:e>
+          </m:eqArr>
+        </m:oMath>
+      </m:oMathPara>
+    </w:p>
+    <w:p>
+      <w:pPr>
+        <w:pStyle w:val="FirstParagraph"/>
+      </w:pPr>
+      <w:r>
+        <w:t xml:space="preserve">The ❌ version applies the definition of</w:t>
+      </w:r>
+      <w:r>
+        <w:t xml:space="preserve"> </w:t>
+      </w:r>
+      <m:oMath>
+        <m:acc>
+          <m:accPr>
+            <m:chr m:val="̃"/>
+          </m:accPr>
+          <m:e>
+            <m:r>
+              <m:t>e</m:t>
+            </m:r>
+          </m:e>
+        </m:acc>
+      </m:oMath>
+      <w:r>
+        <w:t xml:space="preserve"> </w:t>
+      </w:r>
+      <w:r>
+        <w:t xml:space="preserve">and the rule for a difference in one line,</w:t>
+      </w:r>
+      <w:r>
+        <w:t xml:space="preserve"> </w:t>
+      </w:r>
+      <w:r>
+        <w:t xml:space="preserve">and its justification names only the rule.</w:t>
+      </w:r>
+      <w:r>
+        <w:t xml:space="preserve"> </w:t>
+      </w:r>
+      <w:r>
+        <w:t xml:space="preserve">The ✅ version shows the definition on its own line.</w:t>
+      </w:r>
+    </w:p>
+    <w:bookmarkEnd w:id="18"/>
+    <w:bookmarkEnd w:id="19"/>
+    <w:bookmarkStart w:id="20" w:name="using-a-fact-the-reader-has-not-seen"/>
+    <w:p>
+      <w:pPr>
+        <w:pStyle w:val="Heading3"/>
+      </w:pPr>
+      <w:r>
+        <w:t xml:space="preserve">2.2 Using a fact the reader has not seen</w:t>
+      </w:r>
+    </w:p>
+    <w:p>
+      <w:pPr>
+        <w:pStyle w:val="FirstParagraph"/>
+      </w:pPr>
+      <w:r>
         <w:t xml:space="preserve">When a step relies on a fact the document has not yet shown,</w:t>
       </w:r>
       <w:r>
@@ -3600,14 +4338,14 @@
         <w:t xml:space="preserve">Don’t leave the fact as an unexplained justification.</w:t>
       </w:r>
     </w:p>
-    <w:bookmarkEnd w:id="18"/>
-    <w:bookmarkStart w:id="19" w:name="long-derivations"/>
+    <w:bookmarkEnd w:id="20"/>
+    <w:bookmarkStart w:id="24" w:name="long-derivations"/>
     <w:p>
       <w:pPr>
         <w:pStyle w:val="Heading3"/>
       </w:pPr>
       <w:r>
-        <w:t xml:space="preserve">2.2 Long derivations</w:t>
+        <w:t xml:space="preserve">2.3 Long derivations</w:t>
       </w:r>
     </w:p>
     <w:p>
@@ -3634,24 +4372,6 @@
       </w:r>
       <w:r>
         <w:t xml:space="preserve">then plug that result back into the main derivation.</w:t>
-      </w:r>
-      <w:r>
-        <w:t xml:space="preserve"> </w:t>
-      </w:r>
-      <w:r>
-        <w:t xml:space="preserve">For example, when you apply the chain rule,</w:t>
-      </w:r>
-      <w:r>
-        <w:t xml:space="preserve"> </w:t>
-      </w:r>
-      <w:r>
-        <w:t xml:space="preserve">derive the inner derivative in a separate block</w:t>
-      </w:r>
-      <w:r>
-        <w:t xml:space="preserve"> </w:t>
-      </w:r>
-      <w:r>
-        <w:t xml:space="preserve">before you substitute it.</w:t>
       </w:r>
       <w:r>
         <w:t xml:space="preserve"> </w:t>
@@ -3801,15 +4521,13 @@
         <w:t xml:space="preserve">can also keep each line short.</w:t>
       </w:r>
     </w:p>
-    <w:bookmarkEnd w:id="19"/>
-    <w:bookmarkEnd w:id="20"/>
-    <w:bookmarkStart w:id="22" w:name="functions-and-their-values"/>
-    <w:p>
-      <w:pPr>
-        <w:pStyle w:val="Heading2"/>
-      </w:pPr>
-      <w:r>
-        <w:t xml:space="preserve">3 Functions and their values</w:t>
+    <w:bookmarkStart w:id="21" w:name="X00e3fe72795486834d7309e5f3912c392b664b0"/>
+    <w:p>
+      <w:pPr>
+        <w:pStyle w:val="Heading4"/>
+      </w:pPr>
+      <w:r>
+        <w:t xml:space="preserve">Show why you need a result before you derive it</w:t>
       </w:r>
     </w:p>
     <w:p>
@@ -3817,379 +4535,188 @@
         <w:pStyle w:val="FirstParagraph"/>
       </w:pPr>
       <w:r>
-        <w:t xml:space="preserve">A function and its value at a point are different objects.</w:t>
-      </w:r>
-      <w:r>
-        <w:t xml:space="preserve"> </w:t>
-      </w:r>
-      <w:r>
-        <w:t xml:space="preserve">In</w:t>
-      </w:r>
-      <w:r>
-        <w:t xml:space="preserve"> </w:t>
-      </w:r>
-      <m:oMath>
-        <m:sSub>
-          <m:e>
-            <m:r>
-              <m:t>μ</m:t>
-            </m:r>
-          </m:e>
-          <m:sub>
-            <m:r>
-              <m:t>i</m:t>
-            </m:r>
-          </m:sub>
-        </m:sSub>
-        <m:r>
-          <m:rPr>
-            <m:sty m:val="p"/>
-          </m:rPr>
-          <m:t>=</m:t>
-        </m:r>
-        <m:r>
-          <m:t>μ</m:t>
-        </m:r>
-        <m:r>
-          <m:rPr>
-            <m:sty m:val="p"/>
-          </m:rPr>
-          <m:t>(</m:t>
-        </m:r>
-        <m:sSub>
-          <m:e>
-            <m:r>
-              <m:t>x</m:t>
-            </m:r>
-          </m:e>
-          <m:sub>
-            <m:r>
-              <m:t>i</m:t>
-            </m:r>
-          </m:sub>
-        </m:sSub>
-        <m:r>
-          <m:rPr>
-            <m:sty m:val="p"/>
-          </m:rPr>
-          <m:t>)</m:t>
-        </m:r>
-      </m:oMath>
-      <w:r>
-        <w:t xml:space="preserve">,</w:t>
-      </w:r>
-      <w:r>
-        <w:t xml:space="preserve"> </w:t>
-      </w:r>
-      <m:oMath>
-        <m:r>
-          <m:t>μ</m:t>
-        </m:r>
-      </m:oMath>
-      <w:r>
-        <w:t xml:space="preserve"> </w:t>
-      </w:r>
-      <w:r>
-        <w:t xml:space="preserve">is a function,</w:t>
-      </w:r>
-      <w:r>
-        <w:t xml:space="preserve"> </w:t>
-      </w:r>
-      <w:r>
-        <w:t xml:space="preserve">and</w:t>
-      </w:r>
-      <w:r>
-        <w:t xml:space="preserve"> </w:t>
-      </w:r>
-      <m:oMath>
-        <m:r>
-          <m:t>μ</m:t>
-        </m:r>
-        <m:r>
-          <m:rPr>
-            <m:sty m:val="p"/>
-          </m:rPr>
-          <m:t>(</m:t>
-        </m:r>
-        <m:sSub>
-          <m:e>
-            <m:r>
-              <m:t>x</m:t>
-            </m:r>
-          </m:e>
-          <m:sub>
-            <m:r>
-              <m:t>i</m:t>
-            </m:r>
-          </m:sub>
-        </m:sSub>
-        <m:r>
-          <m:rPr>
-            <m:sty m:val="p"/>
-          </m:rPr>
-          <m:t>)</m:t>
-        </m:r>
-      </m:oMath>
-      <w:r>
-        <w:t xml:space="preserve"> </w:t>
-      </w:r>
-      <w:r>
-        <w:t xml:space="preserve">is a number:</w:t>
-      </w:r>
-      <w:r>
-        <w:t xml:space="preserve"> </w:t>
-      </w:r>
-      <w:r>
-        <w:t xml:space="preserve">the value of</w:t>
-      </w:r>
-      <w:r>
-        <w:t xml:space="preserve"> </w:t>
-      </w:r>
-      <m:oMath>
-        <m:r>
-          <m:t>μ</m:t>
-        </m:r>
-      </m:oMath>
-      <w:r>
-        <w:t xml:space="preserve"> </w:t>
-      </w:r>
-      <w:r>
-        <w:t xml:space="preserve">at</w:t>
-      </w:r>
-      <w:r>
-        <w:t xml:space="preserve"> </w:t>
-      </w:r>
-      <m:oMath>
-        <m:sSub>
-          <m:e>
-            <m:r>
-              <m:t>x</m:t>
-            </m:r>
-          </m:e>
-          <m:sub>
-            <m:r>
-              <m:t>i</m:t>
-            </m:r>
-          </m:sub>
-        </m:sSub>
-      </m:oMath>
-      <w:r>
-        <w:t xml:space="preserve">.</w:t>
-      </w:r>
-      <w:r>
-        <w:t xml:space="preserve"> </w:t>
-      </w:r>
-      <w:r>
-        <w:t xml:space="preserve">Written with its placeholder argument,</w:t>
-      </w:r>
-      <w:r>
-        <w:t xml:space="preserve"> </w:t>
-      </w:r>
-      <m:oMath>
-        <m:r>
-          <m:t>μ</m:t>
-        </m:r>
-        <m:r>
-          <m:rPr>
-            <m:sty m:val="p"/>
-          </m:rPr>
-          <m:t>(</m:t>
-        </m:r>
-        <m:r>
-          <m:t>x</m:t>
-        </m:r>
-        <m:r>
-          <m:rPr>
-            <m:sty m:val="p"/>
-          </m:rPr>
-          <m:t>)</m:t>
-        </m:r>
-      </m:oMath>
-      <w:r>
-        <w:t xml:space="preserve"> </w:t>
-      </w:r>
-      <w:r>
-        <w:t xml:space="preserve">already denotes a value,</w:t>
-      </w:r>
-      <w:r>
-        <w:t xml:space="preserve"> </w:t>
-      </w:r>
-      <w:r>
-        <w:t xml:space="preserve">so</w:t>
-      </w:r>
-      <w:r>
-        <w:t xml:space="preserve"> </w:t>
-      </w:r>
-      <w:r>
-        <w:t xml:space="preserve">“the value of</w:t>
-      </w:r>
-      <w:r>
-        <w:t xml:space="preserve"> </w:t>
-      </w:r>
-      <m:oMath>
-        <m:r>
-          <m:t>μ</m:t>
-        </m:r>
-        <m:r>
-          <m:rPr>
-            <m:sty m:val="p"/>
-          </m:rPr>
-          <m:t>(</m:t>
-        </m:r>
-        <m:r>
-          <m:t>x</m:t>
-        </m:r>
-        <m:r>
-          <m:rPr>
-            <m:sty m:val="p"/>
-          </m:rPr>
-          <m:t>)</m:t>
-        </m:r>
-      </m:oMath>
-      <w:r>
-        <w:t xml:space="preserve"> </w:t>
-      </w:r>
-      <w:r>
-        <w:t xml:space="preserve">at</w:t>
-      </w:r>
-      <w:r>
-        <w:t xml:space="preserve"> </w:t>
-      </w:r>
-      <m:oMath>
-        <m:sSub>
-          <m:e>
-            <m:r>
-              <m:t>x</m:t>
-            </m:r>
-          </m:e>
-          <m:sub>
-            <m:r>
-              <m:t>i</m:t>
-            </m:r>
-          </m:sub>
-        </m:sSub>
-      </m:oMath>
-      <w:r>
-        <w:t xml:space="preserve">”</w:t>
-      </w:r>
-      <w:r>
-        <w:t xml:space="preserve"> </w:t>
-      </w:r>
-      <w:r>
-        <w:t xml:space="preserve">reads as a value of a value.</w:t>
-      </w:r>
-      <w:r>
-        <w:t xml:space="preserve"> </w:t>
-      </w:r>
-      <w:r>
-        <w:t xml:space="preserve">Either drop the placeholder and write</w:t>
-      </w:r>
-      <w:r>
-        <w:t xml:space="preserve"> </w:t>
-      </w:r>
-      <w:r>
-        <w:t xml:space="preserve">“the value of</w:t>
-      </w:r>
-      <w:r>
-        <w:t xml:space="preserve"> </w:t>
-      </w:r>
-      <m:oMath>
-        <m:r>
-          <m:t>μ</m:t>
-        </m:r>
-      </m:oMath>
-      <w:r>
-        <w:t xml:space="preserve"> </w:t>
-      </w:r>
-      <w:r>
-        <w:t xml:space="preserve">at</w:t>
-      </w:r>
-      <w:r>
-        <w:t xml:space="preserve"> </w:t>
-      </w:r>
-      <m:oMath>
-        <m:sSub>
-          <m:e>
-            <m:r>
-              <m:t>x</m:t>
-            </m:r>
-          </m:e>
-          <m:sub>
-            <m:r>
-              <m:t>i</m:t>
-            </m:r>
-          </m:sub>
-        </m:sSub>
-      </m:oMath>
-      <w:r>
-        <w:t xml:space="preserve">”</w:t>
-      </w:r>
-      <w:r>
-        <w:t xml:space="preserve">,</w:t>
-      </w:r>
-      <w:r>
-        <w:t xml:space="preserve"> </w:t>
-      </w:r>
-      <w:r>
-        <w:t xml:space="preserve">or keep the placeholder and name the substitution:</w:t>
-      </w:r>
-      <w:r>
-        <w:t xml:space="preserve"> </w:t>
-      </w:r>
-      <w:r>
-        <w:t xml:space="preserve">“</w:t>
-      </w:r>
-      <m:oMath>
-        <m:r>
-          <m:t>μ</m:t>
-        </m:r>
-        <m:r>
-          <m:rPr>
-            <m:sty m:val="p"/>
-          </m:rPr>
-          <m:t>(</m:t>
-        </m:r>
-        <m:r>
-          <m:t>x</m:t>
-        </m:r>
-        <m:r>
-          <m:rPr>
-            <m:sty m:val="p"/>
-          </m:rPr>
-          <m:t>)</m:t>
-        </m:r>
-      </m:oMath>
-      <w:r>
-        <w:t xml:space="preserve"> </w:t>
-      </w:r>
-      <w:r>
-        <w:t xml:space="preserve">evaluated at</w:t>
-      </w:r>
-      <w:r>
-        <w:t xml:space="preserve"> </w:t>
-      </w:r>
-      <m:oMath>
-        <m:sSub>
-          <m:e>
-            <m:r>
-              <m:t>x</m:t>
-            </m:r>
-          </m:e>
-          <m:sub>
-            <m:r>
-              <m:t>i</m:t>
-            </m:r>
-          </m:sub>
-        </m:sSub>
-      </m:oMath>
-      <w:r>
-        <w:t xml:space="preserve">”</w:t>
-      </w:r>
-      <w:r>
-        <w:t xml:space="preserve">.</w:t>
-      </w:r>
-    </w:p>
-    <w:bookmarkStart w:id="21" w:name="exm-function-evaluated-at"/>
+        <w:t xml:space="preserve">Derive an intermediate result only after the main derivation</w:t>
+      </w:r>
+      <w:r>
+        <w:t xml:space="preserve"> </w:t>
+      </w:r>
+      <w:r>
+        <w:t xml:space="preserve">has shown that it needs that result.</w:t>
+      </w:r>
+      <w:r>
+        <w:t xml:space="preserve"> </w:t>
+      </w:r>
+      <w:r>
+        <w:t xml:space="preserve">For example, to differentiate a composite function:</w:t>
+      </w:r>
+    </w:p>
+    <w:p>
+      <w:pPr>
+        <w:pStyle w:val="Compact"/>
+        <w:numPr>
+          <w:ilvl w:val="0"/>
+          <w:numId w:val="1003"/>
+        </w:numPr>
+      </w:pPr>
+      <w:r>
+        <w:t xml:space="preserve">Start the main derivation, and apply the chain rule.</w:t>
+      </w:r>
+      <w:r>
+        <w:t xml:space="preserve"> </w:t>
+      </w:r>
+      <w:r>
+        <w:t xml:space="preserve">The result is a product of an inner and an outer derivative, not yet known.</w:t>
+      </w:r>
+    </w:p>
+    <w:p>
+      <w:pPr>
+        <w:pStyle w:val="Compact"/>
+        <w:numPr>
+          <w:ilvl w:val="0"/>
+          <w:numId w:val="1003"/>
+        </w:numPr>
+      </w:pPr>
+      <w:r>
+        <w:t xml:space="preserve">Pause the main derivation, and derive the inner derivative in its own block.</w:t>
+      </w:r>
+    </w:p>
+    <w:p>
+      <w:pPr>
+        <w:pStyle w:val="Compact"/>
+        <w:numPr>
+          <w:ilvl w:val="0"/>
+          <w:numId w:val="1003"/>
+        </w:numPr>
+      </w:pPr>
+      <w:r>
+        <w:t xml:space="preserve">Derive the outer derivative in its own block.</w:t>
+      </w:r>
+    </w:p>
+    <w:p>
+      <w:pPr>
+        <w:pStyle w:val="Compact"/>
+        <w:numPr>
+          <w:ilvl w:val="0"/>
+          <w:numId w:val="1003"/>
+        </w:numPr>
+      </w:pPr>
+      <w:r>
+        <w:t xml:space="preserve">Return to the main derivation, and substitute both results.</w:t>
+      </w:r>
+    </w:p>
+    <w:p>
+      <w:pPr>
+        <w:pStyle w:val="FirstParagraph"/>
+      </w:pPr>
+      <w:r>
+        <w:t xml:space="preserve">A reader who meets the inner derivative first</w:t>
+      </w:r>
+      <w:r>
+        <w:t xml:space="preserve"> </w:t>
+      </w:r>
+      <w:r>
+        <w:t xml:space="preserve">does not yet know what it is for.</w:t>
+      </w:r>
+    </w:p>
+    <w:bookmarkEnd w:id="21"/>
+    <w:bookmarkStart w:id="23" w:name="color-where-a-result-is-used"/>
+    <w:p>
+      <w:pPr>
+        <w:pStyle w:val="Heading4"/>
+      </w:pPr>
+      <w:r>
+        <w:t xml:space="preserve">Color where a result is used</w:t>
+      </w:r>
+    </w:p>
+    <w:p>
+      <w:pPr>
+        <w:pStyle w:val="FirstParagraph"/>
+      </w:pPr>
+      <w:r>
+        <w:t xml:space="preserve">Give each intermediate result a text color,</w:t>
+      </w:r>
+      <w:r>
+        <w:t xml:space="preserve"> </w:t>
+      </w:r>
+      <w:r>
+        <w:t xml:space="preserve">and use the same color wherever that result appears:</w:t>
+      </w:r>
+    </w:p>
+    <w:p>
+      <w:pPr>
+        <w:pStyle w:val="Compact"/>
+        <w:numPr>
+          <w:ilvl w:val="0"/>
+          <w:numId w:val="1004"/>
+        </w:numPr>
+      </w:pPr>
+      <w:r>
+        <w:t xml:space="preserve">in the line where a later step needs it, as a placeholder;</w:t>
+      </w:r>
+    </w:p>
+    <w:p>
+      <w:pPr>
+        <w:pStyle w:val="Compact"/>
+        <w:numPr>
+          <w:ilvl w:val="0"/>
+          <w:numId w:val="1004"/>
+        </w:numPr>
+      </w:pPr>
+      <w:r>
+        <w:t xml:space="preserve">in the line of its own derivation where it is found;</w:t>
+      </w:r>
+    </w:p>
+    <w:p>
+      <w:pPr>
+        <w:pStyle w:val="Compact"/>
+        <w:numPr>
+          <w:ilvl w:val="0"/>
+          <w:numId w:val="1004"/>
+        </w:numPr>
+      </w:pPr>
+      <w:r>
+        <w:t xml:space="preserve">in each line where it is substituted back in.</w:t>
+      </w:r>
+    </w:p>
+    <w:p>
+      <w:pPr>
+        <w:pStyle w:val="FirstParagraph"/>
+      </w:pPr>
+      <w:r>
+        <w:t xml:space="preserve">State the color key in words at the start of the derivation,</w:t>
+      </w:r>
+      <w:r>
+        <w:t xml:space="preserve"> </w:t>
+      </w:r>
+      <w:r>
+        <w:t xml:space="preserve">so the derivation is still readable without color,</w:t>
+      </w:r>
+      <w:r>
+        <w:t xml:space="preserve"> </w:t>
+      </w:r>
+      <w:r>
+        <w:t xml:space="preserve">for example in grayscale print or for readers who do not see color differences.</w:t>
+      </w:r>
+      <w:r>
+        <w:t xml:space="preserve"> </w:t>
+      </w:r>
+      <w:r>
+        <w:t xml:space="preserve">Use</w:t>
+      </w:r>
+      <w:r>
+        <w:t xml:space="preserve"> </w:t>
+      </w:r>
+      <w:r>
+        <w:rPr>
+          <w:rStyle w:val="VerbatimChar"/>
+        </w:rPr>
+        <w:t xml:space="preserve">\textcolor{name}{...}</w:t>
+      </w:r>
+      <w:r>
+        <w:t xml:space="preserve">, which renders in HTML (MathJax) and in PDF.</w:t>
+      </w:r>
+    </w:p>
+    <w:bookmarkStart w:id="22" w:name="exm-color-plug-in"/>
     <w:p>
       <w:pPr>
         <w:pStyle w:val="BodyText"/>
@@ -4199,7 +4726,595 @@
           <w:b/>
           <w:bCs/>
         </w:rPr>
-        <w:t xml:space="preserve">Example 4 (Saying where a function is evaluated)</w:t>
+        <w:t xml:space="preserve">Example 5 (Coloring the two factors of a chain rule)</w:t>
+      </w:r>
+      <w:r>
+        <w:t xml:space="preserve"> </w:t>
+      </w:r>
+      <w:r>
+        <w:t xml:space="preserve">Writing the mean squared error as</w:t>
+      </w:r>
+      <w:r>
+        <w:t xml:space="preserve"> </w:t>
+      </w:r>
+      <m:oMath>
+        <m:f>
+          <m:fPr>
+            <m:type m:val="bar"/>
+          </m:fPr>
+          <m:num>
+            <m:r>
+              <m:t>1</m:t>
+            </m:r>
+          </m:num>
+          <m:den>
+            <m:r>
+              <m:t>n</m:t>
+            </m:r>
+          </m:den>
+        </m:f>
+        <m:acc>
+          <m:accPr>
+            <m:chr m:val="̃"/>
+          </m:accPr>
+          <m:e>
+            <m:r>
+              <m:t>e</m:t>
+            </m:r>
+          </m:e>
+        </m:acc>
+        <m:r>
+          <m:rPr>
+            <m:sty m:val="p"/>
+          </m:rPr>
+          <m:t>⋅</m:t>
+        </m:r>
+        <m:acc>
+          <m:accPr>
+            <m:chr m:val="̃"/>
+          </m:accPr>
+          <m:e>
+            <m:r>
+              <m:t>e</m:t>
+            </m:r>
+          </m:e>
+        </m:acc>
+      </m:oMath>
+      <w:r>
+        <w:t xml:space="preserve">,</w:t>
+      </w:r>
+      <w:r>
+        <w:t xml:space="preserve"> </w:t>
+      </w:r>
+      <w:r>
+        <w:t xml:space="preserve">with</w:t>
+      </w:r>
+      <w:r>
+        <w:t xml:space="preserve"> </w:t>
+      </w:r>
+      <m:oMath>
+        <m:acc>
+          <m:accPr>
+            <m:chr m:val="̃"/>
+          </m:accPr>
+          <m:e>
+            <m:r>
+              <m:t>e</m:t>
+            </m:r>
+          </m:e>
+        </m:acc>
+        <m:r>
+          <m:rPr>
+            <m:sty m:val="p"/>
+          </m:rPr>
+          <m:t>=</m:t>
+        </m:r>
+        <m:r>
+          <m:rPr>
+            <m:sty m:val="p"/>
+          </m:rPr>
+          <m:t>Φ</m:t>
+        </m:r>
+        <m:acc>
+          <m:accPr>
+            <m:chr m:val="̃"/>
+          </m:accPr>
+          <m:e>
+            <m:r>
+              <m:t>β</m:t>
+            </m:r>
+          </m:e>
+        </m:acc>
+        <m:r>
+          <m:rPr>
+            <m:sty m:val="p"/>
+          </m:rPr>
+          <m:t>−</m:t>
+        </m:r>
+        <m:acc>
+          <m:accPr>
+            <m:chr m:val="̃"/>
+          </m:accPr>
+          <m:e>
+            <m:r>
+              <m:t>y</m:t>
+            </m:r>
+          </m:e>
+        </m:acc>
+      </m:oMath>
+      <w:r>
+        <w:t xml:space="preserve">,</w:t>
+      </w:r>
+      <w:r>
+        <w:t xml:space="preserve"> </w:t>
+      </w:r>
+      <w:r>
+        <w:t xml:space="preserve">the chain rule gives</w:t>
+      </w:r>
+    </w:p>
+    <w:p>
+      <w:pPr>
+        <w:pStyle w:val="BodyText"/>
+      </w:pPr>
+      <w:r>
+        <w:t xml:space="preserve">$$
+    \frac{\partial}{\partial \tilde{\beta}} \text{MSE}(\tilde{\beta})
+    = \textcolor{blue}{\left(\frac{\partial}{\partial \tilde{\beta}} \tilde{e}\right)}
+      \textcolor{red}{\left(\frac{\partial}{\partial \tilde{e}} \frac{1}{n} \tilde{e} \cdot \tilde{e}\right)}.
+    $$</w:t>
+      </w:r>
+    </w:p>
+    <w:p>
+      <w:pPr>
+        <w:pStyle w:val="FirstParagraph"/>
+      </w:pPr>
+      <w:r>
+        <w:t xml:space="preserve">Separate blocks then find</w:t>
+      </w:r>
+      <w:r>
+        <w:t xml:space="preserve"> </w:t>
+      </w:r>
+      <w:r>
+        <w:t xml:space="preserve">$\textcolor{blue}{\frac{\partial}{\partial \tilde{\beta}} \tilde{e}} = \textcolor{blue}{\Phi^\top}$</w:t>
+      </w:r>
+      <w:r>
+        <w:t xml:space="preserve"> </w:t>
+      </w:r>
+      <w:r>
+        <w:t xml:space="preserve">and</w:t>
+      </w:r>
+      <w:r>
+        <w:t xml:space="preserve"> </w:t>
+      </w:r>
+      <w:r>
+        <w:t xml:space="preserve">$\textcolor{red}{\frac{\partial}{\partial \tilde{e}} \frac{1}{n} \tilde{e} \cdot \tilde{e}} = \textcolor{red}{\frac{2}{n} \tilde{e}}$</w:t>
+      </w:r>
+      <w:r>
+        <w:t xml:space="preserve">,</w:t>
+      </w:r>
+      <w:r>
+        <w:t xml:space="preserve"> </w:t>
+      </w:r>
+      <w:r>
+        <w:t xml:space="preserve">and the main derivation resumes with</w:t>
+      </w:r>
+      <w:r>
+        <w:t xml:space="preserve"> </w:t>
+      </w:r>
+      <w:r>
+        <w:t xml:space="preserve">$\textcolor{blue}{\Phi^\top} \textcolor{red}{\left(\frac{2}{n} \tilde{e}\right)}$</w:t>
+      </w:r>
+      <w:r>
+        <w:t xml:space="preserve">.</w:t>
+      </w:r>
+      <w:r>
+        <w:t xml:space="preserve"> </w:t>
+      </w:r>
+      <w:r>
+        <w:t xml:space="preserve">The colors show at a glance which block each factor came from.</w:t>
+      </w:r>
+    </w:p>
+    <w:bookmarkEnd w:id="22"/>
+    <w:bookmarkEnd w:id="23"/>
+    <w:bookmarkEnd w:id="24"/>
+    <w:bookmarkEnd w:id="25"/>
+    <w:bookmarkStart w:id="27" w:name="functions-and-their-values"/>
+    <w:p>
+      <w:pPr>
+        <w:pStyle w:val="Heading2"/>
+      </w:pPr>
+      <w:r>
+        <w:t xml:space="preserve">3 Functions and their values</w:t>
+      </w:r>
+    </w:p>
+    <w:p>
+      <w:pPr>
+        <w:pStyle w:val="FirstParagraph"/>
+      </w:pPr>
+      <w:r>
+        <w:t xml:space="preserve">A function and its value at a point are different objects.</w:t>
+      </w:r>
+      <w:r>
+        <w:t xml:space="preserve"> </w:t>
+      </w:r>
+      <w:r>
+        <w:t xml:space="preserve">In</w:t>
+      </w:r>
+      <w:r>
+        <w:t xml:space="preserve"> </w:t>
+      </w:r>
+      <m:oMath>
+        <m:sSub>
+          <m:e>
+            <m:r>
+              <m:t>μ</m:t>
+            </m:r>
+          </m:e>
+          <m:sub>
+            <m:r>
+              <m:t>i</m:t>
+            </m:r>
+          </m:sub>
+        </m:sSub>
+        <m:r>
+          <m:rPr>
+            <m:sty m:val="p"/>
+          </m:rPr>
+          <m:t>=</m:t>
+        </m:r>
+        <m:r>
+          <m:t>μ</m:t>
+        </m:r>
+        <m:r>
+          <m:rPr>
+            <m:sty m:val="p"/>
+          </m:rPr>
+          <m:t>(</m:t>
+        </m:r>
+        <m:sSub>
+          <m:e>
+            <m:r>
+              <m:t>x</m:t>
+            </m:r>
+          </m:e>
+          <m:sub>
+            <m:r>
+              <m:t>i</m:t>
+            </m:r>
+          </m:sub>
+        </m:sSub>
+        <m:r>
+          <m:rPr>
+            <m:sty m:val="p"/>
+          </m:rPr>
+          <m:t>)</m:t>
+        </m:r>
+      </m:oMath>
+      <w:r>
+        <w:t xml:space="preserve">,</w:t>
+      </w:r>
+      <w:r>
+        <w:t xml:space="preserve"> </w:t>
+      </w:r>
+      <m:oMath>
+        <m:r>
+          <m:t>μ</m:t>
+        </m:r>
+      </m:oMath>
+      <w:r>
+        <w:t xml:space="preserve"> </w:t>
+      </w:r>
+      <w:r>
+        <w:t xml:space="preserve">is a function,</w:t>
+      </w:r>
+      <w:r>
+        <w:t xml:space="preserve"> </w:t>
+      </w:r>
+      <w:r>
+        <w:t xml:space="preserve">and</w:t>
+      </w:r>
+      <w:r>
+        <w:t xml:space="preserve"> </w:t>
+      </w:r>
+      <m:oMath>
+        <m:r>
+          <m:t>μ</m:t>
+        </m:r>
+        <m:r>
+          <m:rPr>
+            <m:sty m:val="p"/>
+          </m:rPr>
+          <m:t>(</m:t>
+        </m:r>
+        <m:sSub>
+          <m:e>
+            <m:r>
+              <m:t>x</m:t>
+            </m:r>
+          </m:e>
+          <m:sub>
+            <m:r>
+              <m:t>i</m:t>
+            </m:r>
+          </m:sub>
+        </m:sSub>
+        <m:r>
+          <m:rPr>
+            <m:sty m:val="p"/>
+          </m:rPr>
+          <m:t>)</m:t>
+        </m:r>
+      </m:oMath>
+      <w:r>
+        <w:t xml:space="preserve"> </w:t>
+      </w:r>
+      <w:r>
+        <w:t xml:space="preserve">is a number:</w:t>
+      </w:r>
+      <w:r>
+        <w:t xml:space="preserve"> </w:t>
+      </w:r>
+      <w:r>
+        <w:t xml:space="preserve">the value of</w:t>
+      </w:r>
+      <w:r>
+        <w:t xml:space="preserve"> </w:t>
+      </w:r>
+      <m:oMath>
+        <m:r>
+          <m:t>μ</m:t>
+        </m:r>
+      </m:oMath>
+      <w:r>
+        <w:t xml:space="preserve"> </w:t>
+      </w:r>
+      <w:r>
+        <w:t xml:space="preserve">at</w:t>
+      </w:r>
+      <w:r>
+        <w:t xml:space="preserve"> </w:t>
+      </w:r>
+      <m:oMath>
+        <m:sSub>
+          <m:e>
+            <m:r>
+              <m:t>x</m:t>
+            </m:r>
+          </m:e>
+          <m:sub>
+            <m:r>
+              <m:t>i</m:t>
+            </m:r>
+          </m:sub>
+        </m:sSub>
+      </m:oMath>
+      <w:r>
+        <w:t xml:space="preserve">.</w:t>
+      </w:r>
+      <w:r>
+        <w:t xml:space="preserve"> </w:t>
+      </w:r>
+      <w:r>
+        <w:t xml:space="preserve">Written with its placeholder argument,</w:t>
+      </w:r>
+      <w:r>
+        <w:t xml:space="preserve"> </w:t>
+      </w:r>
+      <m:oMath>
+        <m:r>
+          <m:t>μ</m:t>
+        </m:r>
+        <m:r>
+          <m:rPr>
+            <m:sty m:val="p"/>
+          </m:rPr>
+          <m:t>(</m:t>
+        </m:r>
+        <m:r>
+          <m:t>x</m:t>
+        </m:r>
+        <m:r>
+          <m:rPr>
+            <m:sty m:val="p"/>
+          </m:rPr>
+          <m:t>)</m:t>
+        </m:r>
+      </m:oMath>
+      <w:r>
+        <w:t xml:space="preserve"> </w:t>
+      </w:r>
+      <w:r>
+        <w:t xml:space="preserve">already denotes a value,</w:t>
+      </w:r>
+      <w:r>
+        <w:t xml:space="preserve"> </w:t>
+      </w:r>
+      <w:r>
+        <w:t xml:space="preserve">so</w:t>
+      </w:r>
+      <w:r>
+        <w:t xml:space="preserve"> </w:t>
+      </w:r>
+      <w:r>
+        <w:t xml:space="preserve">“the value of</w:t>
+      </w:r>
+      <w:r>
+        <w:t xml:space="preserve"> </w:t>
+      </w:r>
+      <m:oMath>
+        <m:r>
+          <m:t>μ</m:t>
+        </m:r>
+        <m:r>
+          <m:rPr>
+            <m:sty m:val="p"/>
+          </m:rPr>
+          <m:t>(</m:t>
+        </m:r>
+        <m:r>
+          <m:t>x</m:t>
+        </m:r>
+        <m:r>
+          <m:rPr>
+            <m:sty m:val="p"/>
+          </m:rPr>
+          <m:t>)</m:t>
+        </m:r>
+      </m:oMath>
+      <w:r>
+        <w:t xml:space="preserve"> </w:t>
+      </w:r>
+      <w:r>
+        <w:t xml:space="preserve">at</w:t>
+      </w:r>
+      <w:r>
+        <w:t xml:space="preserve"> </w:t>
+      </w:r>
+      <m:oMath>
+        <m:sSub>
+          <m:e>
+            <m:r>
+              <m:t>x</m:t>
+            </m:r>
+          </m:e>
+          <m:sub>
+            <m:r>
+              <m:t>i</m:t>
+            </m:r>
+          </m:sub>
+        </m:sSub>
+      </m:oMath>
+      <w:r>
+        <w:t xml:space="preserve">”</w:t>
+      </w:r>
+      <w:r>
+        <w:t xml:space="preserve"> </w:t>
+      </w:r>
+      <w:r>
+        <w:t xml:space="preserve">reads as a value of a value.</w:t>
+      </w:r>
+      <w:r>
+        <w:t xml:space="preserve"> </w:t>
+      </w:r>
+      <w:r>
+        <w:t xml:space="preserve">Either drop the placeholder and write</w:t>
+      </w:r>
+      <w:r>
+        <w:t xml:space="preserve"> </w:t>
+      </w:r>
+      <w:r>
+        <w:t xml:space="preserve">“the value of</w:t>
+      </w:r>
+      <w:r>
+        <w:t xml:space="preserve"> </w:t>
+      </w:r>
+      <m:oMath>
+        <m:r>
+          <m:t>μ</m:t>
+        </m:r>
+      </m:oMath>
+      <w:r>
+        <w:t xml:space="preserve"> </w:t>
+      </w:r>
+      <w:r>
+        <w:t xml:space="preserve">at</w:t>
+      </w:r>
+      <w:r>
+        <w:t xml:space="preserve"> </w:t>
+      </w:r>
+      <m:oMath>
+        <m:sSub>
+          <m:e>
+            <m:r>
+              <m:t>x</m:t>
+            </m:r>
+          </m:e>
+          <m:sub>
+            <m:r>
+              <m:t>i</m:t>
+            </m:r>
+          </m:sub>
+        </m:sSub>
+      </m:oMath>
+      <w:r>
+        <w:t xml:space="preserve">”</w:t>
+      </w:r>
+      <w:r>
+        <w:t xml:space="preserve">,</w:t>
+      </w:r>
+      <w:r>
+        <w:t xml:space="preserve"> </w:t>
+      </w:r>
+      <w:r>
+        <w:t xml:space="preserve">or keep the placeholder and name the substitution:</w:t>
+      </w:r>
+      <w:r>
+        <w:t xml:space="preserve"> </w:t>
+      </w:r>
+      <w:r>
+        <w:t xml:space="preserve">“</w:t>
+      </w:r>
+      <m:oMath>
+        <m:r>
+          <m:t>μ</m:t>
+        </m:r>
+        <m:r>
+          <m:rPr>
+            <m:sty m:val="p"/>
+          </m:rPr>
+          <m:t>(</m:t>
+        </m:r>
+        <m:r>
+          <m:t>x</m:t>
+        </m:r>
+        <m:r>
+          <m:rPr>
+            <m:sty m:val="p"/>
+          </m:rPr>
+          <m:t>)</m:t>
+        </m:r>
+      </m:oMath>
+      <w:r>
+        <w:t xml:space="preserve"> </w:t>
+      </w:r>
+      <w:r>
+        <w:t xml:space="preserve">evaluated at</w:t>
+      </w:r>
+      <w:r>
+        <w:t xml:space="preserve"> </w:t>
+      </w:r>
+      <m:oMath>
+        <m:sSub>
+          <m:e>
+            <m:r>
+              <m:t>x</m:t>
+            </m:r>
+          </m:e>
+          <m:sub>
+            <m:r>
+              <m:t>i</m:t>
+            </m:r>
+          </m:sub>
+        </m:sSub>
+      </m:oMath>
+      <w:r>
+        <w:t xml:space="preserve">”</w:t>
+      </w:r>
+      <w:r>
+        <w:t xml:space="preserve">.</w:t>
+      </w:r>
+    </w:p>
+    <w:bookmarkStart w:id="26" w:name="exm-function-evaluated-at"/>
+    <w:p>
+      <w:pPr>
+        <w:pStyle w:val="BodyText"/>
+      </w:pPr>
+      <w:r>
+        <w:rPr>
+          <w:b/>
+          <w:bCs/>
+        </w:rPr>
+        <w:t xml:space="preserve">Example 6 (Saying where a function is evaluated)</w:t>
       </w:r>
       <w:r>
         <w:t xml:space="preserve"> </w:t>
@@ -4644,7 +5759,7 @@
         <w:t xml:space="preserve">the nearest candidate is the mean function, not the outcome.</w:t>
       </w:r>
     </w:p>
-    <w:bookmarkEnd w:id="21"/>
+    <w:bookmarkEnd w:id="26"/>
     <w:p>
       <w:pPr>
         <w:pStyle w:val="BodyText"/>
@@ -4658,7 +5773,7 @@
         <w:pStyle w:val="Compact"/>
         <w:numPr>
           <w:ilvl w:val="0"/>
-          <w:numId w:val="1003"/>
+          <w:numId w:val="1005"/>
         </w:numPr>
       </w:pPr>
       <w:r>
@@ -4690,7 +5805,7 @@
         <w:pStyle w:val="Compact"/>
         <w:numPr>
           <w:ilvl w:val="0"/>
-          <w:numId w:val="1003"/>
+          <w:numId w:val="1005"/>
         </w:numPr>
       </w:pPr>
       <w:r>
@@ -4877,7 +5992,7 @@
         <w:pStyle w:val="Compact"/>
         <w:numPr>
           <w:ilvl w:val="0"/>
-          <w:numId w:val="1003"/>
+          <w:numId w:val="1005"/>
         </w:numPr>
       </w:pPr>
       <w:r>
@@ -4962,8 +6077,8 @@
         <w:t xml:space="preserve">, for a value.</w:t>
       </w:r>
     </w:p>
-    <w:bookmarkEnd w:id="22"/>
-    <w:bookmarkStart w:id="25" w:name="matching-names-and-notation"/>
+    <w:bookmarkEnd w:id="27"/>
+    <w:bookmarkStart w:id="30" w:name="matching-names-and-notation"/>
     <w:p>
       <w:pPr>
         <w:pStyle w:val="Heading2"/>
@@ -5074,7 +6189,7 @@
       <w:r>
         <w:t xml:space="preserve"> </w:t>
       </w:r>
-      <w:hyperlink r:id="rId23">
+      <w:hyperlink r:id="rId28">
         <w:r>
           <w:rPr>
             <w:rStyle w:val="Hyperlink"/>
@@ -5086,7 +6201,7 @@
         <w:t xml:space="preserve">).</w:t>
       </w:r>
     </w:p>
-    <w:bookmarkStart w:id="24" w:name="exm-name-matches-notation"/>
+    <w:bookmarkStart w:id="29" w:name="exm-name-matches-notation"/>
     <w:p>
       <w:pPr>
         <w:pStyle w:val="BodyText"/>
@@ -5096,7 +6211,7 @@
           <w:b/>
           <w:bCs/>
         </w:rPr>
-        <w:t xml:space="preserve">Example 5 (Matching a name to its notation)</w:t>
+        <w:t xml:space="preserve">Example 7 (Matching a name to its notation)</w:t>
       </w:r>
       <w:r>
         <w:t xml:space="preserve"> </w:t>
@@ -5579,7 +6694,7 @@
         <w:t xml:space="preserve">.</w:t>
       </w:r>
     </w:p>
-    <w:bookmarkEnd w:id="24"/>
+    <w:bookmarkEnd w:id="29"/>
     <w:p>
       <w:pPr>
         <w:pStyle w:val="BodyText"/>
@@ -5600,8 +6715,8 @@
         <w:t xml:space="preserve">and make them agree.</w:t>
       </w:r>
     </w:p>
-    <w:bookmarkEnd w:id="25"/>
-    <w:bookmarkStart w:id="31" w:name="using-shared-macros"/>
+    <w:bookmarkEnd w:id="30"/>
+    <w:bookmarkStart w:id="36" w:name="using-shared-macros"/>
     <w:p>
       <w:pPr>
         <w:pStyle w:val="Heading2"/>
@@ -5674,7 +6789,7 @@
         <w:t xml:space="preserve">so the next document finds it.</w:t>
       </w:r>
     </w:p>
-    <w:bookmarkStart w:id="26" w:name="exm-use-shared-macro"/>
+    <w:bookmarkStart w:id="31" w:name="exm-use-shared-macro"/>
     <w:p>
       <w:pPr>
         <w:pStyle w:val="BodyText"/>
@@ -5684,7 +6799,7 @@
           <w:b/>
           <w:bCs/>
         </w:rPr>
-        <w:t xml:space="preserve">Example 6 (Using a shared macro)</w:t>
+        <w:t xml:space="preserve">Example 8 (Using a shared macro)</w:t>
       </w:r>
       <w:r>
         <w:t xml:space="preserve"> </w:t>
@@ -5759,7 +6874,7 @@
         <w:t xml:space="preserve">every document that uses the macro changes with it.</w:t>
       </w:r>
     </w:p>
-    <w:bookmarkEnd w:id="26"/>
+    <w:bookmarkEnd w:id="31"/>
     <w:p>
       <w:pPr>
         <w:pStyle w:val="BodyText"/>
@@ -5773,7 +6888,7 @@
         <w:pStyle w:val="Compact"/>
         <w:numPr>
           <w:ilvl w:val="0"/>
-          <w:numId w:val="1004"/>
+          <w:numId w:val="1006"/>
         </w:numPr>
       </w:pPr>
       <w:r>
@@ -5785,7 +6900,7 @@
         <w:pStyle w:val="Compact"/>
         <w:numPr>
           <w:ilvl w:val="0"/>
-          <w:numId w:val="1004"/>
+          <w:numId w:val="1006"/>
         </w:numPr>
       </w:pPr>
       <w:r>
@@ -5797,7 +6912,7 @@
         <w:pStyle w:val="Compact"/>
         <w:numPr>
           <w:ilvl w:val="0"/>
-          <w:numId w:val="1004"/>
+          <w:numId w:val="1006"/>
         </w:numPr>
       </w:pPr>
       <w:r>
@@ -5809,7 +6924,7 @@
         <w:pStyle w:val="Compact"/>
         <w:numPr>
           <w:ilvl w:val="0"/>
-          <w:numId w:val="1004"/>
+          <w:numId w:val="1006"/>
         </w:numPr>
       </w:pPr>
       <w:r>
@@ -5821,7 +6936,7 @@
         <w:pStyle w:val="Compact"/>
         <w:numPr>
           <w:ilvl w:val="0"/>
-          <w:numId w:val="1004"/>
+          <w:numId w:val="1006"/>
         </w:numPr>
       </w:pPr>
       <w:r>
@@ -5833,7 +6948,7 @@
         <w:pStyle w:val="Compact"/>
         <w:numPr>
           <w:ilvl w:val="0"/>
-          <w:numId w:val="1004"/>
+          <w:numId w:val="1006"/>
         </w:numPr>
       </w:pPr>
       <w:r>
@@ -5949,7 +7064,7 @@
         <w:t xml:space="preserve">.</w:t>
       </w:r>
     </w:p>
-    <w:bookmarkStart w:id="27" w:name="exm-semantic-macro-name"/>
+    <w:bookmarkStart w:id="32" w:name="exm-semantic-macro-name"/>
     <w:p>
       <w:pPr>
         <w:pStyle w:val="BodyText"/>
@@ -5959,7 +7074,7 @@
           <w:b/>
           <w:bCs/>
         </w:rPr>
-        <w:t xml:space="preserve">Example 7 (Naming a macro for its meaning)</w:t>
+        <w:t xml:space="preserve">Example 9 (Naming a macro for its meaning)</w:t>
       </w:r>
       <w:r>
         <w:t xml:space="preserve"> </w:t>
@@ -6028,7 +7143,7 @@
         <w:t xml:space="preserve">changes one line in the shared file.</w:t>
       </w:r>
     </w:p>
-    <w:bookmarkEnd w:id="27"/>
+    <w:bookmarkEnd w:id="32"/>
     <w:p>
       <w:pPr>
         <w:pStyle w:val="BodyText"/>
@@ -6150,7 +7265,7 @@
         <w:t xml:space="preserve">existing hats are converted in separate sweeps.</w:t>
       </w:r>
     </w:p>
-    <w:bookmarkStart w:id="28" w:name="exm-semantic-decorator"/>
+    <w:bookmarkStart w:id="33" w:name="exm-semantic-decorator"/>
     <w:p>
       <w:pPr>
         <w:pStyle w:val="BodyText"/>
@@ -6160,7 +7275,7 @@
           <w:b/>
           <w:bCs/>
         </w:rPr>
-        <w:t xml:space="preserve">Example 8 (Naming a decorator for its meaning)</w:t>
+        <w:t xml:space="preserve">Example 10 (Naming a decorator for its meaning)</w:t>
       </w:r>
       <w:r>
         <w:t xml:space="preserve"> </w:t>
@@ -6238,7 +7353,7 @@
         <w:t xml:space="preserve">changes.</w:t>
       </w:r>
     </w:p>
-    <w:bookmarkEnd w:id="28"/>
+    <w:bookmarkEnd w:id="33"/>
     <w:p>
       <w:pPr>
         <w:pStyle w:val="BodyText"/>
@@ -6258,7 +7373,7 @@
         <w:pStyle w:val="Compact"/>
         <w:numPr>
           <w:ilvl w:val="0"/>
-          <w:numId w:val="1005"/>
+          <w:numId w:val="1007"/>
         </w:numPr>
       </w:pPr>
       <w:r>
@@ -6291,7 +7406,7 @@
         <w:pStyle w:val="Compact"/>
         <w:numPr>
           <w:ilvl w:val="0"/>
-          <w:numId w:val="1005"/>
+          <w:numId w:val="1007"/>
         </w:numPr>
       </w:pPr>
       <w:r>
@@ -6312,7 +7427,7 @@
         <w:pStyle w:val="Compact"/>
         <w:numPr>
           <w:ilvl w:val="0"/>
-          <w:numId w:val="1005"/>
+          <w:numId w:val="1007"/>
         </w:numPr>
       </w:pPr>
       <w:r>
@@ -6345,7 +7460,7 @@
         <w:pStyle w:val="Compact"/>
         <w:numPr>
           <w:ilvl w:val="0"/>
-          <w:numId w:val="1005"/>
+          <w:numId w:val="1007"/>
         </w:numPr>
       </w:pPr>
       <w:r>
@@ -6366,7 +7481,7 @@
         <w:pStyle w:val="Compact"/>
         <w:numPr>
           <w:ilvl w:val="0"/>
-          <w:numId w:val="1005"/>
+          <w:numId w:val="1007"/>
         </w:numPr>
       </w:pPr>
       <w:r>
@@ -6545,7 +7660,7 @@
         <w:t xml:space="preserve">.</w:t>
       </w:r>
     </w:p>
-    <w:bookmarkStart w:id="29" w:name="exm-semantic-latin-letter"/>
+    <w:bookmarkStart w:id="34" w:name="exm-semantic-latin-letter"/>
     <w:p>
       <w:pPr>
         <w:pStyle w:val="BodyText"/>
@@ -6555,7 +7670,7 @@
           <w:b/>
           <w:bCs/>
         </w:rPr>
-        <w:t xml:space="preserve">Example 9 (Naming a variable for its role)</w:t>
+        <w:t xml:space="preserve">Example 11 (Naming a variable for its role)</w:t>
       </w:r>
       <w:r>
         <w:t xml:space="preserve"> </w:t>
@@ -6635,7 +7750,7 @@
         <w:t xml:space="preserve">which letter is the outcome and which is the residual.</w:t>
       </w:r>
     </w:p>
-    <w:bookmarkEnd w:id="29"/>
+    <w:bookmarkEnd w:id="34"/>
     <w:p>
       <w:pPr>
         <w:pStyle w:val="BodyText"/>
@@ -6662,7 +7777,7 @@
         <w:t xml:space="preserve">and a reader sees which quantity it is about.</w:t>
       </w:r>
     </w:p>
-    <w:bookmarkStart w:id="30" w:name="exm-named-quantity"/>
+    <w:bookmarkStart w:id="35" w:name="exm-named-quantity"/>
     <w:p>
       <w:pPr>
         <w:pStyle w:val="BodyText"/>
@@ -6672,7 +7787,7 @@
           <w:b/>
           <w:bCs/>
         </w:rPr>
-        <w:t xml:space="preserve">Example 10 (Writing a named quantity by its name)</w:t>
+        <w:t xml:space="preserve">Example 12 (Writing a named quantity by its name)</w:t>
       </w:r>
       <w:r>
         <w:t xml:space="preserve"> </w:t>
@@ -6774,9 +7889,9 @@
         <w:t xml:space="preserve">and it names the quantity the gradient depends on.</w:t>
       </w:r>
     </w:p>
-    <w:bookmarkEnd w:id="30"/>
-    <w:bookmarkEnd w:id="31"/>
-    <w:bookmarkStart w:id="33" w:name="writing-dot-products"/>
+    <w:bookmarkEnd w:id="35"/>
+    <w:bookmarkEnd w:id="36"/>
+    <w:bookmarkStart w:id="38" w:name="writing-dot-products"/>
     <w:p>
       <w:pPr>
         <w:pStyle w:val="Heading2"/>
@@ -6949,7 +8064,7 @@
         <w:t xml:space="preserve">and to work out that the result is a single number.</w:t>
       </w:r>
     </w:p>
-    <w:bookmarkStart w:id="32" w:name="exm-dot-product"/>
+    <w:bookmarkStart w:id="37" w:name="exm-dot-product"/>
     <w:p>
       <w:pPr>
         <w:pStyle w:val="BodyText"/>
@@ -6959,7 +8074,7 @@
           <w:b/>
           <w:bCs/>
         </w:rPr>
-        <w:t xml:space="preserve">Example 11 (Writing a dot product)</w:t>
+        <w:t xml:space="preserve">Example 13 (Writing a dot product)</w:t>
       </w:r>
       <w:r>
         <w:t xml:space="preserve"> </w:t>
@@ -7178,7 +8293,7 @@
         <w:t xml:space="preserve">.</w:t>
       </w:r>
     </w:p>
-    <w:bookmarkEnd w:id="32"/>
+    <w:bookmarkEnd w:id="37"/>
     <w:p>
       <w:pPr>
         <w:pStyle w:val="BodyText"/>
@@ -7192,7 +8307,7 @@
         <w:pStyle w:val="Compact"/>
         <w:numPr>
           <w:ilvl w:val="0"/>
-          <w:numId w:val="1006"/>
+          <w:numId w:val="1008"/>
         </w:numPr>
       </w:pPr>
       <w:r>
@@ -7227,7 +8342,7 @@
         <w:pStyle w:val="Compact"/>
         <w:numPr>
           <w:ilvl w:val="0"/>
-          <w:numId w:val="1006"/>
+          <w:numId w:val="1008"/>
         </w:numPr>
       </w:pPr>
       <w:r>
@@ -7276,7 +8391,7 @@
         <w:pStyle w:val="Compact"/>
         <w:numPr>
           <w:ilvl w:val="0"/>
-          <w:numId w:val="1006"/>
+          <w:numId w:val="1008"/>
         </w:numPr>
       </w:pPr>
       <w:r>
@@ -7337,8 +8452,8 @@
         <w:t xml:space="preserve">such as a definition of an inner product space.</w:t>
       </w:r>
     </w:p>
-    <w:bookmarkEnd w:id="33"/>
-    <w:bookmarkStart w:id="36" w:name="writing-out-notational-shorthands"/>
+    <w:bookmarkEnd w:id="38"/>
+    <w:bookmarkStart w:id="41" w:name="writing-out-notational-shorthands"/>
     <w:p>
       <w:pPr>
         <w:pStyle w:val="Heading2"/>
@@ -7777,7 +8892,7 @@
       <w:r>
         <w:t xml:space="preserve"> </w:t>
       </w:r>
-      <w:hyperlink r:id="rId34">
+      <w:hyperlink r:id="rId39">
         <w:r>
           <w:rPr>
             <w:rStyle w:val="Hyperlink"/>
@@ -7818,7 +8933,7 @@
         <w:t xml:space="preserve">catalogs common shorthands and their full forms.</w:t>
       </w:r>
     </w:p>
-    <w:bookmarkStart w:id="35" w:name="exm-notational-shorthand"/>
+    <w:bookmarkStart w:id="40" w:name="exm-notational-shorthand"/>
     <w:p>
       <w:pPr>
         <w:pStyle w:val="BodyText"/>
@@ -7828,7 +8943,7 @@
           <w:b/>
           <w:bCs/>
         </w:rPr>
-        <w:t xml:space="preserve">Example 12 (Writing out the limits of a sum and the range of an index)</w:t>
+        <w:t xml:space="preserve">Example 14 (Writing out the limits of a sum and the range of an index)</w:t>
       </w:r>
       <w:r>
         <w:t xml:space="preserve"> </w:t>
@@ -8385,8 +9500,8 @@
         <w:t xml:space="preserve">observations.</w:t>
       </w:r>
     </w:p>
-    <w:bookmarkEnd w:id="35"/>
-    <w:bookmarkEnd w:id="36"/>
+    <w:bookmarkEnd w:id="40"/>
+    <w:bookmarkEnd w:id="41"/>
     <w:sectPr>
       <w:footnotePr>
         <w:numRestart w:val="eachSect"/>
@@ -8600,6 +9715,91 @@
       </w:rPr>
     </w:lvl>
   </w:abstractNum>
+  <w:abstractNum w:abstractNumId="99411">
+    <w:nsid w:val="00A99411"/>
+    <w:multiLevelType w:val="multilevel"/>
+    <w:lvl w:ilvl="0">
+      <w:start w:val="1"/>
+      <w:numFmt w:val="decimal"/>
+      <w:lvlText w:val="%1."/>
+      <w:lvlJc w:val="left"/>
+      <w:pPr>
+        <w:ind w:left="720" w:hanging="360"/>
+      </w:pPr>
+    </w:lvl>
+    <w:lvl w:ilvl="1">
+      <w:start w:val="1"/>
+      <w:numFmt w:val="decimal"/>
+      <w:lvlText w:val="%2."/>
+      <w:lvlJc w:val="left"/>
+      <w:pPr>
+        <w:ind w:left="1440" w:hanging="360"/>
+      </w:pPr>
+    </w:lvl>
+    <w:lvl w:ilvl="2">
+      <w:start w:val="1"/>
+      <w:numFmt w:val="decimal"/>
+      <w:lvlText w:val="%3."/>
+      <w:lvlJc w:val="left"/>
+      <w:pPr>
+        <w:ind w:left="2160" w:hanging="360"/>
+      </w:pPr>
+    </w:lvl>
+    <w:lvl w:ilvl="3">
+      <w:start w:val="1"/>
+      <w:numFmt w:val="decimal"/>
+      <w:lvlText w:val="%4."/>
+      <w:lvlJc w:val="left"/>
+      <w:pPr>
+        <w:ind w:left="2880" w:hanging="360"/>
+      </w:pPr>
+    </w:lvl>
+    <w:lvl w:ilvl="4">
+      <w:start w:val="1"/>
+      <w:numFmt w:val="decimal"/>
+      <w:lvlText w:val="%5."/>
+      <w:lvlJc w:val="left"/>
+      <w:pPr>
+        <w:ind w:left="3600" w:hanging="360"/>
+      </w:pPr>
+    </w:lvl>
+    <w:lvl w:ilvl="5">
+      <w:start w:val="1"/>
+      <w:numFmt w:val="decimal"/>
+      <w:lvlText w:val="%6."/>
+      <w:lvlJc w:val="left"/>
+      <w:pPr>
+        <w:ind w:left="4320" w:hanging="360"/>
+      </w:pPr>
+    </w:lvl>
+    <w:lvl w:ilvl="6">
+      <w:start w:val="1"/>
+      <w:numFmt w:val="decimal"/>
+      <w:lvlText w:val="%7."/>
+      <w:lvlJc w:val="left"/>
+      <w:pPr>
+        <w:ind w:left="5040" w:hanging="360"/>
+      </w:pPr>
+    </w:lvl>
+    <w:lvl w:ilvl="7">
+      <w:start w:val="1"/>
+      <w:numFmt w:val="decimal"/>
+      <w:lvlText w:val="%8."/>
+      <w:lvlJc w:val="left"/>
+      <w:pPr>
+        <w:ind w:left="5760" w:hanging="360"/>
+      </w:pPr>
+    </w:lvl>
+    <w:lvl w:ilvl="8">
+      <w:start w:val="1"/>
+      <w:numFmt w:val="decimal"/>
+      <w:lvlText w:val="%9."/>
+      <w:lvlJc w:val="left"/>
+      <w:pPr>
+        <w:ind w:left="6480" w:hanging="360"/>
+      </w:pPr>
+    </w:lvl>
+  </w:abstractNum>
   <w:num w:numId="1000">
     <w:abstractNumId w:val="990"/>
   </w:num>
@@ -8610,7 +9810,34 @@
     <w:abstractNumId w:val="991"/>
   </w:num>
   <w:num w:numId="1003">
-    <w:abstractNumId w:val="991"/>
+    <w:abstractNumId w:val="99411"/>
+    <w:lvlOverride w:ilvl="0">
+      <w:startOverride w:val="1"/>
+    </w:lvlOverride>
+    <w:lvlOverride w:ilvl="1">
+      <w:startOverride w:val="1"/>
+    </w:lvlOverride>
+    <w:lvlOverride w:ilvl="2">
+      <w:startOverride w:val="1"/>
+    </w:lvlOverride>
+    <w:lvlOverride w:ilvl="3">
+      <w:startOverride w:val="1"/>
+    </w:lvlOverride>
+    <w:lvlOverride w:ilvl="4">
+      <w:startOverride w:val="1"/>
+    </w:lvlOverride>
+    <w:lvlOverride w:ilvl="5">
+      <w:startOverride w:val="1"/>
+    </w:lvlOverride>
+    <w:lvlOverride w:ilvl="6">
+      <w:startOverride w:val="1"/>
+    </w:lvlOverride>
+    <w:lvlOverride w:ilvl="7">
+      <w:startOverride w:val="1"/>
+    </w:lvlOverride>
+    <w:lvlOverride w:ilvl="8">
+      <w:startOverride w:val="1"/>
+    </w:lvlOverride>
   </w:num>
   <w:num w:numId="1004">
     <w:abstractNumId w:val="991"/>
@@ -8619,6 +9846,12 @@
     <w:abstractNumId w:val="991"/>
   </w:num>
   <w:num w:numId="1006">
+    <w:abstractNumId w:val="991"/>
+  </w:num>
+  <w:num w:numId="1007">
+    <w:abstractNumId w:val="991"/>
+  </w:num>
+  <w:num w:numId="1008">
     <w:abstractNumId w:val="991"/>
   </w:num>
 </w:numbering>

</xml_diff>

<commit_message>
Deploying to gh-pages from @ Morrison-Lab/psw@b77ec5bebf39af5cf936eab5d3f416b67cfdf0ed 🚀
</commit_message>
<xml_diff>
--- a/chapters/notation.docx
+++ b/chapters/notation.docx
@@ -15,7 +15,7 @@
         <w:pStyle w:val="Date"/>
       </w:pPr>
       <w:r>
-        <w:t xml:space="preserve">Last modified: 2026-10-08 22:24:07 (PDT)</w:t>
+        <w:t xml:space="preserve">Last modified: 2026-10-08 22:40:32 (PDT)</w:t>
       </w:r>
     </w:p>
     <w:tbl>
@@ -4918,13 +4918,13 @@
     <w:bookmarkEnd w:id="23"/>
     <w:bookmarkEnd w:id="24"/>
     <w:bookmarkEnd w:id="25"/>
-    <w:bookmarkStart w:id="27" w:name="functions-and-their-values"/>
+    <w:bookmarkStart w:id="28" w:name="one-equals-sign-per-line"/>
     <w:p>
       <w:pPr>
         <w:pStyle w:val="Heading2"/>
       </w:pPr>
       <w:r>
-        <w:t xml:space="preserve">3 Functions and their values</w:t>
+        <w:t xml:space="preserve">3 One equals sign per line</w:t>
       </w:r>
     </w:p>
     <w:p>
@@ -4932,30 +4932,59 @@
         <w:pStyle w:val="FirstParagraph"/>
       </w:pPr>
       <w:r>
-        <w:t xml:space="preserve">A function and its value at a point are different objects.</w:t>
-      </w:r>
-      <w:r>
-        <w:t xml:space="preserve"> </w:t>
-      </w:r>
-      <w:r>
-        <w:t xml:space="preserve">In</w:t>
-      </w:r>
-      <w:r>
-        <w:t xml:space="preserve"> </w:t>
-      </w:r>
-      <m:oMath>
-        <m:sSub>
-          <m:e>
-            <m:r>
-              <m:t>μ</m:t>
-            </m:r>
-          </m:e>
-          <m:sub>
-            <m:r>
-              <m:t>i</m:t>
-            </m:r>
-          </m:sub>
-        </m:sSub>
+        <w:t xml:space="preserve">Put at most one equals sign on each line of math.</w:t>
+      </w:r>
+      <w:r>
+        <w:t xml:space="preserve"> </w:t>
+      </w:r>
+      <w:r>
+        <w:t xml:space="preserve">When a result takes two or more equalities,</w:t>
+      </w:r>
+      <w:r>
+        <w:t xml:space="preserve"> </w:t>
+      </w:r>
+      <w:r>
+        <w:t xml:space="preserve">write them as an aligned display,</w:t>
+      </w:r>
+      <w:r>
+        <w:t xml:space="preserve"> </w:t>
+      </w:r>
+      <w:r>
+        <w:t xml:space="preserve">with one equality per row,</w:t>
+      </w:r>
+      <w:r>
+        <w:t xml:space="preserve"> </w:t>
+      </w:r>
+      <w:r>
+        <w:t xml:space="preserve">each row starting with</w:t>
+      </w:r>
+      <w:r>
+        <w:t xml:space="preserve"> </w:t>
+      </w:r>
+      <w:r>
+        <w:rPr>
+          <w:rStyle w:val="VerbatimChar"/>
+        </w:rPr>
+        <w:t xml:space="preserve">&amp;=</w:t>
+      </w:r>
+      <w:r>
+        <w:t xml:space="preserve">.</w:t>
+      </w:r>
+    </w:p>
+    <w:p>
+      <w:pPr>
+        <w:pStyle w:val="BodyText"/>
+      </w:pPr>
+      <w:r>
+        <w:t xml:space="preserve">A chain such as</w:t>
+      </w:r>
+      <w:r>
+        <w:t xml:space="preserve"> </w:t>
+      </w:r>
+      <m:oMath>
+        <m:r>
+          <m:t>a</m:t>
+        </m:r>
         <m:r>
           <m:rPr>
             <m:sty m:val="p"/>
@@ -4963,348 +4992,91 @@
           <m:t>=</m:t>
         </m:r>
         <m:r>
-          <m:t>μ</m:t>
-        </m:r>
-        <m:r>
-          <m:rPr>
-            <m:sty m:val="p"/>
-          </m:rPr>
-          <m:t>(</m:t>
-        </m:r>
-        <m:sSub>
-          <m:e>
-            <m:r>
-              <m:t>x</m:t>
-            </m:r>
-          </m:e>
-          <m:sub>
-            <m:r>
-              <m:t>i</m:t>
-            </m:r>
-          </m:sub>
-        </m:sSub>
-        <m:r>
-          <m:rPr>
-            <m:sty m:val="p"/>
-          </m:rPr>
-          <m:t>)</m:t>
-        </m:r>
-      </m:oMath>
-      <w:r>
-        <w:t xml:space="preserve">,</w:t>
-      </w:r>
-      <w:r>
-        <w:t xml:space="preserve"> </w:t>
-      </w:r>
-      <m:oMath>
-        <m:r>
-          <m:t>μ</m:t>
-        </m:r>
-      </m:oMath>
-      <w:r>
-        <w:t xml:space="preserve"> </w:t>
-      </w:r>
-      <w:r>
-        <w:t xml:space="preserve">is a function,</w:t>
-      </w:r>
-      <w:r>
-        <w:t xml:space="preserve"> </w:t>
-      </w:r>
-      <w:r>
-        <w:t xml:space="preserve">and</w:t>
-      </w:r>
-      <w:r>
-        <w:t xml:space="preserve"> </w:t>
-      </w:r>
-      <m:oMath>
-        <m:r>
-          <m:t>μ</m:t>
-        </m:r>
-        <m:r>
-          <m:rPr>
-            <m:sty m:val="p"/>
-          </m:rPr>
-          <m:t>(</m:t>
-        </m:r>
-        <m:sSub>
-          <m:e>
-            <m:r>
-              <m:t>x</m:t>
-            </m:r>
-          </m:e>
-          <m:sub>
-            <m:r>
-              <m:t>i</m:t>
-            </m:r>
-          </m:sub>
-        </m:sSub>
-        <m:r>
-          <m:rPr>
-            <m:sty m:val="p"/>
-          </m:rPr>
-          <m:t>)</m:t>
-        </m:r>
-      </m:oMath>
-      <w:r>
-        <w:t xml:space="preserve"> </w:t>
-      </w:r>
-      <w:r>
-        <w:t xml:space="preserve">is a number:</w:t>
-      </w:r>
-      <w:r>
-        <w:t xml:space="preserve"> </w:t>
-      </w:r>
-      <w:r>
-        <w:t xml:space="preserve">the value of</w:t>
-      </w:r>
-      <w:r>
-        <w:t xml:space="preserve"> </w:t>
-      </w:r>
-      <m:oMath>
-        <m:r>
-          <m:t>μ</m:t>
-        </m:r>
-      </m:oMath>
-      <w:r>
-        <w:t xml:space="preserve"> </w:t>
-      </w:r>
-      <w:r>
-        <w:t xml:space="preserve">at</w:t>
-      </w:r>
-      <w:r>
-        <w:t xml:space="preserve"> </w:t>
-      </w:r>
-      <m:oMath>
-        <m:sSub>
-          <m:e>
-            <m:r>
-              <m:t>x</m:t>
-            </m:r>
-          </m:e>
-          <m:sub>
-            <m:r>
-              <m:t>i</m:t>
-            </m:r>
-          </m:sub>
-        </m:sSub>
-      </m:oMath>
-      <w:r>
-        <w:t xml:space="preserve">.</w:t>
-      </w:r>
-      <w:r>
-        <w:t xml:space="preserve"> </w:t>
-      </w:r>
-      <w:r>
-        <w:t xml:space="preserve">Written with its placeholder argument,</w:t>
-      </w:r>
-      <w:r>
-        <w:t xml:space="preserve"> </w:t>
-      </w:r>
-      <m:oMath>
-        <m:r>
-          <m:t>μ</m:t>
-        </m:r>
-        <m:r>
-          <m:rPr>
-            <m:sty m:val="p"/>
-          </m:rPr>
-          <m:t>(</m:t>
-        </m:r>
-        <m:r>
-          <m:t>x</m:t>
-        </m:r>
-        <m:r>
-          <m:rPr>
-            <m:sty m:val="p"/>
-          </m:rPr>
-          <m:t>)</m:t>
-        </m:r>
-      </m:oMath>
-      <w:r>
-        <w:t xml:space="preserve"> </w:t>
-      </w:r>
-      <w:r>
-        <w:t xml:space="preserve">already denotes a value,</w:t>
-      </w:r>
-      <w:r>
-        <w:t xml:space="preserve"> </w:t>
-      </w:r>
-      <w:r>
-        <w:t xml:space="preserve">so</w:t>
-      </w:r>
-      <w:r>
-        <w:t xml:space="preserve"> </w:t>
-      </w:r>
-      <w:r>
-        <w:t xml:space="preserve">“the value of</w:t>
-      </w:r>
-      <w:r>
-        <w:t xml:space="preserve"> </w:t>
-      </w:r>
-      <m:oMath>
-        <m:r>
-          <m:t>μ</m:t>
-        </m:r>
-        <m:r>
-          <m:rPr>
-            <m:sty m:val="p"/>
-          </m:rPr>
-          <m:t>(</m:t>
-        </m:r>
-        <m:r>
-          <m:t>x</m:t>
-        </m:r>
-        <m:r>
-          <m:rPr>
-            <m:sty m:val="p"/>
-          </m:rPr>
-          <m:t>)</m:t>
-        </m:r>
-      </m:oMath>
-      <w:r>
-        <w:t xml:space="preserve"> </w:t>
-      </w:r>
-      <w:r>
-        <w:t xml:space="preserve">at</w:t>
-      </w:r>
-      <w:r>
-        <w:t xml:space="preserve"> </w:t>
-      </w:r>
-      <m:oMath>
-        <m:sSub>
-          <m:e>
-            <m:r>
-              <m:t>x</m:t>
-            </m:r>
-          </m:e>
-          <m:sub>
-            <m:r>
-              <m:t>i</m:t>
-            </m:r>
-          </m:sub>
-        </m:sSub>
-      </m:oMath>
-      <w:r>
-        <w:t xml:space="preserve">”</w:t>
-      </w:r>
-      <w:r>
-        <w:t xml:space="preserve"> </w:t>
-      </w:r>
-      <w:r>
-        <w:t xml:space="preserve">reads as a value of a value.</w:t>
-      </w:r>
-      <w:r>
-        <w:t xml:space="preserve"> </w:t>
-      </w:r>
-      <w:r>
-        <w:t xml:space="preserve">Either drop the placeholder and write</w:t>
-      </w:r>
-      <w:r>
-        <w:t xml:space="preserve"> </w:t>
-      </w:r>
-      <w:r>
-        <w:t xml:space="preserve">“the value of</w:t>
-      </w:r>
-      <w:r>
-        <w:t xml:space="preserve"> </w:t>
-      </w:r>
-      <m:oMath>
-        <m:r>
-          <m:t>μ</m:t>
-        </m:r>
-      </m:oMath>
-      <w:r>
-        <w:t xml:space="preserve"> </w:t>
-      </w:r>
-      <w:r>
-        <w:t xml:space="preserve">at</w:t>
-      </w:r>
-      <w:r>
-        <w:t xml:space="preserve"> </w:t>
-      </w:r>
-      <m:oMath>
-        <m:sSub>
-          <m:e>
-            <m:r>
-              <m:t>x</m:t>
-            </m:r>
-          </m:e>
-          <m:sub>
-            <m:r>
-              <m:t>i</m:t>
-            </m:r>
-          </m:sub>
-        </m:sSub>
-      </m:oMath>
-      <w:r>
-        <w:t xml:space="preserve">”</w:t>
-      </w:r>
-      <w:r>
-        <w:t xml:space="preserve">,</w:t>
-      </w:r>
-      <w:r>
-        <w:t xml:space="preserve"> </w:t>
-      </w:r>
-      <w:r>
-        <w:t xml:space="preserve">or keep the placeholder and name the substitution:</w:t>
-      </w:r>
-      <w:r>
-        <w:t xml:space="preserve"> </w:t>
-      </w:r>
-      <w:r>
-        <w:t xml:space="preserve">“</w:t>
-      </w:r>
-      <m:oMath>
-        <m:r>
-          <m:t>μ</m:t>
-        </m:r>
-        <m:r>
-          <m:rPr>
-            <m:sty m:val="p"/>
-          </m:rPr>
-          <m:t>(</m:t>
-        </m:r>
-        <m:r>
-          <m:t>x</m:t>
-        </m:r>
-        <m:r>
-          <m:rPr>
-            <m:sty m:val="p"/>
-          </m:rPr>
-          <m:t>)</m:t>
-        </m:r>
-      </m:oMath>
-      <w:r>
-        <w:t xml:space="preserve"> </w:t>
-      </w:r>
-      <w:r>
-        <w:t xml:space="preserve">evaluated at</w:t>
-      </w:r>
-      <w:r>
-        <w:t xml:space="preserve"> </w:t>
-      </w:r>
-      <m:oMath>
-        <m:sSub>
-          <m:e>
-            <m:r>
-              <m:t>x</m:t>
-            </m:r>
-          </m:e>
-          <m:sub>
-            <m:r>
-              <m:t>i</m:t>
-            </m:r>
-          </m:sub>
-        </m:sSub>
-      </m:oMath>
-      <w:r>
-        <w:t xml:space="preserve">”</w:t>
-      </w:r>
-      <w:r>
-        <w:t xml:space="preserve">.</w:t>
-      </w:r>
-    </w:p>
-    <w:bookmarkStart w:id="26" w:name="exm-function-evaluated-at"/>
+          <m:t>b</m:t>
+        </m:r>
+        <m:r>
+          <m:rPr>
+            <m:sty m:val="p"/>
+          </m:rPr>
+          <m:t>=</m:t>
+        </m:r>
+        <m:r>
+          <m:t>c</m:t>
+        </m:r>
+      </m:oMath>
+      <w:r>
+        <w:t xml:space="preserve"> </w:t>
+      </w:r>
+      <w:r>
+        <w:t xml:space="preserve">on one line</w:t>
+      </w:r>
+      <w:r>
+        <w:t xml:space="preserve"> </w:t>
+      </w:r>
+      <w:r>
+        <w:t xml:space="preserve">asks the reader to find where each step starts and ends,</w:t>
+      </w:r>
+      <w:r>
+        <w:t xml:space="preserve"> </w:t>
+      </w:r>
+      <w:r>
+        <w:t xml:space="preserve">and to check every step at once.</w:t>
+      </w:r>
+      <w:r>
+        <w:t xml:space="preserve"> </w:t>
+      </w:r>
+      <w:r>
+        <w:t xml:space="preserve">An aligned display puts each step on its own row,</w:t>
+      </w:r>
+      <w:r>
+        <w:t xml:space="preserve"> </w:t>
+      </w:r>
+      <w:r>
+        <w:t xml:space="preserve">so the reader can check one row at a time,</w:t>
+      </w:r>
+      <w:r>
+        <w:t xml:space="preserve"> </w:t>
+      </w:r>
+      <w:r>
+        <w:t xml:space="preserve">and the left-hand side, written once,</w:t>
+      </w:r>
+      <w:r>
+        <w:t xml:space="preserve"> </w:t>
+      </w:r>
+      <w:r>
+        <w:t xml:space="preserve">stays visible above the rows that rewrite it.</w:t>
+      </w:r>
+      <w:r>
+        <w:t xml:space="preserve"> </w:t>
+      </w:r>
+      <w:r>
+        <w:t xml:space="preserve">The rows also leave room for a justification at the end of each step,</w:t>
+      </w:r>
+      <w:r>
+        <w:t xml:space="preserve"> </w:t>
+      </w:r>
+      <w:r>
+        <w:t xml:space="preserve">as</w:t>
+      </w:r>
+      <w:r>
+        <w:t xml:space="preserve"> </w:t>
+      </w:r>
+      <w:hyperlink r:id="rId26">
+        <w:r>
+          <w:rPr>
+            <w:rStyle w:val="Hyperlink"/>
+          </w:rPr>
+          <w:t xml:space="preserve">One operation per step</w:t>
+        </w:r>
+      </w:hyperlink>
+      <w:r>
+        <w:t xml:space="preserve"> </w:t>
+      </w:r>
+      <w:r>
+        <w:t xml:space="preserve">asks.</w:t>
+      </w:r>
+    </w:p>
+    <w:bookmarkStart w:id="27" w:name="exm-one-equals-per-line"/>
     <w:p>
       <w:pPr>
         <w:pStyle w:val="BodyText"/>
@@ -5314,7 +5086,1354 @@
           <w:b/>
           <w:bCs/>
         </w:rPr>
-        <w:t xml:space="preserve">Example 6 (Saying where a function is evaluated)</w:t>
+        <w:t xml:space="preserve">Example 6 (Splitting a chain into rows)</w:t>
+      </w:r>
+      <w:r>
+        <w:t xml:space="preserve"> </w:t>
+      </w:r>
+      <w:r>
+        <w:t xml:space="preserve"> </w:t>
+      </w:r>
+    </w:p>
+    <w:p>
+      <w:pPr>
+        <w:pStyle w:val="BlockText"/>
+      </w:pPr>
+      <w:r>
+        <w:t xml:space="preserve">❌</w:t>
+      </w:r>
+    </w:p>
+    <w:p>
+      <w:pPr>
+        <w:pStyle w:val="BlockText"/>
+      </w:pPr>
+      <m:oMathPara>
+        <m:oMathParaPr>
+          <m:jc m:val="center"/>
+        </m:oMathParaPr>
+        <m:oMath>
+          <m:acc>
+            <m:accPr>
+              <m:chr m:val="̂"/>
+            </m:accPr>
+            <m:e>
+              <m:r>
+                <m:t>B</m:t>
+              </m:r>
+            </m:e>
+          </m:acc>
+          <m:r>
+            <m:rPr>
+              <m:sty m:val="p"/>
+            </m:rPr>
+            <m:t>=</m:t>
+          </m:r>
+          <m:r>
+            <m:rPr>
+              <m:sty m:val="p"/>
+            </m:rPr>
+            <m:t>arg</m:t>
+          </m:r>
+          <m:limLow>
+            <m:e>
+              <m:r>
+                <m:rPr>
+                  <m:sty m:val="p"/>
+                </m:rPr>
+                <m:t>min</m:t>
+              </m:r>
+            </m:e>
+            <m:lim>
+              <m:r>
+                <m:t>B</m:t>
+              </m:r>
+            </m:lim>
+          </m:limLow>
+          <m:r>
+            <m:rPr>
+              <m:sty m:val="p"/>
+            </m:rPr>
+            <m:t>∥</m:t>
+          </m:r>
+          <m:r>
+            <m:t>Y</m:t>
+          </m:r>
+          <m:r>
+            <m:rPr>
+              <m:sty m:val="p"/>
+            </m:rPr>
+            <m:t>−</m:t>
+          </m:r>
+          <m:r>
+            <m:t>X</m:t>
+          </m:r>
+          <m:r>
+            <m:t>B</m:t>
+          </m:r>
+          <m:sSubSup>
+            <m:e>
+              <m:r>
+                <m:rPr>
+                  <m:sty m:val="p"/>
+                </m:rPr>
+                <m:t>∥</m:t>
+              </m:r>
+            </m:e>
+            <m:sub>
+              <m:r>
+                <m:t>F</m:t>
+              </m:r>
+            </m:sub>
+            <m:sup>
+              <m:r>
+                <m:t>2</m:t>
+              </m:r>
+            </m:sup>
+          </m:sSubSup>
+          <m:r>
+            <m:rPr>
+              <m:sty m:val="p"/>
+            </m:rPr>
+            <m:t>=</m:t>
+          </m:r>
+          <m:r>
+            <m:rPr>
+              <m:sty m:val="p"/>
+            </m:rPr>
+            <m:t>arg</m:t>
+          </m:r>
+          <m:limLow>
+            <m:e>
+              <m:r>
+                <m:rPr>
+                  <m:sty m:val="p"/>
+                </m:rPr>
+                <m:t>min</m:t>
+              </m:r>
+            </m:e>
+            <m:lim>
+              <m:r>
+                <m:t>B</m:t>
+              </m:r>
+            </m:lim>
+          </m:limLow>
+          <m:nary>
+            <m:naryPr>
+              <m:chr m:val="∑"/>
+              <m:limLoc m:val="undOvr"/>
+              <m:subHide m:val="off"/>
+              <m:supHide m:val="off"/>
+            </m:naryPr>
+            <m:sub>
+              <m:r>
+                <m:t>k</m:t>
+              </m:r>
+              <m:r>
+                <m:rPr>
+                  <m:sty m:val="p"/>
+                </m:rPr>
+                <m:t>=</m:t>
+              </m:r>
+              <m:r>
+                <m:t>1</m:t>
+              </m:r>
+            </m:sub>
+            <m:sup>
+              <m:r>
+                <m:t>C</m:t>
+              </m:r>
+            </m:sup>
+            <m:e>
+              <m:r>
+                <m:rPr>
+                  <m:sty m:val="p"/>
+                </m:rPr>
+                <m:t>∥</m:t>
+              </m:r>
+            </m:e>
+          </m:nary>
+          <m:sSub>
+            <m:e>
+              <m:r>
+                <m:t>Y</m:t>
+              </m:r>
+            </m:e>
+            <m:sub>
+              <m:r>
+                <m:rPr>
+                  <m:sty m:val="p"/>
+                </m:rPr>
+                <m:t>*</m:t>
+              </m:r>
+              <m:r>
+                <m:rPr>
+                  <m:sty m:val="p"/>
+                </m:rPr>
+                <m:t>,</m:t>
+              </m:r>
+              <m:r>
+                <m:t>k</m:t>
+              </m:r>
+            </m:sub>
+          </m:sSub>
+          <m:r>
+            <m:rPr>
+              <m:sty m:val="p"/>
+            </m:rPr>
+            <m:t>−</m:t>
+          </m:r>
+          <m:r>
+            <m:t>X</m:t>
+          </m:r>
+          <m:sSub>
+            <m:e>
+              <m:r>
+                <m:t>B</m:t>
+              </m:r>
+            </m:e>
+            <m:sub>
+              <m:r>
+                <m:rPr>
+                  <m:sty m:val="p"/>
+                </m:rPr>
+                <m:t>*</m:t>
+              </m:r>
+              <m:r>
+                <m:rPr>
+                  <m:sty m:val="p"/>
+                </m:rPr>
+                <m:t>,</m:t>
+              </m:r>
+              <m:r>
+                <m:t>k</m:t>
+              </m:r>
+            </m:sub>
+          </m:sSub>
+          <m:sSup>
+            <m:e>
+              <m:r>
+                <m:rPr>
+                  <m:sty m:val="p"/>
+                </m:rPr>
+                <m:t>∥</m:t>
+              </m:r>
+            </m:e>
+            <m:sup>
+              <m:r>
+                <m:t>2</m:t>
+              </m:r>
+            </m:sup>
+          </m:sSup>
+        </m:oMath>
+      </m:oMathPara>
+    </w:p>
+    <w:p>
+      <w:pPr>
+        <w:pStyle w:val="BlockText"/>
+      </w:pPr>
+      <w:r>
+        <w:t xml:space="preserve">✅</w:t>
+      </w:r>
+    </w:p>
+    <w:p>
+      <w:pPr>
+        <w:pStyle w:val="BlockText"/>
+      </w:pPr>
+      <m:oMathPara>
+        <m:oMathParaPr>
+          <m:jc m:val="center"/>
+        </m:oMathParaPr>
+        <m:oMath>
+          <m:eqArr>
+            <m:e>
+              <m:acc>
+                <m:accPr>
+                  <m:chr m:val="̂"/>
+                </m:accPr>
+                <m:e>
+                  <m:r>
+                    <m:t>B</m:t>
+                  </m:r>
+                </m:e>
+              </m:acc>
+              <m:r>
+                <m:t>&amp;</m:t>
+              </m:r>
+              <m:r>
+                <m:rPr>
+                  <m:sty m:val="p"/>
+                </m:rPr>
+                <m:t>=</m:t>
+              </m:r>
+              <m:r>
+                <m:rPr>
+                  <m:sty m:val="p"/>
+                </m:rPr>
+                <m:t>arg</m:t>
+              </m:r>
+              <m:limLow>
+                <m:e>
+                  <m:r>
+                    <m:rPr>
+                      <m:sty m:val="p"/>
+                    </m:rPr>
+                    <m:t>min</m:t>
+                  </m:r>
+                </m:e>
+                <m:lim>
+                  <m:r>
+                    <m:t>B</m:t>
+                  </m:r>
+                </m:lim>
+              </m:limLow>
+              <m:r>
+                <m:rPr>
+                  <m:sty m:val="p"/>
+                </m:rPr>
+                <m:t>∥</m:t>
+              </m:r>
+              <m:r>
+                <m:t>Y</m:t>
+              </m:r>
+              <m:r>
+                <m:rPr>
+                  <m:sty m:val="p"/>
+                </m:rPr>
+                <m:t>−</m:t>
+              </m:r>
+              <m:r>
+                <m:t>X</m:t>
+              </m:r>
+              <m:r>
+                <m:t>B</m:t>
+              </m:r>
+              <m:sSubSup>
+                <m:e>
+                  <m:r>
+                    <m:rPr>
+                      <m:sty m:val="p"/>
+                    </m:rPr>
+                    <m:t>∥</m:t>
+                  </m:r>
+                </m:e>
+                <m:sub>
+                  <m:r>
+                    <m:t>F</m:t>
+                  </m:r>
+                </m:sub>
+                <m:sup>
+                  <m:r>
+                    <m:t>2</m:t>
+                  </m:r>
+                </m:sup>
+              </m:sSubSup>
+            </m:e>
+            <m:e>
+              <m:r>
+                <m:t>&amp;</m:t>
+              </m:r>
+              <m:r>
+                <m:rPr>
+                  <m:sty m:val="p"/>
+                </m:rPr>
+                <m:t>=</m:t>
+              </m:r>
+              <m:r>
+                <m:rPr>
+                  <m:sty m:val="p"/>
+                </m:rPr>
+                <m:t>arg</m:t>
+              </m:r>
+              <m:limLow>
+                <m:e>
+                  <m:r>
+                    <m:rPr>
+                      <m:sty m:val="p"/>
+                    </m:rPr>
+                    <m:t>min</m:t>
+                  </m:r>
+                </m:e>
+                <m:lim>
+                  <m:r>
+                    <m:t>B</m:t>
+                  </m:r>
+                </m:lim>
+              </m:limLow>
+              <m:nary>
+                <m:naryPr>
+                  <m:chr m:val="∑"/>
+                  <m:limLoc m:val="undOvr"/>
+                  <m:subHide m:val="off"/>
+                  <m:supHide m:val="off"/>
+                </m:naryPr>
+                <m:sub>
+                  <m:r>
+                    <m:t>k</m:t>
+                  </m:r>
+                  <m:r>
+                    <m:rPr>
+                      <m:sty m:val="p"/>
+                    </m:rPr>
+                    <m:t>=</m:t>
+                  </m:r>
+                  <m:r>
+                    <m:t>1</m:t>
+                  </m:r>
+                </m:sub>
+                <m:sup>
+                  <m:r>
+                    <m:t>C</m:t>
+                  </m:r>
+                </m:sup>
+                <m:e>
+                  <m:r>
+                    <m:rPr>
+                      <m:sty m:val="p"/>
+                    </m:rPr>
+                    <m:t>∥</m:t>
+                  </m:r>
+                </m:e>
+              </m:nary>
+              <m:sSub>
+                <m:e>
+                  <m:r>
+                    <m:t>Y</m:t>
+                  </m:r>
+                </m:e>
+                <m:sub>
+                  <m:r>
+                    <m:rPr>
+                      <m:sty m:val="p"/>
+                    </m:rPr>
+                    <m:t>*</m:t>
+                  </m:r>
+                  <m:r>
+                    <m:rPr>
+                      <m:sty m:val="p"/>
+                    </m:rPr>
+                    <m:t>,</m:t>
+                  </m:r>
+                  <m:r>
+                    <m:t>k</m:t>
+                  </m:r>
+                </m:sub>
+              </m:sSub>
+              <m:r>
+                <m:rPr>
+                  <m:sty m:val="p"/>
+                </m:rPr>
+                <m:t>−</m:t>
+              </m:r>
+              <m:r>
+                <m:t>X</m:t>
+              </m:r>
+              <m:sSub>
+                <m:e>
+                  <m:r>
+                    <m:t>B</m:t>
+                  </m:r>
+                </m:e>
+                <m:sub>
+                  <m:r>
+                    <m:rPr>
+                      <m:sty m:val="p"/>
+                    </m:rPr>
+                    <m:t>*</m:t>
+                  </m:r>
+                  <m:r>
+                    <m:rPr>
+                      <m:sty m:val="p"/>
+                    </m:rPr>
+                    <m:t>,</m:t>
+                  </m:r>
+                  <m:r>
+                    <m:t>k</m:t>
+                  </m:r>
+                </m:sub>
+              </m:sSub>
+              <m:sSup>
+                <m:e>
+                  <m:r>
+                    <m:rPr>
+                      <m:sty m:val="p"/>
+                    </m:rPr>
+                    <m:t>∥</m:t>
+                  </m:r>
+                </m:e>
+                <m:sup>
+                  <m:r>
+                    <m:t>2</m:t>
+                  </m:r>
+                </m:sup>
+              </m:sSup>
+            </m:e>
+          </m:eqArr>
+        </m:oMath>
+      </m:oMathPara>
+    </w:p>
+    <w:p>
+      <w:pPr>
+        <w:pStyle w:val="FirstParagraph"/>
+      </w:pPr>
+      <w:r>
+        <w:t xml:space="preserve">The ❌ version makes the reader find the second equals sign</w:t>
+      </w:r>
+      <w:r>
+        <w:t xml:space="preserve"> </w:t>
+      </w:r>
+      <w:r>
+        <w:t xml:space="preserve">in a long line before they can compare the two expressions.</w:t>
+      </w:r>
+      <w:r>
+        <w:t xml:space="preserve"> </w:t>
+      </w:r>
+      <w:r>
+        <w:t xml:space="preserve">The ✅ version sets the two expressions one above the other,</w:t>
+      </w:r>
+      <w:r>
+        <w:t xml:space="preserve"> </w:t>
+      </w:r>
+      <w:r>
+        <w:t xml:space="preserve">starting at the same place.</w:t>
+      </w:r>
+    </w:p>
+    <w:bookmarkEnd w:id="27"/>
+    <w:p>
+      <w:pPr>
+        <w:pStyle w:val="BodyText"/>
+      </w:pPr>
+      <w:r>
+        <w:t xml:space="preserve">The rule applies wherever an equals sign appears:</w:t>
+      </w:r>
+    </w:p>
+    <w:p>
+      <w:pPr>
+        <w:pStyle w:val="Compact"/>
+        <w:numPr>
+          <w:ilvl w:val="0"/>
+          <w:numId w:val="1005"/>
+        </w:numPr>
+      </w:pPr>
+      <w:r>
+        <w:rPr>
+          <w:b/>
+          <w:bCs/>
+        </w:rPr>
+        <w:t xml:space="preserve">Inside an aligned display.</w:t>
+      </w:r>
+      <w:r>
+        <w:t xml:space="preserve"> </w:t>
+      </w:r>
+      <w:r>
+        <w:t xml:space="preserve">A row such as</w:t>
+      </w:r>
+      <w:r>
+        <w:t xml:space="preserve"> </w:t>
+      </w:r>
+      <w:r>
+        <w:rPr>
+          <w:rStyle w:val="VerbatimChar"/>
+        </w:rPr>
+        <w:t xml:space="preserve">&amp;= b = c</w:t>
+      </w:r>
+      <w:r>
+        <w:t xml:space="preserve"> </w:t>
+      </w:r>
+      <w:r>
+        <w:t xml:space="preserve">is still a chain;</w:t>
+      </w:r>
+      <w:r>
+        <w:t xml:space="preserve"> </w:t>
+      </w:r>
+      <w:r>
+        <w:t xml:space="preserve">split it into two rows.</w:t>
+      </w:r>
+    </w:p>
+    <w:p>
+      <w:pPr>
+        <w:pStyle w:val="Compact"/>
+        <w:numPr>
+          <w:ilvl w:val="0"/>
+          <w:numId w:val="1005"/>
+        </w:numPr>
+      </w:pPr>
+      <w:r>
+        <w:rPr>
+          <w:b/>
+          <w:bCs/>
+        </w:rPr>
+        <w:t xml:space="preserve">In running text.</w:t>
+      </w:r>
+      <w:r>
+        <w:t xml:space="preserve"> </w:t>
+      </w:r>
+      <w:r>
+        <w:t xml:space="preserve">An inline chain such as ❌</w:t>
+      </w:r>
+      <w:r>
+        <w:t xml:space="preserve"> </w:t>
+      </w:r>
+      <m:oMath>
+        <m:acc>
+          <m:accPr>
+            <m:chr m:val="‾"/>
+          </m:accPr>
+          <m:e>
+            <m:r>
+              <m:t>x</m:t>
+            </m:r>
+          </m:e>
+        </m:acc>
+        <m:r>
+          <m:rPr>
+            <m:sty m:val="p"/>
+          </m:rPr>
+          <m:t>=</m:t>
+        </m:r>
+        <m:f>
+          <m:fPr>
+            <m:type m:val="bar"/>
+          </m:fPr>
+          <m:num>
+            <m:r>
+              <m:t>6</m:t>
+            </m:r>
+          </m:num>
+          <m:den>
+            <m:r>
+              <m:t>3</m:t>
+            </m:r>
+          </m:den>
+        </m:f>
+        <m:r>
+          <m:rPr>
+            <m:sty m:val="p"/>
+          </m:rPr>
+          <m:t>=</m:t>
+        </m:r>
+        <m:r>
+          <m:t>2</m:t>
+        </m:r>
+      </m:oMath>
+      <w:r>
+        <w:t xml:space="preserve"> </w:t>
+      </w:r>
+      <w:r>
+        <w:t xml:space="preserve">becomes an aligned display,</w:t>
+      </w:r>
+      <w:r>
+        <w:t xml:space="preserve"> </w:t>
+      </w:r>
+      <w:r>
+        <w:t xml:space="preserve">or two statements in the sentence.</w:t>
+      </w:r>
+    </w:p>
+    <w:p>
+      <w:pPr>
+        <w:pStyle w:val="Compact"/>
+        <w:numPr>
+          <w:ilvl w:val="0"/>
+          <w:numId w:val="1005"/>
+        </w:numPr>
+      </w:pPr>
+      <w:r>
+        <w:rPr>
+          <w:b/>
+          <w:bCs/>
+        </w:rPr>
+        <w:t xml:space="preserve">For a statement that several quantities are equal.</w:t>
+      </w:r>
+      <w:r>
+        <w:t xml:space="preserve"> </w:t>
+      </w:r>
+      <w:r>
+        <w:t xml:space="preserve">Write ✅</w:t>
+      </w:r>
+      <w:r>
+        <w:t xml:space="preserve"> </w:t>
+      </w:r>
+      <m:oMath>
+        <m:sSub>
+          <m:e>
+            <m:r>
+              <m:t>H</m:t>
+            </m:r>
+          </m:e>
+          <m:sub>
+            <m:r>
+              <m:t>0</m:t>
+            </m:r>
+          </m:sub>
+        </m:sSub>
+        <m:r>
+          <m:rPr>
+            <m:sty m:val="p"/>
+          </m:rPr>
+          <m:t>:</m:t>
+        </m:r>
+        <m:sSub>
+          <m:e>
+            <m:r>
+              <m:t>β</m:t>
+            </m:r>
+          </m:e>
+          <m:sub>
+            <m:r>
+              <m:t>j</m:t>
+            </m:r>
+          </m:sub>
+        </m:sSub>
+        <m:r>
+          <m:rPr>
+            <m:sty m:val="p"/>
+          </m:rPr>
+          <m:t>=</m:t>
+        </m:r>
+        <m:r>
+          <m:t>0</m:t>
+        </m:r>
+      </m:oMath>
+      <w:r>
+        <w:t xml:space="preserve"> </w:t>
+      </w:r>
+      <w:r>
+        <w:t xml:space="preserve">for every</w:t>
+      </w:r>
+      <w:r>
+        <w:t xml:space="preserve"> </w:t>
+      </w:r>
+      <m:oMath>
+        <m:r>
+          <m:t>j</m:t>
+        </m:r>
+        <m:r>
+          <m:rPr>
+            <m:sty m:val="p"/>
+          </m:rPr>
+          <m:t>∈</m:t>
+        </m:r>
+        <m:r>
+          <m:rPr>
+            <m:sty m:val="p"/>
+          </m:rPr>
+          <m:t>{</m:t>
+        </m:r>
+        <m:r>
+          <m:t>1</m:t>
+        </m:r>
+        <m:r>
+          <m:rPr>
+            <m:sty m:val="p"/>
+          </m:rPr>
+          <m:t>,</m:t>
+        </m:r>
+        <m:r>
+          <m:rPr>
+            <m:sty m:val="p"/>
+          </m:rPr>
+          <m:t>…</m:t>
+        </m:r>
+        <m:r>
+          <m:rPr>
+            <m:sty m:val="p"/>
+          </m:rPr>
+          <m:t>,</m:t>
+        </m:r>
+        <m:r>
+          <m:t>p</m:t>
+        </m:r>
+        <m:r>
+          <m:rPr>
+            <m:sty m:val="p"/>
+          </m:rPr>
+          <m:t>}</m:t>
+        </m:r>
+      </m:oMath>
+      <w:r>
+        <w:t xml:space="preserve"> </w:t>
+      </w:r>
+      <w:r>
+        <w:t xml:space="preserve">rather than ❌</w:t>
+      </w:r>
+      <w:r>
+        <w:t xml:space="preserve"> </w:t>
+      </w:r>
+      <m:oMath>
+        <m:sSub>
+          <m:e>
+            <m:r>
+              <m:t>H</m:t>
+            </m:r>
+          </m:e>
+          <m:sub>
+            <m:r>
+              <m:t>0</m:t>
+            </m:r>
+          </m:sub>
+        </m:sSub>
+        <m:r>
+          <m:rPr>
+            <m:sty m:val="p"/>
+          </m:rPr>
+          <m:t>:</m:t>
+        </m:r>
+        <m:sSub>
+          <m:e>
+            <m:r>
+              <m:t>β</m:t>
+            </m:r>
+          </m:e>
+          <m:sub>
+            <m:r>
+              <m:t>1</m:t>
+            </m:r>
+          </m:sub>
+        </m:sSub>
+        <m:r>
+          <m:rPr>
+            <m:sty m:val="p"/>
+          </m:rPr>
+          <m:t>=</m:t>
+        </m:r>
+        <m:sSub>
+          <m:e>
+            <m:r>
+              <m:t>β</m:t>
+            </m:r>
+          </m:e>
+          <m:sub>
+            <m:r>
+              <m:t>2</m:t>
+            </m:r>
+          </m:sub>
+        </m:sSub>
+        <m:r>
+          <m:rPr>
+            <m:sty m:val="p"/>
+          </m:rPr>
+          <m:t>=</m:t>
+        </m:r>
+        <m:r>
+          <m:rPr>
+            <m:sty m:val="p"/>
+          </m:rPr>
+          <m:t>⋯</m:t>
+        </m:r>
+        <m:r>
+          <m:rPr>
+            <m:sty m:val="p"/>
+          </m:rPr>
+          <m:t>=</m:t>
+        </m:r>
+        <m:sSub>
+          <m:e>
+            <m:r>
+              <m:t>β</m:t>
+            </m:r>
+          </m:e>
+          <m:sub>
+            <m:r>
+              <m:t>p</m:t>
+            </m:r>
+          </m:sub>
+        </m:sSub>
+        <m:r>
+          <m:rPr>
+            <m:sty m:val="p"/>
+          </m:rPr>
+          <m:t>=</m:t>
+        </m:r>
+        <m:r>
+          <m:t>0</m:t>
+        </m:r>
+      </m:oMath>
+      <w:r>
+        <w:t xml:space="preserve">,</w:t>
+      </w:r>
+      <w:r>
+        <w:t xml:space="preserve"> </w:t>
+      </w:r>
+      <w:r>
+        <w:t xml:space="preserve">so that each claim is a single equality.</w:t>
+      </w:r>
+    </w:p>
+    <w:p>
+      <w:pPr>
+        <w:pStyle w:val="FirstParagraph"/>
+      </w:pPr>
+      <w:r>
+        <w:t xml:space="preserve">Separate equations set side by side,</w:t>
+      </w:r>
+      <w:r>
+        <w:t xml:space="preserve"> </w:t>
+      </w:r>
+      <w:r>
+        <w:t xml:space="preserve">such as</w:t>
+      </w:r>
+      <w:r>
+        <w:t xml:space="preserve"> </w:t>
+      </w:r>
+      <m:oMath>
+        <m:r>
+          <m:t>x</m:t>
+        </m:r>
+        <m:r>
+          <m:rPr>
+            <m:sty m:val="p"/>
+          </m:rPr>
+          <m:t>=</m:t>
+        </m:r>
+        <m:r>
+          <m:t>1</m:t>
+        </m:r>
+        <m:r>
+          <m:rPr>
+            <m:sty m:val="p"/>
+          </m:rPr>
+          <m:t>,</m:t>
+        </m:r>
+        <m:r>
+          <m:t> </m:t>
+        </m:r>
+        <m:r>
+          <m:t>y</m:t>
+        </m:r>
+        <m:r>
+          <m:rPr>
+            <m:sty m:val="p"/>
+          </m:rPr>
+          <m:t>=</m:t>
+        </m:r>
+        <m:r>
+          <m:t>2</m:t>
+        </m:r>
+      </m:oMath>
+      <w:r>
+        <w:t xml:space="preserve">,</w:t>
+      </w:r>
+      <w:r>
+        <w:t xml:space="preserve"> </w:t>
+      </w:r>
+      <w:r>
+        <w:t xml:space="preserve">each have one equals sign,</w:t>
+      </w:r>
+      <w:r>
+        <w:t xml:space="preserve"> </w:t>
+      </w:r>
+      <w:r>
+        <w:t xml:space="preserve">so they are not chains.</w:t>
+      </w:r>
+      <w:r>
+        <w:t xml:space="preserve"> </w:t>
+      </w:r>
+      <w:r>
+        <w:t xml:space="preserve">They still read more easily as separate rows,</w:t>
+      </w:r>
+      <w:r>
+        <w:t xml:space="preserve"> </w:t>
+      </w:r>
+      <w:r>
+        <w:t xml:space="preserve">or as separate statements in the text.</w:t>
+      </w:r>
+    </w:p>
+    <w:bookmarkEnd w:id="28"/>
+    <w:bookmarkStart w:id="30" w:name="functions-and-their-values"/>
+    <w:p>
+      <w:pPr>
+        <w:pStyle w:val="Heading2"/>
+      </w:pPr>
+      <w:r>
+        <w:t xml:space="preserve">4 Functions and their values</w:t>
+      </w:r>
+    </w:p>
+    <w:p>
+      <w:pPr>
+        <w:pStyle w:val="FirstParagraph"/>
+      </w:pPr>
+      <w:r>
+        <w:t xml:space="preserve">A function and its value at a point are different objects.</w:t>
+      </w:r>
+      <w:r>
+        <w:t xml:space="preserve"> </w:t>
+      </w:r>
+      <w:r>
+        <w:t xml:space="preserve">In</w:t>
+      </w:r>
+      <w:r>
+        <w:t xml:space="preserve"> </w:t>
+      </w:r>
+      <m:oMath>
+        <m:sSub>
+          <m:e>
+            <m:r>
+              <m:t>μ</m:t>
+            </m:r>
+          </m:e>
+          <m:sub>
+            <m:r>
+              <m:t>i</m:t>
+            </m:r>
+          </m:sub>
+        </m:sSub>
+        <m:r>
+          <m:rPr>
+            <m:sty m:val="p"/>
+          </m:rPr>
+          <m:t>=</m:t>
+        </m:r>
+        <m:r>
+          <m:t>μ</m:t>
+        </m:r>
+        <m:r>
+          <m:rPr>
+            <m:sty m:val="p"/>
+          </m:rPr>
+          <m:t>(</m:t>
+        </m:r>
+        <m:sSub>
+          <m:e>
+            <m:r>
+              <m:t>x</m:t>
+            </m:r>
+          </m:e>
+          <m:sub>
+            <m:r>
+              <m:t>i</m:t>
+            </m:r>
+          </m:sub>
+        </m:sSub>
+        <m:r>
+          <m:rPr>
+            <m:sty m:val="p"/>
+          </m:rPr>
+          <m:t>)</m:t>
+        </m:r>
+      </m:oMath>
+      <w:r>
+        <w:t xml:space="preserve">,</w:t>
+      </w:r>
+      <w:r>
+        <w:t xml:space="preserve"> </w:t>
+      </w:r>
+      <m:oMath>
+        <m:r>
+          <m:t>μ</m:t>
+        </m:r>
+      </m:oMath>
+      <w:r>
+        <w:t xml:space="preserve"> </w:t>
+      </w:r>
+      <w:r>
+        <w:t xml:space="preserve">is a function,</w:t>
+      </w:r>
+      <w:r>
+        <w:t xml:space="preserve"> </w:t>
+      </w:r>
+      <w:r>
+        <w:t xml:space="preserve">and</w:t>
+      </w:r>
+      <w:r>
+        <w:t xml:space="preserve"> </w:t>
+      </w:r>
+      <m:oMath>
+        <m:r>
+          <m:t>μ</m:t>
+        </m:r>
+        <m:r>
+          <m:rPr>
+            <m:sty m:val="p"/>
+          </m:rPr>
+          <m:t>(</m:t>
+        </m:r>
+        <m:sSub>
+          <m:e>
+            <m:r>
+              <m:t>x</m:t>
+            </m:r>
+          </m:e>
+          <m:sub>
+            <m:r>
+              <m:t>i</m:t>
+            </m:r>
+          </m:sub>
+        </m:sSub>
+        <m:r>
+          <m:rPr>
+            <m:sty m:val="p"/>
+          </m:rPr>
+          <m:t>)</m:t>
+        </m:r>
+      </m:oMath>
+      <w:r>
+        <w:t xml:space="preserve"> </w:t>
+      </w:r>
+      <w:r>
+        <w:t xml:space="preserve">is a number:</w:t>
+      </w:r>
+      <w:r>
+        <w:t xml:space="preserve"> </w:t>
+      </w:r>
+      <w:r>
+        <w:t xml:space="preserve">the value of</w:t>
+      </w:r>
+      <w:r>
+        <w:t xml:space="preserve"> </w:t>
+      </w:r>
+      <m:oMath>
+        <m:r>
+          <m:t>μ</m:t>
+        </m:r>
+      </m:oMath>
+      <w:r>
+        <w:t xml:space="preserve"> </w:t>
+      </w:r>
+      <w:r>
+        <w:t xml:space="preserve">at</w:t>
+      </w:r>
+      <w:r>
+        <w:t xml:space="preserve"> </w:t>
+      </w:r>
+      <m:oMath>
+        <m:sSub>
+          <m:e>
+            <m:r>
+              <m:t>x</m:t>
+            </m:r>
+          </m:e>
+          <m:sub>
+            <m:r>
+              <m:t>i</m:t>
+            </m:r>
+          </m:sub>
+        </m:sSub>
+      </m:oMath>
+      <w:r>
+        <w:t xml:space="preserve">.</w:t>
+      </w:r>
+      <w:r>
+        <w:t xml:space="preserve"> </w:t>
+      </w:r>
+      <w:r>
+        <w:t xml:space="preserve">Written with its placeholder argument,</w:t>
+      </w:r>
+      <w:r>
+        <w:t xml:space="preserve"> </w:t>
+      </w:r>
+      <m:oMath>
+        <m:r>
+          <m:t>μ</m:t>
+        </m:r>
+        <m:r>
+          <m:rPr>
+            <m:sty m:val="p"/>
+          </m:rPr>
+          <m:t>(</m:t>
+        </m:r>
+        <m:r>
+          <m:t>x</m:t>
+        </m:r>
+        <m:r>
+          <m:rPr>
+            <m:sty m:val="p"/>
+          </m:rPr>
+          <m:t>)</m:t>
+        </m:r>
+      </m:oMath>
+      <w:r>
+        <w:t xml:space="preserve"> </w:t>
+      </w:r>
+      <w:r>
+        <w:t xml:space="preserve">already denotes a value,</w:t>
+      </w:r>
+      <w:r>
+        <w:t xml:space="preserve"> </w:t>
+      </w:r>
+      <w:r>
+        <w:t xml:space="preserve">so</w:t>
+      </w:r>
+      <w:r>
+        <w:t xml:space="preserve"> </w:t>
+      </w:r>
+      <w:r>
+        <w:t xml:space="preserve">“the value of</w:t>
+      </w:r>
+      <w:r>
+        <w:t xml:space="preserve"> </w:t>
+      </w:r>
+      <m:oMath>
+        <m:r>
+          <m:t>μ</m:t>
+        </m:r>
+        <m:r>
+          <m:rPr>
+            <m:sty m:val="p"/>
+          </m:rPr>
+          <m:t>(</m:t>
+        </m:r>
+        <m:r>
+          <m:t>x</m:t>
+        </m:r>
+        <m:r>
+          <m:rPr>
+            <m:sty m:val="p"/>
+          </m:rPr>
+          <m:t>)</m:t>
+        </m:r>
+      </m:oMath>
+      <w:r>
+        <w:t xml:space="preserve"> </w:t>
+      </w:r>
+      <w:r>
+        <w:t xml:space="preserve">at</w:t>
+      </w:r>
+      <w:r>
+        <w:t xml:space="preserve"> </w:t>
+      </w:r>
+      <m:oMath>
+        <m:sSub>
+          <m:e>
+            <m:r>
+              <m:t>x</m:t>
+            </m:r>
+          </m:e>
+          <m:sub>
+            <m:r>
+              <m:t>i</m:t>
+            </m:r>
+          </m:sub>
+        </m:sSub>
+      </m:oMath>
+      <w:r>
+        <w:t xml:space="preserve">”</w:t>
+      </w:r>
+      <w:r>
+        <w:t xml:space="preserve"> </w:t>
+      </w:r>
+      <w:r>
+        <w:t xml:space="preserve">reads as a value of a value.</w:t>
+      </w:r>
+      <w:r>
+        <w:t xml:space="preserve"> </w:t>
+      </w:r>
+      <w:r>
+        <w:t xml:space="preserve">Either drop the placeholder and write</w:t>
+      </w:r>
+      <w:r>
+        <w:t xml:space="preserve"> </w:t>
+      </w:r>
+      <w:r>
+        <w:t xml:space="preserve">“the value of</w:t>
+      </w:r>
+      <w:r>
+        <w:t xml:space="preserve"> </w:t>
+      </w:r>
+      <m:oMath>
+        <m:r>
+          <m:t>μ</m:t>
+        </m:r>
+      </m:oMath>
+      <w:r>
+        <w:t xml:space="preserve"> </w:t>
+      </w:r>
+      <w:r>
+        <w:t xml:space="preserve">at</w:t>
+      </w:r>
+      <w:r>
+        <w:t xml:space="preserve"> </w:t>
+      </w:r>
+      <m:oMath>
+        <m:sSub>
+          <m:e>
+            <m:r>
+              <m:t>x</m:t>
+            </m:r>
+          </m:e>
+          <m:sub>
+            <m:r>
+              <m:t>i</m:t>
+            </m:r>
+          </m:sub>
+        </m:sSub>
+      </m:oMath>
+      <w:r>
+        <w:t xml:space="preserve">”</w:t>
+      </w:r>
+      <w:r>
+        <w:t xml:space="preserve">,</w:t>
+      </w:r>
+      <w:r>
+        <w:t xml:space="preserve"> </w:t>
+      </w:r>
+      <w:r>
+        <w:t xml:space="preserve">or keep the placeholder and name the substitution:</w:t>
+      </w:r>
+      <w:r>
+        <w:t xml:space="preserve"> </w:t>
+      </w:r>
+      <w:r>
+        <w:t xml:space="preserve">“</w:t>
+      </w:r>
+      <m:oMath>
+        <m:r>
+          <m:t>μ</m:t>
+        </m:r>
+        <m:r>
+          <m:rPr>
+            <m:sty m:val="p"/>
+          </m:rPr>
+          <m:t>(</m:t>
+        </m:r>
+        <m:r>
+          <m:t>x</m:t>
+        </m:r>
+        <m:r>
+          <m:rPr>
+            <m:sty m:val="p"/>
+          </m:rPr>
+          <m:t>)</m:t>
+        </m:r>
+      </m:oMath>
+      <w:r>
+        <w:t xml:space="preserve"> </w:t>
+      </w:r>
+      <w:r>
+        <w:t xml:space="preserve">evaluated at</w:t>
+      </w:r>
+      <w:r>
+        <w:t xml:space="preserve"> </w:t>
+      </w:r>
+      <m:oMath>
+        <m:sSub>
+          <m:e>
+            <m:r>
+              <m:t>x</m:t>
+            </m:r>
+          </m:e>
+          <m:sub>
+            <m:r>
+              <m:t>i</m:t>
+            </m:r>
+          </m:sub>
+        </m:sSub>
+      </m:oMath>
+      <w:r>
+        <w:t xml:space="preserve">”</w:t>
+      </w:r>
+      <w:r>
+        <w:t xml:space="preserve">.</w:t>
+      </w:r>
+    </w:p>
+    <w:bookmarkStart w:id="29" w:name="exm-function-evaluated-at"/>
+    <w:p>
+      <w:pPr>
+        <w:pStyle w:val="BodyText"/>
+      </w:pPr>
+      <w:r>
+        <w:rPr>
+          <w:b/>
+          <w:bCs/>
+        </w:rPr>
+        <w:t xml:space="preserve">Example 7 (Saying where a function is evaluated)</w:t>
       </w:r>
       <w:r>
         <w:t xml:space="preserve"> </w:t>
@@ -5759,7 +6878,7 @@
         <w:t xml:space="preserve">the nearest candidate is the mean function, not the outcome.</w:t>
       </w:r>
     </w:p>
-    <w:bookmarkEnd w:id="26"/>
+    <w:bookmarkEnd w:id="29"/>
     <w:p>
       <w:pPr>
         <w:pStyle w:val="BodyText"/>
@@ -5773,7 +6892,7 @@
         <w:pStyle w:val="Compact"/>
         <w:numPr>
           <w:ilvl w:val="0"/>
-          <w:numId w:val="1005"/>
+          <w:numId w:val="1006"/>
         </w:numPr>
       </w:pPr>
       <w:r>
@@ -5805,7 +6924,7 @@
         <w:pStyle w:val="Compact"/>
         <w:numPr>
           <w:ilvl w:val="0"/>
-          <w:numId w:val="1005"/>
+          <w:numId w:val="1006"/>
         </w:numPr>
       </w:pPr>
       <w:r>
@@ -5992,7 +7111,7 @@
         <w:pStyle w:val="Compact"/>
         <w:numPr>
           <w:ilvl w:val="0"/>
-          <w:numId w:val="1005"/>
+          <w:numId w:val="1006"/>
         </w:numPr>
       </w:pPr>
       <w:r>
@@ -6077,14 +7196,14 @@
         <w:t xml:space="preserve">, for a value.</w:t>
       </w:r>
     </w:p>
-    <w:bookmarkEnd w:id="27"/>
-    <w:bookmarkStart w:id="30" w:name="matching-names-and-notation"/>
+    <w:bookmarkEnd w:id="30"/>
+    <w:bookmarkStart w:id="33" w:name="matching-names-and-notation"/>
     <w:p>
       <w:pPr>
         <w:pStyle w:val="Heading2"/>
       </w:pPr>
       <w:r>
-        <w:t xml:space="preserve">4 Matching names and notation</w:t>
+        <w:t xml:space="preserve">5 Matching names and notation</w:t>
       </w:r>
     </w:p>
     <w:p>
@@ -6189,7 +7308,7 @@
       <w:r>
         <w:t xml:space="preserve"> </w:t>
       </w:r>
-      <w:hyperlink r:id="rId28">
+      <w:hyperlink r:id="rId31">
         <w:r>
           <w:rPr>
             <w:rStyle w:val="Hyperlink"/>
@@ -6201,7 +7320,7 @@
         <w:t xml:space="preserve">).</w:t>
       </w:r>
     </w:p>
-    <w:bookmarkStart w:id="29" w:name="exm-name-matches-notation"/>
+    <w:bookmarkStart w:id="32" w:name="exm-name-matches-notation"/>
     <w:p>
       <w:pPr>
         <w:pStyle w:val="BodyText"/>
@@ -6211,7 +7330,7 @@
           <w:b/>
           <w:bCs/>
         </w:rPr>
-        <w:t xml:space="preserve">Example 7 (Matching a name to its notation)</w:t>
+        <w:t xml:space="preserve">Example 8 (Matching a name to its notation)</w:t>
       </w:r>
       <w:r>
         <w:t xml:space="preserve"> </w:t>
@@ -6694,7 +7813,7 @@
         <w:t xml:space="preserve">.</w:t>
       </w:r>
     </w:p>
-    <w:bookmarkEnd w:id="29"/>
+    <w:bookmarkEnd w:id="32"/>
     <w:p>
       <w:pPr>
         <w:pStyle w:val="BodyText"/>
@@ -6715,14 +7834,14 @@
         <w:t xml:space="preserve">and make them agree.</w:t>
       </w:r>
     </w:p>
-    <w:bookmarkEnd w:id="30"/>
-    <w:bookmarkStart w:id="36" w:name="using-shared-macros"/>
+    <w:bookmarkEnd w:id="33"/>
+    <w:bookmarkStart w:id="39" w:name="using-shared-macros"/>
     <w:p>
       <w:pPr>
         <w:pStyle w:val="Heading2"/>
       </w:pPr>
       <w:r>
-        <w:t xml:space="preserve">5 Using shared macros</w:t>
+        <w:t xml:space="preserve">6 Using shared macros</w:t>
       </w:r>
     </w:p>
     <w:p>
@@ -6789,7 +7908,7 @@
         <w:t xml:space="preserve">so the next document finds it.</w:t>
       </w:r>
     </w:p>
-    <w:bookmarkStart w:id="31" w:name="exm-use-shared-macro"/>
+    <w:bookmarkStart w:id="34" w:name="exm-use-shared-macro"/>
     <w:p>
       <w:pPr>
         <w:pStyle w:val="BodyText"/>
@@ -6799,7 +7918,7 @@
           <w:b/>
           <w:bCs/>
         </w:rPr>
-        <w:t xml:space="preserve">Example 8 (Using a shared macro)</w:t>
+        <w:t xml:space="preserve">Example 9 (Using a shared macro)</w:t>
       </w:r>
       <w:r>
         <w:t xml:space="preserve"> </w:t>
@@ -6874,498 +7993,13 @@
         <w:t xml:space="preserve">every document that uses the macro changes with it.</w:t>
       </w:r>
     </w:p>
-    <w:bookmarkEnd w:id="31"/>
+    <w:bookmarkEnd w:id="34"/>
     <w:p>
       <w:pPr>
         <w:pStyle w:val="BodyText"/>
       </w:pPr>
       <w:r>
         <w:t xml:space="preserve">The same rule covers these quantities:</w:t>
-      </w:r>
-    </w:p>
-    <w:p>
-      <w:pPr>
-        <w:pStyle w:val="Compact"/>
-        <w:numPr>
-          <w:ilvl w:val="0"/>
-          <w:numId w:val="1006"/>
-        </w:numPr>
-      </w:pPr>
-      <w:r>
-        <w:t xml:space="preserve">transposes</w:t>
-      </w:r>
-    </w:p>
-    <w:p>
-      <w:pPr>
-        <w:pStyle w:val="Compact"/>
-        <w:numPr>
-          <w:ilvl w:val="0"/>
-          <w:numId w:val="1006"/>
-        </w:numPr>
-      </w:pPr>
-      <w:r>
-        <w:t xml:space="preserve">hats on estimates</w:t>
-      </w:r>
-    </w:p>
-    <w:p>
-      <w:pPr>
-        <w:pStyle w:val="Compact"/>
-        <w:numPr>
-          <w:ilvl w:val="0"/>
-          <w:numId w:val="1006"/>
-        </w:numPr>
-      </w:pPr>
-      <w:r>
-        <w:t xml:space="preserve">expectations</w:t>
-      </w:r>
-    </w:p>
-    <w:p>
-      <w:pPr>
-        <w:pStyle w:val="Compact"/>
-        <w:numPr>
-          <w:ilvl w:val="0"/>
-          <w:numId w:val="1006"/>
-        </w:numPr>
-      </w:pPr>
-      <w:r>
-        <w:t xml:space="preserve">variances</w:t>
-      </w:r>
-    </w:p>
-    <w:p>
-      <w:pPr>
-        <w:pStyle w:val="Compact"/>
-        <w:numPr>
-          <w:ilvl w:val="0"/>
-          <w:numId w:val="1006"/>
-        </w:numPr>
-      </w:pPr>
-      <w:r>
-        <w:t xml:space="preserve">probabilities</w:t>
-      </w:r>
-    </w:p>
-    <w:p>
-      <w:pPr>
-        <w:pStyle w:val="Compact"/>
-        <w:numPr>
-          <w:ilvl w:val="0"/>
-          <w:numId w:val="1006"/>
-        </w:numPr>
-      </w:pPr>
-      <w:r>
-        <w:t xml:space="preserve">vectors</w:t>
-      </w:r>
-    </w:p>
-    <w:p>
-      <w:pPr>
-        <w:pStyle w:val="FirstParagraph"/>
-      </w:pPr>
-      <w:r>
-        <w:t xml:space="preserve">A quantity that has a macro keeps the same symbol in every document.</w:t>
-      </w:r>
-    </w:p>
-    <w:p>
-      <w:pPr>
-        <w:pStyle w:val="BodyText"/>
-      </w:pPr>
-      <w:r>
-        <w:t xml:space="preserve">Name a macro for what the symbol means, not for the letter it prints.</w:t>
-      </w:r>
-      <w:r>
-        <w:t xml:space="preserve"> </w:t>
-      </w:r>
-      <w:r>
-        <w:t xml:space="preserve">A macro such as</w:t>
-      </w:r>
-      <w:r>
-        <w:t xml:space="preserve"> </w:t>
-      </w:r>
-      <w:r>
-        <w:rPr>
-          <w:rStyle w:val="VerbatimChar"/>
-        </w:rPr>
-        <w:t xml:space="preserve">\vdelta</w:t>
-      </w:r>
-      <w:r>
-        <w:t xml:space="preserve"> </w:t>
-      </w:r>
-      <w:r>
-        <w:t xml:space="preserve">or</w:t>
-      </w:r>
-      <w:r>
-        <w:t xml:space="preserve"> </w:t>
-      </w:r>
-      <w:r>
-        <w:rPr>
-          <w:rStyle w:val="VerbatimChar"/>
-        </w:rPr>
-        <w:t xml:space="preserve">\hbeta</w:t>
-      </w:r>
-      <w:r>
-        <w:t xml:space="preserve"> </w:t>
-      </w:r>
-      <w:r>
-        <w:t xml:space="preserve">only spells a Greek letter,</w:t>
-      </w:r>
-      <w:r>
-        <w:t xml:space="preserve"> </w:t>
-      </w:r>
-      <w:r>
-        <w:t xml:space="preserve">so it names no concept,</w:t>
-      </w:r>
-      <w:r>
-        <w:t xml:space="preserve"> </w:t>
-      </w:r>
-      <w:r>
-        <w:t xml:space="preserve">and changing the symbol for that concept still means editing every use.</w:t>
-      </w:r>
-      <w:r>
-        <w:t xml:space="preserve"> </w:t>
-      </w:r>
-      <w:r>
-        <w:t xml:space="preserve">Outside a passage that discusses the notation itself,</w:t>
-      </w:r>
-      <w:r>
-        <w:t xml:space="preserve"> </w:t>
-      </w:r>
-      <w:r>
-        <w:t xml:space="preserve">do not write a Greek letter in a math expression,</w:t>
-      </w:r>
-      <w:r>
-        <w:t xml:space="preserve"> </w:t>
-      </w:r>
-      <w:r>
-        <w:t xml:space="preserve">either as a raw command such as</w:t>
-      </w:r>
-      <w:r>
-        <w:t xml:space="preserve"> </w:t>
-      </w:r>
-      <w:r>
-        <w:rPr>
-          <w:rStyle w:val="VerbatimChar"/>
-        </w:rPr>
-        <w:t xml:space="preserve">\delta</w:t>
-      </w:r>
-      <w:r>
-        <w:t xml:space="preserve"> </w:t>
-      </w:r>
-      <w:r>
-        <w:t xml:space="preserve">or inside a letter-named macro such as</w:t>
-      </w:r>
-      <w:r>
-        <w:t xml:space="preserve"> </w:t>
-      </w:r>
-      <w:r>
-        <w:rPr>
-          <w:rStyle w:val="VerbatimChar"/>
-        </w:rPr>
-        <w:t xml:space="preserve">\vdelta</w:t>
-      </w:r>
-      <w:r>
-        <w:t xml:space="preserve">.</w:t>
-      </w:r>
-    </w:p>
-    <w:bookmarkStart w:id="32" w:name="exm-semantic-macro-name"/>
-    <w:p>
-      <w:pPr>
-        <w:pStyle w:val="BodyText"/>
-      </w:pPr>
-      <w:r>
-        <w:rPr>
-          <w:b/>
-          <w:bCs/>
-        </w:rPr>
-        <w:t xml:space="preserve">Example 9 (Naming a macro for its meaning)</w:t>
-      </w:r>
-      <w:r>
-        <w:t xml:space="preserve"> </w:t>
-      </w:r>
-      <w:r>
-        <w:t xml:space="preserve"> </w:t>
-      </w:r>
-    </w:p>
-    <w:p>
-      <w:pPr>
-        <w:pStyle w:val="BlockText"/>
-      </w:pPr>
-      <w:r>
-        <w:t xml:space="preserve">❌ Source:</w:t>
-      </w:r>
-      <w:r>
-        <w:t xml:space="preserve"> </w:t>
-      </w:r>
-      <w:r>
-        <w:rPr>
-          <w:rStyle w:val="VerbatimChar"/>
-        </w:rPr>
-        <w:t xml:space="preserve">The error at layer $\ell$ is $\vdelta^{(\ell)}$, and the step size is $\eta$.</w:t>
-      </w:r>
-    </w:p>
-    <w:p>
-      <w:pPr>
-        <w:pStyle w:val="BlockText"/>
-      </w:pPr>
-      <w:r>
-        <w:t xml:space="preserve">✅ Source:</w:t>
-      </w:r>
-      <w:r>
-        <w:t xml:space="preserve"> </w:t>
-      </w:r>
-      <w:r>
-        <w:rPr>
-          <w:rStyle w:val="VerbatimChar"/>
-        </w:rPr>
-        <w:t xml:space="preserve">The error at layer $\ell$ is $\backerr^{(\ell)}$, and the step size is $\learnrate$.</w:t>
-      </w:r>
-    </w:p>
-    <w:p>
-      <w:pPr>
-        <w:pStyle w:val="FirstParagraph"/>
-      </w:pPr>
-      <w:r>
-        <w:t xml:space="preserve">Both versions print the same symbols.</w:t>
-      </w:r>
-      <w:r>
-        <w:t xml:space="preserve"> </w:t>
-      </w:r>
-      <w:r>
-        <w:t xml:space="preserve">In the ✅ version, a reader of the source sees what each symbol stands for,</w:t>
-      </w:r>
-      <w:r>
-        <w:t xml:space="preserve"> </w:t>
-      </w:r>
-      <w:r>
-        <w:t xml:space="preserve">and a group that changes the symbol for the step size</w:t>
-      </w:r>
-      <w:r>
-        <w:t xml:space="preserve"> </w:t>
-      </w:r>
-      <w:r>
-        <w:t xml:space="preserve">changes one line in the shared file.</w:t>
-      </w:r>
-    </w:p>
-    <w:bookmarkEnd w:id="32"/>
-    <w:p>
-      <w:pPr>
-        <w:pStyle w:val="BodyText"/>
-      </w:pPr>
-      <w:r>
-        <w:t xml:space="preserve">A passage about the notation itself,</w:t>
-      </w:r>
-      <w:r>
-        <w:t xml:space="preserve"> </w:t>
-      </w:r>
-      <w:r>
-        <w:t xml:space="preserve">such as a table that lists each symbol and what it means,</w:t>
-      </w:r>
-      <w:r>
-        <w:t xml:space="preserve"> </w:t>
-      </w:r>
-      <w:r>
-        <w:t xml:space="preserve">may write the letters directly.</w:t>
-      </w:r>
-    </w:p>
-    <w:p>
-      <w:pPr>
-        <w:pStyle w:val="BodyText"/>
-      </w:pPr>
-      <w:r>
-        <w:t xml:space="preserve">The same reasoning applies to decorators.</w:t>
-      </w:r>
-      <w:r>
-        <w:t xml:space="preserve"> </w:t>
-      </w:r>
-      <w:r>
-        <w:t xml:space="preserve">A hat, a tilde or a bar says how a symbol is drawn, not what it means.</w:t>
-      </w:r>
-      <w:r>
-        <w:t xml:space="preserve"> </w:t>
-      </w:r>
-      <w:r>
-        <w:t xml:space="preserve">A hat can mark an estimate, a fitted value or a Fourier transform,</w:t>
-      </w:r>
-      <w:r>
-        <w:t xml:space="preserve"> </w:t>
-      </w:r>
-      <w:r>
-        <w:t xml:space="preserve">so</w:t>
-      </w:r>
-      <w:r>
-        <w:t xml:space="preserve"> </w:t>
-      </w:r>
-      <w:r>
-        <w:rPr>
-          <w:rStyle w:val="VerbatimChar"/>
-        </w:rPr>
-        <w:t xml:space="preserve">\hat</w:t>
-      </w:r>
-      <w:r>
-        <w:t xml:space="preserve"> </w:t>
-      </w:r>
-      <w:r>
-        <w:t xml:space="preserve">names no concept either.</w:t>
-      </w:r>
-      <w:r>
-        <w:t xml:space="preserve"> </w:t>
-      </w:r>
-      <w:r>
-        <w:t xml:space="preserve">Write the macro that names the role instead,</w:t>
-      </w:r>
-      <w:r>
-        <w:t xml:space="preserve"> </w:t>
-      </w:r>
-      <w:r>
-        <w:t xml:space="preserve">such as</w:t>
-      </w:r>
-      <w:r>
-        <w:t xml:space="preserve"> </w:t>
-      </w:r>
-      <w:r>
-        <w:rPr>
-          <w:rStyle w:val="VerbatimChar"/>
-        </w:rPr>
-        <w:t xml:space="preserve">\est{}</w:t>
-      </w:r>
-      <w:r>
-        <w:t xml:space="preserve"> </w:t>
-      </w:r>
-      <w:r>
-        <w:t xml:space="preserve">for an estimate,</w:t>
-      </w:r>
-      <w:r>
-        <w:t xml:space="preserve"> </w:t>
-      </w:r>
-      <w:r>
-        <w:t xml:space="preserve">and keep</w:t>
-      </w:r>
-      <w:r>
-        <w:t xml:space="preserve"> </w:t>
-      </w:r>
-      <w:r>
-        <w:rPr>
-          <w:rStyle w:val="VerbatimChar"/>
-        </w:rPr>
-        <w:t xml:space="preserve">\hat</w:t>
-      </w:r>
-      <w:r>
-        <w:t xml:space="preserve"> </w:t>
-      </w:r>
-      <w:r>
-        <w:t xml:space="preserve">for passages that discuss the notation itself.</w:t>
-      </w:r>
-      <w:r>
-        <w:t xml:space="preserve"> </w:t>
-      </w:r>
-      <w:r>
-        <w:t xml:space="preserve">New math follows this now;</w:t>
-      </w:r>
-      <w:r>
-        <w:t xml:space="preserve"> </w:t>
-      </w:r>
-      <w:r>
-        <w:t xml:space="preserve">existing hats are converted in separate sweeps.</w:t>
-      </w:r>
-    </w:p>
-    <w:bookmarkStart w:id="33" w:name="exm-semantic-decorator"/>
-    <w:p>
-      <w:pPr>
-        <w:pStyle w:val="BodyText"/>
-      </w:pPr>
-      <w:r>
-        <w:rPr>
-          <w:b/>
-          <w:bCs/>
-        </w:rPr>
-        <w:t xml:space="preserve">Example 10 (Naming a decorator for its meaning)</w:t>
-      </w:r>
-      <w:r>
-        <w:t xml:space="preserve"> </w:t>
-      </w:r>
-      <w:r>
-        <w:t xml:space="preserve"> </w:t>
-      </w:r>
-    </w:p>
-    <w:p>
-      <w:pPr>
-        <w:pStyle w:val="BlockText"/>
-      </w:pPr>
-      <w:r>
-        <w:t xml:space="preserve">❌ Source:</w:t>
-      </w:r>
-      <w:r>
-        <w:t xml:space="preserve"> </w:t>
-      </w:r>
-      <w:r>
-        <w:rPr>
-          <w:rStyle w:val="VerbatimChar"/>
-        </w:rPr>
-        <w:t xml:space="preserve">The estimate $\hat{\mean}$ is close to $\mean$.</w:t>
-      </w:r>
-    </w:p>
-    <w:p>
-      <w:pPr>
-        <w:pStyle w:val="BlockText"/>
-      </w:pPr>
-      <w:r>
-        <w:t xml:space="preserve">✅ Source:</w:t>
-      </w:r>
-      <w:r>
-        <w:t xml:space="preserve"> </w:t>
-      </w:r>
-      <w:r>
-        <w:rPr>
-          <w:rStyle w:val="VerbatimChar"/>
-        </w:rPr>
-        <w:t xml:space="preserve">The estimate $\est{\mean}$ is close to $\mean$.</w:t>
-      </w:r>
-    </w:p>
-    <w:p>
-      <w:pPr>
-        <w:pStyle w:val="FirstParagraph"/>
-      </w:pPr>
-      <w:r>
-        <w:t xml:space="preserve">Both versions print the same hat.</w:t>
-      </w:r>
-      <w:r>
-        <w:t xml:space="preserve"> </w:t>
-      </w:r>
-      <w:r>
-        <w:t xml:space="preserve">If the group later marks estimates some other way,</w:t>
-      </w:r>
-      <w:r>
-        <w:t xml:space="preserve"> </w:t>
-      </w:r>
-      <w:r>
-        <w:t xml:space="preserve">only the definition of</w:t>
-      </w:r>
-      <w:r>
-        <w:t xml:space="preserve"> </w:t>
-      </w:r>
-      <w:r>
-        <w:rPr>
-          <w:rStyle w:val="VerbatimChar"/>
-        </w:rPr>
-        <w:t xml:space="preserve">\est</w:t>
-      </w:r>
-      <w:r>
-        <w:t xml:space="preserve"> </w:t>
-      </w:r>
-      <w:r>
-        <w:t xml:space="preserve">changes.</w:t>
-      </w:r>
-    </w:p>
-    <w:bookmarkEnd w:id="33"/>
-    <w:p>
-      <w:pPr>
-        <w:pStyle w:val="BodyText"/>
-      </w:pPr>
-      <w:r>
-        <w:t xml:space="preserve">Latin letters with a fixed role follow the same rule.</w:t>
-      </w:r>
-      <w:r>
-        <w:t xml:space="preserve"> </w:t>
-      </w:r>
-      <w:r>
-        <w:t xml:space="preserve">In a regression or prediction model, use these macros:</w:t>
       </w:r>
     </w:p>
     <w:p>
@@ -7377,28 +8011,7 @@
         </w:numPr>
       </w:pPr>
       <w:r>
-        <w:rPr>
-          <w:rStyle w:val="VerbatimChar"/>
-        </w:rPr>
-        <w:t xml:space="preserve">\outvar</w:t>
-      </w:r>
-      <w:r>
-        <w:t xml:space="preserve"> </w:t>
-      </w:r>
-      <w:r>
-        <w:t xml:space="preserve">for the outcome variable, instead of a bare</w:t>
-      </w:r>
-      <w:r>
-        <w:t xml:space="preserve"> </w:t>
-      </w:r>
-      <w:r>
-        <w:rPr>
-          <w:rStyle w:val="VerbatimChar"/>
-        </w:rPr>
-        <w:t xml:space="preserve">y</w:t>
-      </w:r>
-      <w:r>
-        <w:t xml:space="preserve">;</w:t>
+        <w:t xml:space="preserve">transposes</w:t>
       </w:r>
     </w:p>
     <w:p>
@@ -7410,16 +8023,7 @@
         </w:numPr>
       </w:pPr>
       <w:r>
-        <w:rPr>
-          <w:rStyle w:val="VerbatimChar"/>
-        </w:rPr>
-        <w:t xml:space="preserve">\eoutvar</w:t>
-      </w:r>
-      <w:r>
-        <w:t xml:space="preserve"> </w:t>
-      </w:r>
-      <w:r>
-        <w:t xml:space="preserve">for a predicted outcome;</w:t>
+        <w:t xml:space="preserve">hats on estimates</w:t>
       </w:r>
     </w:p>
     <w:p>
@@ -7431,28 +8035,7 @@
         </w:numPr>
       </w:pPr>
       <w:r>
-        <w:rPr>
-          <w:rStyle w:val="VerbatimChar"/>
-        </w:rPr>
-        <w:t xml:space="preserve">\predvar</w:t>
-      </w:r>
-      <w:r>
-        <w:t xml:space="preserve"> </w:t>
-      </w:r>
-      <w:r>
-        <w:t xml:space="preserve">for a predictor, instead of a bare</w:t>
-      </w:r>
-      <w:r>
-        <w:t xml:space="preserve"> </w:t>
-      </w:r>
-      <w:r>
-        <w:rPr>
-          <w:rStyle w:val="VerbatimChar"/>
-        </w:rPr>
-        <w:t xml:space="preserve">x</w:t>
-      </w:r>
-      <w:r>
-        <w:t xml:space="preserve">;</w:t>
+        <w:t xml:space="preserve">expectations</w:t>
       </w:r>
     </w:p>
     <w:p>
@@ -7464,16 +8047,7 @@
         </w:numPr>
       </w:pPr>
       <w:r>
-        <w:rPr>
-          <w:rStyle w:val="VerbatimChar"/>
-        </w:rPr>
-        <w:t xml:space="preserve">\resid</w:t>
-      </w:r>
-      <w:r>
-        <w:t xml:space="preserve"> </w:t>
-      </w:r>
-      <w:r>
-        <w:t xml:space="preserve">for a residual, the observed minus the predicted outcome;</w:t>
+        <w:t xml:space="preserve">variances</w:t>
       </w:r>
     </w:p>
     <w:p>
@@ -7485,6 +8059,551 @@
         </w:numPr>
       </w:pPr>
       <w:r>
+        <w:t xml:space="preserve">probabilities</w:t>
+      </w:r>
+    </w:p>
+    <w:p>
+      <w:pPr>
+        <w:pStyle w:val="Compact"/>
+        <w:numPr>
+          <w:ilvl w:val="0"/>
+          <w:numId w:val="1007"/>
+        </w:numPr>
+      </w:pPr>
+      <w:r>
+        <w:t xml:space="preserve">vectors</w:t>
+      </w:r>
+    </w:p>
+    <w:p>
+      <w:pPr>
+        <w:pStyle w:val="FirstParagraph"/>
+      </w:pPr>
+      <w:r>
+        <w:t xml:space="preserve">A quantity that has a macro keeps the same symbol in every document.</w:t>
+      </w:r>
+    </w:p>
+    <w:p>
+      <w:pPr>
+        <w:pStyle w:val="BodyText"/>
+      </w:pPr>
+      <w:r>
+        <w:t xml:space="preserve">Name a macro for what the symbol means, not for the letter it prints.</w:t>
+      </w:r>
+      <w:r>
+        <w:t xml:space="preserve"> </w:t>
+      </w:r>
+      <w:r>
+        <w:t xml:space="preserve">A macro such as</w:t>
+      </w:r>
+      <w:r>
+        <w:t xml:space="preserve"> </w:t>
+      </w:r>
+      <w:r>
+        <w:rPr>
+          <w:rStyle w:val="VerbatimChar"/>
+        </w:rPr>
+        <w:t xml:space="preserve">\vdelta</w:t>
+      </w:r>
+      <w:r>
+        <w:t xml:space="preserve"> </w:t>
+      </w:r>
+      <w:r>
+        <w:t xml:space="preserve">or</w:t>
+      </w:r>
+      <w:r>
+        <w:t xml:space="preserve"> </w:t>
+      </w:r>
+      <w:r>
+        <w:rPr>
+          <w:rStyle w:val="VerbatimChar"/>
+        </w:rPr>
+        <w:t xml:space="preserve">\hbeta</w:t>
+      </w:r>
+      <w:r>
+        <w:t xml:space="preserve"> </w:t>
+      </w:r>
+      <w:r>
+        <w:t xml:space="preserve">only spells a Greek letter,</w:t>
+      </w:r>
+      <w:r>
+        <w:t xml:space="preserve"> </w:t>
+      </w:r>
+      <w:r>
+        <w:t xml:space="preserve">so it names no concept,</w:t>
+      </w:r>
+      <w:r>
+        <w:t xml:space="preserve"> </w:t>
+      </w:r>
+      <w:r>
+        <w:t xml:space="preserve">and changing the symbol for that concept still means editing every use.</w:t>
+      </w:r>
+      <w:r>
+        <w:t xml:space="preserve"> </w:t>
+      </w:r>
+      <w:r>
+        <w:t xml:space="preserve">Outside a passage that discusses the notation itself,</w:t>
+      </w:r>
+      <w:r>
+        <w:t xml:space="preserve"> </w:t>
+      </w:r>
+      <w:r>
+        <w:t xml:space="preserve">do not write a Greek letter in a math expression,</w:t>
+      </w:r>
+      <w:r>
+        <w:t xml:space="preserve"> </w:t>
+      </w:r>
+      <w:r>
+        <w:t xml:space="preserve">either as a raw command such as</w:t>
+      </w:r>
+      <w:r>
+        <w:t xml:space="preserve"> </w:t>
+      </w:r>
+      <w:r>
+        <w:rPr>
+          <w:rStyle w:val="VerbatimChar"/>
+        </w:rPr>
+        <w:t xml:space="preserve">\delta</w:t>
+      </w:r>
+      <w:r>
+        <w:t xml:space="preserve"> </w:t>
+      </w:r>
+      <w:r>
+        <w:t xml:space="preserve">or inside a letter-named macro such as</w:t>
+      </w:r>
+      <w:r>
+        <w:t xml:space="preserve"> </w:t>
+      </w:r>
+      <w:r>
+        <w:rPr>
+          <w:rStyle w:val="VerbatimChar"/>
+        </w:rPr>
+        <w:t xml:space="preserve">\vdelta</w:t>
+      </w:r>
+      <w:r>
+        <w:t xml:space="preserve">.</w:t>
+      </w:r>
+    </w:p>
+    <w:bookmarkStart w:id="35" w:name="exm-semantic-macro-name"/>
+    <w:p>
+      <w:pPr>
+        <w:pStyle w:val="BodyText"/>
+      </w:pPr>
+      <w:r>
+        <w:rPr>
+          <w:b/>
+          <w:bCs/>
+        </w:rPr>
+        <w:t xml:space="preserve">Example 10 (Naming a macro for its meaning)</w:t>
+      </w:r>
+      <w:r>
+        <w:t xml:space="preserve"> </w:t>
+      </w:r>
+      <w:r>
+        <w:t xml:space="preserve"> </w:t>
+      </w:r>
+    </w:p>
+    <w:p>
+      <w:pPr>
+        <w:pStyle w:val="BlockText"/>
+      </w:pPr>
+      <w:r>
+        <w:t xml:space="preserve">❌ Source:</w:t>
+      </w:r>
+      <w:r>
+        <w:t xml:space="preserve"> </w:t>
+      </w:r>
+      <w:r>
+        <w:rPr>
+          <w:rStyle w:val="VerbatimChar"/>
+        </w:rPr>
+        <w:t xml:space="preserve">The error at layer $\ell$ is $\vdelta^{(\ell)}$, and the step size is $\eta$.</w:t>
+      </w:r>
+    </w:p>
+    <w:p>
+      <w:pPr>
+        <w:pStyle w:val="BlockText"/>
+      </w:pPr>
+      <w:r>
+        <w:t xml:space="preserve">✅ Source:</w:t>
+      </w:r>
+      <w:r>
+        <w:t xml:space="preserve"> </w:t>
+      </w:r>
+      <w:r>
+        <w:rPr>
+          <w:rStyle w:val="VerbatimChar"/>
+        </w:rPr>
+        <w:t xml:space="preserve">The error at layer $\ell$ is $\backerr^{(\ell)}$, and the step size is $\learnrate$.</w:t>
+      </w:r>
+    </w:p>
+    <w:p>
+      <w:pPr>
+        <w:pStyle w:val="FirstParagraph"/>
+      </w:pPr>
+      <w:r>
+        <w:t xml:space="preserve">Both versions print the same symbols.</w:t>
+      </w:r>
+      <w:r>
+        <w:t xml:space="preserve"> </w:t>
+      </w:r>
+      <w:r>
+        <w:t xml:space="preserve">In the ✅ version, a reader of the source sees what each symbol stands for,</w:t>
+      </w:r>
+      <w:r>
+        <w:t xml:space="preserve"> </w:t>
+      </w:r>
+      <w:r>
+        <w:t xml:space="preserve">and a group that changes the symbol for the step size</w:t>
+      </w:r>
+      <w:r>
+        <w:t xml:space="preserve"> </w:t>
+      </w:r>
+      <w:r>
+        <w:t xml:space="preserve">changes one line in the shared file.</w:t>
+      </w:r>
+    </w:p>
+    <w:bookmarkEnd w:id="35"/>
+    <w:p>
+      <w:pPr>
+        <w:pStyle w:val="BodyText"/>
+      </w:pPr>
+      <w:r>
+        <w:t xml:space="preserve">A passage about the notation itself,</w:t>
+      </w:r>
+      <w:r>
+        <w:t xml:space="preserve"> </w:t>
+      </w:r>
+      <w:r>
+        <w:t xml:space="preserve">such as a table that lists each symbol and what it means,</w:t>
+      </w:r>
+      <w:r>
+        <w:t xml:space="preserve"> </w:t>
+      </w:r>
+      <w:r>
+        <w:t xml:space="preserve">may write the letters directly.</w:t>
+      </w:r>
+    </w:p>
+    <w:p>
+      <w:pPr>
+        <w:pStyle w:val="BodyText"/>
+      </w:pPr>
+      <w:r>
+        <w:t xml:space="preserve">The same reasoning applies to decorators.</w:t>
+      </w:r>
+      <w:r>
+        <w:t xml:space="preserve"> </w:t>
+      </w:r>
+      <w:r>
+        <w:t xml:space="preserve">A hat, a tilde or a bar says how a symbol is drawn, not what it means.</w:t>
+      </w:r>
+      <w:r>
+        <w:t xml:space="preserve"> </w:t>
+      </w:r>
+      <w:r>
+        <w:t xml:space="preserve">A hat can mark an estimate, a fitted value or a Fourier transform,</w:t>
+      </w:r>
+      <w:r>
+        <w:t xml:space="preserve"> </w:t>
+      </w:r>
+      <w:r>
+        <w:t xml:space="preserve">so</w:t>
+      </w:r>
+      <w:r>
+        <w:t xml:space="preserve"> </w:t>
+      </w:r>
+      <w:r>
+        <w:rPr>
+          <w:rStyle w:val="VerbatimChar"/>
+        </w:rPr>
+        <w:t xml:space="preserve">\hat</w:t>
+      </w:r>
+      <w:r>
+        <w:t xml:space="preserve"> </w:t>
+      </w:r>
+      <w:r>
+        <w:t xml:space="preserve">names no concept either.</w:t>
+      </w:r>
+      <w:r>
+        <w:t xml:space="preserve"> </w:t>
+      </w:r>
+      <w:r>
+        <w:t xml:space="preserve">Write the macro that names the role instead,</w:t>
+      </w:r>
+      <w:r>
+        <w:t xml:space="preserve"> </w:t>
+      </w:r>
+      <w:r>
+        <w:t xml:space="preserve">such as</w:t>
+      </w:r>
+      <w:r>
+        <w:t xml:space="preserve"> </w:t>
+      </w:r>
+      <w:r>
+        <w:rPr>
+          <w:rStyle w:val="VerbatimChar"/>
+        </w:rPr>
+        <w:t xml:space="preserve">\est{}</w:t>
+      </w:r>
+      <w:r>
+        <w:t xml:space="preserve"> </w:t>
+      </w:r>
+      <w:r>
+        <w:t xml:space="preserve">for an estimate,</w:t>
+      </w:r>
+      <w:r>
+        <w:t xml:space="preserve"> </w:t>
+      </w:r>
+      <w:r>
+        <w:t xml:space="preserve">and keep</w:t>
+      </w:r>
+      <w:r>
+        <w:t xml:space="preserve"> </w:t>
+      </w:r>
+      <w:r>
+        <w:rPr>
+          <w:rStyle w:val="VerbatimChar"/>
+        </w:rPr>
+        <w:t xml:space="preserve">\hat</w:t>
+      </w:r>
+      <w:r>
+        <w:t xml:space="preserve"> </w:t>
+      </w:r>
+      <w:r>
+        <w:t xml:space="preserve">for passages that discuss the notation itself.</w:t>
+      </w:r>
+      <w:r>
+        <w:t xml:space="preserve"> </w:t>
+      </w:r>
+      <w:r>
+        <w:t xml:space="preserve">New math follows this now;</w:t>
+      </w:r>
+      <w:r>
+        <w:t xml:space="preserve"> </w:t>
+      </w:r>
+      <w:r>
+        <w:t xml:space="preserve">existing hats are converted in separate sweeps.</w:t>
+      </w:r>
+    </w:p>
+    <w:bookmarkStart w:id="36" w:name="exm-semantic-decorator"/>
+    <w:p>
+      <w:pPr>
+        <w:pStyle w:val="BodyText"/>
+      </w:pPr>
+      <w:r>
+        <w:rPr>
+          <w:b/>
+          <w:bCs/>
+        </w:rPr>
+        <w:t xml:space="preserve">Example 11 (Naming a decorator for its meaning)</w:t>
+      </w:r>
+      <w:r>
+        <w:t xml:space="preserve"> </w:t>
+      </w:r>
+      <w:r>
+        <w:t xml:space="preserve"> </w:t>
+      </w:r>
+    </w:p>
+    <w:p>
+      <w:pPr>
+        <w:pStyle w:val="BlockText"/>
+      </w:pPr>
+      <w:r>
+        <w:t xml:space="preserve">❌ Source:</w:t>
+      </w:r>
+      <w:r>
+        <w:t xml:space="preserve"> </w:t>
+      </w:r>
+      <w:r>
+        <w:rPr>
+          <w:rStyle w:val="VerbatimChar"/>
+        </w:rPr>
+        <w:t xml:space="preserve">The estimate $\hat{\mean}$ is close to $\mean$.</w:t>
+      </w:r>
+    </w:p>
+    <w:p>
+      <w:pPr>
+        <w:pStyle w:val="BlockText"/>
+      </w:pPr>
+      <w:r>
+        <w:t xml:space="preserve">✅ Source:</w:t>
+      </w:r>
+      <w:r>
+        <w:t xml:space="preserve"> </w:t>
+      </w:r>
+      <w:r>
+        <w:rPr>
+          <w:rStyle w:val="VerbatimChar"/>
+        </w:rPr>
+        <w:t xml:space="preserve">The estimate $\est{\mean}$ is close to $\mean$.</w:t>
+      </w:r>
+    </w:p>
+    <w:p>
+      <w:pPr>
+        <w:pStyle w:val="FirstParagraph"/>
+      </w:pPr>
+      <w:r>
+        <w:t xml:space="preserve">Both versions print the same hat.</w:t>
+      </w:r>
+      <w:r>
+        <w:t xml:space="preserve"> </w:t>
+      </w:r>
+      <w:r>
+        <w:t xml:space="preserve">If the group later marks estimates some other way,</w:t>
+      </w:r>
+      <w:r>
+        <w:t xml:space="preserve"> </w:t>
+      </w:r>
+      <w:r>
+        <w:t xml:space="preserve">only the definition of</w:t>
+      </w:r>
+      <w:r>
+        <w:t xml:space="preserve"> </w:t>
+      </w:r>
+      <w:r>
+        <w:rPr>
+          <w:rStyle w:val="VerbatimChar"/>
+        </w:rPr>
+        <w:t xml:space="preserve">\est</w:t>
+      </w:r>
+      <w:r>
+        <w:t xml:space="preserve"> </w:t>
+      </w:r>
+      <w:r>
+        <w:t xml:space="preserve">changes.</w:t>
+      </w:r>
+    </w:p>
+    <w:bookmarkEnd w:id="36"/>
+    <w:p>
+      <w:pPr>
+        <w:pStyle w:val="BodyText"/>
+      </w:pPr>
+      <w:r>
+        <w:t xml:space="preserve">Latin letters with a fixed role follow the same rule.</w:t>
+      </w:r>
+      <w:r>
+        <w:t xml:space="preserve"> </w:t>
+      </w:r>
+      <w:r>
+        <w:t xml:space="preserve">In a regression or prediction model, use these macros:</w:t>
+      </w:r>
+    </w:p>
+    <w:p>
+      <w:pPr>
+        <w:pStyle w:val="Compact"/>
+        <w:numPr>
+          <w:ilvl w:val="0"/>
+          <w:numId w:val="1008"/>
+        </w:numPr>
+      </w:pPr>
+      <w:r>
+        <w:rPr>
+          <w:rStyle w:val="VerbatimChar"/>
+        </w:rPr>
+        <w:t xml:space="preserve">\outvar</w:t>
+      </w:r>
+      <w:r>
+        <w:t xml:space="preserve"> </w:t>
+      </w:r>
+      <w:r>
+        <w:t xml:space="preserve">for the outcome variable, instead of a bare</w:t>
+      </w:r>
+      <w:r>
+        <w:t xml:space="preserve"> </w:t>
+      </w:r>
+      <w:r>
+        <w:rPr>
+          <w:rStyle w:val="VerbatimChar"/>
+        </w:rPr>
+        <w:t xml:space="preserve">y</w:t>
+      </w:r>
+      <w:r>
+        <w:t xml:space="preserve">;</w:t>
+      </w:r>
+    </w:p>
+    <w:p>
+      <w:pPr>
+        <w:pStyle w:val="Compact"/>
+        <w:numPr>
+          <w:ilvl w:val="0"/>
+          <w:numId w:val="1008"/>
+        </w:numPr>
+      </w:pPr>
+      <w:r>
+        <w:rPr>
+          <w:rStyle w:val="VerbatimChar"/>
+        </w:rPr>
+        <w:t xml:space="preserve">\eoutvar</w:t>
+      </w:r>
+      <w:r>
+        <w:t xml:space="preserve"> </w:t>
+      </w:r>
+      <w:r>
+        <w:t xml:space="preserve">for a predicted outcome;</w:t>
+      </w:r>
+    </w:p>
+    <w:p>
+      <w:pPr>
+        <w:pStyle w:val="Compact"/>
+        <w:numPr>
+          <w:ilvl w:val="0"/>
+          <w:numId w:val="1008"/>
+        </w:numPr>
+      </w:pPr>
+      <w:r>
+        <w:rPr>
+          <w:rStyle w:val="VerbatimChar"/>
+        </w:rPr>
+        <w:t xml:space="preserve">\predvar</w:t>
+      </w:r>
+      <w:r>
+        <w:t xml:space="preserve"> </w:t>
+      </w:r>
+      <w:r>
+        <w:t xml:space="preserve">for a predictor, instead of a bare</w:t>
+      </w:r>
+      <w:r>
+        <w:t xml:space="preserve"> </w:t>
+      </w:r>
+      <w:r>
+        <w:rPr>
+          <w:rStyle w:val="VerbatimChar"/>
+        </w:rPr>
+        <w:t xml:space="preserve">x</w:t>
+      </w:r>
+      <w:r>
+        <w:t xml:space="preserve">;</w:t>
+      </w:r>
+    </w:p>
+    <w:p>
+      <w:pPr>
+        <w:pStyle w:val="Compact"/>
+        <w:numPr>
+          <w:ilvl w:val="0"/>
+          <w:numId w:val="1008"/>
+        </w:numPr>
+      </w:pPr>
+      <w:r>
+        <w:rPr>
+          <w:rStyle w:val="VerbatimChar"/>
+        </w:rPr>
+        <w:t xml:space="preserve">\resid</w:t>
+      </w:r>
+      <w:r>
+        <w:t xml:space="preserve"> </w:t>
+      </w:r>
+      <w:r>
+        <w:t xml:space="preserve">for a residual, the observed minus the predicted outcome;</w:t>
+      </w:r>
+    </w:p>
+    <w:p>
+      <w:pPr>
+        <w:pStyle w:val="Compact"/>
+        <w:numPr>
+          <w:ilvl w:val="0"/>
+          <w:numId w:val="1008"/>
+        </w:numPr>
+      </w:pPr>
+      <w:r>
         <w:rPr>
           <w:rStyle w:val="VerbatimChar"/>
         </w:rPr>
@@ -7660,7 +8779,7 @@
         <w:t xml:space="preserve">.</w:t>
       </w:r>
     </w:p>
-    <w:bookmarkStart w:id="34" w:name="exm-semantic-latin-letter"/>
+    <w:bookmarkStart w:id="37" w:name="exm-semantic-latin-letter"/>
     <w:p>
       <w:pPr>
         <w:pStyle w:val="BodyText"/>
@@ -7670,7 +8789,7 @@
           <w:b/>
           <w:bCs/>
         </w:rPr>
-        <w:t xml:space="preserve">Example 11 (Naming a variable for its role)</w:t>
+        <w:t xml:space="preserve">Example 12 (Naming a variable for its role)</w:t>
       </w:r>
       <w:r>
         <w:t xml:space="preserve"> </w:t>
@@ -7750,7 +8869,7 @@
         <w:t xml:space="preserve">which letter is the outcome and which is the residual.</w:t>
       </w:r>
     </w:p>
-    <w:bookmarkEnd w:id="34"/>
+    <w:bookmarkEnd w:id="37"/>
     <w:p>
       <w:pPr>
         <w:pStyle w:val="BodyText"/>
@@ -7777,7 +8896,7 @@
         <w:t xml:space="preserve">and a reader sees which quantity it is about.</w:t>
       </w:r>
     </w:p>
-    <w:bookmarkStart w:id="35" w:name="exm-named-quantity"/>
+    <w:bookmarkStart w:id="38" w:name="exm-named-quantity"/>
     <w:p>
       <w:pPr>
         <w:pStyle w:val="BodyText"/>
@@ -7787,7 +8906,7 @@
           <w:b/>
           <w:bCs/>
         </w:rPr>
-        <w:t xml:space="preserve">Example 12 (Writing a named quantity by its name)</w:t>
+        <w:t xml:space="preserve">Example 13 (Writing a named quantity by its name)</w:t>
       </w:r>
       <w:r>
         <w:t xml:space="preserve"> </w:t>
@@ -7889,15 +9008,15 @@
         <w:t xml:space="preserve">and it names the quantity the gradient depends on.</w:t>
       </w:r>
     </w:p>
-    <w:bookmarkEnd w:id="35"/>
-    <w:bookmarkEnd w:id="36"/>
-    <w:bookmarkStart w:id="38" w:name="writing-dot-products"/>
+    <w:bookmarkEnd w:id="38"/>
+    <w:bookmarkEnd w:id="39"/>
+    <w:bookmarkStart w:id="41" w:name="writing-dot-products"/>
     <w:p>
       <w:pPr>
         <w:pStyle w:val="Heading2"/>
       </w:pPr>
       <w:r>
-        <w:t xml:space="preserve">6 Writing dot products</w:t>
+        <w:t xml:space="preserve">7 Writing dot products</w:t>
       </w:r>
     </w:p>
     <w:p>
@@ -8064,7 +9183,7 @@
         <w:t xml:space="preserve">and to work out that the result is a single number.</w:t>
       </w:r>
     </w:p>
-    <w:bookmarkStart w:id="37" w:name="exm-dot-product"/>
+    <w:bookmarkStart w:id="40" w:name="exm-dot-product"/>
     <w:p>
       <w:pPr>
         <w:pStyle w:val="BodyText"/>
@@ -8074,7 +9193,7 @@
           <w:b/>
           <w:bCs/>
         </w:rPr>
-        <w:t xml:space="preserve">Example 13 (Writing a dot product)</w:t>
+        <w:t xml:space="preserve">Example 14 (Writing a dot product)</w:t>
       </w:r>
       <w:r>
         <w:t xml:space="preserve"> </w:t>
@@ -8293,7 +9412,7 @@
         <w:t xml:space="preserve">.</w:t>
       </w:r>
     </w:p>
-    <w:bookmarkEnd w:id="37"/>
+    <w:bookmarkEnd w:id="40"/>
     <w:p>
       <w:pPr>
         <w:pStyle w:val="BodyText"/>
@@ -8307,7 +9426,7 @@
         <w:pStyle w:val="Compact"/>
         <w:numPr>
           <w:ilvl w:val="0"/>
-          <w:numId w:val="1008"/>
+          <w:numId w:val="1009"/>
         </w:numPr>
       </w:pPr>
       <w:r>
@@ -8342,7 +9461,7 @@
         <w:pStyle w:val="Compact"/>
         <w:numPr>
           <w:ilvl w:val="0"/>
-          <w:numId w:val="1008"/>
+          <w:numId w:val="1009"/>
         </w:numPr>
       </w:pPr>
       <w:r>
@@ -8391,7 +9510,7 @@
         <w:pStyle w:val="Compact"/>
         <w:numPr>
           <w:ilvl w:val="0"/>
-          <w:numId w:val="1008"/>
+          <w:numId w:val="1009"/>
         </w:numPr>
       </w:pPr>
       <w:r>
@@ -8452,14 +9571,14 @@
         <w:t xml:space="preserve">such as a definition of an inner product space.</w:t>
       </w:r>
     </w:p>
-    <w:bookmarkEnd w:id="38"/>
-    <w:bookmarkStart w:id="41" w:name="writing-out-notational-shorthands"/>
+    <w:bookmarkEnd w:id="41"/>
+    <w:bookmarkStart w:id="44" w:name="writing-out-notational-shorthands"/>
     <w:p>
       <w:pPr>
         <w:pStyle w:val="Heading2"/>
       </w:pPr>
       <w:r>
-        <w:t xml:space="preserve">7 Writing out notational shorthands</w:t>
+        <w:t xml:space="preserve">8 Writing out notational shorthands</w:t>
       </w:r>
     </w:p>
     <w:p>
@@ -8892,7 +10011,7 @@
       <w:r>
         <w:t xml:space="preserve"> </w:t>
       </w:r>
-      <w:hyperlink r:id="rId39">
+      <w:hyperlink r:id="rId42">
         <w:r>
           <w:rPr>
             <w:rStyle w:val="Hyperlink"/>
@@ -8933,7 +10052,7 @@
         <w:t xml:space="preserve">catalogs common shorthands and their full forms.</w:t>
       </w:r>
     </w:p>
-    <w:bookmarkStart w:id="40" w:name="exm-notational-shorthand"/>
+    <w:bookmarkStart w:id="43" w:name="exm-notational-shorthand"/>
     <w:p>
       <w:pPr>
         <w:pStyle w:val="BodyText"/>
@@ -8943,7 +10062,7 @@
           <w:b/>
           <w:bCs/>
         </w:rPr>
-        <w:t xml:space="preserve">Example 14 (Writing out the limits of a sum and the range of an index)</w:t>
+        <w:t xml:space="preserve">Example 15 (Writing out the limits of a sum and the range of an index)</w:t>
       </w:r>
       <w:r>
         <w:t xml:space="preserve"> </w:t>
@@ -9500,8 +10619,8 @@
         <w:t xml:space="preserve">observations.</w:t>
       </w:r>
     </w:p>
-    <w:bookmarkEnd w:id="40"/>
-    <w:bookmarkEnd w:id="41"/>
+    <w:bookmarkEnd w:id="43"/>
+    <w:bookmarkEnd w:id="44"/>
     <w:sectPr>
       <w:footnotePr>
         <w:numRestart w:val="eachSect"/>
@@ -9852,6 +10971,9 @@
     <w:abstractNumId w:val="991"/>
   </w:num>
   <w:num w:numId="1008">
+    <w:abstractNumId w:val="991"/>
+  </w:num>
+  <w:num w:numId="1009">
     <w:abstractNumId w:val="991"/>
   </w:num>
 </w:numbering>

</xml_diff>

<commit_message>
Deploying to gh-pages from @ Morrison-Lab/psw@4bb7728c72ff2a74cdaa72c739530c41206053f7 🚀
</commit_message>
<xml_diff>
--- a/chapters/notation.docx
+++ b/chapters/notation.docx
@@ -15,7 +15,7 @@
         <w:pStyle w:val="Date"/>
       </w:pPr>
       <w:r>
-        <w:t xml:space="preserve">Last modified: 2026-10-09 11:38:54 (PDT)</w:t>
+        <w:t xml:space="preserve">Last modified: 2026-10-09 12:00:07 (PDT)</w:t>
       </w:r>
     </w:p>
     <w:tbl>
@@ -7835,7 +7835,7 @@
       </w:r>
     </w:p>
     <w:bookmarkEnd w:id="33"/>
-    <w:bookmarkStart w:id="39" w:name="using-shared-macros"/>
+    <w:bookmarkStart w:id="40" w:name="using-shared-macros"/>
     <w:p>
       <w:pPr>
         <w:pStyle w:val="Heading2"/>
@@ -9009,8 +9009,249 @@
       </w:r>
     </w:p>
     <w:bookmarkEnd w:id="38"/>
+    <w:p>
+      <w:pPr>
+        <w:pStyle w:val="BodyText"/>
+      </w:pPr>
+      <w:r>
+        <w:t xml:space="preserve">Delimiters follow the same rule.</w:t>
+      </w:r>
+      <w:r>
+        <w:t xml:space="preserve"> </w:t>
+      </w:r>
+      <w:r>
+        <w:t xml:space="preserve">Manual sizing commands, such as</w:t>
+      </w:r>
+      <w:r>
+        <w:t xml:space="preserve"> </w:t>
+      </w:r>
+      <w:r>
+        <w:rPr>
+          <w:rStyle w:val="VerbatimChar"/>
+        </w:rPr>
+        <w:t xml:space="preserve">\big</w:t>
+      </w:r>
+      <w:r>
+        <w:t xml:space="preserve"> </w:t>
+      </w:r>
+      <w:r>
+        <w:t xml:space="preserve">and</w:t>
+      </w:r>
+      <w:r>
+        <w:t xml:space="preserve"> </w:t>
+      </w:r>
+      <w:r>
+        <w:rPr>
+          <w:rStyle w:val="VerbatimChar"/>
+        </w:rPr>
+        <w:t xml:space="preserve">\left</w:t>
+      </w:r>
+      <w:r>
+        <w:t xml:space="preserve"> </w:t>
+      </w:r>
+      <w:r>
+        <w:t xml:space="preserve">with</w:t>
+      </w:r>
+      <w:r>
+        <w:t xml:space="preserve"> </w:t>
+      </w:r>
+      <w:r>
+        <w:rPr>
+          <w:rStyle w:val="VerbatimChar"/>
+        </w:rPr>
+        <w:t xml:space="preserve">\right</w:t>
+      </w:r>
+      <w:r>
+        <w:t xml:space="preserve">,</w:t>
+      </w:r>
+      <w:r>
+        <w:t xml:space="preserve"> </w:t>
+      </w:r>
+      <w:r>
+        <w:t xml:space="preserve">say how a bracket is drawn, not what it groups.</w:t>
+      </w:r>
+      <w:r>
+        <w:t xml:space="preserve"> </w:t>
+      </w:r>
+      <w:r>
+        <w:t xml:space="preserve">The shared macros</w:t>
+      </w:r>
+      <w:r>
+        <w:t xml:space="preserve"> </w:t>
+      </w:r>
+      <w:r>
+        <w:rPr>
+          <w:rStyle w:val="VerbatimChar"/>
+        </w:rPr>
+        <w:t xml:space="preserve">\paren{}</w:t>
+      </w:r>
+      <w:r>
+        <w:t xml:space="preserve">,</w:t>
+      </w:r>
+      <w:r>
+        <w:t xml:space="preserve"> </w:t>
+      </w:r>
+      <w:r>
+        <w:rPr>
+          <w:rStyle w:val="VerbatimChar"/>
+        </w:rPr>
+        <w:t xml:space="preserve">\sb{}</w:t>
+      </w:r>
+      <w:r>
+        <w:t xml:space="preserve">,</w:t>
+      </w:r>
+      <w:r>
+        <w:t xml:space="preserve"> </w:t>
+      </w:r>
+      <w:r>
+        <w:rPr>
+          <w:rStyle w:val="VerbatimChar"/>
+        </w:rPr>
+        <w:t xml:space="preserve">\cb{}</w:t>
+      </w:r>
+      <w:r>
+        <w:t xml:space="preserve">,</w:t>
+      </w:r>
+      <w:r>
+        <w:t xml:space="preserve"> </w:t>
+      </w:r>
+      <w:r>
+        <w:rPr>
+          <w:rStyle w:val="VerbatimChar"/>
+        </w:rPr>
+        <w:t xml:space="preserve">\set{}</w:t>
+      </w:r>
+      <w:r>
+        <w:t xml:space="preserve"> </w:t>
+      </w:r>
+      <w:r>
+        <w:t xml:space="preserve">and</w:t>
+      </w:r>
+      <w:r>
+        <w:t xml:space="preserve"> </w:t>
+      </w:r>
+      <w:r>
+        <w:rPr>
+          <w:rStyle w:val="VerbatimChar"/>
+        </w:rPr>
+        <w:t xml:space="preserve">\abs{}</w:t>
+      </w:r>
+      <w:r>
+        <w:t xml:space="preserve"> </w:t>
+      </w:r>
+      <w:r>
+        <w:t xml:space="preserve">size themselves to their contents,</w:t>
+      </w:r>
+      <w:r>
+        <w:t xml:space="preserve"> </w:t>
+      </w:r>
+      <w:r>
+        <w:t xml:space="preserve">so write them instead of a hand-sized pair.</w:t>
+      </w:r>
+      <w:r>
+        <w:t xml:space="preserve"> </w:t>
+      </w:r>
+      <w:r>
+        <w:t xml:space="preserve">Arrows such as</w:t>
+      </w:r>
+      <w:r>
+        <w:t xml:space="preserve"> </w:t>
+      </w:r>
+      <w:r>
+        <w:rPr>
+          <w:rStyle w:val="VerbatimChar"/>
+        </w:rPr>
+        <w:t xml:space="preserve">\leftarrow</w:t>
+      </w:r>
+      <w:r>
+        <w:t xml:space="preserve"> </w:t>
+      </w:r>
+      <w:r>
+        <w:t xml:space="preserve">are not delimiters.</w:t>
+      </w:r>
+    </w:p>
+    <w:bookmarkStart w:id="39" w:name="exm-semantic-delimiter"/>
+    <w:p>
+      <w:pPr>
+        <w:pStyle w:val="BodyText"/>
+      </w:pPr>
+      <w:r>
+        <w:rPr>
+          <w:b/>
+          <w:bCs/>
+        </w:rPr>
+        <w:t xml:space="preserve">Example 14 (Letting the macro size the bracket)</w:t>
+      </w:r>
+      <w:r>
+        <w:t xml:space="preserve"> </w:t>
+      </w:r>
+      <w:r>
+        <w:t xml:space="preserve"> </w:t>
+      </w:r>
+    </w:p>
+    <w:p>
+      <w:pPr>
+        <w:pStyle w:val="BlockText"/>
+      </w:pPr>
+      <w:r>
+        <w:t xml:space="preserve">❌ Source:</w:t>
+      </w:r>
+      <w:r>
+        <w:t xml:space="preserve"> </w:t>
+      </w:r>
+      <w:r>
+        <w:rPr>
+          <w:rStyle w:val="VerbatimChar"/>
+        </w:rPr>
+        <w:t xml:space="preserve">The mean is $\E{\left( X - \mu \right)^2}$.</w:t>
+      </w:r>
+    </w:p>
+    <w:p>
+      <w:pPr>
+        <w:pStyle w:val="BlockText"/>
+      </w:pPr>
+      <w:r>
+        <w:t xml:space="preserve">✅ Source:</w:t>
+      </w:r>
+      <w:r>
+        <w:t xml:space="preserve"> </w:t>
+      </w:r>
+      <w:r>
+        <w:rPr>
+          <w:rStyle w:val="VerbatimChar"/>
+        </w:rPr>
+        <w:t xml:space="preserve">The mean is $\E{\paren{X - \mu}^2}$.</w:t>
+      </w:r>
+    </w:p>
+    <w:p>
+      <w:pPr>
+        <w:pStyle w:val="FirstParagraph"/>
+      </w:pPr>
+      <w:r>
+        <w:t xml:space="preserve">Both versions print the same expression.</w:t>
+      </w:r>
+      <w:r>
+        <w:t xml:space="preserve"> </w:t>
+      </w:r>
+      <w:r>
+        <w:t xml:space="preserve">In the ✅ version, the macro sizes the bracket,</w:t>
+      </w:r>
+      <w:r>
+        <w:t xml:space="preserve"> </w:t>
+      </w:r>
+      <w:r>
+        <w:t xml:space="preserve">and a group that changes how brackets are drawn</w:t>
+      </w:r>
+      <w:r>
+        <w:t xml:space="preserve"> </w:t>
+      </w:r>
+      <w:r>
+        <w:t xml:space="preserve">edits one definition in the shared file.</w:t>
+      </w:r>
+    </w:p>
     <w:bookmarkEnd w:id="39"/>
-    <w:bookmarkStart w:id="41" w:name="writing-dot-products"/>
+    <w:bookmarkEnd w:id="40"/>
+    <w:bookmarkStart w:id="42" w:name="writing-dot-products"/>
     <w:p>
       <w:pPr>
         <w:pStyle w:val="Heading2"/>
@@ -9183,7 +9424,7 @@
         <w:t xml:space="preserve">and to work out that the result is a single number.</w:t>
       </w:r>
     </w:p>
-    <w:bookmarkStart w:id="40" w:name="exm-dot-product"/>
+    <w:bookmarkStart w:id="41" w:name="exm-dot-product"/>
     <w:p>
       <w:pPr>
         <w:pStyle w:val="BodyText"/>
@@ -9193,7 +9434,7 @@
           <w:b/>
           <w:bCs/>
         </w:rPr>
-        <w:t xml:space="preserve">Example 14 (Writing a dot product)</w:t>
+        <w:t xml:space="preserve">Example 15 (Writing a dot product)</w:t>
       </w:r>
       <w:r>
         <w:t xml:space="preserve"> </w:t>
@@ -9412,7 +9653,7 @@
         <w:t xml:space="preserve">.</w:t>
       </w:r>
     </w:p>
-    <w:bookmarkEnd w:id="40"/>
+    <w:bookmarkEnd w:id="41"/>
     <w:p>
       <w:pPr>
         <w:pStyle w:val="BodyText"/>
@@ -9571,8 +9812,8 @@
         <w:t xml:space="preserve">such as a definition of an inner product space.</w:t>
       </w:r>
     </w:p>
-    <w:bookmarkEnd w:id="41"/>
-    <w:bookmarkStart w:id="44" w:name="writing-out-notational-shorthands"/>
+    <w:bookmarkEnd w:id="42"/>
+    <w:bookmarkStart w:id="45" w:name="writing-out-notational-shorthands"/>
     <w:p>
       <w:pPr>
         <w:pStyle w:val="Heading2"/>
@@ -10011,7 +10252,7 @@
       <w:r>
         <w:t xml:space="preserve"> </w:t>
       </w:r>
-      <w:hyperlink r:id="rId42">
+      <w:hyperlink r:id="rId43">
         <w:r>
           <w:rPr>
             <w:rStyle w:val="Hyperlink"/>
@@ -10052,7 +10293,7 @@
         <w:t xml:space="preserve">catalogs common shorthands and their full forms.</w:t>
       </w:r>
     </w:p>
-    <w:bookmarkStart w:id="43" w:name="exm-notational-shorthand"/>
+    <w:bookmarkStart w:id="44" w:name="exm-notational-shorthand"/>
     <w:p>
       <w:pPr>
         <w:pStyle w:val="BodyText"/>
@@ -10062,7 +10303,7 @@
           <w:b/>
           <w:bCs/>
         </w:rPr>
-        <w:t xml:space="preserve">Example 15 (Writing out the limits of a sum and the range of an index)</w:t>
+        <w:t xml:space="preserve">Example 16 (Writing out the limits of a sum and the range of an index)</w:t>
       </w:r>
       <w:r>
         <w:t xml:space="preserve"> </w:t>
@@ -10619,8 +10860,8 @@
         <w:t xml:space="preserve">observations.</w:t>
       </w:r>
     </w:p>
-    <w:bookmarkEnd w:id="43"/>
     <w:bookmarkEnd w:id="44"/>
+    <w:bookmarkEnd w:id="45"/>
     <w:sectPr>
       <w:footnotePr>
         <w:numRestart w:val="eachSect"/>

</xml_diff>

<commit_message>
Deploying to gh-pages from @ Morrison-Lab/psw@574dfe9cc0f270f7498f532cf0629e9fdca4d713 🚀
</commit_message>
<xml_diff>
--- a/chapters/notation.docx
+++ b/chapters/notation.docx
@@ -15,7 +15,7 @@
         <w:pStyle w:val="Date"/>
       </w:pPr>
       <w:r>
-        <w:t xml:space="preserve">Last modified: 2026-10-10 12:11:39 (PDT)</w:t>
+        <w:t xml:space="preserve">Last modified: 2026-10-11 20:38:16 (PDT)</w:t>
       </w:r>
     </w:p>
     <w:tbl>
@@ -7835,7 +7835,7 @@
       </w:r>
     </w:p>
     <w:bookmarkEnd w:id="33"/>
-    <w:bookmarkStart w:id="40" w:name="using-shared-macros"/>
+    <w:bookmarkStart w:id="41" w:name="using-shared-macros"/>
     <w:p>
       <w:pPr>
         <w:pStyle w:val="Heading2"/>
@@ -8478,6 +8478,283 @@
         <w:pStyle w:val="BodyText"/>
       </w:pPr>
       <w:r>
+        <w:t xml:space="preserve">Font commands follow the same rule.</w:t>
+      </w:r>
+      <w:r>
+        <w:t xml:space="preserve"> </w:t>
+      </w:r>
+      <w:r>
+        <w:rPr>
+          <w:rStyle w:val="VerbatimChar"/>
+        </w:rPr>
+        <w:t xml:space="preserve">\mathscr</w:t>
+      </w:r>
+      <w:r>
+        <w:t xml:space="preserve">,</w:t>
+      </w:r>
+      <w:r>
+        <w:t xml:space="preserve"> </w:t>
+      </w:r>
+      <w:r>
+        <w:rPr>
+          <w:rStyle w:val="VerbatimChar"/>
+        </w:rPr>
+        <w:t xml:space="preserve">\mathcal</w:t>
+      </w:r>
+      <w:r>
+        <w:t xml:space="preserve">,</w:t>
+      </w:r>
+      <w:r>
+        <w:t xml:space="preserve"> </w:t>
+      </w:r>
+      <w:r>
+        <w:rPr>
+          <w:rStyle w:val="VerbatimChar"/>
+        </w:rPr>
+        <w:t xml:space="preserve">\mathbb</w:t>
+      </w:r>
+      <w:r>
+        <w:t xml:space="preserve"> </w:t>
+      </w:r>
+      <w:r>
+        <w:t xml:space="preserve">and</w:t>
+      </w:r>
+      <w:r>
+        <w:t xml:space="preserve"> </w:t>
+      </w:r>
+      <w:r>
+        <w:rPr>
+          <w:rStyle w:val="VerbatimChar"/>
+        </w:rPr>
+        <w:t xml:space="preserve">\mathbf</w:t>
+      </w:r>
+      <w:r>
+        <w:t xml:space="preserve"> </w:t>
+      </w:r>
+      <w:r>
+        <w:t xml:space="preserve">say how a letter is drawn,</w:t>
+      </w:r>
+      <w:r>
+        <w:t xml:space="preserve"> </w:t>
+      </w:r>
+      <w:r>
+        <w:t xml:space="preserve">not what it stands for,</w:t>
+      </w:r>
+      <w:r>
+        <w:t xml:space="preserve"> </w:t>
+      </w:r>
+      <w:r>
+        <w:t xml:space="preserve">so a raw</w:t>
+      </w:r>
+      <w:r>
+        <w:t xml:space="preserve"> </w:t>
+      </w:r>
+      <w:r>
+        <w:rPr>
+          <w:rStyle w:val="VerbatimChar"/>
+        </w:rPr>
+        <w:t xml:space="preserve">\mathbb{R}</w:t>
+      </w:r>
+      <w:r>
+        <w:t xml:space="preserve"> </w:t>
+      </w:r>
+      <w:r>
+        <w:t xml:space="preserve">or</w:t>
+      </w:r>
+      <w:r>
+        <w:t xml:space="preserve"> </w:t>
+      </w:r>
+      <w:r>
+        <w:rPr>
+          <w:rStyle w:val="VerbatimChar"/>
+        </w:rPr>
+        <w:t xml:space="preserve">\mathscr{A}</w:t>
+      </w:r>
+      <w:r>
+        <w:t xml:space="preserve"> </w:t>
+      </w:r>
+      <w:r>
+        <w:t xml:space="preserve">leaves the reader of the source guessing at the concept</w:t>
+      </w:r>
+      <w:r>
+        <w:t xml:space="preserve"> </w:t>
+      </w:r>
+      <w:r>
+        <w:t xml:space="preserve">and leaves the group editing every use to change the symbol.</w:t>
+      </w:r>
+      <w:r>
+        <w:t xml:space="preserve"> </w:t>
+      </w:r>
+      <w:r>
+        <w:t xml:space="preserve">Write the macro that names the concept.</w:t>
+      </w:r>
+      <w:r>
+        <w:t xml:space="preserve"> </w:t>
+      </w:r>
+      <w:r>
+        <w:t xml:space="preserve">Name the macro for the set, such as</w:t>
+      </w:r>
+      <w:r>
+        <w:t xml:space="preserve"> </w:t>
+      </w:r>
+      <w:r>
+        <w:rPr>
+          <w:rStyle w:val="VerbatimChar"/>
+        </w:rPr>
+        <w:t xml:space="preserve">\reals</w:t>
+      </w:r>
+      <w:r>
+        <w:t xml:space="preserve"> </w:t>
+      </w:r>
+      <w:r>
+        <w:t xml:space="preserve">for the real numbers,</w:t>
+      </w:r>
+      <w:r>
+        <w:t xml:space="preserve"> </w:t>
+      </w:r>
+      <w:r>
+        <w:t xml:space="preserve">not for the font, as</w:t>
+      </w:r>
+      <w:r>
+        <w:t xml:space="preserve"> </w:t>
+      </w:r>
+      <w:r>
+        <w:rPr>
+          <w:rStyle w:val="VerbatimChar"/>
+        </w:rPr>
+        <w:t xml:space="preserve">\bbR</w:t>
+      </w:r>
+      <w:r>
+        <w:t xml:space="preserve"> </w:t>
+      </w:r>
+      <w:r>
+        <w:t xml:space="preserve">would be.</w:t>
+      </w:r>
+      <w:r>
+        <w:t xml:space="preserve"> </w:t>
+      </w:r>
+      <w:r>
+        <w:t xml:space="preserve">A document that reaches for a font command directly</w:t>
+      </w:r>
+      <w:r>
+        <w:t xml:space="preserve"> </w:t>
+      </w:r>
+      <w:r>
+        <w:t xml:space="preserve">has found a concept with no macro yet:</w:t>
+      </w:r>
+      <w:r>
+        <w:t xml:space="preserve"> </w:t>
+      </w:r>
+      <w:r>
+        <w:t xml:space="preserve">add the macro to the shared file, then use it.</w:t>
+      </w:r>
+      <w:r>
+        <w:t xml:space="preserve"> </w:t>
+      </w:r>
+      <w:r>
+        <w:t xml:space="preserve">As with Greek letters, a passage that discusses the notation itself</w:t>
+      </w:r>
+      <w:r>
+        <w:t xml:space="preserve"> </w:t>
+      </w:r>
+      <w:r>
+        <w:t xml:space="preserve">may write the font command directly.</w:t>
+      </w:r>
+    </w:p>
+    <w:bookmarkStart w:id="37" w:name="exm-semantic-font"/>
+    <w:p>
+      <w:pPr>
+        <w:pStyle w:val="BodyText"/>
+      </w:pPr>
+      <w:r>
+        <w:rPr>
+          <w:b/>
+          <w:bCs/>
+        </w:rPr>
+        <w:t xml:space="preserve">Example 12 (Naming a set for its meaning)</w:t>
+      </w:r>
+      <w:r>
+        <w:t xml:space="preserve"> </w:t>
+      </w:r>
+      <w:r>
+        <w:t xml:space="preserve"> </w:t>
+      </w:r>
+    </w:p>
+    <w:p>
+      <w:pPr>
+        <w:pStyle w:val="BlockText"/>
+      </w:pPr>
+      <w:r>
+        <w:t xml:space="preserve">❌ Source:</w:t>
+      </w:r>
+      <w:r>
+        <w:t xml:space="preserve"> </w:t>
+      </w:r>
+      <w:r>
+        <w:rPr>
+          <w:rStyle w:val="VerbatimChar"/>
+        </w:rPr>
+        <w:t xml:space="preserve">The function maps $\mathbb{R}$ to $\mathbb{R}$.</w:t>
+      </w:r>
+    </w:p>
+    <w:p>
+      <w:pPr>
+        <w:pStyle w:val="BlockText"/>
+      </w:pPr>
+      <w:r>
+        <w:t xml:space="preserve">✅ Source:</w:t>
+      </w:r>
+      <w:r>
+        <w:t xml:space="preserve"> </w:t>
+      </w:r>
+      <w:r>
+        <w:rPr>
+          <w:rStyle w:val="VerbatimChar"/>
+        </w:rPr>
+        <w:t xml:space="preserve">The function maps $\reals$ to $\reals$.</w:t>
+      </w:r>
+    </w:p>
+    <w:p>
+      <w:pPr>
+        <w:pStyle w:val="FirstParagraph"/>
+      </w:pPr>
+      <w:r>
+        <w:t xml:space="preserve">Both versions print the same symbol.</w:t>
+      </w:r>
+      <w:r>
+        <w:t xml:space="preserve"> </w:t>
+      </w:r>
+      <w:r>
+        <w:t xml:space="preserve">If the group changes how it writes the real numbers,</w:t>
+      </w:r>
+      <w:r>
+        <w:t xml:space="preserve"> </w:t>
+      </w:r>
+      <w:r>
+        <w:t xml:space="preserve">only the definition of</w:t>
+      </w:r>
+      <w:r>
+        <w:t xml:space="preserve"> </w:t>
+      </w:r>
+      <w:r>
+        <w:rPr>
+          <w:rStyle w:val="VerbatimChar"/>
+        </w:rPr>
+        <w:t xml:space="preserve">\reals</w:t>
+      </w:r>
+      <w:r>
+        <w:t xml:space="preserve"> </w:t>
+      </w:r>
+      <w:r>
+        <w:t xml:space="preserve">changes.</w:t>
+      </w:r>
+    </w:p>
+    <w:bookmarkEnd w:id="37"/>
+    <w:p>
+      <w:pPr>
+        <w:pStyle w:val="BodyText"/>
+      </w:pPr>
+      <w:r>
         <w:t xml:space="preserve">Latin letters with a fixed role follow the same rule.</w:t>
       </w:r>
       <w:r>
@@ -8779,7 +9056,7 @@
         <w:t xml:space="preserve">.</w:t>
       </w:r>
     </w:p>
-    <w:bookmarkStart w:id="37" w:name="exm-semantic-latin-letter"/>
+    <w:bookmarkStart w:id="38" w:name="exm-semantic-latin-letter"/>
     <w:p>
       <w:pPr>
         <w:pStyle w:val="BodyText"/>
@@ -8789,7 +9066,7 @@
           <w:b/>
           <w:bCs/>
         </w:rPr>
-        <w:t xml:space="preserve">Example 12 (Naming a variable for its role)</w:t>
+        <w:t xml:space="preserve">Example 13 (Naming a variable for its role)</w:t>
       </w:r>
       <w:r>
         <w:t xml:space="preserve"> </w:t>
@@ -8869,7 +9146,7 @@
         <w:t xml:space="preserve">which letter is the outcome and which is the residual.</w:t>
       </w:r>
     </w:p>
-    <w:bookmarkEnd w:id="37"/>
+    <w:bookmarkEnd w:id="38"/>
     <w:p>
       <w:pPr>
         <w:pStyle w:val="BodyText"/>
@@ -8896,7 +9173,7 @@
         <w:t xml:space="preserve">and a reader sees which quantity it is about.</w:t>
       </w:r>
     </w:p>
-    <w:bookmarkStart w:id="38" w:name="exm-named-quantity"/>
+    <w:bookmarkStart w:id="39" w:name="exm-named-quantity"/>
     <w:p>
       <w:pPr>
         <w:pStyle w:val="BodyText"/>
@@ -8906,7 +9183,7 @@
           <w:b/>
           <w:bCs/>
         </w:rPr>
-        <w:t xml:space="preserve">Example 13 (Writing a named quantity by its name)</w:t>
+        <w:t xml:space="preserve">Example 14 (Writing a named quantity by its name)</w:t>
       </w:r>
       <w:r>
         <w:t xml:space="preserve"> </w:t>
@@ -9008,7 +9285,7 @@
         <w:t xml:space="preserve">and it names the quantity the gradient depends on.</w:t>
       </w:r>
     </w:p>
-    <w:bookmarkEnd w:id="38"/>
+    <w:bookmarkEnd w:id="39"/>
     <w:p>
       <w:pPr>
         <w:pStyle w:val="BodyText"/>
@@ -9170,7 +9447,7 @@
         <w:t xml:space="preserve">are not delimiters.</w:t>
       </w:r>
     </w:p>
-    <w:bookmarkStart w:id="39" w:name="exm-semantic-delimiter"/>
+    <w:bookmarkStart w:id="40" w:name="exm-semantic-delimiter"/>
     <w:p>
       <w:pPr>
         <w:pStyle w:val="BodyText"/>
@@ -9180,7 +9457,7 @@
           <w:b/>
           <w:bCs/>
         </w:rPr>
-        <w:t xml:space="preserve">Example 14 (Letting the macro size the bracket)</w:t>
+        <w:t xml:space="preserve">Example 15 (Letting the macro size the bracket)</w:t>
       </w:r>
       <w:r>
         <w:t xml:space="preserve"> </w:t>
@@ -9249,9 +9526,9 @@
         <w:t xml:space="preserve">edits one definition in the shared file.</w:t>
       </w:r>
     </w:p>
-    <w:bookmarkEnd w:id="39"/>
     <w:bookmarkEnd w:id="40"/>
-    <w:bookmarkStart w:id="42" w:name="writing-dot-products"/>
+    <w:bookmarkEnd w:id="41"/>
+    <w:bookmarkStart w:id="43" w:name="writing-dot-products"/>
     <w:p>
       <w:pPr>
         <w:pStyle w:val="Heading2"/>
@@ -9424,7 +9701,7 @@
         <w:t xml:space="preserve">and to work out that the result is a single number.</w:t>
       </w:r>
     </w:p>
-    <w:bookmarkStart w:id="41" w:name="exm-dot-product"/>
+    <w:bookmarkStart w:id="42" w:name="exm-dot-product"/>
     <w:p>
       <w:pPr>
         <w:pStyle w:val="BodyText"/>
@@ -9434,7 +9711,7 @@
           <w:b/>
           <w:bCs/>
         </w:rPr>
-        <w:t xml:space="preserve">Example 15 (Writing a dot product)</w:t>
+        <w:t xml:space="preserve">Example 16 (Writing a dot product)</w:t>
       </w:r>
       <w:r>
         <w:t xml:space="preserve"> </w:t>
@@ -9653,7 +9930,7 @@
         <w:t xml:space="preserve">.</w:t>
       </w:r>
     </w:p>
-    <w:bookmarkEnd w:id="41"/>
+    <w:bookmarkEnd w:id="42"/>
     <w:p>
       <w:pPr>
         <w:pStyle w:val="BodyText"/>
@@ -9812,8 +10089,8 @@
         <w:t xml:space="preserve">such as a definition of an inner product space.</w:t>
       </w:r>
     </w:p>
-    <w:bookmarkEnd w:id="42"/>
-    <w:bookmarkStart w:id="45" w:name="writing-out-notational-shorthands"/>
+    <w:bookmarkEnd w:id="43"/>
+    <w:bookmarkStart w:id="46" w:name="writing-out-notational-shorthands"/>
     <w:p>
       <w:pPr>
         <w:pStyle w:val="Heading2"/>
@@ -10252,7 +10529,7 @@
       <w:r>
         <w:t xml:space="preserve"> </w:t>
       </w:r>
-      <w:hyperlink r:id="rId43">
+      <w:hyperlink r:id="rId44">
         <w:r>
           <w:rPr>
             <w:rStyle w:val="Hyperlink"/>
@@ -10293,7 +10570,7 @@
         <w:t xml:space="preserve">catalogs common shorthands and their full forms.</w:t>
       </w:r>
     </w:p>
-    <w:bookmarkStart w:id="44" w:name="exm-notational-shorthand"/>
+    <w:bookmarkStart w:id="45" w:name="exm-notational-shorthand"/>
     <w:p>
       <w:pPr>
         <w:pStyle w:val="BodyText"/>
@@ -10303,7 +10580,7 @@
           <w:b/>
           <w:bCs/>
         </w:rPr>
-        <w:t xml:space="preserve">Example 16 (Writing out the limits of a sum and the range of an index)</w:t>
+        <w:t xml:space="preserve">Example 17 (Writing out the limits of a sum and the range of an index)</w:t>
       </w:r>
       <w:r>
         <w:t xml:space="preserve"> </w:t>
@@ -10860,8 +11137,8 @@
         <w:t xml:space="preserve">observations.</w:t>
       </w:r>
     </w:p>
-    <w:bookmarkEnd w:id="44"/>
     <w:bookmarkEnd w:id="45"/>
+    <w:bookmarkEnd w:id="46"/>
     <w:sectPr>
       <w:footnotePr>
         <w:numRestart w:val="eachSect"/>

</xml_diff>

<commit_message>
Deploying to gh-pages from @ Morrison-Lab/psw@eded3edcd8745284f24af8de8872054124bda915 🚀
</commit_message>
<xml_diff>
--- a/chapters/notation.docx
+++ b/chapters/notation.docx
@@ -15,7 +15,7 @@
         <w:pStyle w:val="Date"/>
       </w:pPr>
       <w:r>
-        <w:t xml:space="preserve">Last modified: 2026-10-14 01:49:34 (PDT)</w:t>
+        <w:t xml:space="preserve">Last modified: 2026-10-14 02:26:37 (PDT)</w:t>
       </w:r>
     </w:p>
     <w:tbl>
@@ -7208,6 +7208,423 @@
       </w:r>
       <w:r>
         <w:t xml:space="preserve">, for a value.</w:t>
+      </w:r>
+    </w:p>
+    <w:p>
+      <w:pPr>
+        <w:pStyle w:val="FirstParagraph"/>
+      </w:pPr>
+      <w:r>
+        <w:t xml:space="preserve">In machine learning notes, the prediction function is</w:t>
+      </w:r>
+      <w:r>
+        <w:t xml:space="preserve"> </w:t>
+      </w:r>
+      <m:oMath>
+        <m:r>
+          <m:t>h</m:t>
+        </m:r>
+      </m:oMath>
+      <w:r>
+        <w:t xml:space="preserve">,</w:t>
+      </w:r>
+      <w:r>
+        <w:t xml:space="preserve"> </w:t>
+      </w:r>
+      <w:r>
+        <w:t xml:space="preserve">and its value at the</w:t>
+      </w:r>
+      <w:r>
+        <w:t xml:space="preserve"> </w:t>
+      </w:r>
+      <m:oMath>
+        <m:r>
+          <m:t>i</m:t>
+        </m:r>
+      </m:oMath>
+      <w:r>
+        <w:t xml:space="preserve">-th observed input is the</w:t>
+      </w:r>
+      <w:r>
+        <w:t xml:space="preserve"> </w:t>
+      </w:r>
+      <w:r>
+        <w:rPr>
+          <w:b/>
+          <w:bCs/>
+        </w:rPr>
+        <w:t xml:space="preserve">fitted value</w:t>
+      </w:r>
+      <w:r>
+        <w:t xml:space="preserve">.</w:t>
+      </w:r>
+      <w:r>
+        <w:t xml:space="preserve"> </w:t>
+      </w:r>
+      <w:r>
+        <w:t xml:space="preserve">Define it once as</w:t>
+      </w:r>
+      <w:r>
+        <w:t xml:space="preserve"> </w:t>
+      </w:r>
+      <m:oMath>
+        <m:sSub>
+          <m:e>
+            <m:acc>
+              <m:accPr>
+                <m:chr m:val="̂"/>
+              </m:accPr>
+              <m:e>
+                <m:r>
+                  <m:t>y</m:t>
+                </m:r>
+              </m:e>
+            </m:acc>
+          </m:e>
+          <m:sub>
+            <m:r>
+              <m:t>i</m:t>
+            </m:r>
+          </m:sub>
+        </m:sSub>
+        <m:r>
+          <m:rPr>
+            <m:sty m:val="p"/>
+          </m:rPr>
+          <m:t>=</m:t>
+        </m:r>
+        <m:r>
+          <m:t>h</m:t>
+        </m:r>
+        <m:r>
+          <m:rPr>
+            <m:sty m:val="p"/>
+          </m:rPr>
+          <m:t>(</m:t>
+        </m:r>
+        <m:sSub>
+          <m:e>
+            <m:r>
+              <m:t>x</m:t>
+            </m:r>
+          </m:e>
+          <m:sub>
+            <m:r>
+              <m:t>i</m:t>
+            </m:r>
+          </m:sub>
+        </m:sSub>
+        <m:r>
+          <m:rPr>
+            <m:sty m:val="p"/>
+          </m:rPr>
+          <m:t>)</m:t>
+        </m:r>
+      </m:oMath>
+      <w:r>
+        <w:t xml:space="preserve">,</w:t>
+      </w:r>
+      <w:r>
+        <w:t xml:space="preserve"> </w:t>
+      </w:r>
+      <w:r>
+        <w:t xml:space="preserve">then print</w:t>
+      </w:r>
+      <w:r>
+        <w:t xml:space="preserve"> </w:t>
+      </w:r>
+      <m:oMath>
+        <m:sSub>
+          <m:e>
+            <m:acc>
+              <m:accPr>
+                <m:chr m:val="̂"/>
+              </m:accPr>
+              <m:e>
+                <m:r>
+                  <m:t>y</m:t>
+                </m:r>
+              </m:e>
+            </m:acc>
+          </m:e>
+          <m:sub>
+            <m:r>
+              <m:t>i</m:t>
+            </m:r>
+          </m:sub>
+        </m:sSub>
+      </m:oMath>
+      <w:r>
+        <w:t xml:space="preserve">, not</w:t>
+      </w:r>
+      <w:r>
+        <w:t xml:space="preserve"> </w:t>
+      </w:r>
+      <m:oMath>
+        <m:r>
+          <m:t>h</m:t>
+        </m:r>
+        <m:r>
+          <m:rPr>
+            <m:sty m:val="p"/>
+          </m:rPr>
+          <m:t>(</m:t>
+        </m:r>
+        <m:sSub>
+          <m:e>
+            <m:r>
+              <m:t>x</m:t>
+            </m:r>
+          </m:e>
+          <m:sub>
+            <m:r>
+              <m:t>i</m:t>
+            </m:r>
+          </m:sub>
+        </m:sSub>
+        <m:r>
+          <m:rPr>
+            <m:sty m:val="p"/>
+          </m:rPr>
+          <m:t>)</m:t>
+        </m:r>
+      </m:oMath>
+      <w:r>
+        <w:t xml:space="preserve">,</w:t>
+      </w:r>
+      <w:r>
+        <w:t xml:space="preserve"> </w:t>
+      </w:r>
+      <w:r>
+        <w:t xml:space="preserve">wherever the fitted value appears in a loss, a residual or a risk sum.</w:t>
+      </w:r>
+      <w:r>
+        <w:t xml:space="preserve"> </w:t>
+      </w:r>
+      <w:r>
+        <w:t xml:space="preserve">Keep</w:t>
+      </w:r>
+      <w:r>
+        <w:t xml:space="preserve"> </w:t>
+      </w:r>
+      <m:oMath>
+        <m:r>
+          <m:t>h</m:t>
+        </m:r>
+        <m:r>
+          <m:rPr>
+            <m:sty m:val="p"/>
+          </m:rPr>
+          <m:t>(</m:t>
+        </m:r>
+        <m:r>
+          <m:t>x</m:t>
+        </m:r>
+        <m:r>
+          <m:rPr>
+            <m:sty m:val="p"/>
+          </m:rPr>
+          <m:t>)</m:t>
+        </m:r>
+      </m:oMath>
+      <w:r>
+        <w:t xml:space="preserve"> </w:t>
+      </w:r>
+      <w:r>
+        <w:t xml:space="preserve">where</w:t>
+      </w:r>
+      <w:r>
+        <w:t xml:space="preserve"> </w:t>
+      </w:r>
+      <m:oMath>
+        <m:r>
+          <m:t>h</m:t>
+        </m:r>
+      </m:oMath>
+      <w:r>
+        <w:t xml:space="preserve"> </w:t>
+      </w:r>
+      <w:r>
+        <w:t xml:space="preserve">itself is the subject,</w:t>
+      </w:r>
+      <w:r>
+        <w:t xml:space="preserve"> </w:t>
+      </w:r>
+      <w:r>
+        <w:t xml:space="preserve">as in</w:t>
+      </w:r>
+      <w:r>
+        <w:t xml:space="preserve"> </w:t>
+      </w:r>
+      <w:r>
+        <w:t xml:space="preserve">“the linear function</w:t>
+      </w:r>
+      <w:r>
+        <w:t xml:space="preserve"> </w:t>
+      </w:r>
+      <m:oMath>
+        <m:r>
+          <m:t>h</m:t>
+        </m:r>
+        <m:r>
+          <m:rPr>
+            <m:sty m:val="p"/>
+          </m:rPr>
+          <m:t>(</m:t>
+        </m:r>
+        <m:r>
+          <m:t>x</m:t>
+        </m:r>
+        <m:r>
+          <m:rPr>
+            <m:sty m:val="p"/>
+          </m:rPr>
+          <m:t>)</m:t>
+        </m:r>
+        <m:r>
+          <m:rPr>
+            <m:sty m:val="p"/>
+          </m:rPr>
+          <m:t>=</m:t>
+        </m:r>
+        <m:sSub>
+          <m:e>
+            <m:r>
+              <m:t>β</m:t>
+            </m:r>
+          </m:e>
+          <m:sub>
+            <m:r>
+              <m:t>0</m:t>
+            </m:r>
+          </m:sub>
+        </m:sSub>
+        <m:r>
+          <m:rPr>
+            <m:sty m:val="p"/>
+          </m:rPr>
+          <m:t>+</m:t>
+        </m:r>
+        <m:sSub>
+          <m:e>
+            <m:r>
+              <m:t>β</m:t>
+            </m:r>
+          </m:e>
+          <m:sub>
+            <m:r>
+              <m:t>x</m:t>
+            </m:r>
+          </m:sub>
+        </m:sSub>
+        <m:r>
+          <m:t>x</m:t>
+        </m:r>
+      </m:oMath>
+      <w:r>
+        <w:t xml:space="preserve">”</w:t>
+      </w:r>
+      <w:r>
+        <w:t xml:space="preserve">,</w:t>
+      </w:r>
+      <w:r>
+        <w:t xml:space="preserve"> </w:t>
+      </w:r>
+      <w:r>
+        <w:t xml:space="preserve">and where the output is not a prediction of</w:t>
+      </w:r>
+      <w:r>
+        <w:t xml:space="preserve"> </w:t>
+      </w:r>
+      <m:oMath>
+        <m:sSub>
+          <m:e>
+            <m:r>
+              <m:t>y</m:t>
+            </m:r>
+          </m:e>
+          <m:sub>
+            <m:r>
+              <m:t>i</m:t>
+            </m:r>
+          </m:sub>
+        </m:sSub>
+      </m:oMath>
+      <w:r>
+        <w:t xml:space="preserve">,</w:t>
+      </w:r>
+      <w:r>
+        <w:t xml:space="preserve"> </w:t>
+      </w:r>
+      <w:r>
+        <w:t xml:space="preserve">such as the decision score of a support vector machine</w:t>
+      </w:r>
+      <w:r>
+        <w:t xml:space="preserve"> </w:t>
+      </w:r>
+      <w:r>
+        <w:t xml:space="preserve">or a vector of class probabilities.</w:t>
+      </w:r>
+    </w:p>
+    <w:p>
+      <w:pPr>
+        <w:pStyle w:val="BodyText"/>
+      </w:pPr>
+      <w:r>
+        <w:t xml:space="preserve">In the source, a document that uses the shared macros</w:t>
+      </w:r>
+      <w:r>
+        <w:t xml:space="preserve"> </w:t>
+      </w:r>
+      <w:r>
+        <w:t xml:space="preserve">writes the fitted value with the macro for a predicted outcome,</w:t>
+      </w:r>
+      <w:r>
+        <w:t xml:space="preserve"> </w:t>
+      </w:r>
+      <w:r>
+        <w:rPr>
+          <w:rStyle w:val="VerbatimChar"/>
+        </w:rPr>
+        <w:t xml:space="preserve">\eoutvar</w:t>
+      </w:r>
+      <w:r>
+        <w:t xml:space="preserve"> </w:t>
+      </w:r>
+      <w:r>
+        <w:t xml:space="preserve">(see</w:t>
+      </w:r>
+      <w:r>
+        <w:t xml:space="preserve"> </w:t>
+      </w:r>
+      <w:hyperlink w:anchor="using-shared-macros">
+        <w:r>
+          <w:rPr>
+            <w:rStyle w:val="Hyperlink"/>
+          </w:rPr>
+          <w:t xml:space="preserve">Using shared macros</w:t>
+        </w:r>
+      </w:hyperlink>
+      <w:r>
+        <w:t xml:space="preserve">),</w:t>
+      </w:r>
+      <w:r>
+        <w:t xml:space="preserve"> </w:t>
+      </w:r>
+      <w:r>
+        <w:t xml:space="preserve">and a document without them may write</w:t>
+      </w:r>
+      <w:r>
+        <w:t xml:space="preserve"> </w:t>
+      </w:r>
+      <w:r>
+        <w:rPr>
+          <w:rStyle w:val="VerbatimChar"/>
+        </w:rPr>
+        <w:t xml:space="preserve">\hat{y}</w:t>
+      </w:r>
+      <w:r>
+        <w:t xml:space="preserve">.</w:t>
       </w:r>
     </w:p>
     <w:bookmarkEnd w:id="31"/>

</xml_diff>

<commit_message>
Deploying to gh-pages from @ Morrison-Lab/psw@b45b6c4ee9fa74051730d25f5fae1773bfe09010 🚀
</commit_message>
<xml_diff>
--- a/chapters/notation.docx
+++ b/chapters/notation.docx
@@ -15,7 +15,7 @@
         <w:pStyle w:val="Date"/>
       </w:pPr>
       <w:r>
-        <w:t xml:space="preserve">Last modified: 2026-10-16 01:46:24 (PDT)</w:t>
+        <w:t xml:space="preserve">Last modified: 2026-10-16 01:51:05 (PDT)</w:t>
       </w:r>
     </w:p>
     <w:tbl>
@@ -9959,13 +9959,240 @@
     </w:p>
     <w:bookmarkEnd w:id="41"/>
     <w:bookmarkEnd w:id="42"/>
-    <w:bookmarkStart w:id="44" w:name="writing-dot-products"/>
+    <w:bookmarkStart w:id="44" w:name="making-expressions-concise"/>
     <w:p>
       <w:pPr>
         <w:pStyle w:val="Heading2"/>
       </w:pPr>
       <w:r>
-        <w:t xml:space="preserve">7 Writing dot products</w:t>
+        <w:t xml:space="preserve">7 Making expressions concise</w:t>
+      </w:r>
+    </w:p>
+    <w:p>
+      <w:pPr>
+        <w:pStyle w:val="FirstParagraph"/>
+      </w:pPr>
+      <w:r>
+        <w:t xml:space="preserve">Make each expression as concise as possible.</w:t>
+      </w:r>
+      <w:r>
+        <w:t xml:space="preserve"> </w:t>
+      </w:r>
+      <w:r>
+        <w:t xml:space="preserve">The less clutter an expression has, the easier it is to read.</w:t>
+      </w:r>
+    </w:p>
+    <w:p>
+      <w:pPr>
+        <w:pStyle w:val="BodyText"/>
+      </w:pPr>
+      <w:r>
+        <w:t xml:space="preserve">Before you finish a definition, theorem or proof,</w:t>
+      </w:r>
+      <w:r>
+        <w:t xml:space="preserve"> </w:t>
+      </w:r>
+      <w:r>
+        <w:t xml:space="preserve">scan it for a sub-expression that is written out in full</w:t>
+      </w:r>
+      <w:r>
+        <w:t xml:space="preserve"> </w:t>
+      </w:r>
+      <w:r>
+        <w:t xml:space="preserve">more than once,</w:t>
+      </w:r>
+      <w:r>
+        <w:t xml:space="preserve"> </w:t>
+      </w:r>
+      <w:r>
+        <w:t xml:space="preserve">or that is a conceptually coherent chunk</w:t>
+      </w:r>
+      <w:r>
+        <w:t xml:space="preserve"> </w:t>
+      </w:r>
+      <w:r>
+        <w:t xml:space="preserve">even if it appears only once,</w:t>
+      </w:r>
+      <w:r>
+        <w:t xml:space="preserve"> </w:t>
+      </w:r>
+      <w:r>
+        <w:t xml:space="preserve">such as the prediction error (the fitted value minus the outcome)</w:t>
+      </w:r>
+      <w:r>
+        <w:t xml:space="preserve"> </w:t>
+      </w:r>
+      <w:r>
+        <w:t xml:space="preserve">or the loss of a prediction on one observation.</w:t>
+      </w:r>
+      <w:r>
+        <w:t xml:space="preserve"> </w:t>
+      </w:r>
+      <w:r>
+        <w:t xml:space="preserve">Give the chunk a name and a macro,</w:t>
+      </w:r>
+      <w:r>
+        <w:t xml:space="preserve"> </w:t>
+      </w:r>
+      <w:r>
+        <w:t xml:space="preserve">and write the macro everywhere the chunk appears.</w:t>
+      </w:r>
+    </w:p>
+    <w:bookmarkStart w:id="43" w:name="exm-concise-expression"/>
+    <w:p>
+      <w:pPr>
+        <w:pStyle w:val="BodyText"/>
+      </w:pPr>
+      <w:r>
+        <w:rPr>
+          <w:b/>
+          <w:bCs/>
+        </w:rPr>
+        <w:t xml:space="preserve">Example 16 (Naming a repeated chunk)</w:t>
+      </w:r>
+      <w:r>
+        <w:t xml:space="preserve"> </w:t>
+      </w:r>
+      <w:r>
+        <w:t xml:space="preserve"> </w:t>
+      </w:r>
+    </w:p>
+    <w:p>
+      <w:pPr>
+        <w:pStyle w:val="BlockText"/>
+      </w:pPr>
+      <w:r>
+        <w:t xml:space="preserve">❌ Source:</w:t>
+      </w:r>
+      <w:r>
+        <w:t xml:space="preserve"> </w:t>
+      </w:r>
+      <w:r>
+        <w:rPr>
+          <w:rStyle w:val="VerbatimChar"/>
+        </w:rPr>
+        <w:t xml:space="preserve">The loss is $\frac{1}{n} \sum_{i=1}^n \paren{\eoutvar_i - \outvar_i}^2$, and its derivative is $\frac{2}{n} \sum_{i=1}^n \paren{\eoutvar_i - \outvar_i} \predvar_i$.</w:t>
+      </w:r>
+    </w:p>
+    <w:p>
+      <w:pPr>
+        <w:pStyle w:val="BlockText"/>
+      </w:pPr>
+      <w:r>
+        <w:t xml:space="preserve">✅ Source:</w:t>
+      </w:r>
+      <w:r>
+        <w:t xml:space="preserve"> </w:t>
+      </w:r>
+      <w:r>
+        <w:rPr>
+          <w:rStyle w:val="VerbatimChar"/>
+        </w:rPr>
+        <w:t xml:space="preserve">The loss is $\frac{1}{n} \sum_{i=1}^n \prederr_i^2$, and its derivative is $\frac{2}{n} \sum_{i=1}^n \prederr_i \predvar_i$.</w:t>
+      </w:r>
+    </w:p>
+    <w:p>
+      <w:pPr>
+        <w:pStyle w:val="FirstParagraph"/>
+      </w:pPr>
+      <w:r>
+        <w:t xml:space="preserve">Both versions print the same quantities.</w:t>
+      </w:r>
+      <w:r>
+        <w:t xml:space="preserve"> </w:t>
+      </w:r>
+      <w:r>
+        <w:t xml:space="preserve">The ❌ version writes the difference</w:t>
+      </w:r>
+      <w:r>
+        <w:t xml:space="preserve"> </w:t>
+      </w:r>
+      <w:r>
+        <w:rPr>
+          <w:rStyle w:val="VerbatimChar"/>
+        </w:rPr>
+        <w:t xml:space="preserve">\eoutvar_i - \outvar_i</w:t>
+      </w:r>
+      <w:r>
+        <w:t xml:space="preserve"> </w:t>
+      </w:r>
+      <w:r>
+        <w:t xml:space="preserve">out twice.</w:t>
+      </w:r>
+      <w:r>
+        <w:t xml:space="preserve"> </w:t>
+      </w:r>
+      <w:r>
+        <w:t xml:space="preserve">The ✅ version names it once, as the prediction error,</w:t>
+      </w:r>
+      <w:r>
+        <w:t xml:space="preserve"> </w:t>
+      </w:r>
+      <w:r>
+        <w:t xml:space="preserve">and each formula shows at a glance what it is built from.</w:t>
+      </w:r>
+    </w:p>
+    <w:bookmarkEnd w:id="43"/>
+    <w:p>
+      <w:pPr>
+        <w:pStyle w:val="BodyText"/>
+      </w:pPr>
+      <w:r>
+        <w:t xml:space="preserve">Add the macro to the shared macro file before you use it,</w:t>
+      </w:r>
+      <w:r>
+        <w:t xml:space="preserve"> </w:t>
+      </w:r>
+      <w:r>
+        <w:t xml:space="preserve">never as a local macro in one document</w:t>
+      </w:r>
+      <w:r>
+        <w:t xml:space="preserve"> </w:t>
+      </w:r>
+      <w:r>
+        <w:t xml:space="preserve">(see</w:t>
+      </w:r>
+      <w:r>
+        <w:t xml:space="preserve"> </w:t>
+      </w:r>
+      <w:hyperlink w:anchor="using-shared-macros">
+        <w:r>
+          <w:rPr>
+            <w:rStyle w:val="Hyperlink"/>
+          </w:rPr>
+          <w:t xml:space="preserve">Using shared macros</w:t>
+        </w:r>
+      </w:hyperlink>
+      <w:r>
+        <w:t xml:space="preserve">),</w:t>
+      </w:r>
+      <w:r>
+        <w:t xml:space="preserve"> </w:t>
+      </w:r>
+      <w:r>
+        <w:t xml:space="preserve">and record its meaning in that file’s</w:t>
+      </w:r>
+      <w:r>
+        <w:t xml:space="preserve"> </w:t>
+      </w:r>
+      <w:r>
+        <w:rPr>
+          <w:rStyle w:val="VerbatimChar"/>
+        </w:rPr>
+        <w:t xml:space="preserve">interpretations.tsv</w:t>
+      </w:r>
+      <w:r>
+        <w:t xml:space="preserve">.</w:t>
+      </w:r>
+    </w:p>
+    <w:bookmarkEnd w:id="44"/>
+    <w:bookmarkStart w:id="46" w:name="writing-dot-products"/>
+    <w:p>
+      <w:pPr>
+        <w:pStyle w:val="Heading2"/>
+      </w:pPr>
+      <w:r>
+        <w:t xml:space="preserve">8 Writing dot products</w:t>
       </w:r>
     </w:p>
     <w:p>
@@ -10132,7 +10359,7 @@
         <w:t xml:space="preserve">and to work out that the result is a single number.</w:t>
       </w:r>
     </w:p>
-    <w:bookmarkStart w:id="43" w:name="exm-dot-product"/>
+    <w:bookmarkStart w:id="45" w:name="exm-dot-product"/>
     <w:p>
       <w:pPr>
         <w:pStyle w:val="BodyText"/>
@@ -10142,7 +10369,7 @@
           <w:b/>
           <w:bCs/>
         </w:rPr>
-        <w:t xml:space="preserve">Example 16 (Writing a dot product)</w:t>
+        <w:t xml:space="preserve">Example 17 (Writing a dot product)</w:t>
       </w:r>
       <w:r>
         <w:t xml:space="preserve"> </w:t>
@@ -10361,7 +10588,7 @@
         <w:t xml:space="preserve">.</w:t>
       </w:r>
     </w:p>
-    <w:bookmarkEnd w:id="43"/>
+    <w:bookmarkEnd w:id="45"/>
     <w:p>
       <w:pPr>
         <w:pStyle w:val="BodyText"/>
@@ -10520,14 +10747,14 @@
         <w:t xml:space="preserve">such as a definition of an inner product space.</w:t>
       </w:r>
     </w:p>
-    <w:bookmarkEnd w:id="44"/>
-    <w:bookmarkStart w:id="47" w:name="writing-out-notational-shorthands"/>
+    <w:bookmarkEnd w:id="46"/>
+    <w:bookmarkStart w:id="49" w:name="writing-out-notational-shorthands"/>
     <w:p>
       <w:pPr>
         <w:pStyle w:val="Heading2"/>
       </w:pPr>
       <w:r>
-        <w:t xml:space="preserve">8 Writing out notational shorthands</w:t>
+        <w:t xml:space="preserve">9 Writing out notational shorthands</w:t>
       </w:r>
     </w:p>
     <w:p>
@@ -10960,7 +11187,7 @@
       <w:r>
         <w:t xml:space="preserve"> </w:t>
       </w:r>
-      <w:hyperlink r:id="rId45">
+      <w:hyperlink r:id="rId47">
         <w:r>
           <w:rPr>
             <w:rStyle w:val="Hyperlink"/>
@@ -11001,7 +11228,7 @@
         <w:t xml:space="preserve">catalogs common shorthands and their full forms.</w:t>
       </w:r>
     </w:p>
-    <w:bookmarkStart w:id="46" w:name="exm-notational-shorthand"/>
+    <w:bookmarkStart w:id="48" w:name="exm-notational-shorthand"/>
     <w:p>
       <w:pPr>
         <w:pStyle w:val="BodyText"/>
@@ -11011,7 +11238,7 @@
           <w:b/>
           <w:bCs/>
         </w:rPr>
-        <w:t xml:space="preserve">Example 17 (Writing out the limits of a sum and the range of an index)</w:t>
+        <w:t xml:space="preserve">Example 18 (Writing out the limits of a sum and the range of an index)</w:t>
       </w:r>
       <w:r>
         <w:t xml:space="preserve"> </w:t>
@@ -11568,15 +11795,15 @@
         <w:t xml:space="preserve">observations.</w:t>
       </w:r>
     </w:p>
-    <w:bookmarkEnd w:id="46"/>
-    <w:bookmarkEnd w:id="47"/>
-    <w:bookmarkStart w:id="49" w:name="stating-assumptions-before-using-them"/>
+    <w:bookmarkEnd w:id="48"/>
+    <w:bookmarkEnd w:id="49"/>
+    <w:bookmarkStart w:id="51" w:name="stating-assumptions-before-using-them"/>
     <w:p>
       <w:pPr>
         <w:pStyle w:val="Heading2"/>
       </w:pPr>
       <w:r>
-        <w:t xml:space="preserve">9 Stating assumptions before using them</w:t>
+        <w:t xml:space="preserve">10 Stating assumptions before using them</w:t>
       </w:r>
     </w:p>
     <w:p>
@@ -11760,7 +11987,7 @@
         <w:t xml:space="preserve">cite it in the justification on that line.</w:t>
       </w:r>
     </w:p>
-    <w:bookmarkStart w:id="48" w:name="exm-assumptions-first"/>
+    <w:bookmarkStart w:id="50" w:name="exm-assumptions-first"/>
     <w:p>
       <w:pPr>
         <w:pStyle w:val="BodyText"/>
@@ -11770,7 +11997,7 @@
           <w:b/>
           <w:bCs/>
         </w:rPr>
-        <w:t xml:space="preserve">Example 18 (Stating the restriction on</w:t>
+        <w:t xml:space="preserve">Example 19 (Stating the restriction on</w:t>
       </w:r>
       <w:r>
         <w:rPr>
@@ -12442,8 +12669,8 @@
         <w:t xml:space="preserve">and the justification says exactly where the condition is used.</w:t>
       </w:r>
     </w:p>
-    <w:bookmarkEnd w:id="48"/>
-    <w:bookmarkEnd w:id="49"/>
+    <w:bookmarkEnd w:id="50"/>
+    <w:bookmarkEnd w:id="51"/>
     <w:sectPr>
       <w:footnotePr>
         <w:numRestart w:val="eachSect"/>

</xml_diff>

<commit_message>
Deploying to gh-pages from @ Morrison-Lab/psw@c28629d79b2b7ceb8fc57f3df558c64126396064 🚀
</commit_message>
<xml_diff>
--- a/chapters/notation.docx
+++ b/chapters/notation.docx
@@ -15,7 +15,7 @@
         <w:pStyle w:val="Date"/>
       </w:pPr>
       <w:r>
-        <w:t xml:space="preserve">Last modified: 2026-10-16 01:58:21 (PDT)</w:t>
+        <w:t xml:space="preserve">Last modified: 2026-10-16 02:37:52 (PDT)</w:t>
       </w:r>
     </w:p>
     <w:tbl>
@@ -8613,6 +8613,18 @@
       <w:r>
         <w:t xml:space="preserve">.</w:t>
       </w:r>
+      <w:r>
+        <w:t xml:space="preserve"> </w:t>
+      </w:r>
+      <w:r>
+        <w:t xml:space="preserve">The only exception is a one-off symbol that fits no semantic category,</w:t>
+      </w:r>
+      <w:r>
+        <w:t xml:space="preserve"> </w:t>
+      </w:r>
+      <w:r>
+        <w:t xml:space="preserve">and the rule for Latin letters below says when that applies.</w:t>
+      </w:r>
     </w:p>
     <w:bookmarkStart w:id="36" w:name="exm-semantic-macro-name"/>
     <w:p>
@@ -9186,7 +9198,69 @@
         <w:pStyle w:val="BodyText"/>
       </w:pPr>
       <w:r>
-        <w:t xml:space="preserve">Latin letters with a fixed role follow the same rule.</w:t>
+        <w:t xml:space="preserve">Latin letters follow the same rule, with the same single exception for letters of either alphabet.</w:t>
+      </w:r>
+      <w:r>
+        <w:t xml:space="preserve"> </w:t>
+      </w:r>
+      <w:r>
+        <w:t xml:space="preserve">Outside a passage that discusses the notation itself,</w:t>
+      </w:r>
+      <w:r>
+        <w:t xml:space="preserve"> </w:t>
+      </w:r>
+      <w:r>
+        <w:t xml:space="preserve">do not write a literal Latin or Greek letter in a math expression.</w:t>
+      </w:r>
+      <w:r>
+        <w:t xml:space="preserve"> </w:t>
+      </w:r>
+      <w:r>
+        <w:t xml:space="preserve">The exception is a one-off symbol that fits no semantic category.</w:t>
+      </w:r>
+      <w:r>
+        <w:t xml:space="preserve"> </w:t>
+      </w:r>
+      <w:r>
+        <w:t xml:space="preserve">The shared macros already name outcome variables, covariates and generic parameters,</w:t>
+      </w:r>
+      <w:r>
+        <w:t xml:space="preserve"> </w:t>
+      </w:r>
+      <w:r>
+        <w:t xml:space="preserve">so a one-off should almost never be needed.</w:t>
+      </w:r>
+      <w:r>
+        <w:t xml:space="preserve"> </w:t>
+      </w:r>
+      <w:r>
+        <w:t xml:space="preserve">When a symbol has a category but no macro, add the macro to the shared file first.</w:t>
+      </w:r>
+      <w:r>
+        <w:t xml:space="preserve"> </w:t>
+      </w:r>
+      <w:r>
+        <w:t xml:space="preserve">New macros always go in the group’s shared macros repository,</w:t>
+      </w:r>
+      <w:r>
+        <w:t xml:space="preserve"> </w:t>
+      </w:r>
+      <w:r>
+        <w:t xml:space="preserve">never in a repository that applies them,</w:t>
+      </w:r>
+      <w:r>
+        <w:t xml:space="preserve"> </w:t>
+      </w:r>
+      <w:r>
+        <w:t xml:space="preserve">unless that repository explicitly overrides the default meaning of one specific macro.</w:t>
+      </w:r>
+    </w:p>
+    <w:p>
+      <w:pPr>
+        <w:pStyle w:val="BodyText"/>
+      </w:pPr>
+      <w:r>
+        <w:t xml:space="preserve">Latin letters with a fixed role show the rule.</w:t>
       </w:r>
       <w:r>
         <w:t xml:space="preserve"> </w:t>

</xml_diff>

<commit_message>
Deploying to gh-pages from @ Morrison-Lab/psw@9cdecb8af00bb8f34a7f6e4a4e471435a389a591 🚀
</commit_message>
<xml_diff>
--- a/chapters/notation.docx
+++ b/chapters/notation.docx
@@ -15,7 +15,7 @@
         <w:pStyle w:val="Date"/>
       </w:pPr>
       <w:r>
-        <w:t xml:space="preserve">Last modified: 2026-10-16 02:37:52 (PDT)</w:t>
+        <w:t xml:space="preserve">Last modified: 2026-10-16 02:42:44 (PDT)</w:t>
       </w:r>
     </w:p>
     <w:tbl>
@@ -10033,7 +10033,7 @@
     </w:p>
     <w:bookmarkEnd w:id="41"/>
     <w:bookmarkEnd w:id="42"/>
-    <w:bookmarkStart w:id="44" w:name="making-expressions-concise"/>
+    <w:bookmarkStart w:id="45" w:name="making-expressions-concise"/>
     <w:p>
       <w:pPr>
         <w:pStyle w:val="Heading2"/>
@@ -10055,6 +10055,26 @@
       <w:r>
         <w:t xml:space="preserve">The less clutter an expression has, the easier it is to read.</w:t>
       </w:r>
+      <w:r>
+        <w:t xml:space="preserve"> </w:t>
+      </w:r>
+      <w:r>
+        <w:t xml:space="preserve">This is one case of</w:t>
+      </w:r>
+      <w:r>
+        <w:t xml:space="preserve"> </w:t>
+      </w:r>
+      <w:hyperlink r:id="rId43">
+        <w:r>
+          <w:rPr>
+            <w:rStyle w:val="Hyperlink"/>
+          </w:rPr>
+          <w:t xml:space="preserve">building every unit from smaller atomic units</w:t>
+        </w:r>
+      </w:hyperlink>
+      <w:r>
+        <w:t xml:space="preserve">.</w:t>
+      </w:r>
     </w:p>
     <w:p>
       <w:pPr>
@@ -10112,7 +10132,7 @@
         <w:t xml:space="preserve">and write the macro everywhere the chunk appears.</w:t>
       </w:r>
     </w:p>
-    <w:bookmarkStart w:id="43" w:name="exm-concise-expression"/>
+    <w:bookmarkStart w:id="44" w:name="exm-concise-expression"/>
     <w:p>
       <w:pPr>
         <w:pStyle w:val="BodyText"/>
@@ -10206,7 +10226,7 @@
         <w:t xml:space="preserve">and each formula shows at a glance what it is built from.</w:t>
       </w:r>
     </w:p>
-    <w:bookmarkEnd w:id="43"/>
+    <w:bookmarkEnd w:id="44"/>
     <w:p>
       <w:pPr>
         <w:pStyle w:val="BodyText"/>
@@ -10259,8 +10279,8 @@
         <w:t xml:space="preserve">.</w:t>
       </w:r>
     </w:p>
-    <w:bookmarkEnd w:id="44"/>
-    <w:bookmarkStart w:id="46" w:name="writing-dot-products"/>
+    <w:bookmarkEnd w:id="45"/>
+    <w:bookmarkStart w:id="47" w:name="writing-dot-products"/>
     <w:p>
       <w:pPr>
         <w:pStyle w:val="Heading2"/>
@@ -10433,7 +10453,7 @@
         <w:t xml:space="preserve">and to work out that the result is a single number.</w:t>
       </w:r>
     </w:p>
-    <w:bookmarkStart w:id="45" w:name="exm-dot-product"/>
+    <w:bookmarkStart w:id="46" w:name="exm-dot-product"/>
     <w:p>
       <w:pPr>
         <w:pStyle w:val="BodyText"/>
@@ -10662,7 +10682,7 @@
         <w:t xml:space="preserve">.</w:t>
       </w:r>
     </w:p>
-    <w:bookmarkEnd w:id="45"/>
+    <w:bookmarkEnd w:id="46"/>
     <w:p>
       <w:pPr>
         <w:pStyle w:val="BodyText"/>
@@ -10821,8 +10841,8 @@
         <w:t xml:space="preserve">such as a definition of an inner product space.</w:t>
       </w:r>
     </w:p>
-    <w:bookmarkEnd w:id="46"/>
-    <w:bookmarkStart w:id="49" w:name="writing-out-notational-shorthands"/>
+    <w:bookmarkEnd w:id="47"/>
+    <w:bookmarkStart w:id="50" w:name="writing-out-notational-shorthands"/>
     <w:p>
       <w:pPr>
         <w:pStyle w:val="Heading2"/>
@@ -11261,7 +11281,7 @@
       <w:r>
         <w:t xml:space="preserve"> </w:t>
       </w:r>
-      <w:hyperlink r:id="rId47">
+      <w:hyperlink r:id="rId48">
         <w:r>
           <w:rPr>
             <w:rStyle w:val="Hyperlink"/>
@@ -11302,7 +11322,7 @@
         <w:t xml:space="preserve">catalogs common shorthands and their full forms.</w:t>
       </w:r>
     </w:p>
-    <w:bookmarkStart w:id="48" w:name="exm-notational-shorthand"/>
+    <w:bookmarkStart w:id="49" w:name="exm-notational-shorthand"/>
     <w:p>
       <w:pPr>
         <w:pStyle w:val="BodyText"/>
@@ -11869,9 +11889,9 @@
         <w:t xml:space="preserve">observations.</w:t>
       </w:r>
     </w:p>
-    <w:bookmarkEnd w:id="48"/>
     <w:bookmarkEnd w:id="49"/>
-    <w:bookmarkStart w:id="51" w:name="stating-assumptions-before-using-them"/>
+    <w:bookmarkEnd w:id="50"/>
+    <w:bookmarkStart w:id="52" w:name="stating-assumptions-before-using-them"/>
     <w:p>
       <w:pPr>
         <w:pStyle w:val="Heading2"/>
@@ -12061,7 +12081,7 @@
         <w:t xml:space="preserve">cite it in the justification on that line.</w:t>
       </w:r>
     </w:p>
-    <w:bookmarkStart w:id="50" w:name="exm-assumptions-first"/>
+    <w:bookmarkStart w:id="51" w:name="exm-assumptions-first"/>
     <w:p>
       <w:pPr>
         <w:pStyle w:val="BodyText"/>
@@ -12743,8 +12763,8 @@
         <w:t xml:space="preserve">and the justification says exactly where the condition is used.</w:t>
       </w:r>
     </w:p>
-    <w:bookmarkEnd w:id="50"/>
     <w:bookmarkEnd w:id="51"/>
+    <w:bookmarkEnd w:id="52"/>
     <w:sectPr>
       <w:footnotePr>
         <w:numRestart w:val="eachSect"/>

</xml_diff>

<commit_message>
Deploying to gh-pages from @ Morrison-Lab/psw@70ff8b444b698411f623d12483ae3bbeaf12494e 🚀
</commit_message>
<xml_diff>
--- a/chapters/notation.docx
+++ b/chapters/notation.docx
@@ -15,7 +15,7 @@
         <w:pStyle w:val="Date"/>
       </w:pPr>
       <w:r>
-        <w:t xml:space="preserve">Last modified: 2026-10-16 04:37:11 (PDT)</w:t>
+        <w:t xml:space="preserve">Last modified: 2026-10-16 04:52:23 (PDT)</w:t>
       </w:r>
     </w:p>
     <w:tbl>
@@ -7628,13 +7628,13 @@
       </w:r>
     </w:p>
     <w:bookmarkEnd w:id="31"/>
-    <w:bookmarkStart w:id="34" w:name="matching-names-and-notation"/>
+    <w:bookmarkStart w:id="33" w:name="random-variables-and-their-values"/>
     <w:p>
       <w:pPr>
         <w:pStyle w:val="Heading2"/>
       </w:pPr>
       <w:r>
-        <w:t xml:space="preserve">5 Matching names and notation</w:t>
+        <w:t xml:space="preserve">5 Random variables and their values</w:t>
       </w:r>
     </w:p>
     <w:p>
@@ -7642,6 +7642,1027 @@
         <w:pStyle w:val="FirstParagraph"/>
       </w:pPr>
       <w:r>
+        <w:t xml:space="preserve">A random variable and a value that it takes are different objects.</w:t>
+      </w:r>
+      <w:r>
+        <w:t xml:space="preserve"> </w:t>
+      </w:r>
+      <w:r>
+        <w:t xml:space="preserve">Before the data are collected, the outcome is a random variable;</w:t>
+      </w:r>
+      <w:r>
+        <w:t xml:space="preserve"> </w:t>
+      </w:r>
+      <w:r>
+        <w:t xml:space="preserve">after, it is a number.</w:t>
+      </w:r>
+      <w:r>
+        <w:t xml:space="preserve"> </w:t>
+      </w:r>
+      <w:r>
+        <w:t xml:space="preserve">Statements about the two have different meanings.</w:t>
+      </w:r>
+      <w:r>
+        <w:t xml:space="preserve"> </w:t>
+      </w:r>
+      <w:r>
+        <w:t xml:space="preserve">Write them with different symbols.</w:t>
+      </w:r>
+    </w:p>
+    <w:p>
+      <w:pPr>
+        <w:pStyle w:val="BodyText"/>
+      </w:pPr>
+      <w:r>
+        <w:t xml:space="preserve">Use a capital letter for the random variable</w:t>
+      </w:r>
+      <w:r>
+        <w:t xml:space="preserve"> </w:t>
+      </w:r>
+      <w:r>
+        <w:t xml:space="preserve">and the matching lowercase letter for a value that it takes:</w:t>
+      </w:r>
+    </w:p>
+    <w:p>
+      <w:pPr>
+        <w:pStyle w:val="Compact"/>
+        <w:numPr>
+          <w:ilvl w:val="0"/>
+          <w:numId w:val="1007"/>
+        </w:numPr>
+      </w:pPr>
+      <m:oMath>
+        <m:r>
+          <m:t>Y</m:t>
+        </m:r>
+      </m:oMath>
+      <w:r>
+        <w:t xml:space="preserve"> </w:t>
+      </w:r>
+      <w:r>
+        <w:t xml:space="preserve">is the random variable, such as the outcome of a coin flip before the flip;</w:t>
+      </w:r>
+    </w:p>
+    <w:p>
+      <w:pPr>
+        <w:pStyle w:val="Compact"/>
+        <w:numPr>
+          <w:ilvl w:val="0"/>
+          <w:numId w:val="1007"/>
+        </w:numPr>
+      </w:pPr>
+      <m:oMath>
+        <m:r>
+          <m:t>y</m:t>
+        </m:r>
+      </m:oMath>
+      <w:r>
+        <w:t xml:space="preserve"> </w:t>
+      </w:r>
+      <w:r>
+        <w:t xml:space="preserve">is one value of</w:t>
+      </w:r>
+      <w:r>
+        <w:t xml:space="preserve"> </w:t>
+      </w:r>
+      <m:oMath>
+        <m:r>
+          <m:t>Y</m:t>
+        </m:r>
+      </m:oMath>
+      <w:r>
+        <w:t xml:space="preserve">, such as 1 after the flip lands heads;</w:t>
+      </w:r>
+    </w:p>
+    <w:p>
+      <w:pPr>
+        <w:pStyle w:val="Compact"/>
+        <w:numPr>
+          <w:ilvl w:val="0"/>
+          <w:numId w:val="1007"/>
+        </w:numPr>
+      </w:pPr>
+      <m:oMath>
+        <m:sSub>
+          <m:e>
+            <m:r>
+              <m:t>Y</m:t>
+            </m:r>
+          </m:e>
+          <m:sub>
+            <m:r>
+              <m:t>i</m:t>
+            </m:r>
+          </m:sub>
+        </m:sSub>
+      </m:oMath>
+      <w:r>
+        <w:t xml:space="preserve"> </w:t>
+      </w:r>
+      <w:r>
+        <w:t xml:space="preserve">is the random variable for the</w:t>
+      </w:r>
+      <w:r>
+        <w:t xml:space="preserve"> </w:t>
+      </w:r>
+      <m:oMath>
+        <m:r>
+          <m:t>i</m:t>
+        </m:r>
+      </m:oMath>
+      <w:r>
+        <w:t xml:space="preserve">-th observation;</w:t>
+      </w:r>
+    </w:p>
+    <w:p>
+      <w:pPr>
+        <w:pStyle w:val="Compact"/>
+        <w:numPr>
+          <w:ilvl w:val="0"/>
+          <w:numId w:val="1007"/>
+        </w:numPr>
+      </w:pPr>
+      <m:oMath>
+        <m:sSub>
+          <m:e>
+            <m:r>
+              <m:t>y</m:t>
+            </m:r>
+          </m:e>
+          <m:sub>
+            <m:r>
+              <m:t>i</m:t>
+            </m:r>
+          </m:sub>
+        </m:sSub>
+      </m:oMath>
+      <w:r>
+        <w:t xml:space="preserve"> </w:t>
+      </w:r>
+      <w:r>
+        <w:t xml:space="preserve">is that observation’s observed value.</w:t>
+      </w:r>
+    </w:p>
+    <w:p>
+      <w:pPr>
+        <w:pStyle w:val="FirstParagraph"/>
+      </w:pPr>
+      <w:r>
+        <w:t xml:space="preserve">State the convention where you first use the symbols.</w:t>
+      </w:r>
+      <w:r>
+        <w:t xml:space="preserve"> </w:t>
+      </w:r>
+      <w:r>
+        <w:t xml:space="preserve">Keep it in every later section.</w:t>
+      </w:r>
+      <w:r>
+        <w:t xml:space="preserve"> </w:t>
+      </w:r>
+      <w:r>
+        <w:t xml:space="preserve">Do not switch between</w:t>
+      </w:r>
+      <w:r>
+        <w:t xml:space="preserve"> </w:t>
+      </w:r>
+      <m:oMath>
+        <m:sSub>
+          <m:e>
+            <m:r>
+              <m:t>Y</m:t>
+            </m:r>
+          </m:e>
+          <m:sub>
+            <m:r>
+              <m:t>i</m:t>
+            </m:r>
+          </m:sub>
+        </m:sSub>
+      </m:oMath>
+      <w:r>
+        <w:t xml:space="preserve"> </w:t>
+      </w:r>
+      <w:r>
+        <w:t xml:space="preserve">and</w:t>
+      </w:r>
+      <w:r>
+        <w:t xml:space="preserve"> </w:t>
+      </w:r>
+      <m:oMath>
+        <m:sSub>
+          <m:e>
+            <m:r>
+              <m:t>y</m:t>
+            </m:r>
+          </m:e>
+          <m:sub>
+            <m:r>
+              <m:t>i</m:t>
+            </m:r>
+          </m:sub>
+        </m:sSub>
+      </m:oMath>
+      <w:r>
+        <w:t xml:space="preserve"> </w:t>
+      </w:r>
+      <w:r>
+        <w:t xml:space="preserve">for the same quantity</w:t>
+      </w:r>
+      <w:r>
+        <w:t xml:space="preserve"> </w:t>
+      </w:r>
+      <w:r>
+        <w:t xml:space="preserve">unless the meaning changes from</w:t>
+      </w:r>
+      <w:r>
+        <w:t xml:space="preserve"> </w:t>
+      </w:r>
+      <w:r>
+        <w:t xml:space="preserve">“before the data”</w:t>
+      </w:r>
+      <w:r>
+        <w:t xml:space="preserve"> </w:t>
+      </w:r>
+      <w:r>
+        <w:t xml:space="preserve">to</w:t>
+      </w:r>
+      <w:r>
+        <w:t xml:space="preserve"> </w:t>
+      </w:r>
+      <w:r>
+        <w:t xml:space="preserve">“after the data”</w:t>
+      </w:r>
+      <w:r>
+        <w:t xml:space="preserve">.</w:t>
+      </w:r>
+    </w:p>
+    <w:bookmarkStart w:id="32" w:name="exm-random-variable-vs-value"/>
+    <w:p>
+      <w:pPr>
+        <w:pStyle w:val="BodyText"/>
+      </w:pPr>
+      <w:r>
+        <w:rPr>
+          <w:b/>
+          <w:bCs/>
+        </w:rPr>
+        <w:t xml:space="preserve">Example 8 (Writing a random variable and its value)</w:t>
+      </w:r>
+      <w:r>
+        <w:t xml:space="preserve"> </w:t>
+      </w:r>
+      <w:r>
+        <w:t xml:space="preserve"> </w:t>
+      </w:r>
+    </w:p>
+    <w:p>
+      <w:pPr>
+        <w:pStyle w:val="BlockText"/>
+      </w:pPr>
+      <w:r>
+        <w:t xml:space="preserve">❌ The probability that</w:t>
+      </w:r>
+      <w:r>
+        <w:t xml:space="preserve"> </w:t>
+      </w:r>
+      <m:oMath>
+        <m:sSub>
+          <m:e>
+            <m:r>
+              <m:t>y</m:t>
+            </m:r>
+          </m:e>
+          <m:sub>
+            <m:r>
+              <m:t>i</m:t>
+            </m:r>
+          </m:sub>
+        </m:sSub>
+      </m:oMath>
+      <w:r>
+        <w:t xml:space="preserve"> </w:t>
+      </w:r>
+      <w:r>
+        <w:t xml:space="preserve">exceeds 3 is</w:t>
+      </w:r>
+      <w:r>
+        <w:t xml:space="preserve"> </w:t>
+      </w:r>
+      <m:oMath>
+        <m:r>
+          <m:t>0.2</m:t>
+        </m:r>
+      </m:oMath>
+      <w:r>
+        <w:t xml:space="preserve">.</w:t>
+      </w:r>
+    </w:p>
+    <w:p>
+      <w:pPr>
+        <w:pStyle w:val="BlockText"/>
+      </w:pPr>
+      <w:r>
+        <w:t xml:space="preserve">✅ The probability that</w:t>
+      </w:r>
+      <w:r>
+        <w:t xml:space="preserve"> </w:t>
+      </w:r>
+      <m:oMath>
+        <m:sSub>
+          <m:e>
+            <m:r>
+              <m:t>Y</m:t>
+            </m:r>
+          </m:e>
+          <m:sub>
+            <m:r>
+              <m:t>i</m:t>
+            </m:r>
+          </m:sub>
+        </m:sSub>
+      </m:oMath>
+      <w:r>
+        <w:t xml:space="preserve"> </w:t>
+      </w:r>
+      <w:r>
+        <w:t xml:space="preserve">exceeds 3 is</w:t>
+      </w:r>
+      <w:r>
+        <w:t xml:space="preserve"> </w:t>
+      </w:r>
+      <m:oMath>
+        <m:r>
+          <m:t>0.2</m:t>
+        </m:r>
+      </m:oMath>
+      <w:r>
+        <w:t xml:space="preserve">.</w:t>
+      </w:r>
+    </w:p>
+    <w:p>
+      <w:pPr>
+        <w:pStyle w:val="BlockText"/>
+      </w:pPr>
+      <w:r>
+        <w:t xml:space="preserve">❌ The sample mean of the</w:t>
+      </w:r>
+      <w:r>
+        <w:t xml:space="preserve"> </w:t>
+      </w:r>
+      <m:oMath>
+        <m:sSub>
+          <m:e>
+            <m:r>
+              <m:t>Y</m:t>
+            </m:r>
+          </m:e>
+          <m:sub>
+            <m:r>
+              <m:t>i</m:t>
+            </m:r>
+          </m:sub>
+        </m:sSub>
+      </m:oMath>
+      <w:r>
+        <w:t xml:space="preserve"> </w:t>
+      </w:r>
+      <w:r>
+        <w:t xml:space="preserve">is 2.4.</w:t>
+      </w:r>
+    </w:p>
+    <w:p>
+      <w:pPr>
+        <w:pStyle w:val="BlockText"/>
+      </w:pPr>
+      <w:r>
+        <w:t xml:space="preserve">✅ The sample mean of the</w:t>
+      </w:r>
+      <w:r>
+        <w:t xml:space="preserve"> </w:t>
+      </w:r>
+      <m:oMath>
+        <m:sSub>
+          <m:e>
+            <m:r>
+              <m:t>y</m:t>
+            </m:r>
+          </m:e>
+          <m:sub>
+            <m:r>
+              <m:t>i</m:t>
+            </m:r>
+          </m:sub>
+        </m:sSub>
+      </m:oMath>
+      <w:r>
+        <w:t xml:space="preserve"> </w:t>
+      </w:r>
+      <w:r>
+        <w:t xml:space="preserve">is 2.4.</w:t>
+      </w:r>
+    </w:p>
+    <w:p>
+      <w:pPr>
+        <w:pStyle w:val="FirstParagraph"/>
+      </w:pPr>
+      <w:r>
+        <w:t xml:space="preserve">A probability is a statement about a random variable.</w:t>
+      </w:r>
+      <w:r>
+        <w:t xml:space="preserve"> </w:t>
+      </w:r>
+      <w:r>
+        <w:t xml:space="preserve">The ❌ version of the first pair puts a fixed number</w:t>
+      </w:r>
+      <w:r>
+        <w:t xml:space="preserve"> </w:t>
+      </w:r>
+      <w:r>
+        <w:t xml:space="preserve">where a quantity that can vary belongs.</w:t>
+      </w:r>
+      <w:r>
+        <w:t xml:space="preserve"> </w:t>
+      </w:r>
+      <w:r>
+        <w:t xml:space="preserve">An observed number has no probability of exceeding 3.</w:t>
+      </w:r>
+      <w:r>
+        <w:t xml:space="preserve"> </w:t>
+      </w:r>
+      <w:r>
+        <w:t xml:space="preserve">The second pair has the reverse mistake.</w:t>
+      </w:r>
+      <w:r>
+        <w:t xml:space="preserve"> </w:t>
+      </w:r>
+      <w:r>
+        <w:t xml:space="preserve">A sample mean of 2.4 is a number computed from observed values.</w:t>
+      </w:r>
+      <w:r>
+        <w:t xml:space="preserve"> </w:t>
+      </w:r>
+      <w:r>
+        <w:t xml:space="preserve">The ❌ version attributes it to the random variables.</w:t>
+      </w:r>
+      <w:r>
+        <w:t xml:space="preserve"> </w:t>
+      </w:r>
+      <w:r>
+        <w:t xml:space="preserve">The sample mean of the random variables,</w:t>
+      </w:r>
+      <w:r>
+        <w:t xml:space="preserve"> </w:t>
+      </w:r>
+      <m:oMath>
+        <m:acc>
+          <m:accPr>
+            <m:chr m:val="‾"/>
+          </m:accPr>
+          <m:e>
+            <m:r>
+              <m:t>Y</m:t>
+            </m:r>
+          </m:e>
+        </m:acc>
+      </m:oMath>
+      <w:r>
+        <w:t xml:space="preserve">, is itself a random variable.</w:t>
+      </w:r>
+    </w:p>
+    <w:bookmarkEnd w:id="32"/>
+    <w:p>
+      <w:pPr>
+        <w:pStyle w:val="BodyText"/>
+      </w:pPr>
+      <w:r>
+        <w:t xml:space="preserve">Match the notation to the claim:</w:t>
+      </w:r>
+    </w:p>
+    <w:p>
+      <w:pPr>
+        <w:pStyle w:val="Compact"/>
+        <w:numPr>
+          <w:ilvl w:val="0"/>
+          <w:numId w:val="1008"/>
+        </w:numPr>
+      </w:pPr>
+      <w:r>
+        <w:t xml:space="preserve">Write</w:t>
+      </w:r>
+      <w:r>
+        <w:t xml:space="preserve"> </w:t>
+      </w:r>
+      <m:oMath>
+        <m:r>
+          <m:rPr>
+            <m:sty m:val="p"/>
+          </m:rPr>
+          <m:t>Pr</m:t>
+        </m:r>
+        <m:r>
+          <m:rPr>
+            <m:sty m:val="p"/>
+          </m:rPr>
+          <m:t>(</m:t>
+        </m:r>
+        <m:r>
+          <m:t>Y</m:t>
+        </m:r>
+        <m:r>
+          <m:rPr>
+            <m:sty m:val="p"/>
+          </m:rPr>
+          <m:t>≤</m:t>
+        </m:r>
+        <m:r>
+          <m:t>y</m:t>
+        </m:r>
+        <m:r>
+          <m:rPr>
+            <m:sty m:val="p"/>
+          </m:rPr>
+          <m:t>)</m:t>
+        </m:r>
+      </m:oMath>
+      <w:r>
+        <w:t xml:space="preserve"> </w:t>
+      </w:r>
+      <w:r>
+        <w:t xml:space="preserve">for a probability,</w:t>
+      </w:r>
+      <w:r>
+        <w:t xml:space="preserve"> </w:t>
+      </w:r>
+      <w:r>
+        <w:t xml:space="preserve">with the random variable on the left of the inequality</w:t>
+      </w:r>
+      <w:r>
+        <w:t xml:space="preserve"> </w:t>
+      </w:r>
+      <w:r>
+        <w:t xml:space="preserve">and the value on the right.</w:t>
+      </w:r>
+    </w:p>
+    <w:p>
+      <w:pPr>
+        <w:pStyle w:val="Compact"/>
+        <w:numPr>
+          <w:ilvl w:val="0"/>
+          <w:numId w:val="1008"/>
+        </w:numPr>
+      </w:pPr>
+      <w:r>
+        <w:t xml:space="preserve">Write</w:t>
+      </w:r>
+      <w:r>
+        <w:t xml:space="preserve"> </w:t>
+      </w:r>
+      <m:oMath>
+        <m:r>
+          <m:rPr>
+            <m:nor/>
+            <m:sty m:val="p"/>
+          </m:rPr>
+          <m:t>E</m:t>
+        </m:r>
+        <m:r>
+          <m:rPr>
+            <m:sty m:val="p"/>
+          </m:rPr>
+          <m:t>[</m:t>
+        </m:r>
+        <m:r>
+          <m:t>Y</m:t>
+        </m:r>
+        <m:r>
+          <m:rPr>
+            <m:sty m:val="p"/>
+          </m:rPr>
+          <m:t>]</m:t>
+        </m:r>
+      </m:oMath>
+      <w:r>
+        <w:t xml:space="preserve"> </w:t>
+      </w:r>
+      <w:r>
+        <w:t xml:space="preserve">and</w:t>
+      </w:r>
+      <w:r>
+        <w:t xml:space="preserve"> </w:t>
+      </w:r>
+      <m:oMath>
+        <m:r>
+          <m:rPr>
+            <m:nor/>
+            <m:sty m:val="p"/>
+          </m:rPr>
+          <m:t>Var</m:t>
+        </m:r>
+        <m:r>
+          <m:rPr>
+            <m:sty m:val="p"/>
+          </m:rPr>
+          <m:t>(</m:t>
+        </m:r>
+        <m:r>
+          <m:t>Y</m:t>
+        </m:r>
+        <m:r>
+          <m:rPr>
+            <m:sty m:val="p"/>
+          </m:rPr>
+          <m:t>)</m:t>
+        </m:r>
+      </m:oMath>
+      <w:r>
+        <w:t xml:space="preserve"> </w:t>
+      </w:r>
+      <w:r>
+        <w:t xml:space="preserve">for the mean and variance</w:t>
+      </w:r>
+      <w:r>
+        <w:t xml:space="preserve"> </w:t>
+      </w:r>
+      <w:r>
+        <w:t xml:space="preserve">of a random variable,</w:t>
+      </w:r>
+      <w:r>
+        <w:t xml:space="preserve"> </w:t>
+      </w:r>
+      <w:r>
+        <w:t xml:space="preserve">never</w:t>
+      </w:r>
+      <w:r>
+        <w:t xml:space="preserve"> </w:t>
+      </w:r>
+      <m:oMath>
+        <m:r>
+          <m:rPr>
+            <m:nor/>
+            <m:sty m:val="p"/>
+          </m:rPr>
+          <m:t>E</m:t>
+        </m:r>
+        <m:r>
+          <m:rPr>
+            <m:sty m:val="p"/>
+          </m:rPr>
+          <m:t>[</m:t>
+        </m:r>
+        <m:r>
+          <m:t>y</m:t>
+        </m:r>
+        <m:r>
+          <m:rPr>
+            <m:sty m:val="p"/>
+          </m:rPr>
+          <m:t>]</m:t>
+        </m:r>
+      </m:oMath>
+      <w:r>
+        <w:t xml:space="preserve"> </w:t>
+      </w:r>
+      <w:r>
+        <w:t xml:space="preserve">or</w:t>
+      </w:r>
+      <w:r>
+        <w:t xml:space="preserve"> </w:t>
+      </w:r>
+      <m:oMath>
+        <m:r>
+          <m:rPr>
+            <m:nor/>
+            <m:sty m:val="p"/>
+          </m:rPr>
+          <m:t>Var</m:t>
+        </m:r>
+        <m:r>
+          <m:rPr>
+            <m:sty m:val="p"/>
+          </m:rPr>
+          <m:t>(</m:t>
+        </m:r>
+        <m:r>
+          <m:t>y</m:t>
+        </m:r>
+        <m:r>
+          <m:rPr>
+            <m:sty m:val="p"/>
+          </m:rPr>
+          <m:t>)</m:t>
+        </m:r>
+      </m:oMath>
+      <w:r>
+        <w:t xml:space="preserve"> </w:t>
+      </w:r>
+      <w:r>
+        <w:t xml:space="preserve">for an observed value.</w:t>
+      </w:r>
+    </w:p>
+    <w:p>
+      <w:pPr>
+        <w:pStyle w:val="Compact"/>
+        <w:numPr>
+          <w:ilvl w:val="0"/>
+          <w:numId w:val="1008"/>
+        </w:numPr>
+      </w:pPr>
+      <w:r>
+        <w:t xml:space="preserve">Write a statistic computed from observed values with lowercase letters,</w:t>
+      </w:r>
+      <w:r>
+        <w:t xml:space="preserve"> </w:t>
+      </w:r>
+      <w:r>
+        <w:t xml:space="preserve">as in</w:t>
+      </w:r>
+      <w:r>
+        <w:t xml:space="preserve"> </w:t>
+      </w:r>
+      <m:oMath>
+        <m:acc>
+          <m:accPr>
+            <m:chr m:val="‾"/>
+          </m:accPr>
+          <m:e>
+            <m:r>
+              <m:t>y</m:t>
+            </m:r>
+          </m:e>
+        </m:acc>
+        <m:r>
+          <m:rPr>
+            <m:sty m:val="p"/>
+          </m:rPr>
+          <m:t>=</m:t>
+        </m:r>
+        <m:f>
+          <m:fPr>
+            <m:type m:val="bar"/>
+          </m:fPr>
+          <m:num>
+            <m:r>
+              <m:t>1</m:t>
+            </m:r>
+          </m:num>
+          <m:den>
+            <m:r>
+              <m:t>n</m:t>
+            </m:r>
+          </m:den>
+        </m:f>
+        <m:nary>
+          <m:naryPr>
+            <m:chr m:val="∑"/>
+            <m:limLoc m:val="undOvr"/>
+            <m:subHide m:val="off"/>
+            <m:supHide m:val="off"/>
+          </m:naryPr>
+          <m:sub>
+            <m:r>
+              <m:t>i</m:t>
+            </m:r>
+            <m:r>
+              <m:rPr>
+                <m:sty m:val="p"/>
+              </m:rPr>
+              <m:t>=</m:t>
+            </m:r>
+            <m:r>
+              <m:t>1</m:t>
+            </m:r>
+          </m:sub>
+          <m:sup>
+            <m:r>
+              <m:t>n</m:t>
+            </m:r>
+          </m:sup>
+          <m:e>
+            <m:sSub>
+              <m:e>
+                <m:r>
+                  <m:t>y</m:t>
+                </m:r>
+              </m:e>
+              <m:sub>
+                <m:r>
+                  <m:t>i</m:t>
+                </m:r>
+              </m:sub>
+            </m:sSub>
+          </m:e>
+        </m:nary>
+      </m:oMath>
+      <w:r>
+        <w:t xml:space="preserve">,</w:t>
+      </w:r>
+      <w:r>
+        <w:t xml:space="preserve"> </w:t>
+      </w:r>
+      <w:r>
+        <w:t xml:space="preserve">and the same statistic as a random variable with capitals,</w:t>
+      </w:r>
+      <w:r>
+        <w:t xml:space="preserve"> </w:t>
+      </w:r>
+      <m:oMath>
+        <m:acc>
+          <m:accPr>
+            <m:chr m:val="‾"/>
+          </m:accPr>
+          <m:e>
+            <m:r>
+              <m:t>Y</m:t>
+            </m:r>
+          </m:e>
+        </m:acc>
+        <m:r>
+          <m:rPr>
+            <m:sty m:val="p"/>
+          </m:rPr>
+          <m:t>=</m:t>
+        </m:r>
+        <m:f>
+          <m:fPr>
+            <m:type m:val="bar"/>
+          </m:fPr>
+          <m:num>
+            <m:r>
+              <m:t>1</m:t>
+            </m:r>
+          </m:num>
+          <m:den>
+            <m:r>
+              <m:t>n</m:t>
+            </m:r>
+          </m:den>
+        </m:f>
+        <m:nary>
+          <m:naryPr>
+            <m:chr m:val="∑"/>
+            <m:limLoc m:val="undOvr"/>
+            <m:subHide m:val="off"/>
+            <m:supHide m:val="off"/>
+          </m:naryPr>
+          <m:sub>
+            <m:r>
+              <m:t>i</m:t>
+            </m:r>
+            <m:r>
+              <m:rPr>
+                <m:sty m:val="p"/>
+              </m:rPr>
+              <m:t>=</m:t>
+            </m:r>
+            <m:r>
+              <m:t>1</m:t>
+            </m:r>
+          </m:sub>
+          <m:sup>
+            <m:r>
+              <m:t>n</m:t>
+            </m:r>
+          </m:sup>
+          <m:e>
+            <m:sSub>
+              <m:e>
+                <m:r>
+                  <m:t>Y</m:t>
+                </m:r>
+              </m:e>
+              <m:sub>
+                <m:r>
+                  <m:t>i</m:t>
+                </m:r>
+              </m:sub>
+            </m:sSub>
+          </m:e>
+        </m:nary>
+      </m:oMath>
+      <w:r>
+        <w:t xml:space="preserve">.</w:t>
+      </w:r>
+      <w:r>
+        <w:t xml:space="preserve"> </w:t>
+      </w:r>
+      <w:r>
+        <w:t xml:space="preserve">The first is a number, such as 2.4.</w:t>
+      </w:r>
+      <w:r>
+        <w:t xml:space="preserve"> </w:t>
+      </w:r>
+      <w:r>
+        <w:t xml:space="preserve">The second has a sampling distribution.</w:t>
+      </w:r>
+    </w:p>
+    <w:p>
+      <w:pPr>
+        <w:pStyle w:val="FirstParagraph"/>
+      </w:pPr>
+      <w:r>
+        <w:t xml:space="preserve">Some fields reserve capital letters for matrices,</w:t>
+      </w:r>
+      <w:r>
+        <w:t xml:space="preserve"> </w:t>
+      </w:r>
+      <w:r>
+        <w:t xml:space="preserve">or use the same letter for a random variable and its value.</w:t>
+      </w:r>
+      <w:r>
+        <w:t xml:space="preserve"> </w:t>
+      </w:r>
+      <w:r>
+        <w:t xml:space="preserve">In that case, say so where you introduce the symbols.</w:t>
+      </w:r>
+      <w:r>
+        <w:t xml:space="preserve"> </w:t>
+      </w:r>
+      <w:r>
+        <w:t xml:space="preserve">Add a word that tells the reader which meaning applies,</w:t>
+      </w:r>
+      <w:r>
+        <w:t xml:space="preserve"> </w:t>
+      </w:r>
+      <w:r>
+        <w:t xml:space="preserve">such as</w:t>
+      </w:r>
+      <w:r>
+        <w:t xml:space="preserve"> </w:t>
+      </w:r>
+      <w:r>
+        <w:t xml:space="preserve">“the random variable</w:t>
+      </w:r>
+      <w:r>
+        <w:t xml:space="preserve"> </w:t>
+      </w:r>
+      <m:oMath>
+        <m:sSub>
+          <m:e>
+            <m:r>
+              <m:t>Y</m:t>
+            </m:r>
+          </m:e>
+          <m:sub>
+            <m:r>
+              <m:t>i</m:t>
+            </m:r>
+          </m:sub>
+        </m:sSub>
+      </m:oMath>
+      <w:r>
+        <w:t xml:space="preserve">”</w:t>
+      </w:r>
+      <w:r>
+        <w:t xml:space="preserve"> </w:t>
+      </w:r>
+      <w:r>
+        <w:t xml:space="preserve">or</w:t>
+      </w:r>
+      <w:r>
+        <w:t xml:space="preserve"> </w:t>
+      </w:r>
+      <w:r>
+        <w:t xml:space="preserve">“the observed value</w:t>
+      </w:r>
+      <w:r>
+        <w:t xml:space="preserve"> </w:t>
+      </w:r>
+      <m:oMath>
+        <m:sSub>
+          <m:e>
+            <m:r>
+              <m:t>y</m:t>
+            </m:r>
+          </m:e>
+          <m:sub>
+            <m:r>
+              <m:t>i</m:t>
+            </m:r>
+          </m:sub>
+        </m:sSub>
+      </m:oMath>
+      <w:r>
+        <w:t xml:space="preserve">”</w:t>
+      </w:r>
+      <w:r>
+        <w:t xml:space="preserve">.</w:t>
+      </w:r>
+    </w:p>
+    <w:bookmarkEnd w:id="33"/>
+    <w:bookmarkStart w:id="36" w:name="matching-names-and-notation"/>
+    <w:p>
+      <w:pPr>
+        <w:pStyle w:val="Heading2"/>
+      </w:pPr>
+      <w:r>
+        <w:t xml:space="preserve">6 Matching names and notation</w:t>
+      </w:r>
+    </w:p>
+    <w:p>
+      <w:pPr>
+        <w:pStyle w:val="FirstParagraph"/>
+      </w:pPr>
+      <w:r>
         <w:t xml:space="preserve">A name and its notation must describe the same object.</w:t>
       </w:r>
       <w:r>
@@ -7739,7 +8760,7 @@
       <w:r>
         <w:t xml:space="preserve"> </w:t>
       </w:r>
-      <w:hyperlink r:id="rId32">
+      <w:hyperlink r:id="rId34">
         <w:r>
           <w:rPr>
             <w:rStyle w:val="Hyperlink"/>
@@ -7751,7 +8772,7 @@
         <w:t xml:space="preserve">).</w:t>
       </w:r>
     </w:p>
-    <w:bookmarkStart w:id="33" w:name="exm-name-matches-notation"/>
+    <w:bookmarkStart w:id="35" w:name="exm-name-matches-notation"/>
     <w:p>
       <w:pPr>
         <w:pStyle w:val="BodyText"/>
@@ -7761,7 +8782,7 @@
           <w:b/>
           <w:bCs/>
         </w:rPr>
-        <w:t xml:space="preserve">Example 8 (Matching a name to its notation)</w:t>
+        <w:t xml:space="preserve">Example 9 (Matching a name to its notation)</w:t>
       </w:r>
       <w:r>
         <w:t xml:space="preserve"> </w:t>
@@ -8244,7 +9265,7 @@
         <w:t xml:space="preserve">.</w:t>
       </w:r>
     </w:p>
-    <w:bookmarkEnd w:id="33"/>
+    <w:bookmarkEnd w:id="35"/>
     <w:p>
       <w:pPr>
         <w:pStyle w:val="BodyText"/>
@@ -8265,14 +9286,14 @@
         <w:t xml:space="preserve">and make them agree.</w:t>
       </w:r>
     </w:p>
-    <w:bookmarkEnd w:id="34"/>
-    <w:bookmarkStart w:id="42" w:name="using-shared-macros"/>
+    <w:bookmarkEnd w:id="36"/>
+    <w:bookmarkStart w:id="44" w:name="using-shared-macros"/>
     <w:p>
       <w:pPr>
         <w:pStyle w:val="Heading2"/>
       </w:pPr>
       <w:r>
-        <w:t xml:space="preserve">6 Using shared macros</w:t>
+        <w:t xml:space="preserve">7 Using shared macros</w:t>
       </w:r>
     </w:p>
     <w:p>
@@ -8339,7 +9360,7 @@
         <w:t xml:space="preserve">so the next document finds it.</w:t>
       </w:r>
     </w:p>
-    <w:bookmarkStart w:id="35" w:name="exm-use-shared-macro"/>
+    <w:bookmarkStart w:id="37" w:name="exm-use-shared-macro"/>
     <w:p>
       <w:pPr>
         <w:pStyle w:val="BodyText"/>
@@ -8349,7 +9370,7 @@
           <w:b/>
           <w:bCs/>
         </w:rPr>
-        <w:t xml:space="preserve">Example 9 (Using a shared macro)</w:t>
+        <w:t xml:space="preserve">Example 10 (Using a shared macro)</w:t>
       </w:r>
       <w:r>
         <w:t xml:space="preserve"> </w:t>
@@ -8424,7 +9445,7 @@
         <w:t xml:space="preserve">every document that uses the macro changes with it.</w:t>
       </w:r>
     </w:p>
-    <w:bookmarkEnd w:id="35"/>
+    <w:bookmarkEnd w:id="37"/>
     <w:p>
       <w:pPr>
         <w:pStyle w:val="BodyText"/>
@@ -8438,7 +9459,7 @@
         <w:pStyle w:val="Compact"/>
         <w:numPr>
           <w:ilvl w:val="0"/>
-          <w:numId w:val="1007"/>
+          <w:numId w:val="1009"/>
         </w:numPr>
       </w:pPr>
       <w:r>
@@ -8450,7 +9471,7 @@
         <w:pStyle w:val="Compact"/>
         <w:numPr>
           <w:ilvl w:val="0"/>
-          <w:numId w:val="1007"/>
+          <w:numId w:val="1009"/>
         </w:numPr>
       </w:pPr>
       <w:r>
@@ -8462,7 +9483,7 @@
         <w:pStyle w:val="Compact"/>
         <w:numPr>
           <w:ilvl w:val="0"/>
-          <w:numId w:val="1007"/>
+          <w:numId w:val="1009"/>
         </w:numPr>
       </w:pPr>
       <w:r>
@@ -8474,7 +9495,7 @@
         <w:pStyle w:val="Compact"/>
         <w:numPr>
           <w:ilvl w:val="0"/>
-          <w:numId w:val="1007"/>
+          <w:numId w:val="1009"/>
         </w:numPr>
       </w:pPr>
       <w:r>
@@ -8486,7 +9507,7 @@
         <w:pStyle w:val="Compact"/>
         <w:numPr>
           <w:ilvl w:val="0"/>
-          <w:numId w:val="1007"/>
+          <w:numId w:val="1009"/>
         </w:numPr>
       </w:pPr>
       <w:r>
@@ -8498,7 +9519,7 @@
         <w:pStyle w:val="Compact"/>
         <w:numPr>
           <w:ilvl w:val="0"/>
-          <w:numId w:val="1007"/>
+          <w:numId w:val="1009"/>
         </w:numPr>
       </w:pPr>
       <w:r>
@@ -8626,7 +9647,7 @@
         <w:t xml:space="preserve">and the rule for Latin letters below says when that applies.</w:t>
       </w:r>
     </w:p>
-    <w:bookmarkStart w:id="36" w:name="exm-semantic-macro-name"/>
+    <w:bookmarkStart w:id="38" w:name="exm-semantic-macro-name"/>
     <w:p>
       <w:pPr>
         <w:pStyle w:val="BodyText"/>
@@ -8636,7 +9657,7 @@
           <w:b/>
           <w:bCs/>
         </w:rPr>
-        <w:t xml:space="preserve">Example 10 (Naming a macro for its meaning)</w:t>
+        <w:t xml:space="preserve">Example 11 (Naming a macro for its meaning)</w:t>
       </w:r>
       <w:r>
         <w:t xml:space="preserve"> </w:t>
@@ -8705,7 +9726,7 @@
         <w:t xml:space="preserve">changes one line in the shared file.</w:t>
       </w:r>
     </w:p>
-    <w:bookmarkEnd w:id="36"/>
+    <w:bookmarkEnd w:id="38"/>
     <w:p>
       <w:pPr>
         <w:pStyle w:val="BodyText"/>
@@ -8827,7 +9848,7 @@
         <w:t xml:space="preserve">existing hats are converted in separate sweeps.</w:t>
       </w:r>
     </w:p>
-    <w:bookmarkStart w:id="37" w:name="exm-semantic-decorator"/>
+    <w:bookmarkStart w:id="39" w:name="exm-semantic-decorator"/>
     <w:p>
       <w:pPr>
         <w:pStyle w:val="BodyText"/>
@@ -8837,7 +9858,7 @@
           <w:b/>
           <w:bCs/>
         </w:rPr>
-        <w:t xml:space="preserve">Example 11 (Naming a decorator for its meaning)</w:t>
+        <w:t xml:space="preserve">Example 12 (Naming a decorator for its meaning)</w:t>
       </w:r>
       <w:r>
         <w:t xml:space="preserve"> </w:t>
@@ -8915,7 +9936,7 @@
         <w:t xml:space="preserve">changes.</w:t>
       </w:r>
     </w:p>
-    <w:bookmarkEnd w:id="37"/>
+    <w:bookmarkEnd w:id="39"/>
     <w:p>
       <w:pPr>
         <w:pStyle w:val="BodyText"/>
@@ -9104,7 +10125,7 @@
         <w:t xml:space="preserve">may write the font command directly.</w:t>
       </w:r>
     </w:p>
-    <w:bookmarkStart w:id="38" w:name="exm-semantic-font"/>
+    <w:bookmarkStart w:id="40" w:name="exm-semantic-font"/>
     <w:p>
       <w:pPr>
         <w:pStyle w:val="BodyText"/>
@@ -9114,7 +10135,7 @@
           <w:b/>
           <w:bCs/>
         </w:rPr>
-        <w:t xml:space="preserve">Example 12 (Naming a set for its meaning)</w:t>
+        <w:t xml:space="preserve">Example 13 (Naming a set for its meaning)</w:t>
       </w:r>
       <w:r>
         <w:t xml:space="preserve"> </w:t>
@@ -9192,7 +10213,7 @@
         <w:t xml:space="preserve">changes.</w:t>
       </w:r>
     </w:p>
-    <w:bookmarkEnd w:id="38"/>
+    <w:bookmarkEnd w:id="40"/>
     <w:p>
       <w:pPr>
         <w:pStyle w:val="BodyText"/>
@@ -9274,7 +10295,7 @@
         <w:pStyle w:val="Compact"/>
         <w:numPr>
           <w:ilvl w:val="0"/>
-          <w:numId w:val="1008"/>
+          <w:numId w:val="1010"/>
         </w:numPr>
       </w:pPr>
       <w:r>
@@ -9307,7 +10328,7 @@
         <w:pStyle w:val="Compact"/>
         <w:numPr>
           <w:ilvl w:val="0"/>
-          <w:numId w:val="1008"/>
+          <w:numId w:val="1010"/>
         </w:numPr>
       </w:pPr>
       <w:r>
@@ -9328,7 +10349,7 @@
         <w:pStyle w:val="Compact"/>
         <w:numPr>
           <w:ilvl w:val="0"/>
-          <w:numId w:val="1008"/>
+          <w:numId w:val="1010"/>
         </w:numPr>
       </w:pPr>
       <w:r>
@@ -9361,7 +10382,7 @@
         <w:pStyle w:val="Compact"/>
         <w:numPr>
           <w:ilvl w:val="0"/>
-          <w:numId w:val="1008"/>
+          <w:numId w:val="1010"/>
         </w:numPr>
       </w:pPr>
       <w:r>
@@ -9382,7 +10403,7 @@
         <w:pStyle w:val="Compact"/>
         <w:numPr>
           <w:ilvl w:val="0"/>
-          <w:numId w:val="1008"/>
+          <w:numId w:val="1010"/>
         </w:numPr>
       </w:pPr>
       <w:r>
@@ -9561,7 +10582,7 @@
         <w:t xml:space="preserve">.</w:t>
       </w:r>
     </w:p>
-    <w:bookmarkStart w:id="39" w:name="exm-semantic-latin-letter"/>
+    <w:bookmarkStart w:id="41" w:name="exm-semantic-latin-letter"/>
     <w:p>
       <w:pPr>
         <w:pStyle w:val="BodyText"/>
@@ -9571,7 +10592,7 @@
           <w:b/>
           <w:bCs/>
         </w:rPr>
-        <w:t xml:space="preserve">Example 13 (Naming a variable for its role)</w:t>
+        <w:t xml:space="preserve">Example 14 (Naming a variable for its role)</w:t>
       </w:r>
       <w:r>
         <w:t xml:space="preserve"> </w:t>
@@ -9651,7 +10672,7 @@
         <w:t xml:space="preserve">which letter is the outcome and which is the residual.</w:t>
       </w:r>
     </w:p>
-    <w:bookmarkEnd w:id="39"/>
+    <w:bookmarkEnd w:id="41"/>
     <w:p>
       <w:pPr>
         <w:pStyle w:val="BodyText"/>
@@ -9678,7 +10699,7 @@
         <w:t xml:space="preserve">and a reader sees which quantity it is about.</w:t>
       </w:r>
     </w:p>
-    <w:bookmarkStart w:id="40" w:name="exm-named-quantity"/>
+    <w:bookmarkStart w:id="42" w:name="exm-named-quantity"/>
     <w:p>
       <w:pPr>
         <w:pStyle w:val="BodyText"/>
@@ -9688,7 +10709,7 @@
           <w:b/>
           <w:bCs/>
         </w:rPr>
-        <w:t xml:space="preserve">Example 14 (Writing a named quantity by its name)</w:t>
+        <w:t xml:space="preserve">Example 15 (Writing a named quantity by its name)</w:t>
       </w:r>
       <w:r>
         <w:t xml:space="preserve"> </w:t>
@@ -9790,7 +10811,7 @@
         <w:t xml:space="preserve">and it names the quantity the gradient depends on.</w:t>
       </w:r>
     </w:p>
-    <w:bookmarkEnd w:id="40"/>
+    <w:bookmarkEnd w:id="42"/>
     <w:p>
       <w:pPr>
         <w:pStyle w:val="BodyText"/>
@@ -9952,7 +10973,7 @@
         <w:t xml:space="preserve">are not delimiters.</w:t>
       </w:r>
     </w:p>
-    <w:bookmarkStart w:id="41" w:name="exm-semantic-delimiter"/>
+    <w:bookmarkStart w:id="43" w:name="exm-semantic-delimiter"/>
     <w:p>
       <w:pPr>
         <w:pStyle w:val="BodyText"/>
@@ -9962,7 +10983,7 @@
           <w:b/>
           <w:bCs/>
         </w:rPr>
-        <w:t xml:space="preserve">Example 15 (Letting the macro size the bracket)</w:t>
+        <w:t xml:space="preserve">Example 16 (Letting the macro size the bracket)</w:t>
       </w:r>
       <w:r>
         <w:t xml:space="preserve"> </w:t>
@@ -10031,15 +11052,15 @@
         <w:t xml:space="preserve">edits one definition in the shared file.</w:t>
       </w:r>
     </w:p>
-    <w:bookmarkEnd w:id="41"/>
-    <w:bookmarkEnd w:id="42"/>
-    <w:bookmarkStart w:id="45" w:name="making-expressions-concise"/>
+    <w:bookmarkEnd w:id="43"/>
+    <w:bookmarkEnd w:id="44"/>
+    <w:bookmarkStart w:id="47" w:name="making-expressions-concise"/>
     <w:p>
       <w:pPr>
         <w:pStyle w:val="Heading2"/>
       </w:pPr>
       <w:r>
-        <w:t xml:space="preserve">7 Making expressions concise</w:t>
+        <w:t xml:space="preserve">8 Making expressions concise</w:t>
       </w:r>
     </w:p>
     <w:p>
@@ -10064,7 +11085,7 @@
       <w:r>
         <w:t xml:space="preserve"> </w:t>
       </w:r>
-      <w:hyperlink r:id="rId43">
+      <w:hyperlink r:id="rId45">
         <w:r>
           <w:rPr>
             <w:rStyle w:val="Hyperlink"/>
@@ -10132,7 +11153,7 @@
         <w:t xml:space="preserve">and write the macro everywhere the chunk appears.</w:t>
       </w:r>
     </w:p>
-    <w:bookmarkStart w:id="44" w:name="exm-concise-expression"/>
+    <w:bookmarkStart w:id="46" w:name="exm-concise-expression"/>
     <w:p>
       <w:pPr>
         <w:pStyle w:val="BodyText"/>
@@ -10142,7 +11163,7 @@
           <w:b/>
           <w:bCs/>
         </w:rPr>
-        <w:t xml:space="preserve">Example 16 (Naming a repeated chunk)</w:t>
+        <w:t xml:space="preserve">Example 17 (Naming a repeated chunk)</w:t>
       </w:r>
       <w:r>
         <w:t xml:space="preserve"> </w:t>
@@ -10226,7 +11247,7 @@
         <w:t xml:space="preserve">and each formula shows at a glance what it is built from.</w:t>
       </w:r>
     </w:p>
-    <w:bookmarkEnd w:id="44"/>
+    <w:bookmarkEnd w:id="46"/>
     <w:p>
       <w:pPr>
         <w:pStyle w:val="BodyText"/>
@@ -10279,14 +11300,14 @@
         <w:t xml:space="preserve">.</w:t>
       </w:r>
     </w:p>
-    <w:bookmarkEnd w:id="45"/>
-    <w:bookmarkStart w:id="47" w:name="writing-dot-products"/>
+    <w:bookmarkEnd w:id="47"/>
+    <w:bookmarkStart w:id="49" w:name="writing-dot-products"/>
     <w:p>
       <w:pPr>
         <w:pStyle w:val="Heading2"/>
       </w:pPr>
       <w:r>
-        <w:t xml:space="preserve">8 Writing dot products</w:t>
+        <w:t xml:space="preserve">9 Writing dot products</w:t>
       </w:r>
     </w:p>
     <w:p>
@@ -10453,7 +11474,7 @@
         <w:t xml:space="preserve">and to work out that the result is a single number.</w:t>
       </w:r>
     </w:p>
-    <w:bookmarkStart w:id="46" w:name="exm-dot-product"/>
+    <w:bookmarkStart w:id="48" w:name="exm-dot-product"/>
     <w:p>
       <w:pPr>
         <w:pStyle w:val="BodyText"/>
@@ -10463,7 +11484,7 @@
           <w:b/>
           <w:bCs/>
         </w:rPr>
-        <w:t xml:space="preserve">Example 17 (Writing a dot product)</w:t>
+        <w:t xml:space="preserve">Example 18 (Writing a dot product)</w:t>
       </w:r>
       <w:r>
         <w:t xml:space="preserve"> </w:t>
@@ -10682,7 +11703,7 @@
         <w:t xml:space="preserve">.</w:t>
       </w:r>
     </w:p>
-    <w:bookmarkEnd w:id="46"/>
+    <w:bookmarkEnd w:id="48"/>
     <w:p>
       <w:pPr>
         <w:pStyle w:val="BodyText"/>
@@ -10696,7 +11717,7 @@
         <w:pStyle w:val="Compact"/>
         <w:numPr>
           <w:ilvl w:val="0"/>
-          <w:numId w:val="1009"/>
+          <w:numId w:val="1011"/>
         </w:numPr>
       </w:pPr>
       <w:r>
@@ -10731,7 +11752,7 @@
         <w:pStyle w:val="Compact"/>
         <w:numPr>
           <w:ilvl w:val="0"/>
-          <w:numId w:val="1009"/>
+          <w:numId w:val="1011"/>
         </w:numPr>
       </w:pPr>
       <w:r>
@@ -10780,7 +11801,7 @@
         <w:pStyle w:val="Compact"/>
         <w:numPr>
           <w:ilvl w:val="0"/>
-          <w:numId w:val="1009"/>
+          <w:numId w:val="1011"/>
         </w:numPr>
       </w:pPr>
       <w:r>
@@ -10841,14 +11862,14 @@
         <w:t xml:space="preserve">such as a definition of an inner product space.</w:t>
       </w:r>
     </w:p>
-    <w:bookmarkEnd w:id="47"/>
-    <w:bookmarkStart w:id="50" w:name="writing-out-notational-shorthands"/>
+    <w:bookmarkEnd w:id="49"/>
+    <w:bookmarkStart w:id="52" w:name="writing-out-notational-shorthands"/>
     <w:p>
       <w:pPr>
         <w:pStyle w:val="Heading2"/>
       </w:pPr>
       <w:r>
-        <w:t xml:space="preserve">9 Writing out notational shorthands</w:t>
+        <w:t xml:space="preserve">10 Writing out notational shorthands</w:t>
       </w:r>
     </w:p>
     <w:p>
@@ -11281,7 +12302,7 @@
       <w:r>
         <w:t xml:space="preserve"> </w:t>
       </w:r>
-      <w:hyperlink r:id="rId48">
+      <w:hyperlink r:id="rId50">
         <w:r>
           <w:rPr>
             <w:rStyle w:val="Hyperlink"/>
@@ -11322,7 +12343,7 @@
         <w:t xml:space="preserve">catalogs common shorthands and their full forms.</w:t>
       </w:r>
     </w:p>
-    <w:bookmarkStart w:id="49" w:name="exm-notational-shorthand"/>
+    <w:bookmarkStart w:id="51" w:name="exm-notational-shorthand"/>
     <w:p>
       <w:pPr>
         <w:pStyle w:val="BodyText"/>
@@ -11332,7 +12353,7 @@
           <w:b/>
           <w:bCs/>
         </w:rPr>
-        <w:t xml:space="preserve">Example 18 (Writing out the limits of a sum and the range of an index)</w:t>
+        <w:t xml:space="preserve">Example 19 (Writing out the limits of a sum and the range of an index)</w:t>
       </w:r>
       <w:r>
         <w:t xml:space="preserve"> </w:t>
@@ -11889,15 +12910,15 @@
         <w:t xml:space="preserve">observations.</w:t>
       </w:r>
     </w:p>
-    <w:bookmarkEnd w:id="49"/>
-    <w:bookmarkEnd w:id="50"/>
-    <w:bookmarkStart w:id="52" w:name="stating-assumptions-before-using-them"/>
+    <w:bookmarkEnd w:id="51"/>
+    <w:bookmarkEnd w:id="52"/>
+    <w:bookmarkStart w:id="54" w:name="stating-assumptions-before-using-them"/>
     <w:p>
       <w:pPr>
         <w:pStyle w:val="Heading2"/>
       </w:pPr>
       <w:r>
-        <w:t xml:space="preserve">10 Stating assumptions before using them</w:t>
+        <w:t xml:space="preserve">11 Stating assumptions before using them</w:t>
       </w:r>
     </w:p>
     <w:p>
@@ -11951,7 +12972,7 @@
         <w:pStyle w:val="Compact"/>
         <w:numPr>
           <w:ilvl w:val="0"/>
-          <w:numId w:val="1010"/>
+          <w:numId w:val="1012"/>
         </w:numPr>
       </w:pPr>
       <w:r>
@@ -11989,7 +13010,7 @@
         <w:pStyle w:val="Compact"/>
         <w:numPr>
           <w:ilvl w:val="0"/>
-          <w:numId w:val="1010"/>
+          <w:numId w:val="1012"/>
         </w:numPr>
       </w:pPr>
       <w:r>
@@ -12001,7 +13022,7 @@
         <w:pStyle w:val="Compact"/>
         <w:numPr>
           <w:ilvl w:val="0"/>
-          <w:numId w:val="1010"/>
+          <w:numId w:val="1012"/>
         </w:numPr>
       </w:pPr>
       <w:r>
@@ -12013,7 +13034,7 @@
         <w:pStyle w:val="Compact"/>
         <w:numPr>
           <w:ilvl w:val="0"/>
-          <w:numId w:val="1010"/>
+          <w:numId w:val="1012"/>
         </w:numPr>
       </w:pPr>
       <w:r>
@@ -12081,7 +13102,7 @@
         <w:t xml:space="preserve">cite it in the justification on that line.</w:t>
       </w:r>
     </w:p>
-    <w:bookmarkStart w:id="51" w:name="exm-assumptions-first"/>
+    <w:bookmarkStart w:id="53" w:name="exm-assumptions-first"/>
     <w:p>
       <w:pPr>
         <w:pStyle w:val="BodyText"/>
@@ -12091,7 +13112,7 @@
           <w:b/>
           <w:bCs/>
         </w:rPr>
-        <w:t xml:space="preserve">Example 19 (Stating the restriction on</w:t>
+        <w:t xml:space="preserve">Example 20 (Stating the restriction on</w:t>
       </w:r>
       <w:r>
         <w:rPr>
@@ -12763,8 +13784,8 @@
         <w:t xml:space="preserve">and the justification says exactly where the condition is used.</w:t>
       </w:r>
     </w:p>
-    <w:bookmarkEnd w:id="51"/>
-    <w:bookmarkEnd w:id="52"/>
+    <w:bookmarkEnd w:id="53"/>
+    <w:bookmarkEnd w:id="54"/>
     <w:sectPr>
       <w:footnotePr>
         <w:numRestart w:val="eachSect"/>
@@ -13121,6 +14142,12 @@
     <w:abstractNumId w:val="991"/>
   </w:num>
   <w:num w:numId="1010">
+    <w:abstractNumId w:val="991"/>
+  </w:num>
+  <w:num w:numId="1011">
+    <w:abstractNumId w:val="991"/>
+  </w:num>
+  <w:num w:numId="1012">
     <w:abstractNumId w:val="991"/>
   </w:num>
 </w:numbering>

</xml_diff>

<commit_message>
Deploying to gh-pages from @ Morrison-Lab/psw@99e76814f67d07223defda197f2789e9c58bbd4e 🚀
</commit_message>
<xml_diff>
--- a/chapters/notation.docx
+++ b/chapters/notation.docx
@@ -15,7 +15,7 @@
         <w:pStyle w:val="Date"/>
       </w:pPr>
       <w:r>
-        <w:t xml:space="preserve">Last modified: 2026-10-16 16:33:26 (PDT)</w:t>
+        <w:t xml:space="preserve">Last modified: 2026-10-16 16:41:57 (PDT)</w:t>
       </w:r>
     </w:p>
     <w:tbl>
@@ -9287,7 +9287,7 @@
       </w:r>
     </w:p>
     <w:bookmarkEnd w:id="36"/>
-    <w:bookmarkStart w:id="44" w:name="using-shared-macros"/>
+    <w:bookmarkStart w:id="45" w:name="using-shared-macros"/>
     <w:p>
       <w:pPr>
         <w:pStyle w:val="Heading2"/>
@@ -11053,8 +11053,120 @@
       </w:r>
     </w:p>
     <w:bookmarkEnd w:id="43"/>
+    <w:p>
+      <w:pPr>
+        <w:pStyle w:val="BodyText"/>
+      </w:pPr>
+      <w:r>
+        <w:t xml:space="preserve">Macros are for the author, not the reader.</w:t>
+      </w:r>
+      <w:r>
+        <w:t xml:space="preserve"> </w:t>
+      </w:r>
+      <w:r>
+        <w:t xml:space="preserve">Reader-facing text, such as a lecture, a handout or a notation section,</w:t>
+      </w:r>
+      <w:r>
+        <w:t xml:space="preserve"> </w:t>
+      </w:r>
+      <w:r>
+        <w:t xml:space="preserve">describes the symbols that a macro prints and what they mean,</w:t>
+      </w:r>
+      <w:r>
+        <w:t xml:space="preserve"> </w:t>
+      </w:r>
+      <w:r>
+        <w:t xml:space="preserve">and never names the macro that produced them.</w:t>
+      </w:r>
+      <w:r>
+        <w:t xml:space="preserve"> </w:t>
+      </w:r>
+      <w:r>
+        <w:t xml:space="preserve">List every symbol that the reader meets in the document’s notation table,</w:t>
+      </w:r>
+      <w:r>
+        <w:t xml:space="preserve"> </w:t>
+      </w:r>
+      <w:r>
+        <w:t xml:space="preserve">with its meaning.</w:t>
+      </w:r>
+    </w:p>
+    <w:bookmarkStart w:id="44" w:name="exm-describe-symbol-not-macro"/>
+    <w:p>
+      <w:pPr>
+        <w:pStyle w:val="BodyText"/>
+      </w:pPr>
+      <w:r>
+        <w:rPr>
+          <w:b/>
+          <w:bCs/>
+        </w:rPr>
+        <w:t xml:space="preserve">Example 17 (Describing the symbol, not the macro)</w:t>
+      </w:r>
+      <w:r>
+        <w:t xml:space="preserve"> </w:t>
+      </w:r>
+      <w:r>
+        <w:t xml:space="preserve"> </w:t>
+      </w:r>
+    </w:p>
+    <w:p>
+      <w:pPr>
+        <w:pStyle w:val="BlockText"/>
+      </w:pPr>
+      <w:r>
+        <w:t xml:space="preserve">❌ Source:</w:t>
+      </w:r>
+      <w:r>
+        <w:t xml:space="preserve"> </w:t>
+      </w:r>
+      <w:r>
+        <w:rPr>
+          <w:rStyle w:val="VerbatimChar"/>
+        </w:rPr>
+        <w:t xml:space="preserve">The macro \avgfitf prints the average fit, so write $\avgfitf{x}$ for it.</w:t>
+      </w:r>
+    </w:p>
+    <w:p>
+      <w:pPr>
+        <w:pStyle w:val="BlockText"/>
+      </w:pPr>
+      <w:r>
+        <w:t xml:space="preserve">✅ Source:</w:t>
+      </w:r>
+      <w:r>
+        <w:t xml:space="preserve"> </w:t>
+      </w:r>
+      <w:r>
+        <w:rPr>
+          <w:rStyle w:val="VerbatimChar"/>
+        </w:rPr>
+        <w:t xml:space="preserve">The average fit at $x$ is written $\avgfitf{x}$.</w:t>
+      </w:r>
+    </w:p>
+    <w:p>
+      <w:pPr>
+        <w:pStyle w:val="FirstParagraph"/>
+      </w:pPr>
+      <w:r>
+        <w:t xml:space="preserve">The ✅ version tells the reader what the symbol means.</w:t>
+      </w:r>
+      <w:r>
+        <w:t xml:space="preserve"> </w:t>
+      </w:r>
+      <w:r>
+        <w:t xml:space="preserve">The reader never sees the macro name,</w:t>
+      </w:r>
+      <w:r>
+        <w:t xml:space="preserve"> </w:t>
+      </w:r>
+      <w:r>
+        <w:t xml:space="preserve">and the symbol has its own row in the notation table.</w:t>
+      </w:r>
+    </w:p>
     <w:bookmarkEnd w:id="44"/>
-    <w:bookmarkStart w:id="47" w:name="making-expressions-concise"/>
+    <w:bookmarkEnd w:id="45"/>
+    <w:bookmarkStart w:id="48" w:name="making-expressions-concise"/>
     <w:p>
       <w:pPr>
         <w:pStyle w:val="Heading2"/>
@@ -11085,7 +11197,7 @@
       <w:r>
         <w:t xml:space="preserve"> </w:t>
       </w:r>
-      <w:hyperlink r:id="rId45">
+      <w:hyperlink r:id="rId46">
         <w:r>
           <w:rPr>
             <w:rStyle w:val="Hyperlink"/>
@@ -11153,7 +11265,7 @@
         <w:t xml:space="preserve">and write the macro everywhere the chunk appears.</w:t>
       </w:r>
     </w:p>
-    <w:bookmarkStart w:id="46" w:name="exm-concise-expression"/>
+    <w:bookmarkStart w:id="47" w:name="exm-concise-expression"/>
     <w:p>
       <w:pPr>
         <w:pStyle w:val="BodyText"/>
@@ -11163,7 +11275,7 @@
           <w:b/>
           <w:bCs/>
         </w:rPr>
-        <w:t xml:space="preserve">Example 17 (Naming a repeated chunk)</w:t>
+        <w:t xml:space="preserve">Example 18 (Naming a repeated chunk)</w:t>
       </w:r>
       <w:r>
         <w:t xml:space="preserve"> </w:t>
@@ -11247,7 +11359,7 @@
         <w:t xml:space="preserve">and each formula shows at a glance what it is built from.</w:t>
       </w:r>
     </w:p>
-    <w:bookmarkEnd w:id="46"/>
+    <w:bookmarkEnd w:id="47"/>
     <w:p>
       <w:pPr>
         <w:pStyle w:val="BodyText"/>
@@ -11300,8 +11412,8 @@
         <w:t xml:space="preserve">.</w:t>
       </w:r>
     </w:p>
-    <w:bookmarkEnd w:id="47"/>
-    <w:bookmarkStart w:id="49" w:name="writing-dot-products"/>
+    <w:bookmarkEnd w:id="48"/>
+    <w:bookmarkStart w:id="50" w:name="writing-dot-products"/>
     <w:p>
       <w:pPr>
         <w:pStyle w:val="Heading2"/>
@@ -11474,7 +11586,7 @@
         <w:t xml:space="preserve">and to work out that the result is a single number.</w:t>
       </w:r>
     </w:p>
-    <w:bookmarkStart w:id="48" w:name="exm-dot-product"/>
+    <w:bookmarkStart w:id="49" w:name="exm-dot-product"/>
     <w:p>
       <w:pPr>
         <w:pStyle w:val="BodyText"/>
@@ -11484,7 +11596,7 @@
           <w:b/>
           <w:bCs/>
         </w:rPr>
-        <w:t xml:space="preserve">Example 18 (Writing a dot product)</w:t>
+        <w:t xml:space="preserve">Example 19 (Writing a dot product)</w:t>
       </w:r>
       <w:r>
         <w:t xml:space="preserve"> </w:t>
@@ -11703,7 +11815,7 @@
         <w:t xml:space="preserve">.</w:t>
       </w:r>
     </w:p>
-    <w:bookmarkEnd w:id="48"/>
+    <w:bookmarkEnd w:id="49"/>
     <w:p>
       <w:pPr>
         <w:pStyle w:val="BodyText"/>
@@ -11862,8 +11974,8 @@
         <w:t xml:space="preserve">such as a definition of an inner product space.</w:t>
       </w:r>
     </w:p>
-    <w:bookmarkEnd w:id="49"/>
-    <w:bookmarkStart w:id="52" w:name="writing-out-notational-shorthands"/>
+    <w:bookmarkEnd w:id="50"/>
+    <w:bookmarkStart w:id="53" w:name="writing-out-notational-shorthands"/>
     <w:p>
       <w:pPr>
         <w:pStyle w:val="Heading2"/>
@@ -12302,7 +12414,7 @@
       <w:r>
         <w:t xml:space="preserve"> </w:t>
       </w:r>
-      <w:hyperlink r:id="rId50">
+      <w:hyperlink r:id="rId51">
         <w:r>
           <w:rPr>
             <w:rStyle w:val="Hyperlink"/>
@@ -12343,7 +12455,7 @@
         <w:t xml:space="preserve">catalogs common shorthands and their full forms.</w:t>
       </w:r>
     </w:p>
-    <w:bookmarkStart w:id="51" w:name="exm-notational-shorthand"/>
+    <w:bookmarkStart w:id="52" w:name="exm-notational-shorthand"/>
     <w:p>
       <w:pPr>
         <w:pStyle w:val="BodyText"/>
@@ -12353,7 +12465,7 @@
           <w:b/>
           <w:bCs/>
         </w:rPr>
-        <w:t xml:space="preserve">Example 19 (Writing out the limits of a sum and the range of an index)</w:t>
+        <w:t xml:space="preserve">Example 20 (Writing out the limits of a sum and the range of an index)</w:t>
       </w:r>
       <w:r>
         <w:t xml:space="preserve"> </w:t>
@@ -12910,9 +13022,9 @@
         <w:t xml:space="preserve">observations.</w:t>
       </w:r>
     </w:p>
-    <w:bookmarkEnd w:id="51"/>
     <w:bookmarkEnd w:id="52"/>
-    <w:bookmarkStart w:id="54" w:name="stating-assumptions-before-using-them"/>
+    <w:bookmarkEnd w:id="53"/>
+    <w:bookmarkStart w:id="55" w:name="stating-assumptions-before-using-them"/>
     <w:p>
       <w:pPr>
         <w:pStyle w:val="Heading2"/>
@@ -13102,7 +13214,7 @@
         <w:t xml:space="preserve">cite it in the justification on that line.</w:t>
       </w:r>
     </w:p>
-    <w:bookmarkStart w:id="53" w:name="exm-assumptions-first"/>
+    <w:bookmarkStart w:id="54" w:name="exm-assumptions-first"/>
     <w:p>
       <w:pPr>
         <w:pStyle w:val="BodyText"/>
@@ -13112,7 +13224,7 @@
           <w:b/>
           <w:bCs/>
         </w:rPr>
-        <w:t xml:space="preserve">Example 20 (Stating the restriction on</w:t>
+        <w:t xml:space="preserve">Example 21 (Stating the restriction on</w:t>
       </w:r>
       <w:r>
         <w:rPr>
@@ -13784,8 +13896,8 @@
         <w:t xml:space="preserve">and the justification says exactly where the condition is used.</w:t>
       </w:r>
     </w:p>
-    <w:bookmarkEnd w:id="53"/>
     <w:bookmarkEnd w:id="54"/>
+    <w:bookmarkEnd w:id="55"/>
     <w:sectPr>
       <w:footnotePr>
         <w:numRestart w:val="eachSect"/>

</xml_diff>

<commit_message>
Deploying to gh-pages from @ Morrison-Lab/psw@f473fa4c4d9b29510ee1aa2fdd97030312cffc98 🚀
</commit_message>
<xml_diff>
--- a/chapters/notation.docx
+++ b/chapters/notation.docx
@@ -15,7 +15,7 @@
         <w:pStyle w:val="Date"/>
       </w:pPr>
       <w:r>
-        <w:t xml:space="preserve">Last modified: 2026-10-16 18:58:42 (PDT)</w:t>
+        <w:t xml:space="preserve">Last modified: 2026-10-16 22:47:07 (PDT)</w:t>
       </w:r>
     </w:p>
     <w:tbl>
@@ -7628,13 +7628,13 @@
       </w:r>
     </w:p>
     <w:bookmarkEnd w:id="31"/>
-    <w:bookmarkStart w:id="33" w:name="random-variables-and-their-values"/>
+    <w:bookmarkStart w:id="36" w:name="types-of-functions-and-procedures"/>
     <w:p>
       <w:pPr>
         <w:pStyle w:val="Heading2"/>
       </w:pPr>
       <w:r>
-        <w:t xml:space="preserve">5 Random variables and their values</w:t>
+        <w:t xml:space="preserve">5 Types of functions and procedures</w:t>
       </w:r>
     </w:p>
     <w:p>
@@ -7642,45 +7642,24 @@
         <w:pStyle w:val="FirstParagraph"/>
       </w:pPr>
       <w:r>
-        <w:t xml:space="preserve">A random variable and a value that it takes are different objects.</w:t>
-      </w:r>
-      <w:r>
-        <w:t xml:space="preserve"> </w:t>
-      </w:r>
-      <w:r>
-        <w:t xml:space="preserve">Before the data are collected, the outcome is a random variable;</w:t>
-      </w:r>
-      <w:r>
-        <w:t xml:space="preserve"> </w:t>
-      </w:r>
-      <w:r>
-        <w:t xml:space="preserve">after, it is a number.</w:t>
-      </w:r>
-      <w:r>
-        <w:t xml:space="preserve"> </w:t>
-      </w:r>
-      <w:r>
-        <w:t xml:space="preserve">Statements about the two have different meanings.</w:t>
-      </w:r>
-      <w:r>
-        <w:t xml:space="preserve"> </w:t>
-      </w:r>
-      <w:r>
-        <w:t xml:space="preserve">Write them with different symbols.</w:t>
-      </w:r>
-    </w:p>
-    <w:p>
-      <w:pPr>
-        <w:pStyle w:val="BodyText"/>
-      </w:pPr>
-      <w:r>
-        <w:t xml:space="preserve">Use a capital letter for the random variable</w:t>
-      </w:r>
-      <w:r>
-        <w:t xml:space="preserve"> </w:t>
-      </w:r>
-      <w:r>
-        <w:t xml:space="preserve">and the matching lowercase letter for a value that it takes:</w:t>
+        <w:t xml:space="preserve">Name the type of every</w:t>
+      </w:r>
+      <w:r>
+        <w:t xml:space="preserve"> </w:t>
+      </w:r>
+      <w:hyperlink r:id="rId32">
+        <w:r>
+          <w:rPr>
+            <w:rStyle w:val="Hyperlink"/>
+          </w:rPr>
+          <w:t xml:space="preserve">function</w:t>
+        </w:r>
+      </w:hyperlink>
+      <w:r>
+        <w:t xml:space="preserve"> </w:t>
+      </w:r>
+      <w:r>
+        <w:t xml:space="preserve">and procedure when you define it:</w:t>
       </w:r>
     </w:p>
     <w:p>
@@ -7691,16 +7670,22 @@
           <w:numId w:val="1007"/>
         </w:numPr>
       </w:pPr>
-      <m:oMath>
-        <m:r>
-          <m:t>Y</m:t>
-        </m:r>
-      </m:oMath>
-      <w:r>
-        <w:t xml:space="preserve"> </w:t>
-      </w:r>
-      <w:r>
-        <w:t xml:space="preserve">is the random variable, such as the outcome of a coin flip before the flip;</w:t>
+      <w:r>
+        <w:t xml:space="preserve">the set it takes its argument from (its</w:t>
+      </w:r>
+      <w:r>
+        <w:t xml:space="preserve"> </w:t>
+      </w:r>
+      <w:hyperlink r:id="rId33">
+        <w:r>
+          <w:rPr>
+            <w:rStyle w:val="Hyperlink"/>
+          </w:rPr>
+          <w:t xml:space="preserve">domain</w:t>
+        </w:r>
+      </w:hyperlink>
+      <w:r>
+        <w:t xml:space="preserve">)</w:t>
       </w:r>
     </w:p>
     <w:p>
@@ -7711,27 +7696,22 @@
           <w:numId w:val="1007"/>
         </w:numPr>
       </w:pPr>
-      <m:oMath>
-        <m:r>
-          <m:t>y</m:t>
-        </m:r>
-      </m:oMath>
-      <w:r>
-        <w:t xml:space="preserve"> </w:t>
-      </w:r>
-      <w:r>
-        <w:t xml:space="preserve">is one value of</w:t>
-      </w:r>
-      <w:r>
-        <w:t xml:space="preserve"> </w:t>
-      </w:r>
-      <m:oMath>
-        <m:r>
-          <m:t>Y</m:t>
-        </m:r>
-      </m:oMath>
-      <w:r>
-        <w:t xml:space="preserve">, such as 1 after the flip lands heads;</w:t>
+      <w:r>
+        <w:t xml:space="preserve">the set its values lie in (its</w:t>
+      </w:r>
+      <w:r>
+        <w:t xml:space="preserve"> </w:t>
+      </w:r>
+      <w:hyperlink r:id="rId34">
+        <w:r>
+          <w:rPr>
+            <w:rStyle w:val="Hyperlink"/>
+          </w:rPr>
+          <w:t xml:space="preserve">codomain</w:t>
+        </w:r>
+      </w:hyperlink>
+      <w:r>
+        <w:t xml:space="preserve">)</w:t>
       </w:r>
     </w:p>
     <w:p>
@@ -7742,65 +7722,8 @@
           <w:numId w:val="1007"/>
         </w:numPr>
       </w:pPr>
-      <m:oMath>
-        <m:sSub>
-          <m:e>
-            <m:r>
-              <m:t>Y</m:t>
-            </m:r>
-          </m:e>
-          <m:sub>
-            <m:r>
-              <m:t>i</m:t>
-            </m:r>
-          </m:sub>
-        </m:sSub>
-      </m:oMath>
-      <w:r>
-        <w:t xml:space="preserve"> </w:t>
-      </w:r>
-      <w:r>
-        <w:t xml:space="preserve">is the random variable for the</w:t>
-      </w:r>
-      <w:r>
-        <w:t xml:space="preserve"> </w:t>
-      </w:r>
-      <m:oMath>
-        <m:r>
-          <m:t>i</m:t>
-        </m:r>
-      </m:oMath>
-      <w:r>
-        <w:t xml:space="preserve">-th observation;</w:t>
-      </w:r>
-    </w:p>
-    <w:p>
-      <w:pPr>
-        <w:pStyle w:val="Compact"/>
-        <w:numPr>
-          <w:ilvl w:val="0"/>
-          <w:numId w:val="1007"/>
-        </w:numPr>
-      </w:pPr>
-      <m:oMath>
-        <m:sSub>
-          <m:e>
-            <m:r>
-              <m:t>y</m:t>
-            </m:r>
-          </m:e>
-          <m:sub>
-            <m:r>
-              <m:t>i</m:t>
-            </m:r>
-          </m:sub>
-        </m:sSub>
-      </m:oMath>
-      <w:r>
-        <w:t xml:space="preserve"> </w:t>
-      </w:r>
-      <w:r>
-        <w:t xml:space="preserve">is that observation’s observed value.</w:t>
+      <w:r>
+        <w:t xml:space="preserve">for each input and output, what kind of mathematical object it is</w:t>
       </w:r>
     </w:p>
     <w:p>
@@ -7808,95 +7731,66 @@
         <w:pStyle w:val="FirstParagraph"/>
       </w:pPr>
       <w:r>
-        <w:t xml:space="preserve">State the convention where you first use the symbols.</w:t>
-      </w:r>
-      <w:r>
-        <w:t xml:space="preserve"> </w:t>
-      </w:r>
-      <w:r>
-        <w:t xml:space="preserve">Keep it in every later section.</w:t>
-      </w:r>
-      <w:r>
-        <w:t xml:space="preserve"> </w:t>
-      </w:r>
-      <w:r>
-        <w:t xml:space="preserve">Do not switch between</w:t>
-      </w:r>
-      <w:r>
-        <w:t xml:space="preserve"> </w:t>
-      </w:r>
-      <m:oMath>
-        <m:sSub>
-          <m:e>
-            <m:r>
-              <m:t>Y</m:t>
-            </m:r>
-          </m:e>
-          <m:sub>
-            <m:r>
-              <m:t>i</m:t>
-            </m:r>
-          </m:sub>
-        </m:sSub>
-      </m:oMath>
-      <w:r>
-        <w:t xml:space="preserve"> </w:t>
-      </w:r>
-      <w:r>
-        <w:t xml:space="preserve">and</w:t>
-      </w:r>
-      <w:r>
-        <w:t xml:space="preserve"> </w:t>
-      </w:r>
-      <m:oMath>
-        <m:sSub>
-          <m:e>
-            <m:r>
-              <m:t>y</m:t>
-            </m:r>
-          </m:e>
-          <m:sub>
-            <m:r>
-              <m:t>i</m:t>
-            </m:r>
-          </m:sub>
-        </m:sSub>
-      </m:oMath>
-      <w:r>
-        <w:t xml:space="preserve"> </w:t>
-      </w:r>
-      <w:r>
-        <w:t xml:space="preserve">for the same quantity</w:t>
-      </w:r>
-      <w:r>
-        <w:t xml:space="preserve"> </w:t>
-      </w:r>
-      <w:r>
-        <w:t xml:space="preserve">unless the meaning changes from</w:t>
-      </w:r>
-      <w:r>
-        <w:t xml:space="preserve"> </w:t>
-      </w:r>
-      <w:r>
-        <w:t xml:space="preserve">“before the data”</w:t>
-      </w:r>
-      <w:r>
-        <w:t xml:space="preserve"> </w:t>
-      </w:r>
-      <w:r>
-        <w:t xml:space="preserve">to</w:t>
-      </w:r>
-      <w:r>
-        <w:t xml:space="preserve"> </w:t>
-      </w:r>
-      <w:r>
-        <w:t xml:space="preserve">“after the data”</w:t>
+        <w:t xml:space="preserve">Say</w:t>
+      </w:r>
+      <w:r>
+        <w:t xml:space="preserve"> </w:t>
+      </w:r>
+      <w:r>
+        <w:t xml:space="preserve">“function”</w:t>
+      </w:r>
+      <w:r>
+        <w:t xml:space="preserve">, not</w:t>
+      </w:r>
+      <w:r>
+        <w:t xml:space="preserve"> </w:t>
+      </w:r>
+      <w:r>
+        <w:t xml:space="preserve">“rule”</w:t>
+      </w:r>
+      <w:r>
+        <w:t xml:space="preserve"> </w:t>
+      </w:r>
+      <w:r>
+        <w:t xml:space="preserve">or</w:t>
+      </w:r>
+      <w:r>
+        <w:t xml:space="preserve"> </w:t>
+      </w:r>
+      <w:r>
+        <w:t xml:space="preserve">“map”</w:t>
       </w:r>
       <w:r>
         <w:t xml:space="preserve">.</w:t>
       </w:r>
     </w:p>
-    <w:bookmarkStart w:id="32" w:name="exm-random-variable-vs-value"/>
+    <w:p>
+      <w:pPr>
+        <w:pStyle w:val="BodyText"/>
+      </w:pPr>
+      <w:r>
+        <w:t xml:space="preserve">A procedure that takes several inputs is a function of all of them,</w:t>
+      </w:r>
+      <w:r>
+        <w:t xml:space="preserve"> </w:t>
+      </w:r>
+      <w:r>
+        <w:t xml:space="preserve">so list each input with its type.</w:t>
+      </w:r>
+      <w:r>
+        <w:t xml:space="preserve"> </w:t>
+      </w:r>
+      <w:r>
+        <w:t xml:space="preserve">When an output is itself a function,</w:t>
+      </w:r>
+      <w:r>
+        <w:t xml:space="preserve"> </w:t>
+      </w:r>
+      <w:r>
+        <w:t xml:space="preserve">say so and give its domain and codomain too.</w:t>
+      </w:r>
+    </w:p>
+    <w:bookmarkStart w:id="35" w:name="exm-function-types"/>
     <w:p>
       <w:pPr>
         <w:pStyle w:val="BodyText"/>
@@ -7906,7 +7800,442 @@
           <w:b/>
           <w:bCs/>
         </w:rPr>
-        <w:t xml:space="preserve">Example 8 (Writing a random variable and its value)</w:t>
+        <w:t xml:space="preserve">Example 8 (Typing a procedure’s inputs and output)</w:t>
+      </w:r>
+      <w:r>
+        <w:t xml:space="preserve"> </w:t>
+      </w:r>
+      <w:r>
+        <w:t xml:space="preserve"> </w:t>
+      </w:r>
+    </w:p>
+    <w:p>
+      <w:pPr>
+        <w:pStyle w:val="BlockText"/>
+      </w:pPr>
+      <w:r>
+        <w:t xml:space="preserve">❌ A fitting procedure is a rule that takes data</w:t>
+      </w:r>
+      <w:r>
+        <w:t xml:space="preserve"> </w:t>
+      </w:r>
+      <w:r>
+        <w:t xml:space="preserve">and produces a prediction.</w:t>
+      </w:r>
+    </w:p>
+    <w:p>
+      <w:pPr>
+        <w:pStyle w:val="BlockText"/>
+      </w:pPr>
+      <w:r>
+        <w:t xml:space="preserve">✅ A fitting procedure is a function</w:t>
+      </w:r>
+      <w:r>
+        <w:t xml:space="preserve"> </w:t>
+      </w:r>
+      <w:r>
+        <w:t xml:space="preserve">from data sets to fitted models.</w:t>
+      </w:r>
+      <w:r>
+        <w:t xml:space="preserve"> </w:t>
+      </w:r>
+      <w:r>
+        <w:t xml:space="preserve">A fitted model is a function</w:t>
+      </w:r>
+      <w:r>
+        <w:t xml:space="preserve"> </w:t>
+      </w:r>
+      <w:r>
+        <w:t xml:space="preserve">from covariate values to predicted outcomes.</w:t>
+      </w:r>
+    </w:p>
+    <w:p>
+      <w:pPr>
+        <w:pStyle w:val="FirstParagraph"/>
+      </w:pPr>
+      <w:r>
+        <w:t xml:space="preserve">The ❌ version leaves four types unsaid.</w:t>
+      </w:r>
+      <w:r>
+        <w:t xml:space="preserve"> </w:t>
+      </w:r>
+      <w:r>
+        <w:t xml:space="preserve">“Rule”</w:t>
+      </w:r>
+      <w:r>
+        <w:t xml:space="preserve"> </w:t>
+      </w:r>
+      <w:r>
+        <w:t xml:space="preserve">does not say that the procedure is a function.</w:t>
+      </w:r>
+      <w:r>
+        <w:t xml:space="preserve"> </w:t>
+      </w:r>
+      <w:r>
+        <w:t xml:space="preserve">“Data”</w:t>
+      </w:r>
+      <w:r>
+        <w:t xml:space="preserve"> </w:t>
+      </w:r>
+      <w:r>
+        <w:t xml:space="preserve">does not say that the input is a data set.</w:t>
+      </w:r>
+      <w:r>
+        <w:t xml:space="preserve"> </w:t>
+      </w:r>
+      <w:r>
+        <w:t xml:space="preserve">“A prediction”</w:t>
+      </w:r>
+      <w:r>
+        <w:t xml:space="preserve"> </w:t>
+      </w:r>
+      <w:r>
+        <w:t xml:space="preserve">is a single predicted outcome,</w:t>
+      </w:r>
+      <w:r>
+        <w:t xml:space="preserve"> </w:t>
+      </w:r>
+      <w:r>
+        <w:t xml:space="preserve">so it does not say that the output is a fitted model.</w:t>
+      </w:r>
+      <w:r>
+        <w:t xml:space="preserve"> </w:t>
+      </w:r>
+      <w:r>
+        <w:t xml:space="preserve">Nor does it say that a fitted model is itself a function,</w:t>
+      </w:r>
+      <w:r>
+        <w:t xml:space="preserve"> </w:t>
+      </w:r>
+      <w:r>
+        <w:t xml:space="preserve">which makes a prediction only when given a covariate value.</w:t>
+      </w:r>
+      <w:r>
+        <w:t xml:space="preserve"> </w:t>
+      </w:r>
+      <w:r>
+        <w:t xml:space="preserve">The ✅ version states each type,</w:t>
+      </w:r>
+      <w:r>
+        <w:t xml:space="preserve"> </w:t>
+      </w:r>
+      <w:r>
+        <w:t xml:space="preserve">so a reader can check that the output of one</w:t>
+      </w:r>
+      <w:r>
+        <w:t xml:space="preserve"> </w:t>
+      </w:r>
+      <w:r>
+        <w:t xml:space="preserve">is an acceptable input to the next.</w:t>
+      </w:r>
+    </w:p>
+    <w:bookmarkEnd w:id="35"/>
+    <w:p>
+      <w:pPr>
+        <w:pStyle w:val="BodyText"/>
+      </w:pPr>
+      <w:r>
+        <w:t xml:space="preserve">Check each use against the stated types:</w:t>
+      </w:r>
+      <w:r>
+        <w:t xml:space="preserve"> </w:t>
+      </w:r>
+      <w:r>
+        <w:t xml:space="preserve">a function applied to something outside its domain,</w:t>
+      </w:r>
+      <w:r>
+        <w:t xml:space="preserve"> </w:t>
+      </w:r>
+      <w:r>
+        <w:t xml:space="preserve">or a value described with the wrong type,</w:t>
+      </w:r>
+      <w:r>
+        <w:t xml:space="preserve"> </w:t>
+      </w:r>
+      <w:r>
+        <w:t xml:space="preserve">is an error even when the notation looks right.</w:t>
+      </w:r>
+    </w:p>
+    <w:bookmarkEnd w:id="36"/>
+    <w:bookmarkStart w:id="38" w:name="random-variables-and-their-values"/>
+    <w:p>
+      <w:pPr>
+        <w:pStyle w:val="Heading2"/>
+      </w:pPr>
+      <w:r>
+        <w:t xml:space="preserve">6 Random variables and their values</w:t>
+      </w:r>
+    </w:p>
+    <w:p>
+      <w:pPr>
+        <w:pStyle w:val="FirstParagraph"/>
+      </w:pPr>
+      <w:r>
+        <w:t xml:space="preserve">A random variable and a value that it takes are different objects.</w:t>
+      </w:r>
+      <w:r>
+        <w:t xml:space="preserve"> </w:t>
+      </w:r>
+      <w:r>
+        <w:t xml:space="preserve">Before the data are collected, the outcome is a random variable;</w:t>
+      </w:r>
+      <w:r>
+        <w:t xml:space="preserve"> </w:t>
+      </w:r>
+      <w:r>
+        <w:t xml:space="preserve">after, it is a number.</w:t>
+      </w:r>
+      <w:r>
+        <w:t xml:space="preserve"> </w:t>
+      </w:r>
+      <w:r>
+        <w:t xml:space="preserve">Statements about the two have different meanings.</w:t>
+      </w:r>
+      <w:r>
+        <w:t xml:space="preserve"> </w:t>
+      </w:r>
+      <w:r>
+        <w:t xml:space="preserve">Write them with different symbols.</w:t>
+      </w:r>
+    </w:p>
+    <w:p>
+      <w:pPr>
+        <w:pStyle w:val="BodyText"/>
+      </w:pPr>
+      <w:r>
+        <w:t xml:space="preserve">Use a capital letter for the random variable</w:t>
+      </w:r>
+      <w:r>
+        <w:t xml:space="preserve"> </w:t>
+      </w:r>
+      <w:r>
+        <w:t xml:space="preserve">and the matching lowercase letter for a value that it takes:</w:t>
+      </w:r>
+    </w:p>
+    <w:p>
+      <w:pPr>
+        <w:pStyle w:val="Compact"/>
+        <w:numPr>
+          <w:ilvl w:val="0"/>
+          <w:numId w:val="1008"/>
+        </w:numPr>
+      </w:pPr>
+      <m:oMath>
+        <m:r>
+          <m:t>Y</m:t>
+        </m:r>
+      </m:oMath>
+      <w:r>
+        <w:t xml:space="preserve"> </w:t>
+      </w:r>
+      <w:r>
+        <w:t xml:space="preserve">is the random variable, such as the outcome of a coin flip before the flip;</w:t>
+      </w:r>
+    </w:p>
+    <w:p>
+      <w:pPr>
+        <w:pStyle w:val="Compact"/>
+        <w:numPr>
+          <w:ilvl w:val="0"/>
+          <w:numId w:val="1008"/>
+        </w:numPr>
+      </w:pPr>
+      <m:oMath>
+        <m:r>
+          <m:t>y</m:t>
+        </m:r>
+      </m:oMath>
+      <w:r>
+        <w:t xml:space="preserve"> </w:t>
+      </w:r>
+      <w:r>
+        <w:t xml:space="preserve">is one value of</w:t>
+      </w:r>
+      <w:r>
+        <w:t xml:space="preserve"> </w:t>
+      </w:r>
+      <m:oMath>
+        <m:r>
+          <m:t>Y</m:t>
+        </m:r>
+      </m:oMath>
+      <w:r>
+        <w:t xml:space="preserve">, such as 1 after the flip lands heads;</w:t>
+      </w:r>
+    </w:p>
+    <w:p>
+      <w:pPr>
+        <w:pStyle w:val="Compact"/>
+        <w:numPr>
+          <w:ilvl w:val="0"/>
+          <w:numId w:val="1008"/>
+        </w:numPr>
+      </w:pPr>
+      <m:oMath>
+        <m:sSub>
+          <m:e>
+            <m:r>
+              <m:t>Y</m:t>
+            </m:r>
+          </m:e>
+          <m:sub>
+            <m:r>
+              <m:t>i</m:t>
+            </m:r>
+          </m:sub>
+        </m:sSub>
+      </m:oMath>
+      <w:r>
+        <w:t xml:space="preserve"> </w:t>
+      </w:r>
+      <w:r>
+        <w:t xml:space="preserve">is the random variable for the</w:t>
+      </w:r>
+      <w:r>
+        <w:t xml:space="preserve"> </w:t>
+      </w:r>
+      <m:oMath>
+        <m:r>
+          <m:t>i</m:t>
+        </m:r>
+      </m:oMath>
+      <w:r>
+        <w:t xml:space="preserve">-th observation;</w:t>
+      </w:r>
+    </w:p>
+    <w:p>
+      <w:pPr>
+        <w:pStyle w:val="Compact"/>
+        <w:numPr>
+          <w:ilvl w:val="0"/>
+          <w:numId w:val="1008"/>
+        </w:numPr>
+      </w:pPr>
+      <m:oMath>
+        <m:sSub>
+          <m:e>
+            <m:r>
+              <m:t>y</m:t>
+            </m:r>
+          </m:e>
+          <m:sub>
+            <m:r>
+              <m:t>i</m:t>
+            </m:r>
+          </m:sub>
+        </m:sSub>
+      </m:oMath>
+      <w:r>
+        <w:t xml:space="preserve"> </w:t>
+      </w:r>
+      <w:r>
+        <w:t xml:space="preserve">is that observation’s observed value.</w:t>
+      </w:r>
+    </w:p>
+    <w:p>
+      <w:pPr>
+        <w:pStyle w:val="FirstParagraph"/>
+      </w:pPr>
+      <w:r>
+        <w:t xml:space="preserve">State the convention where you first use the symbols.</w:t>
+      </w:r>
+      <w:r>
+        <w:t xml:space="preserve"> </w:t>
+      </w:r>
+      <w:r>
+        <w:t xml:space="preserve">Keep it in every later section.</w:t>
+      </w:r>
+      <w:r>
+        <w:t xml:space="preserve"> </w:t>
+      </w:r>
+      <w:r>
+        <w:t xml:space="preserve">Do not switch between</w:t>
+      </w:r>
+      <w:r>
+        <w:t xml:space="preserve"> </w:t>
+      </w:r>
+      <m:oMath>
+        <m:sSub>
+          <m:e>
+            <m:r>
+              <m:t>Y</m:t>
+            </m:r>
+          </m:e>
+          <m:sub>
+            <m:r>
+              <m:t>i</m:t>
+            </m:r>
+          </m:sub>
+        </m:sSub>
+      </m:oMath>
+      <w:r>
+        <w:t xml:space="preserve"> </w:t>
+      </w:r>
+      <w:r>
+        <w:t xml:space="preserve">and</w:t>
+      </w:r>
+      <w:r>
+        <w:t xml:space="preserve"> </w:t>
+      </w:r>
+      <m:oMath>
+        <m:sSub>
+          <m:e>
+            <m:r>
+              <m:t>y</m:t>
+            </m:r>
+          </m:e>
+          <m:sub>
+            <m:r>
+              <m:t>i</m:t>
+            </m:r>
+          </m:sub>
+        </m:sSub>
+      </m:oMath>
+      <w:r>
+        <w:t xml:space="preserve"> </w:t>
+      </w:r>
+      <w:r>
+        <w:t xml:space="preserve">for the same quantity</w:t>
+      </w:r>
+      <w:r>
+        <w:t xml:space="preserve"> </w:t>
+      </w:r>
+      <w:r>
+        <w:t xml:space="preserve">unless the meaning changes from</w:t>
+      </w:r>
+      <w:r>
+        <w:t xml:space="preserve"> </w:t>
+      </w:r>
+      <w:r>
+        <w:t xml:space="preserve">“before the data”</w:t>
+      </w:r>
+      <w:r>
+        <w:t xml:space="preserve"> </w:t>
+      </w:r>
+      <w:r>
+        <w:t xml:space="preserve">to</w:t>
+      </w:r>
+      <w:r>
+        <w:t xml:space="preserve"> </w:t>
+      </w:r>
+      <w:r>
+        <w:t xml:space="preserve">“after the data”</w:t>
+      </w:r>
+      <w:r>
+        <w:t xml:space="preserve">.</w:t>
+      </w:r>
+    </w:p>
+    <w:bookmarkStart w:id="37" w:name="exm-random-variable-vs-value"/>
+    <w:p>
+      <w:pPr>
+        <w:pStyle w:val="BodyText"/>
+      </w:pPr>
+      <w:r>
+        <w:rPr>
+          <w:b/>
+          <w:bCs/>
+        </w:rPr>
+        <w:t xml:space="preserve">Example 9 (Writing a random variable and its value)</w:t>
       </w:r>
       <w:r>
         <w:t xml:space="preserve"> </w:t>
@@ -8129,7 +8458,7 @@
         <w:t xml:space="preserve">, is itself a random variable.</w:t>
       </w:r>
     </w:p>
-    <w:bookmarkEnd w:id="32"/>
+    <w:bookmarkEnd w:id="37"/>
     <w:p>
       <w:pPr>
         <w:pStyle w:val="BodyText"/>
@@ -8143,7 +8472,7 @@
         <w:pStyle w:val="Compact"/>
         <w:numPr>
           <w:ilvl w:val="0"/>
-          <w:numId w:val="1008"/>
+          <w:numId w:val="1009"/>
         </w:numPr>
       </w:pPr>
       <w:r>
@@ -8208,7 +8537,7 @@
         <w:pStyle w:val="Compact"/>
         <w:numPr>
           <w:ilvl w:val="0"/>
-          <w:numId w:val="1008"/>
+          <w:numId w:val="1009"/>
         </w:numPr>
       </w:pPr>
       <w:r>
@@ -8364,7 +8693,7 @@
         <w:pStyle w:val="Compact"/>
         <w:numPr>
           <w:ilvl w:val="0"/>
-          <w:numId w:val="1008"/>
+          <w:numId w:val="1009"/>
         </w:numPr>
       </w:pPr>
       <w:r>
@@ -8648,14 +8977,14 @@
         <w:t xml:space="preserve">.</w:t>
       </w:r>
     </w:p>
-    <w:bookmarkEnd w:id="33"/>
-    <w:bookmarkStart w:id="36" w:name="matching-names-and-notation"/>
+    <w:bookmarkEnd w:id="38"/>
+    <w:bookmarkStart w:id="41" w:name="matching-names-and-notation"/>
     <w:p>
       <w:pPr>
         <w:pStyle w:val="Heading2"/>
       </w:pPr>
       <w:r>
-        <w:t xml:space="preserve">6 Matching names and notation</w:t>
+        <w:t xml:space="preserve">7 Matching names and notation</w:t>
       </w:r>
     </w:p>
     <w:p>
@@ -8760,7 +9089,7 @@
       <w:r>
         <w:t xml:space="preserve"> </w:t>
       </w:r>
-      <w:hyperlink r:id="rId34">
+      <w:hyperlink r:id="rId39">
         <w:r>
           <w:rPr>
             <w:rStyle w:val="Hyperlink"/>
@@ -8772,7 +9101,7 @@
         <w:t xml:space="preserve">).</w:t>
       </w:r>
     </w:p>
-    <w:bookmarkStart w:id="35" w:name="exm-name-matches-notation"/>
+    <w:bookmarkStart w:id="40" w:name="exm-name-matches-notation"/>
     <w:p>
       <w:pPr>
         <w:pStyle w:val="BodyText"/>
@@ -8782,7 +9111,7 @@
           <w:b/>
           <w:bCs/>
         </w:rPr>
-        <w:t xml:space="preserve">Example 9 (Matching a name to its notation)</w:t>
+        <w:t xml:space="preserve">Example 10 (Matching a name to its notation)</w:t>
       </w:r>
       <w:r>
         <w:t xml:space="preserve"> </w:t>
@@ -9265,7 +9594,7 @@
         <w:t xml:space="preserve">.</w:t>
       </w:r>
     </w:p>
-    <w:bookmarkEnd w:id="35"/>
+    <w:bookmarkEnd w:id="40"/>
     <w:p>
       <w:pPr>
         <w:pStyle w:val="BodyText"/>
@@ -9286,14 +9615,14 @@
         <w:t xml:space="preserve">and make them agree.</w:t>
       </w:r>
     </w:p>
-    <w:bookmarkEnd w:id="36"/>
-    <w:bookmarkStart w:id="45" w:name="using-shared-macros"/>
+    <w:bookmarkEnd w:id="41"/>
+    <w:bookmarkStart w:id="50" w:name="using-shared-macros"/>
     <w:p>
       <w:pPr>
         <w:pStyle w:val="Heading2"/>
       </w:pPr>
       <w:r>
-        <w:t xml:space="preserve">7 Using shared macros</w:t>
+        <w:t xml:space="preserve">8 Using shared macros</w:t>
       </w:r>
     </w:p>
     <w:p>
@@ -9360,7 +9689,7 @@
         <w:t xml:space="preserve">so the next document finds it.</w:t>
       </w:r>
     </w:p>
-    <w:bookmarkStart w:id="37" w:name="exm-use-shared-macro"/>
+    <w:bookmarkStart w:id="42" w:name="exm-use-shared-macro"/>
     <w:p>
       <w:pPr>
         <w:pStyle w:val="BodyText"/>
@@ -9370,7 +9699,7 @@
           <w:b/>
           <w:bCs/>
         </w:rPr>
-        <w:t xml:space="preserve">Example 10 (Using a shared macro)</w:t>
+        <w:t xml:space="preserve">Example 11 (Using a shared macro)</w:t>
       </w:r>
       <w:r>
         <w:t xml:space="preserve"> </w:t>
@@ -9445,849 +9774,13 @@
         <w:t xml:space="preserve">every document that uses the macro changes with it.</w:t>
       </w:r>
     </w:p>
-    <w:bookmarkEnd w:id="37"/>
+    <w:bookmarkEnd w:id="42"/>
     <w:p>
       <w:pPr>
         <w:pStyle w:val="BodyText"/>
       </w:pPr>
       <w:r>
         <w:t xml:space="preserve">The same rule covers these quantities:</w:t>
-      </w:r>
-    </w:p>
-    <w:p>
-      <w:pPr>
-        <w:pStyle w:val="Compact"/>
-        <w:numPr>
-          <w:ilvl w:val="0"/>
-          <w:numId w:val="1009"/>
-        </w:numPr>
-      </w:pPr>
-      <w:r>
-        <w:t xml:space="preserve">transposes</w:t>
-      </w:r>
-    </w:p>
-    <w:p>
-      <w:pPr>
-        <w:pStyle w:val="Compact"/>
-        <w:numPr>
-          <w:ilvl w:val="0"/>
-          <w:numId w:val="1009"/>
-        </w:numPr>
-      </w:pPr>
-      <w:r>
-        <w:t xml:space="preserve">hats on estimates</w:t>
-      </w:r>
-    </w:p>
-    <w:p>
-      <w:pPr>
-        <w:pStyle w:val="Compact"/>
-        <w:numPr>
-          <w:ilvl w:val="0"/>
-          <w:numId w:val="1009"/>
-        </w:numPr>
-      </w:pPr>
-      <w:r>
-        <w:t xml:space="preserve">expectations</w:t>
-      </w:r>
-    </w:p>
-    <w:p>
-      <w:pPr>
-        <w:pStyle w:val="Compact"/>
-        <w:numPr>
-          <w:ilvl w:val="0"/>
-          <w:numId w:val="1009"/>
-        </w:numPr>
-      </w:pPr>
-      <w:r>
-        <w:t xml:space="preserve">variances</w:t>
-      </w:r>
-    </w:p>
-    <w:p>
-      <w:pPr>
-        <w:pStyle w:val="Compact"/>
-        <w:numPr>
-          <w:ilvl w:val="0"/>
-          <w:numId w:val="1009"/>
-        </w:numPr>
-      </w:pPr>
-      <w:r>
-        <w:t xml:space="preserve">probabilities</w:t>
-      </w:r>
-    </w:p>
-    <w:p>
-      <w:pPr>
-        <w:pStyle w:val="Compact"/>
-        <w:numPr>
-          <w:ilvl w:val="0"/>
-          <w:numId w:val="1009"/>
-        </w:numPr>
-      </w:pPr>
-      <w:r>
-        <w:t xml:space="preserve">vectors</w:t>
-      </w:r>
-    </w:p>
-    <w:p>
-      <w:pPr>
-        <w:pStyle w:val="FirstParagraph"/>
-      </w:pPr>
-      <w:r>
-        <w:t xml:space="preserve">A quantity that has a macro keeps the same symbol in every document.</w:t>
-      </w:r>
-    </w:p>
-    <w:p>
-      <w:pPr>
-        <w:pStyle w:val="BodyText"/>
-      </w:pPr>
-      <w:r>
-        <w:t xml:space="preserve">Name a macro for what the symbol means, not for the letter it prints.</w:t>
-      </w:r>
-      <w:r>
-        <w:t xml:space="preserve"> </w:t>
-      </w:r>
-      <w:r>
-        <w:t xml:space="preserve">A macro such as</w:t>
-      </w:r>
-      <w:r>
-        <w:t xml:space="preserve"> </w:t>
-      </w:r>
-      <w:r>
-        <w:rPr>
-          <w:rStyle w:val="VerbatimChar"/>
-        </w:rPr>
-        <w:t xml:space="preserve">\vdelta</w:t>
-      </w:r>
-      <w:r>
-        <w:t xml:space="preserve"> </w:t>
-      </w:r>
-      <w:r>
-        <w:t xml:space="preserve">or</w:t>
-      </w:r>
-      <w:r>
-        <w:t xml:space="preserve"> </w:t>
-      </w:r>
-      <w:r>
-        <w:rPr>
-          <w:rStyle w:val="VerbatimChar"/>
-        </w:rPr>
-        <w:t xml:space="preserve">\hbeta</w:t>
-      </w:r>
-      <w:r>
-        <w:t xml:space="preserve"> </w:t>
-      </w:r>
-      <w:r>
-        <w:t xml:space="preserve">only spells a Greek letter,</w:t>
-      </w:r>
-      <w:r>
-        <w:t xml:space="preserve"> </w:t>
-      </w:r>
-      <w:r>
-        <w:t xml:space="preserve">so it names no concept,</w:t>
-      </w:r>
-      <w:r>
-        <w:t xml:space="preserve"> </w:t>
-      </w:r>
-      <w:r>
-        <w:t xml:space="preserve">and changing the symbol for that concept still means editing every use.</w:t>
-      </w:r>
-      <w:r>
-        <w:t xml:space="preserve"> </w:t>
-      </w:r>
-      <w:r>
-        <w:t xml:space="preserve">Outside a passage that discusses the notation itself,</w:t>
-      </w:r>
-      <w:r>
-        <w:t xml:space="preserve"> </w:t>
-      </w:r>
-      <w:r>
-        <w:t xml:space="preserve">do not write a Greek letter in a math expression,</w:t>
-      </w:r>
-      <w:r>
-        <w:t xml:space="preserve"> </w:t>
-      </w:r>
-      <w:r>
-        <w:t xml:space="preserve">either as a raw command such as</w:t>
-      </w:r>
-      <w:r>
-        <w:t xml:space="preserve"> </w:t>
-      </w:r>
-      <w:r>
-        <w:rPr>
-          <w:rStyle w:val="VerbatimChar"/>
-        </w:rPr>
-        <w:t xml:space="preserve">\delta</w:t>
-      </w:r>
-      <w:r>
-        <w:t xml:space="preserve"> </w:t>
-      </w:r>
-      <w:r>
-        <w:t xml:space="preserve">or inside a letter-named macro such as</w:t>
-      </w:r>
-      <w:r>
-        <w:t xml:space="preserve"> </w:t>
-      </w:r>
-      <w:r>
-        <w:rPr>
-          <w:rStyle w:val="VerbatimChar"/>
-        </w:rPr>
-        <w:t xml:space="preserve">\vdelta</w:t>
-      </w:r>
-      <w:r>
-        <w:t xml:space="preserve">.</w:t>
-      </w:r>
-      <w:r>
-        <w:t xml:space="preserve"> </w:t>
-      </w:r>
-      <w:r>
-        <w:t xml:space="preserve">The only exception is a one-off symbol that fits no semantic category,</w:t>
-      </w:r>
-      <w:r>
-        <w:t xml:space="preserve"> </w:t>
-      </w:r>
-      <w:r>
-        <w:t xml:space="preserve">and the rule for Latin letters below says when that applies.</w:t>
-      </w:r>
-    </w:p>
-    <w:bookmarkStart w:id="38" w:name="exm-semantic-macro-name"/>
-    <w:p>
-      <w:pPr>
-        <w:pStyle w:val="BodyText"/>
-      </w:pPr>
-      <w:r>
-        <w:rPr>
-          <w:b/>
-          <w:bCs/>
-        </w:rPr>
-        <w:t xml:space="preserve">Example 11 (Naming a macro for its meaning)</w:t>
-      </w:r>
-      <w:r>
-        <w:t xml:space="preserve"> </w:t>
-      </w:r>
-      <w:r>
-        <w:t xml:space="preserve"> </w:t>
-      </w:r>
-    </w:p>
-    <w:p>
-      <w:pPr>
-        <w:pStyle w:val="BlockText"/>
-      </w:pPr>
-      <w:r>
-        <w:t xml:space="preserve">❌ Source:</w:t>
-      </w:r>
-      <w:r>
-        <w:t xml:space="preserve"> </w:t>
-      </w:r>
-      <w:r>
-        <w:rPr>
-          <w:rStyle w:val="VerbatimChar"/>
-        </w:rPr>
-        <w:t xml:space="preserve">The error at layer $\ell$ is $\vdelta^{(\ell)}$, and the step size is $\eta$.</w:t>
-      </w:r>
-    </w:p>
-    <w:p>
-      <w:pPr>
-        <w:pStyle w:val="BlockText"/>
-      </w:pPr>
-      <w:r>
-        <w:t xml:space="preserve">✅ Source:</w:t>
-      </w:r>
-      <w:r>
-        <w:t xml:space="preserve"> </w:t>
-      </w:r>
-      <w:r>
-        <w:rPr>
-          <w:rStyle w:val="VerbatimChar"/>
-        </w:rPr>
-        <w:t xml:space="preserve">The error at layer $\ell$ is $\backerr^{(\ell)}$, and the step size is $\learnrate$.</w:t>
-      </w:r>
-    </w:p>
-    <w:p>
-      <w:pPr>
-        <w:pStyle w:val="FirstParagraph"/>
-      </w:pPr>
-      <w:r>
-        <w:t xml:space="preserve">Both versions print the same symbols.</w:t>
-      </w:r>
-      <w:r>
-        <w:t xml:space="preserve"> </w:t>
-      </w:r>
-      <w:r>
-        <w:t xml:space="preserve">In the ✅ version, a reader of the source sees what each symbol stands for,</w:t>
-      </w:r>
-      <w:r>
-        <w:t xml:space="preserve"> </w:t>
-      </w:r>
-      <w:r>
-        <w:t xml:space="preserve">and a group that changes the symbol for the step size</w:t>
-      </w:r>
-      <w:r>
-        <w:t xml:space="preserve"> </w:t>
-      </w:r>
-      <w:r>
-        <w:t xml:space="preserve">changes one line in the shared file.</w:t>
-      </w:r>
-    </w:p>
-    <w:bookmarkEnd w:id="38"/>
-    <w:p>
-      <w:pPr>
-        <w:pStyle w:val="BodyText"/>
-      </w:pPr>
-      <w:r>
-        <w:t xml:space="preserve">A passage about the notation itself,</w:t>
-      </w:r>
-      <w:r>
-        <w:t xml:space="preserve"> </w:t>
-      </w:r>
-      <w:r>
-        <w:t xml:space="preserve">such as a table that lists each symbol and what it means,</w:t>
-      </w:r>
-      <w:r>
-        <w:t xml:space="preserve"> </w:t>
-      </w:r>
-      <w:r>
-        <w:t xml:space="preserve">may write the letters directly.</w:t>
-      </w:r>
-    </w:p>
-    <w:p>
-      <w:pPr>
-        <w:pStyle w:val="BodyText"/>
-      </w:pPr>
-      <w:r>
-        <w:t xml:space="preserve">The same reasoning applies to decorators.</w:t>
-      </w:r>
-      <w:r>
-        <w:t xml:space="preserve"> </w:t>
-      </w:r>
-      <w:r>
-        <w:t xml:space="preserve">A hat, a tilde or a bar says how a symbol is drawn, not what it means.</w:t>
-      </w:r>
-      <w:r>
-        <w:t xml:space="preserve"> </w:t>
-      </w:r>
-      <w:r>
-        <w:t xml:space="preserve">A hat can mark an estimate, a fitted value or a Fourier transform,</w:t>
-      </w:r>
-      <w:r>
-        <w:t xml:space="preserve"> </w:t>
-      </w:r>
-      <w:r>
-        <w:t xml:space="preserve">so</w:t>
-      </w:r>
-      <w:r>
-        <w:t xml:space="preserve"> </w:t>
-      </w:r>
-      <w:r>
-        <w:rPr>
-          <w:rStyle w:val="VerbatimChar"/>
-        </w:rPr>
-        <w:t xml:space="preserve">\hat</w:t>
-      </w:r>
-      <w:r>
-        <w:t xml:space="preserve"> </w:t>
-      </w:r>
-      <w:r>
-        <w:t xml:space="preserve">names no concept either.</w:t>
-      </w:r>
-      <w:r>
-        <w:t xml:space="preserve"> </w:t>
-      </w:r>
-      <w:r>
-        <w:t xml:space="preserve">Write the macro that names the role instead,</w:t>
-      </w:r>
-      <w:r>
-        <w:t xml:space="preserve"> </w:t>
-      </w:r>
-      <w:r>
-        <w:t xml:space="preserve">such as</w:t>
-      </w:r>
-      <w:r>
-        <w:t xml:space="preserve"> </w:t>
-      </w:r>
-      <w:r>
-        <w:rPr>
-          <w:rStyle w:val="VerbatimChar"/>
-        </w:rPr>
-        <w:t xml:space="preserve">\est{}</w:t>
-      </w:r>
-      <w:r>
-        <w:t xml:space="preserve"> </w:t>
-      </w:r>
-      <w:r>
-        <w:t xml:space="preserve">for an estimate,</w:t>
-      </w:r>
-      <w:r>
-        <w:t xml:space="preserve"> </w:t>
-      </w:r>
-      <w:r>
-        <w:t xml:space="preserve">and keep</w:t>
-      </w:r>
-      <w:r>
-        <w:t xml:space="preserve"> </w:t>
-      </w:r>
-      <w:r>
-        <w:rPr>
-          <w:rStyle w:val="VerbatimChar"/>
-        </w:rPr>
-        <w:t xml:space="preserve">\hat</w:t>
-      </w:r>
-      <w:r>
-        <w:t xml:space="preserve"> </w:t>
-      </w:r>
-      <w:r>
-        <w:t xml:space="preserve">for passages that discuss the notation itself.</w:t>
-      </w:r>
-      <w:r>
-        <w:t xml:space="preserve"> </w:t>
-      </w:r>
-      <w:r>
-        <w:t xml:space="preserve">New math follows this now;</w:t>
-      </w:r>
-      <w:r>
-        <w:t xml:space="preserve"> </w:t>
-      </w:r>
-      <w:r>
-        <w:t xml:space="preserve">existing hats are converted in separate sweeps.</w:t>
-      </w:r>
-    </w:p>
-    <w:bookmarkStart w:id="39" w:name="exm-semantic-decorator"/>
-    <w:p>
-      <w:pPr>
-        <w:pStyle w:val="BodyText"/>
-      </w:pPr>
-      <w:r>
-        <w:rPr>
-          <w:b/>
-          <w:bCs/>
-        </w:rPr>
-        <w:t xml:space="preserve">Example 12 (Naming a decorator for its meaning)</w:t>
-      </w:r>
-      <w:r>
-        <w:t xml:space="preserve"> </w:t>
-      </w:r>
-      <w:r>
-        <w:t xml:space="preserve"> </w:t>
-      </w:r>
-    </w:p>
-    <w:p>
-      <w:pPr>
-        <w:pStyle w:val="BlockText"/>
-      </w:pPr>
-      <w:r>
-        <w:t xml:space="preserve">❌ Source:</w:t>
-      </w:r>
-      <w:r>
-        <w:t xml:space="preserve"> </w:t>
-      </w:r>
-      <w:r>
-        <w:rPr>
-          <w:rStyle w:val="VerbatimChar"/>
-        </w:rPr>
-        <w:t xml:space="preserve">The estimate $\hat{\mean}$ is close to $\mean$.</w:t>
-      </w:r>
-    </w:p>
-    <w:p>
-      <w:pPr>
-        <w:pStyle w:val="BlockText"/>
-      </w:pPr>
-      <w:r>
-        <w:t xml:space="preserve">✅ Source:</w:t>
-      </w:r>
-      <w:r>
-        <w:t xml:space="preserve"> </w:t>
-      </w:r>
-      <w:r>
-        <w:rPr>
-          <w:rStyle w:val="VerbatimChar"/>
-        </w:rPr>
-        <w:t xml:space="preserve">The estimate $\est{\mean}$ is close to $\mean$.</w:t>
-      </w:r>
-    </w:p>
-    <w:p>
-      <w:pPr>
-        <w:pStyle w:val="FirstParagraph"/>
-      </w:pPr>
-      <w:r>
-        <w:t xml:space="preserve">Both versions print the same hat.</w:t>
-      </w:r>
-      <w:r>
-        <w:t xml:space="preserve"> </w:t>
-      </w:r>
-      <w:r>
-        <w:t xml:space="preserve">If the group later marks estimates some other way,</w:t>
-      </w:r>
-      <w:r>
-        <w:t xml:space="preserve"> </w:t>
-      </w:r>
-      <w:r>
-        <w:t xml:space="preserve">only the definition of</w:t>
-      </w:r>
-      <w:r>
-        <w:t xml:space="preserve"> </w:t>
-      </w:r>
-      <w:r>
-        <w:rPr>
-          <w:rStyle w:val="VerbatimChar"/>
-        </w:rPr>
-        <w:t xml:space="preserve">\est</w:t>
-      </w:r>
-      <w:r>
-        <w:t xml:space="preserve"> </w:t>
-      </w:r>
-      <w:r>
-        <w:t xml:space="preserve">changes.</w:t>
-      </w:r>
-    </w:p>
-    <w:bookmarkEnd w:id="39"/>
-    <w:p>
-      <w:pPr>
-        <w:pStyle w:val="BodyText"/>
-      </w:pPr>
-      <w:r>
-        <w:t xml:space="preserve">Font commands follow the same rule.</w:t>
-      </w:r>
-      <w:r>
-        <w:t xml:space="preserve"> </w:t>
-      </w:r>
-      <w:r>
-        <w:rPr>
-          <w:rStyle w:val="VerbatimChar"/>
-        </w:rPr>
-        <w:t xml:space="preserve">\mathscr</w:t>
-      </w:r>
-      <w:r>
-        <w:t xml:space="preserve">,</w:t>
-      </w:r>
-      <w:r>
-        <w:t xml:space="preserve"> </w:t>
-      </w:r>
-      <w:r>
-        <w:rPr>
-          <w:rStyle w:val="VerbatimChar"/>
-        </w:rPr>
-        <w:t xml:space="preserve">\mathcal</w:t>
-      </w:r>
-      <w:r>
-        <w:t xml:space="preserve">,</w:t>
-      </w:r>
-      <w:r>
-        <w:t xml:space="preserve"> </w:t>
-      </w:r>
-      <w:r>
-        <w:rPr>
-          <w:rStyle w:val="VerbatimChar"/>
-        </w:rPr>
-        <w:t xml:space="preserve">\mathbb</w:t>
-      </w:r>
-      <w:r>
-        <w:t xml:space="preserve"> </w:t>
-      </w:r>
-      <w:r>
-        <w:t xml:space="preserve">and</w:t>
-      </w:r>
-      <w:r>
-        <w:t xml:space="preserve"> </w:t>
-      </w:r>
-      <w:r>
-        <w:rPr>
-          <w:rStyle w:val="VerbatimChar"/>
-        </w:rPr>
-        <w:t xml:space="preserve">\mathbf</w:t>
-      </w:r>
-      <w:r>
-        <w:t xml:space="preserve"> </w:t>
-      </w:r>
-      <w:r>
-        <w:t xml:space="preserve">say how a letter is drawn,</w:t>
-      </w:r>
-      <w:r>
-        <w:t xml:space="preserve"> </w:t>
-      </w:r>
-      <w:r>
-        <w:t xml:space="preserve">not what it stands for,</w:t>
-      </w:r>
-      <w:r>
-        <w:t xml:space="preserve"> </w:t>
-      </w:r>
-      <w:r>
-        <w:t xml:space="preserve">so a raw</w:t>
-      </w:r>
-      <w:r>
-        <w:t xml:space="preserve"> </w:t>
-      </w:r>
-      <w:r>
-        <w:rPr>
-          <w:rStyle w:val="VerbatimChar"/>
-        </w:rPr>
-        <w:t xml:space="preserve">\mathbb{R}</w:t>
-      </w:r>
-      <w:r>
-        <w:t xml:space="preserve"> </w:t>
-      </w:r>
-      <w:r>
-        <w:t xml:space="preserve">or</w:t>
-      </w:r>
-      <w:r>
-        <w:t xml:space="preserve"> </w:t>
-      </w:r>
-      <w:r>
-        <w:rPr>
-          <w:rStyle w:val="VerbatimChar"/>
-        </w:rPr>
-        <w:t xml:space="preserve">\mathscr{A}</w:t>
-      </w:r>
-      <w:r>
-        <w:t xml:space="preserve"> </w:t>
-      </w:r>
-      <w:r>
-        <w:t xml:space="preserve">leaves the reader of the source guessing at the concept</w:t>
-      </w:r>
-      <w:r>
-        <w:t xml:space="preserve"> </w:t>
-      </w:r>
-      <w:r>
-        <w:t xml:space="preserve">and leaves the group editing every use to change the symbol.</w:t>
-      </w:r>
-      <w:r>
-        <w:t xml:space="preserve"> </w:t>
-      </w:r>
-      <w:r>
-        <w:t xml:space="preserve">Write the macro that names the concept.</w:t>
-      </w:r>
-      <w:r>
-        <w:t xml:space="preserve"> </w:t>
-      </w:r>
-      <w:r>
-        <w:t xml:space="preserve">Name the macro for the set, such as</w:t>
-      </w:r>
-      <w:r>
-        <w:t xml:space="preserve"> </w:t>
-      </w:r>
-      <w:r>
-        <w:rPr>
-          <w:rStyle w:val="VerbatimChar"/>
-        </w:rPr>
-        <w:t xml:space="preserve">\reals</w:t>
-      </w:r>
-      <w:r>
-        <w:t xml:space="preserve"> </w:t>
-      </w:r>
-      <w:r>
-        <w:t xml:space="preserve">for the real numbers,</w:t>
-      </w:r>
-      <w:r>
-        <w:t xml:space="preserve"> </w:t>
-      </w:r>
-      <w:r>
-        <w:t xml:space="preserve">not for the font, as</w:t>
-      </w:r>
-      <w:r>
-        <w:t xml:space="preserve"> </w:t>
-      </w:r>
-      <w:r>
-        <w:rPr>
-          <w:rStyle w:val="VerbatimChar"/>
-        </w:rPr>
-        <w:t xml:space="preserve">\bbR</w:t>
-      </w:r>
-      <w:r>
-        <w:t xml:space="preserve"> </w:t>
-      </w:r>
-      <w:r>
-        <w:t xml:space="preserve">would be.</w:t>
-      </w:r>
-      <w:r>
-        <w:t xml:space="preserve"> </w:t>
-      </w:r>
-      <w:r>
-        <w:t xml:space="preserve">A document that reaches for a font command directly</w:t>
-      </w:r>
-      <w:r>
-        <w:t xml:space="preserve"> </w:t>
-      </w:r>
-      <w:r>
-        <w:t xml:space="preserve">has found a concept with no macro yet:</w:t>
-      </w:r>
-      <w:r>
-        <w:t xml:space="preserve"> </w:t>
-      </w:r>
-      <w:r>
-        <w:t xml:space="preserve">add the macro to the shared file, then use it.</w:t>
-      </w:r>
-      <w:r>
-        <w:t xml:space="preserve"> </w:t>
-      </w:r>
-      <w:r>
-        <w:t xml:space="preserve">As with Greek letters, a passage that discusses the notation itself</w:t>
-      </w:r>
-      <w:r>
-        <w:t xml:space="preserve"> </w:t>
-      </w:r>
-      <w:r>
-        <w:t xml:space="preserve">may write the font command directly.</w:t>
-      </w:r>
-    </w:p>
-    <w:bookmarkStart w:id="40" w:name="exm-semantic-font"/>
-    <w:p>
-      <w:pPr>
-        <w:pStyle w:val="BodyText"/>
-      </w:pPr>
-      <w:r>
-        <w:rPr>
-          <w:b/>
-          <w:bCs/>
-        </w:rPr>
-        <w:t xml:space="preserve">Example 13 (Naming a set for its meaning)</w:t>
-      </w:r>
-      <w:r>
-        <w:t xml:space="preserve"> </w:t>
-      </w:r>
-      <w:r>
-        <w:t xml:space="preserve"> </w:t>
-      </w:r>
-    </w:p>
-    <w:p>
-      <w:pPr>
-        <w:pStyle w:val="BlockText"/>
-      </w:pPr>
-      <w:r>
-        <w:t xml:space="preserve">❌ Source:</w:t>
-      </w:r>
-      <w:r>
-        <w:t xml:space="preserve"> </w:t>
-      </w:r>
-      <w:r>
-        <w:rPr>
-          <w:rStyle w:val="VerbatimChar"/>
-        </w:rPr>
-        <w:t xml:space="preserve">The function maps $\mathbb{R}$ to $\mathbb{R}$.</w:t>
-      </w:r>
-    </w:p>
-    <w:p>
-      <w:pPr>
-        <w:pStyle w:val="BlockText"/>
-      </w:pPr>
-      <w:r>
-        <w:t xml:space="preserve">✅ Source:</w:t>
-      </w:r>
-      <w:r>
-        <w:t xml:space="preserve"> </w:t>
-      </w:r>
-      <w:r>
-        <w:rPr>
-          <w:rStyle w:val="VerbatimChar"/>
-        </w:rPr>
-        <w:t xml:space="preserve">The function maps $\reals$ to $\reals$.</w:t>
-      </w:r>
-    </w:p>
-    <w:p>
-      <w:pPr>
-        <w:pStyle w:val="FirstParagraph"/>
-      </w:pPr>
-      <w:r>
-        <w:t xml:space="preserve">Both versions print the same symbol.</w:t>
-      </w:r>
-      <w:r>
-        <w:t xml:space="preserve"> </w:t>
-      </w:r>
-      <w:r>
-        <w:t xml:space="preserve">If the group changes how it writes the real numbers,</w:t>
-      </w:r>
-      <w:r>
-        <w:t xml:space="preserve"> </w:t>
-      </w:r>
-      <w:r>
-        <w:t xml:space="preserve">only the definition of</w:t>
-      </w:r>
-      <w:r>
-        <w:t xml:space="preserve"> </w:t>
-      </w:r>
-      <w:r>
-        <w:rPr>
-          <w:rStyle w:val="VerbatimChar"/>
-        </w:rPr>
-        <w:t xml:space="preserve">\reals</w:t>
-      </w:r>
-      <w:r>
-        <w:t xml:space="preserve"> </w:t>
-      </w:r>
-      <w:r>
-        <w:t xml:space="preserve">changes.</w:t>
-      </w:r>
-    </w:p>
-    <w:bookmarkEnd w:id="40"/>
-    <w:p>
-      <w:pPr>
-        <w:pStyle w:val="BodyText"/>
-      </w:pPr>
-      <w:r>
-        <w:t xml:space="preserve">Latin letters follow the same rule, with the same single exception for letters of either alphabet.</w:t>
-      </w:r>
-      <w:r>
-        <w:t xml:space="preserve"> </w:t>
-      </w:r>
-      <w:r>
-        <w:t xml:space="preserve">Outside a passage that discusses the notation itself,</w:t>
-      </w:r>
-      <w:r>
-        <w:t xml:space="preserve"> </w:t>
-      </w:r>
-      <w:r>
-        <w:t xml:space="preserve">do not write a literal Latin or Greek letter in a math expression.</w:t>
-      </w:r>
-      <w:r>
-        <w:t xml:space="preserve"> </w:t>
-      </w:r>
-      <w:r>
-        <w:t xml:space="preserve">The exception is a one-off symbol that fits no semantic category.</w:t>
-      </w:r>
-      <w:r>
-        <w:t xml:space="preserve"> </w:t>
-      </w:r>
-      <w:r>
-        <w:t xml:space="preserve">The shared macros already name outcome variables, covariates and generic parameters,</w:t>
-      </w:r>
-      <w:r>
-        <w:t xml:space="preserve"> </w:t>
-      </w:r>
-      <w:r>
-        <w:t xml:space="preserve">so a one-off should almost never be needed.</w:t>
-      </w:r>
-      <w:r>
-        <w:t xml:space="preserve"> </w:t>
-      </w:r>
-      <w:r>
-        <w:t xml:space="preserve">When a symbol has a category but no macro, add the macro to the shared file first.</w:t>
-      </w:r>
-      <w:r>
-        <w:t xml:space="preserve"> </w:t>
-      </w:r>
-      <w:r>
-        <w:t xml:space="preserve">New macros always go in the group’s shared macros repository,</w:t>
-      </w:r>
-      <w:r>
-        <w:t xml:space="preserve"> </w:t>
-      </w:r>
-      <w:r>
-        <w:t xml:space="preserve">never in a repository that applies them,</w:t>
-      </w:r>
-      <w:r>
-        <w:t xml:space="preserve"> </w:t>
-      </w:r>
-      <w:r>
-        <w:t xml:space="preserve">unless that repository explicitly overrides the default meaning of one specific macro.</w:t>
-      </w:r>
-    </w:p>
-    <w:p>
-      <w:pPr>
-        <w:pStyle w:val="BodyText"/>
-      </w:pPr>
-      <w:r>
-        <w:t xml:space="preserve">Latin letters with a fixed role show the rule.</w:t>
-      </w:r>
-      <w:r>
-        <w:t xml:space="preserve"> </w:t>
-      </w:r>
-      <w:r>
-        <w:t xml:space="preserve">In a regression or prediction model, use these macros:</w:t>
       </w:r>
     </w:p>
     <w:p>
@@ -10299,28 +9792,7 @@
         </w:numPr>
       </w:pPr>
       <w:r>
-        <w:rPr>
-          <w:rStyle w:val="VerbatimChar"/>
-        </w:rPr>
-        <w:t xml:space="preserve">\outvar</w:t>
-      </w:r>
-      <w:r>
-        <w:t xml:space="preserve"> </w:t>
-      </w:r>
-      <w:r>
-        <w:t xml:space="preserve">for the outcome variable, instead of a bare</w:t>
-      </w:r>
-      <w:r>
-        <w:t xml:space="preserve"> </w:t>
-      </w:r>
-      <w:r>
-        <w:rPr>
-          <w:rStyle w:val="VerbatimChar"/>
-        </w:rPr>
-        <w:t xml:space="preserve">y</w:t>
-      </w:r>
-      <w:r>
-        <w:t xml:space="preserve">;</w:t>
+        <w:t xml:space="preserve">transposes</w:t>
       </w:r>
     </w:p>
     <w:p>
@@ -10332,16 +9804,7 @@
         </w:numPr>
       </w:pPr>
       <w:r>
-        <w:rPr>
-          <w:rStyle w:val="VerbatimChar"/>
-        </w:rPr>
-        <w:t xml:space="preserve">\eoutvar</w:t>
-      </w:r>
-      <w:r>
-        <w:t xml:space="preserve"> </w:t>
-      </w:r>
-      <w:r>
-        <w:t xml:space="preserve">for a predicted outcome;</w:t>
+        <w:t xml:space="preserve">hats on estimates</w:t>
       </w:r>
     </w:p>
     <w:p>
@@ -10353,28 +9816,7 @@
         </w:numPr>
       </w:pPr>
       <w:r>
-        <w:rPr>
-          <w:rStyle w:val="VerbatimChar"/>
-        </w:rPr>
-        <w:t xml:space="preserve">\predvar</w:t>
-      </w:r>
-      <w:r>
-        <w:t xml:space="preserve"> </w:t>
-      </w:r>
-      <w:r>
-        <w:t xml:space="preserve">for a predictor, instead of a bare</w:t>
-      </w:r>
-      <w:r>
-        <w:t xml:space="preserve"> </w:t>
-      </w:r>
-      <w:r>
-        <w:rPr>
-          <w:rStyle w:val="VerbatimChar"/>
-        </w:rPr>
-        <w:t xml:space="preserve">x</w:t>
-      </w:r>
-      <w:r>
-        <w:t xml:space="preserve">;</w:t>
+        <w:t xml:space="preserve">expectations</w:t>
       </w:r>
     </w:p>
     <w:p>
@@ -10386,16 +9828,7 @@
         </w:numPr>
       </w:pPr>
       <w:r>
-        <w:rPr>
-          <w:rStyle w:val="VerbatimChar"/>
-        </w:rPr>
-        <w:t xml:space="preserve">\resid</w:t>
-      </w:r>
-      <w:r>
-        <w:t xml:space="preserve"> </w:t>
-      </w:r>
-      <w:r>
-        <w:t xml:space="preserve">for a residual, the observed minus the predicted outcome;</w:t>
+        <w:t xml:space="preserve">variances</w:t>
       </w:r>
     </w:p>
     <w:p>
@@ -10407,6 +9840,902 @@
         </w:numPr>
       </w:pPr>
       <w:r>
+        <w:t xml:space="preserve">probabilities</w:t>
+      </w:r>
+    </w:p>
+    <w:p>
+      <w:pPr>
+        <w:pStyle w:val="Compact"/>
+        <w:numPr>
+          <w:ilvl w:val="0"/>
+          <w:numId w:val="1010"/>
+        </w:numPr>
+      </w:pPr>
+      <w:r>
+        <w:t xml:space="preserve">vectors</w:t>
+      </w:r>
+    </w:p>
+    <w:p>
+      <w:pPr>
+        <w:pStyle w:val="FirstParagraph"/>
+      </w:pPr>
+      <w:r>
+        <w:t xml:space="preserve">A quantity that has a macro keeps the same symbol in every document.</w:t>
+      </w:r>
+    </w:p>
+    <w:p>
+      <w:pPr>
+        <w:pStyle w:val="BodyText"/>
+      </w:pPr>
+      <w:r>
+        <w:t xml:space="preserve">Name a macro for what the symbol means, not for the letter it prints.</w:t>
+      </w:r>
+      <w:r>
+        <w:t xml:space="preserve"> </w:t>
+      </w:r>
+      <w:r>
+        <w:t xml:space="preserve">A macro such as</w:t>
+      </w:r>
+      <w:r>
+        <w:t xml:space="preserve"> </w:t>
+      </w:r>
+      <w:r>
+        <w:rPr>
+          <w:rStyle w:val="VerbatimChar"/>
+        </w:rPr>
+        <w:t xml:space="preserve">\vdelta</w:t>
+      </w:r>
+      <w:r>
+        <w:t xml:space="preserve"> </w:t>
+      </w:r>
+      <w:r>
+        <w:t xml:space="preserve">or</w:t>
+      </w:r>
+      <w:r>
+        <w:t xml:space="preserve"> </w:t>
+      </w:r>
+      <w:r>
+        <w:rPr>
+          <w:rStyle w:val="VerbatimChar"/>
+        </w:rPr>
+        <w:t xml:space="preserve">\hbeta</w:t>
+      </w:r>
+      <w:r>
+        <w:t xml:space="preserve"> </w:t>
+      </w:r>
+      <w:r>
+        <w:t xml:space="preserve">only spells a Greek letter,</w:t>
+      </w:r>
+      <w:r>
+        <w:t xml:space="preserve"> </w:t>
+      </w:r>
+      <w:r>
+        <w:t xml:space="preserve">so it names no concept,</w:t>
+      </w:r>
+      <w:r>
+        <w:t xml:space="preserve"> </w:t>
+      </w:r>
+      <w:r>
+        <w:t xml:space="preserve">and changing the symbol for that concept still means editing every use.</w:t>
+      </w:r>
+      <w:r>
+        <w:t xml:space="preserve"> </w:t>
+      </w:r>
+      <w:r>
+        <w:t xml:space="preserve">Outside a passage that discusses the notation itself,</w:t>
+      </w:r>
+      <w:r>
+        <w:t xml:space="preserve"> </w:t>
+      </w:r>
+      <w:r>
+        <w:t xml:space="preserve">do not write a Greek letter in a math expression,</w:t>
+      </w:r>
+      <w:r>
+        <w:t xml:space="preserve"> </w:t>
+      </w:r>
+      <w:r>
+        <w:t xml:space="preserve">either as a raw command such as</w:t>
+      </w:r>
+      <w:r>
+        <w:t xml:space="preserve"> </w:t>
+      </w:r>
+      <w:r>
+        <w:rPr>
+          <w:rStyle w:val="VerbatimChar"/>
+        </w:rPr>
+        <w:t xml:space="preserve">\delta</w:t>
+      </w:r>
+      <w:r>
+        <w:t xml:space="preserve"> </w:t>
+      </w:r>
+      <w:r>
+        <w:t xml:space="preserve">or inside a letter-named macro such as</w:t>
+      </w:r>
+      <w:r>
+        <w:t xml:space="preserve"> </w:t>
+      </w:r>
+      <w:r>
+        <w:rPr>
+          <w:rStyle w:val="VerbatimChar"/>
+        </w:rPr>
+        <w:t xml:space="preserve">\vdelta</w:t>
+      </w:r>
+      <w:r>
+        <w:t xml:space="preserve">.</w:t>
+      </w:r>
+      <w:r>
+        <w:t xml:space="preserve"> </w:t>
+      </w:r>
+      <w:r>
+        <w:t xml:space="preserve">The only exception is a one-off symbol that fits no semantic category,</w:t>
+      </w:r>
+      <w:r>
+        <w:t xml:space="preserve"> </w:t>
+      </w:r>
+      <w:r>
+        <w:t xml:space="preserve">and the rule for Latin letters below says when that applies.</w:t>
+      </w:r>
+    </w:p>
+    <w:bookmarkStart w:id="43" w:name="exm-semantic-macro-name"/>
+    <w:p>
+      <w:pPr>
+        <w:pStyle w:val="BodyText"/>
+      </w:pPr>
+      <w:r>
+        <w:rPr>
+          <w:b/>
+          <w:bCs/>
+        </w:rPr>
+        <w:t xml:space="preserve">Example 12 (Naming a macro for its meaning)</w:t>
+      </w:r>
+      <w:r>
+        <w:t xml:space="preserve"> </w:t>
+      </w:r>
+      <w:r>
+        <w:t xml:space="preserve"> </w:t>
+      </w:r>
+    </w:p>
+    <w:p>
+      <w:pPr>
+        <w:pStyle w:val="BlockText"/>
+      </w:pPr>
+      <w:r>
+        <w:t xml:space="preserve">❌ Source:</w:t>
+      </w:r>
+      <w:r>
+        <w:t xml:space="preserve"> </w:t>
+      </w:r>
+      <w:r>
+        <w:rPr>
+          <w:rStyle w:val="VerbatimChar"/>
+        </w:rPr>
+        <w:t xml:space="preserve">The error at layer $\ell$ is $\vdelta^{(\ell)}$, and the step size is $\eta$.</w:t>
+      </w:r>
+    </w:p>
+    <w:p>
+      <w:pPr>
+        <w:pStyle w:val="BlockText"/>
+      </w:pPr>
+      <w:r>
+        <w:t xml:space="preserve">✅ Source:</w:t>
+      </w:r>
+      <w:r>
+        <w:t xml:space="preserve"> </w:t>
+      </w:r>
+      <w:r>
+        <w:rPr>
+          <w:rStyle w:val="VerbatimChar"/>
+        </w:rPr>
+        <w:t xml:space="preserve">The error at layer $\ell$ is $\backerr^{(\ell)}$, and the step size is $\learnrate$.</w:t>
+      </w:r>
+    </w:p>
+    <w:p>
+      <w:pPr>
+        <w:pStyle w:val="FirstParagraph"/>
+      </w:pPr>
+      <w:r>
+        <w:t xml:space="preserve">Both versions print the same symbols.</w:t>
+      </w:r>
+      <w:r>
+        <w:t xml:space="preserve"> </w:t>
+      </w:r>
+      <w:r>
+        <w:t xml:space="preserve">In the ✅ version, a reader of the source sees what each symbol stands for,</w:t>
+      </w:r>
+      <w:r>
+        <w:t xml:space="preserve"> </w:t>
+      </w:r>
+      <w:r>
+        <w:t xml:space="preserve">and a group that changes the symbol for the step size</w:t>
+      </w:r>
+      <w:r>
+        <w:t xml:space="preserve"> </w:t>
+      </w:r>
+      <w:r>
+        <w:t xml:space="preserve">changes one line in the shared file.</w:t>
+      </w:r>
+    </w:p>
+    <w:bookmarkEnd w:id="43"/>
+    <w:p>
+      <w:pPr>
+        <w:pStyle w:val="BodyText"/>
+      </w:pPr>
+      <w:r>
+        <w:t xml:space="preserve">A passage about the notation itself,</w:t>
+      </w:r>
+      <w:r>
+        <w:t xml:space="preserve"> </w:t>
+      </w:r>
+      <w:r>
+        <w:t xml:space="preserve">such as a table that lists each symbol and what it means,</w:t>
+      </w:r>
+      <w:r>
+        <w:t xml:space="preserve"> </w:t>
+      </w:r>
+      <w:r>
+        <w:t xml:space="preserve">may write the letters directly.</w:t>
+      </w:r>
+    </w:p>
+    <w:p>
+      <w:pPr>
+        <w:pStyle w:val="BodyText"/>
+      </w:pPr>
+      <w:r>
+        <w:t xml:space="preserve">The same reasoning applies to decorators.</w:t>
+      </w:r>
+      <w:r>
+        <w:t xml:space="preserve"> </w:t>
+      </w:r>
+      <w:r>
+        <w:t xml:space="preserve">A hat, a tilde or a bar says how a symbol is drawn, not what it means.</w:t>
+      </w:r>
+      <w:r>
+        <w:t xml:space="preserve"> </w:t>
+      </w:r>
+      <w:r>
+        <w:t xml:space="preserve">A hat can mark an estimate, a fitted value or a Fourier transform,</w:t>
+      </w:r>
+      <w:r>
+        <w:t xml:space="preserve"> </w:t>
+      </w:r>
+      <w:r>
+        <w:t xml:space="preserve">so</w:t>
+      </w:r>
+      <w:r>
+        <w:t xml:space="preserve"> </w:t>
+      </w:r>
+      <w:r>
+        <w:rPr>
+          <w:rStyle w:val="VerbatimChar"/>
+        </w:rPr>
+        <w:t xml:space="preserve">\hat</w:t>
+      </w:r>
+      <w:r>
+        <w:t xml:space="preserve"> </w:t>
+      </w:r>
+      <w:r>
+        <w:t xml:space="preserve">names no concept either.</w:t>
+      </w:r>
+      <w:r>
+        <w:t xml:space="preserve"> </w:t>
+      </w:r>
+      <w:r>
+        <w:t xml:space="preserve">Write the macro that names the role instead,</w:t>
+      </w:r>
+      <w:r>
+        <w:t xml:space="preserve"> </w:t>
+      </w:r>
+      <w:r>
+        <w:t xml:space="preserve">such as</w:t>
+      </w:r>
+      <w:r>
+        <w:t xml:space="preserve"> </w:t>
+      </w:r>
+      <w:r>
+        <w:rPr>
+          <w:rStyle w:val="VerbatimChar"/>
+        </w:rPr>
+        <w:t xml:space="preserve">\est{}</w:t>
+      </w:r>
+      <w:r>
+        <w:t xml:space="preserve"> </w:t>
+      </w:r>
+      <w:r>
+        <w:t xml:space="preserve">for an estimate,</w:t>
+      </w:r>
+      <w:r>
+        <w:t xml:space="preserve"> </w:t>
+      </w:r>
+      <w:r>
+        <w:t xml:space="preserve">and keep</w:t>
+      </w:r>
+      <w:r>
+        <w:t xml:space="preserve"> </w:t>
+      </w:r>
+      <w:r>
+        <w:rPr>
+          <w:rStyle w:val="VerbatimChar"/>
+        </w:rPr>
+        <w:t xml:space="preserve">\hat</w:t>
+      </w:r>
+      <w:r>
+        <w:t xml:space="preserve"> </w:t>
+      </w:r>
+      <w:r>
+        <w:t xml:space="preserve">for passages that discuss the notation itself.</w:t>
+      </w:r>
+      <w:r>
+        <w:t xml:space="preserve"> </w:t>
+      </w:r>
+      <w:r>
+        <w:t xml:space="preserve">New math follows this now;</w:t>
+      </w:r>
+      <w:r>
+        <w:t xml:space="preserve"> </w:t>
+      </w:r>
+      <w:r>
+        <w:t xml:space="preserve">existing hats are converted in separate sweeps.</w:t>
+      </w:r>
+    </w:p>
+    <w:bookmarkStart w:id="44" w:name="exm-semantic-decorator"/>
+    <w:p>
+      <w:pPr>
+        <w:pStyle w:val="BodyText"/>
+      </w:pPr>
+      <w:r>
+        <w:rPr>
+          <w:b/>
+          <w:bCs/>
+        </w:rPr>
+        <w:t xml:space="preserve">Example 13 (Naming a decorator for its meaning)</w:t>
+      </w:r>
+      <w:r>
+        <w:t xml:space="preserve"> </w:t>
+      </w:r>
+      <w:r>
+        <w:t xml:space="preserve"> </w:t>
+      </w:r>
+    </w:p>
+    <w:p>
+      <w:pPr>
+        <w:pStyle w:val="BlockText"/>
+      </w:pPr>
+      <w:r>
+        <w:t xml:space="preserve">❌ Source:</w:t>
+      </w:r>
+      <w:r>
+        <w:t xml:space="preserve"> </w:t>
+      </w:r>
+      <w:r>
+        <w:rPr>
+          <w:rStyle w:val="VerbatimChar"/>
+        </w:rPr>
+        <w:t xml:space="preserve">The estimate $\hat{\mean}$ is close to $\mean$.</w:t>
+      </w:r>
+    </w:p>
+    <w:p>
+      <w:pPr>
+        <w:pStyle w:val="BlockText"/>
+      </w:pPr>
+      <w:r>
+        <w:t xml:space="preserve">✅ Source:</w:t>
+      </w:r>
+      <w:r>
+        <w:t xml:space="preserve"> </w:t>
+      </w:r>
+      <w:r>
+        <w:rPr>
+          <w:rStyle w:val="VerbatimChar"/>
+        </w:rPr>
+        <w:t xml:space="preserve">The estimate $\est{\mean}$ is close to $\mean$.</w:t>
+      </w:r>
+    </w:p>
+    <w:p>
+      <w:pPr>
+        <w:pStyle w:val="FirstParagraph"/>
+      </w:pPr>
+      <w:r>
+        <w:t xml:space="preserve">Both versions print the same hat.</w:t>
+      </w:r>
+      <w:r>
+        <w:t xml:space="preserve"> </w:t>
+      </w:r>
+      <w:r>
+        <w:t xml:space="preserve">If the group later marks estimates some other way,</w:t>
+      </w:r>
+      <w:r>
+        <w:t xml:space="preserve"> </w:t>
+      </w:r>
+      <w:r>
+        <w:t xml:space="preserve">only the definition of</w:t>
+      </w:r>
+      <w:r>
+        <w:t xml:space="preserve"> </w:t>
+      </w:r>
+      <w:r>
+        <w:rPr>
+          <w:rStyle w:val="VerbatimChar"/>
+        </w:rPr>
+        <w:t xml:space="preserve">\est</w:t>
+      </w:r>
+      <w:r>
+        <w:t xml:space="preserve"> </w:t>
+      </w:r>
+      <w:r>
+        <w:t xml:space="preserve">changes.</w:t>
+      </w:r>
+    </w:p>
+    <w:bookmarkEnd w:id="44"/>
+    <w:p>
+      <w:pPr>
+        <w:pStyle w:val="BodyText"/>
+      </w:pPr>
+      <w:r>
+        <w:t xml:space="preserve">Font commands follow the same rule.</w:t>
+      </w:r>
+      <w:r>
+        <w:t xml:space="preserve"> </w:t>
+      </w:r>
+      <w:r>
+        <w:rPr>
+          <w:rStyle w:val="VerbatimChar"/>
+        </w:rPr>
+        <w:t xml:space="preserve">\mathscr</w:t>
+      </w:r>
+      <w:r>
+        <w:t xml:space="preserve">,</w:t>
+      </w:r>
+      <w:r>
+        <w:t xml:space="preserve"> </w:t>
+      </w:r>
+      <w:r>
+        <w:rPr>
+          <w:rStyle w:val="VerbatimChar"/>
+        </w:rPr>
+        <w:t xml:space="preserve">\mathcal</w:t>
+      </w:r>
+      <w:r>
+        <w:t xml:space="preserve">,</w:t>
+      </w:r>
+      <w:r>
+        <w:t xml:space="preserve"> </w:t>
+      </w:r>
+      <w:r>
+        <w:rPr>
+          <w:rStyle w:val="VerbatimChar"/>
+        </w:rPr>
+        <w:t xml:space="preserve">\mathbb</w:t>
+      </w:r>
+      <w:r>
+        <w:t xml:space="preserve"> </w:t>
+      </w:r>
+      <w:r>
+        <w:t xml:space="preserve">and</w:t>
+      </w:r>
+      <w:r>
+        <w:t xml:space="preserve"> </w:t>
+      </w:r>
+      <w:r>
+        <w:rPr>
+          <w:rStyle w:val="VerbatimChar"/>
+        </w:rPr>
+        <w:t xml:space="preserve">\mathbf</w:t>
+      </w:r>
+      <w:r>
+        <w:t xml:space="preserve"> </w:t>
+      </w:r>
+      <w:r>
+        <w:t xml:space="preserve">say how a letter is drawn,</w:t>
+      </w:r>
+      <w:r>
+        <w:t xml:space="preserve"> </w:t>
+      </w:r>
+      <w:r>
+        <w:t xml:space="preserve">not what it stands for,</w:t>
+      </w:r>
+      <w:r>
+        <w:t xml:space="preserve"> </w:t>
+      </w:r>
+      <w:r>
+        <w:t xml:space="preserve">so a raw</w:t>
+      </w:r>
+      <w:r>
+        <w:t xml:space="preserve"> </w:t>
+      </w:r>
+      <w:r>
+        <w:rPr>
+          <w:rStyle w:val="VerbatimChar"/>
+        </w:rPr>
+        <w:t xml:space="preserve">\mathbb{R}</w:t>
+      </w:r>
+      <w:r>
+        <w:t xml:space="preserve"> </w:t>
+      </w:r>
+      <w:r>
+        <w:t xml:space="preserve">or</w:t>
+      </w:r>
+      <w:r>
+        <w:t xml:space="preserve"> </w:t>
+      </w:r>
+      <w:r>
+        <w:rPr>
+          <w:rStyle w:val="VerbatimChar"/>
+        </w:rPr>
+        <w:t xml:space="preserve">\mathscr{A}</w:t>
+      </w:r>
+      <w:r>
+        <w:t xml:space="preserve"> </w:t>
+      </w:r>
+      <w:r>
+        <w:t xml:space="preserve">leaves the reader of the source guessing at the concept</w:t>
+      </w:r>
+      <w:r>
+        <w:t xml:space="preserve"> </w:t>
+      </w:r>
+      <w:r>
+        <w:t xml:space="preserve">and leaves the group editing every use to change the symbol.</w:t>
+      </w:r>
+      <w:r>
+        <w:t xml:space="preserve"> </w:t>
+      </w:r>
+      <w:r>
+        <w:t xml:space="preserve">Write the macro that names the concept.</w:t>
+      </w:r>
+      <w:r>
+        <w:t xml:space="preserve"> </w:t>
+      </w:r>
+      <w:r>
+        <w:t xml:space="preserve">Name the macro for the set, such as</w:t>
+      </w:r>
+      <w:r>
+        <w:t xml:space="preserve"> </w:t>
+      </w:r>
+      <w:r>
+        <w:rPr>
+          <w:rStyle w:val="VerbatimChar"/>
+        </w:rPr>
+        <w:t xml:space="preserve">\reals</w:t>
+      </w:r>
+      <w:r>
+        <w:t xml:space="preserve"> </w:t>
+      </w:r>
+      <w:r>
+        <w:t xml:space="preserve">for the real numbers,</w:t>
+      </w:r>
+      <w:r>
+        <w:t xml:space="preserve"> </w:t>
+      </w:r>
+      <w:r>
+        <w:t xml:space="preserve">not for the font, as</w:t>
+      </w:r>
+      <w:r>
+        <w:t xml:space="preserve"> </w:t>
+      </w:r>
+      <w:r>
+        <w:rPr>
+          <w:rStyle w:val="VerbatimChar"/>
+        </w:rPr>
+        <w:t xml:space="preserve">\bbR</w:t>
+      </w:r>
+      <w:r>
+        <w:t xml:space="preserve"> </w:t>
+      </w:r>
+      <w:r>
+        <w:t xml:space="preserve">would be.</w:t>
+      </w:r>
+      <w:r>
+        <w:t xml:space="preserve"> </w:t>
+      </w:r>
+      <w:r>
+        <w:t xml:space="preserve">A document that reaches for a font command directly</w:t>
+      </w:r>
+      <w:r>
+        <w:t xml:space="preserve"> </w:t>
+      </w:r>
+      <w:r>
+        <w:t xml:space="preserve">has found a concept with no macro yet:</w:t>
+      </w:r>
+      <w:r>
+        <w:t xml:space="preserve"> </w:t>
+      </w:r>
+      <w:r>
+        <w:t xml:space="preserve">add the macro to the shared file, then use it.</w:t>
+      </w:r>
+      <w:r>
+        <w:t xml:space="preserve"> </w:t>
+      </w:r>
+      <w:r>
+        <w:t xml:space="preserve">As with Greek letters, a passage that discusses the notation itself</w:t>
+      </w:r>
+      <w:r>
+        <w:t xml:space="preserve"> </w:t>
+      </w:r>
+      <w:r>
+        <w:t xml:space="preserve">may write the font command directly.</w:t>
+      </w:r>
+    </w:p>
+    <w:bookmarkStart w:id="45" w:name="exm-semantic-font"/>
+    <w:p>
+      <w:pPr>
+        <w:pStyle w:val="BodyText"/>
+      </w:pPr>
+      <w:r>
+        <w:rPr>
+          <w:b/>
+          <w:bCs/>
+        </w:rPr>
+        <w:t xml:space="preserve">Example 14 (Naming a set for its meaning)</w:t>
+      </w:r>
+      <w:r>
+        <w:t xml:space="preserve"> </w:t>
+      </w:r>
+      <w:r>
+        <w:t xml:space="preserve"> </w:t>
+      </w:r>
+    </w:p>
+    <w:p>
+      <w:pPr>
+        <w:pStyle w:val="BlockText"/>
+      </w:pPr>
+      <w:r>
+        <w:t xml:space="preserve">❌ Source:</w:t>
+      </w:r>
+      <w:r>
+        <w:t xml:space="preserve"> </w:t>
+      </w:r>
+      <w:r>
+        <w:rPr>
+          <w:rStyle w:val="VerbatimChar"/>
+        </w:rPr>
+        <w:t xml:space="preserve">The function maps $\mathbb{R}$ to $\mathbb{R}$.</w:t>
+      </w:r>
+    </w:p>
+    <w:p>
+      <w:pPr>
+        <w:pStyle w:val="BlockText"/>
+      </w:pPr>
+      <w:r>
+        <w:t xml:space="preserve">✅ Source:</w:t>
+      </w:r>
+      <w:r>
+        <w:t xml:space="preserve"> </w:t>
+      </w:r>
+      <w:r>
+        <w:rPr>
+          <w:rStyle w:val="VerbatimChar"/>
+        </w:rPr>
+        <w:t xml:space="preserve">The function maps $\reals$ to $\reals$.</w:t>
+      </w:r>
+    </w:p>
+    <w:p>
+      <w:pPr>
+        <w:pStyle w:val="FirstParagraph"/>
+      </w:pPr>
+      <w:r>
+        <w:t xml:space="preserve">Both versions print the same symbol.</w:t>
+      </w:r>
+      <w:r>
+        <w:t xml:space="preserve"> </w:t>
+      </w:r>
+      <w:r>
+        <w:t xml:space="preserve">If the group changes how it writes the real numbers,</w:t>
+      </w:r>
+      <w:r>
+        <w:t xml:space="preserve"> </w:t>
+      </w:r>
+      <w:r>
+        <w:t xml:space="preserve">only the definition of</w:t>
+      </w:r>
+      <w:r>
+        <w:t xml:space="preserve"> </w:t>
+      </w:r>
+      <w:r>
+        <w:rPr>
+          <w:rStyle w:val="VerbatimChar"/>
+        </w:rPr>
+        <w:t xml:space="preserve">\reals</w:t>
+      </w:r>
+      <w:r>
+        <w:t xml:space="preserve"> </w:t>
+      </w:r>
+      <w:r>
+        <w:t xml:space="preserve">changes.</w:t>
+      </w:r>
+    </w:p>
+    <w:bookmarkEnd w:id="45"/>
+    <w:p>
+      <w:pPr>
+        <w:pStyle w:val="BodyText"/>
+      </w:pPr>
+      <w:r>
+        <w:t xml:space="preserve">Latin letters follow the same rule, with the same single exception for letters of either alphabet.</w:t>
+      </w:r>
+      <w:r>
+        <w:t xml:space="preserve"> </w:t>
+      </w:r>
+      <w:r>
+        <w:t xml:space="preserve">Outside a passage that discusses the notation itself,</w:t>
+      </w:r>
+      <w:r>
+        <w:t xml:space="preserve"> </w:t>
+      </w:r>
+      <w:r>
+        <w:t xml:space="preserve">do not write a literal Latin or Greek letter in a math expression.</w:t>
+      </w:r>
+      <w:r>
+        <w:t xml:space="preserve"> </w:t>
+      </w:r>
+      <w:r>
+        <w:t xml:space="preserve">The exception is a one-off symbol that fits no semantic category.</w:t>
+      </w:r>
+      <w:r>
+        <w:t xml:space="preserve"> </w:t>
+      </w:r>
+      <w:r>
+        <w:t xml:space="preserve">The shared macros already name outcome variables, covariates and generic parameters,</w:t>
+      </w:r>
+      <w:r>
+        <w:t xml:space="preserve"> </w:t>
+      </w:r>
+      <w:r>
+        <w:t xml:space="preserve">so a one-off should almost never be needed.</w:t>
+      </w:r>
+      <w:r>
+        <w:t xml:space="preserve"> </w:t>
+      </w:r>
+      <w:r>
+        <w:t xml:space="preserve">When a symbol has a category but no macro, add the macro to the shared file first.</w:t>
+      </w:r>
+      <w:r>
+        <w:t xml:space="preserve"> </w:t>
+      </w:r>
+      <w:r>
+        <w:t xml:space="preserve">New macros always go in the group’s shared macros repository,</w:t>
+      </w:r>
+      <w:r>
+        <w:t xml:space="preserve"> </w:t>
+      </w:r>
+      <w:r>
+        <w:t xml:space="preserve">never in a repository that applies them,</w:t>
+      </w:r>
+      <w:r>
+        <w:t xml:space="preserve"> </w:t>
+      </w:r>
+      <w:r>
+        <w:t xml:space="preserve">unless that repository explicitly overrides the default meaning of one specific macro.</w:t>
+      </w:r>
+    </w:p>
+    <w:p>
+      <w:pPr>
+        <w:pStyle w:val="BodyText"/>
+      </w:pPr>
+      <w:r>
+        <w:t xml:space="preserve">Latin letters with a fixed role show the rule.</w:t>
+      </w:r>
+      <w:r>
+        <w:t xml:space="preserve"> </w:t>
+      </w:r>
+      <w:r>
+        <w:t xml:space="preserve">In a regression or prediction model, use these macros:</w:t>
+      </w:r>
+    </w:p>
+    <w:p>
+      <w:pPr>
+        <w:pStyle w:val="Compact"/>
+        <w:numPr>
+          <w:ilvl w:val="0"/>
+          <w:numId w:val="1011"/>
+        </w:numPr>
+      </w:pPr>
+      <w:r>
+        <w:rPr>
+          <w:rStyle w:val="VerbatimChar"/>
+        </w:rPr>
+        <w:t xml:space="preserve">\outvar</w:t>
+      </w:r>
+      <w:r>
+        <w:t xml:space="preserve"> </w:t>
+      </w:r>
+      <w:r>
+        <w:t xml:space="preserve">for the outcome variable, instead of a bare</w:t>
+      </w:r>
+      <w:r>
+        <w:t xml:space="preserve"> </w:t>
+      </w:r>
+      <w:r>
+        <w:rPr>
+          <w:rStyle w:val="VerbatimChar"/>
+        </w:rPr>
+        <w:t xml:space="preserve">y</w:t>
+      </w:r>
+      <w:r>
+        <w:t xml:space="preserve">;</w:t>
+      </w:r>
+    </w:p>
+    <w:p>
+      <w:pPr>
+        <w:pStyle w:val="Compact"/>
+        <w:numPr>
+          <w:ilvl w:val="0"/>
+          <w:numId w:val="1011"/>
+        </w:numPr>
+      </w:pPr>
+      <w:r>
+        <w:rPr>
+          <w:rStyle w:val="VerbatimChar"/>
+        </w:rPr>
+        <w:t xml:space="preserve">\eoutvar</w:t>
+      </w:r>
+      <w:r>
+        <w:t xml:space="preserve"> </w:t>
+      </w:r>
+      <w:r>
+        <w:t xml:space="preserve">for a predicted outcome;</w:t>
+      </w:r>
+    </w:p>
+    <w:p>
+      <w:pPr>
+        <w:pStyle w:val="Compact"/>
+        <w:numPr>
+          <w:ilvl w:val="0"/>
+          <w:numId w:val="1011"/>
+        </w:numPr>
+      </w:pPr>
+      <w:r>
+        <w:rPr>
+          <w:rStyle w:val="VerbatimChar"/>
+        </w:rPr>
+        <w:t xml:space="preserve">\predvar</w:t>
+      </w:r>
+      <w:r>
+        <w:t xml:space="preserve"> </w:t>
+      </w:r>
+      <w:r>
+        <w:t xml:space="preserve">for a predictor, instead of a bare</w:t>
+      </w:r>
+      <w:r>
+        <w:t xml:space="preserve"> </w:t>
+      </w:r>
+      <w:r>
+        <w:rPr>
+          <w:rStyle w:val="VerbatimChar"/>
+        </w:rPr>
+        <w:t xml:space="preserve">x</w:t>
+      </w:r>
+      <w:r>
+        <w:t xml:space="preserve">;</w:t>
+      </w:r>
+    </w:p>
+    <w:p>
+      <w:pPr>
+        <w:pStyle w:val="Compact"/>
+        <w:numPr>
+          <w:ilvl w:val="0"/>
+          <w:numId w:val="1011"/>
+        </w:numPr>
+      </w:pPr>
+      <w:r>
+        <w:rPr>
+          <w:rStyle w:val="VerbatimChar"/>
+        </w:rPr>
+        <w:t xml:space="preserve">\resid</w:t>
+      </w:r>
+      <w:r>
+        <w:t xml:space="preserve"> </w:t>
+      </w:r>
+      <w:r>
+        <w:t xml:space="preserve">for a residual, the observed minus the predicted outcome;</w:t>
+      </w:r>
+    </w:p>
+    <w:p>
+      <w:pPr>
+        <w:pStyle w:val="Compact"/>
+        <w:numPr>
+          <w:ilvl w:val="0"/>
+          <w:numId w:val="1011"/>
+        </w:numPr>
+      </w:pPr>
+      <w:r>
         <w:rPr>
           <w:rStyle w:val="VerbatimChar"/>
         </w:rPr>
@@ -10582,7 +10911,7 @@
         <w:t xml:space="preserve">.</w:t>
       </w:r>
     </w:p>
-    <w:bookmarkStart w:id="41" w:name="exm-semantic-latin-letter"/>
+    <w:bookmarkStart w:id="46" w:name="exm-semantic-latin-letter"/>
     <w:p>
       <w:pPr>
         <w:pStyle w:val="BodyText"/>
@@ -10592,7 +10921,7 @@
           <w:b/>
           <w:bCs/>
         </w:rPr>
-        <w:t xml:space="preserve">Example 14 (Naming a variable for its role)</w:t>
+        <w:t xml:space="preserve">Example 15 (Naming a variable for its role)</w:t>
       </w:r>
       <w:r>
         <w:t xml:space="preserve"> </w:t>
@@ -10672,7 +11001,7 @@
         <w:t xml:space="preserve">which letter is the outcome and which is the residual.</w:t>
       </w:r>
     </w:p>
-    <w:bookmarkEnd w:id="41"/>
+    <w:bookmarkEnd w:id="46"/>
     <w:p>
       <w:pPr>
         <w:pStyle w:val="BodyText"/>
@@ -10699,7 +11028,7 @@
         <w:t xml:space="preserve">and a reader sees which quantity it is about.</w:t>
       </w:r>
     </w:p>
-    <w:bookmarkStart w:id="42" w:name="exm-named-quantity"/>
+    <w:bookmarkStart w:id="47" w:name="exm-named-quantity"/>
     <w:p>
       <w:pPr>
         <w:pStyle w:val="BodyText"/>
@@ -10709,7 +11038,7 @@
           <w:b/>
           <w:bCs/>
         </w:rPr>
-        <w:t xml:space="preserve">Example 15 (Writing a named quantity by its name)</w:t>
+        <w:t xml:space="preserve">Example 16 (Writing a named quantity by its name)</w:t>
       </w:r>
       <w:r>
         <w:t xml:space="preserve"> </w:t>
@@ -10811,7 +11140,7 @@
         <w:t xml:space="preserve">and it names the quantity the gradient depends on.</w:t>
       </w:r>
     </w:p>
-    <w:bookmarkEnd w:id="42"/>
+    <w:bookmarkEnd w:id="47"/>
     <w:p>
       <w:pPr>
         <w:pStyle w:val="BodyText"/>
@@ -10973,7 +11302,7 @@
         <w:t xml:space="preserve">are not delimiters.</w:t>
       </w:r>
     </w:p>
-    <w:bookmarkStart w:id="43" w:name="exm-semantic-delimiter"/>
+    <w:bookmarkStart w:id="48" w:name="exm-semantic-delimiter"/>
     <w:p>
       <w:pPr>
         <w:pStyle w:val="BodyText"/>
@@ -10983,7 +11312,7 @@
           <w:b/>
           <w:bCs/>
         </w:rPr>
-        <w:t xml:space="preserve">Example 16 (Letting the macro size the bracket)</w:t>
+        <w:t xml:space="preserve">Example 17 (Letting the macro size the bracket)</w:t>
       </w:r>
       <w:r>
         <w:t xml:space="preserve"> </w:t>
@@ -11052,7 +11381,7 @@
         <w:t xml:space="preserve">edits one definition in the shared file.</w:t>
       </w:r>
     </w:p>
-    <w:bookmarkEnd w:id="43"/>
+    <w:bookmarkEnd w:id="48"/>
     <w:p>
       <w:pPr>
         <w:pStyle w:val="BodyText"/>
@@ -11091,7 +11420,7 @@
         <w:t xml:space="preserve">with its meaning.</w:t>
       </w:r>
     </w:p>
-    <w:bookmarkStart w:id="44" w:name="exm-describe-symbol-not-macro"/>
+    <w:bookmarkStart w:id="49" w:name="exm-describe-symbol-not-macro"/>
     <w:p>
       <w:pPr>
         <w:pStyle w:val="BodyText"/>
@@ -11101,7 +11430,7 @@
           <w:b/>
           <w:bCs/>
         </w:rPr>
-        <w:t xml:space="preserve">Example 17 (Describing the symbol, not the macro)</w:t>
+        <w:t xml:space="preserve">Example 18 (Describing the symbol, not the macro)</w:t>
       </w:r>
       <w:r>
         <w:t xml:space="preserve"> </w:t>
@@ -11164,15 +11493,15 @@
         <w:t xml:space="preserve">and the symbol has its own row in the notation table.</w:t>
       </w:r>
     </w:p>
-    <w:bookmarkEnd w:id="44"/>
-    <w:bookmarkEnd w:id="45"/>
-    <w:bookmarkStart w:id="48" w:name="making-expressions-concise"/>
+    <w:bookmarkEnd w:id="49"/>
+    <w:bookmarkEnd w:id="50"/>
+    <w:bookmarkStart w:id="53" w:name="making-expressions-concise"/>
     <w:p>
       <w:pPr>
         <w:pStyle w:val="Heading2"/>
       </w:pPr>
       <w:r>
-        <w:t xml:space="preserve">8 Making expressions concise</w:t>
+        <w:t xml:space="preserve">9 Making expressions concise</w:t>
       </w:r>
     </w:p>
     <w:p>
@@ -11197,7 +11526,7 @@
       <w:r>
         <w:t xml:space="preserve"> </w:t>
       </w:r>
-      <w:hyperlink r:id="rId46">
+      <w:hyperlink r:id="rId51">
         <w:r>
           <w:rPr>
             <w:rStyle w:val="Hyperlink"/>
@@ -11265,7 +11594,7 @@
         <w:t xml:space="preserve">and write the macro everywhere the chunk appears.</w:t>
       </w:r>
     </w:p>
-    <w:bookmarkStart w:id="47" w:name="exm-concise-expression"/>
+    <w:bookmarkStart w:id="52" w:name="exm-concise-expression"/>
     <w:p>
       <w:pPr>
         <w:pStyle w:val="BodyText"/>
@@ -11275,7 +11604,7 @@
           <w:b/>
           <w:bCs/>
         </w:rPr>
-        <w:t xml:space="preserve">Example 18 (Naming a repeated chunk)</w:t>
+        <w:t xml:space="preserve">Example 19 (Naming a repeated chunk)</w:t>
       </w:r>
       <w:r>
         <w:t xml:space="preserve"> </w:t>
@@ -11359,7 +11688,7 @@
         <w:t xml:space="preserve">and each formula shows at a glance what it is built from.</w:t>
       </w:r>
     </w:p>
-    <w:bookmarkEnd w:id="47"/>
+    <w:bookmarkEnd w:id="52"/>
     <w:p>
       <w:pPr>
         <w:pStyle w:val="BodyText"/>
@@ -11412,14 +11741,14 @@
         <w:t xml:space="preserve">.</w:t>
       </w:r>
     </w:p>
-    <w:bookmarkEnd w:id="48"/>
-    <w:bookmarkStart w:id="50" w:name="writing-dot-products"/>
+    <w:bookmarkEnd w:id="53"/>
+    <w:bookmarkStart w:id="55" w:name="writing-dot-products"/>
     <w:p>
       <w:pPr>
         <w:pStyle w:val="Heading2"/>
       </w:pPr>
       <w:r>
-        <w:t xml:space="preserve">9 Writing dot products</w:t>
+        <w:t xml:space="preserve">10 Writing dot products</w:t>
       </w:r>
     </w:p>
     <w:p>
@@ -11586,7 +11915,7 @@
         <w:t xml:space="preserve">and to work out that the result is a single number.</w:t>
       </w:r>
     </w:p>
-    <w:bookmarkStart w:id="49" w:name="exm-dot-product"/>
+    <w:bookmarkStart w:id="54" w:name="exm-dot-product"/>
     <w:p>
       <w:pPr>
         <w:pStyle w:val="BodyText"/>
@@ -11596,7 +11925,7 @@
           <w:b/>
           <w:bCs/>
         </w:rPr>
-        <w:t xml:space="preserve">Example 19 (Writing a dot product)</w:t>
+        <w:t xml:space="preserve">Example 20 (Writing a dot product)</w:t>
       </w:r>
       <w:r>
         <w:t xml:space="preserve"> </w:t>
@@ -11815,7 +12144,7 @@
         <w:t xml:space="preserve">.</w:t>
       </w:r>
     </w:p>
-    <w:bookmarkEnd w:id="49"/>
+    <w:bookmarkEnd w:id="54"/>
     <w:p>
       <w:pPr>
         <w:pStyle w:val="BodyText"/>
@@ -11829,7 +12158,7 @@
         <w:pStyle w:val="Compact"/>
         <w:numPr>
           <w:ilvl w:val="0"/>
-          <w:numId w:val="1011"/>
+          <w:numId w:val="1012"/>
         </w:numPr>
       </w:pPr>
       <w:r>
@@ -11864,7 +12193,7 @@
         <w:pStyle w:val="Compact"/>
         <w:numPr>
           <w:ilvl w:val="0"/>
-          <w:numId w:val="1011"/>
+          <w:numId w:val="1012"/>
         </w:numPr>
       </w:pPr>
       <w:r>
@@ -11913,7 +12242,7 @@
         <w:pStyle w:val="Compact"/>
         <w:numPr>
           <w:ilvl w:val="0"/>
-          <w:numId w:val="1011"/>
+          <w:numId w:val="1012"/>
         </w:numPr>
       </w:pPr>
       <w:r>
@@ -11974,14 +12303,14 @@
         <w:t xml:space="preserve">such as a definition of an inner product space.</w:t>
       </w:r>
     </w:p>
-    <w:bookmarkEnd w:id="50"/>
-    <w:bookmarkStart w:id="53" w:name="writing-out-notational-shorthands"/>
+    <w:bookmarkEnd w:id="55"/>
+    <w:bookmarkStart w:id="58" w:name="writing-out-notational-shorthands"/>
     <w:p>
       <w:pPr>
         <w:pStyle w:val="Heading2"/>
       </w:pPr>
       <w:r>
-        <w:t xml:space="preserve">10 Writing out notational shorthands</w:t>
+        <w:t xml:space="preserve">11 Writing out notational shorthands</w:t>
       </w:r>
     </w:p>
     <w:p>
@@ -12414,7 +12743,7 @@
       <w:r>
         <w:t xml:space="preserve"> </w:t>
       </w:r>
-      <w:hyperlink r:id="rId51">
+      <w:hyperlink r:id="rId56">
         <w:r>
           <w:rPr>
             <w:rStyle w:val="Hyperlink"/>
@@ -12455,7 +12784,7 @@
         <w:t xml:space="preserve">catalogs common shorthands and their full forms.</w:t>
       </w:r>
     </w:p>
-    <w:bookmarkStart w:id="52" w:name="exm-notational-shorthand"/>
+    <w:bookmarkStart w:id="57" w:name="exm-notational-shorthand"/>
     <w:p>
       <w:pPr>
         <w:pStyle w:val="BodyText"/>
@@ -12465,7 +12794,7 @@
           <w:b/>
           <w:bCs/>
         </w:rPr>
-        <w:t xml:space="preserve">Example 20 (Writing out the limits of a sum and the range of an index)</w:t>
+        <w:t xml:space="preserve">Example 21 (Writing out the limits of a sum and the range of an index)</w:t>
       </w:r>
       <w:r>
         <w:t xml:space="preserve"> </w:t>
@@ -13022,15 +13351,15 @@
         <w:t xml:space="preserve">observations.</w:t>
       </w:r>
     </w:p>
-    <w:bookmarkEnd w:id="52"/>
-    <w:bookmarkEnd w:id="53"/>
-    <w:bookmarkStart w:id="55" w:name="stating-assumptions-before-using-them"/>
+    <w:bookmarkEnd w:id="57"/>
+    <w:bookmarkEnd w:id="58"/>
+    <w:bookmarkStart w:id="60" w:name="stating-assumptions-before-using-them"/>
     <w:p>
       <w:pPr>
         <w:pStyle w:val="Heading2"/>
       </w:pPr>
       <w:r>
-        <w:t xml:space="preserve">11 Stating assumptions before using them</w:t>
+        <w:t xml:space="preserve">12 Stating assumptions before using them</w:t>
       </w:r>
     </w:p>
     <w:p>
@@ -13084,7 +13413,7 @@
         <w:pStyle w:val="Compact"/>
         <w:numPr>
           <w:ilvl w:val="0"/>
-          <w:numId w:val="1012"/>
+          <w:numId w:val="1013"/>
         </w:numPr>
       </w:pPr>
       <w:r>
@@ -13122,7 +13451,7 @@
         <w:pStyle w:val="Compact"/>
         <w:numPr>
           <w:ilvl w:val="0"/>
-          <w:numId w:val="1012"/>
+          <w:numId w:val="1013"/>
         </w:numPr>
       </w:pPr>
       <w:r>
@@ -13134,7 +13463,7 @@
         <w:pStyle w:val="Compact"/>
         <w:numPr>
           <w:ilvl w:val="0"/>
-          <w:numId w:val="1012"/>
+          <w:numId w:val="1013"/>
         </w:numPr>
       </w:pPr>
       <w:r>
@@ -13146,7 +13475,7 @@
         <w:pStyle w:val="Compact"/>
         <w:numPr>
           <w:ilvl w:val="0"/>
-          <w:numId w:val="1012"/>
+          <w:numId w:val="1013"/>
         </w:numPr>
       </w:pPr>
       <w:r>
@@ -13214,7 +13543,7 @@
         <w:t xml:space="preserve">cite it in the justification on that line.</w:t>
       </w:r>
     </w:p>
-    <w:bookmarkStart w:id="54" w:name="exm-assumptions-first"/>
+    <w:bookmarkStart w:id="59" w:name="exm-assumptions-first"/>
     <w:p>
       <w:pPr>
         <w:pStyle w:val="BodyText"/>
@@ -13224,7 +13553,7 @@
           <w:b/>
           <w:bCs/>
         </w:rPr>
-        <w:t xml:space="preserve">Example 21 (Stating the restriction on</w:t>
+        <w:t xml:space="preserve">Example 22 (Stating the restriction on</w:t>
       </w:r>
       <w:r>
         <w:rPr>
@@ -13896,8 +14225,8 @@
         <w:t xml:space="preserve">and the justification says exactly where the condition is used.</w:t>
       </w:r>
     </w:p>
-    <w:bookmarkEnd w:id="54"/>
-    <w:bookmarkEnd w:id="55"/>
+    <w:bookmarkEnd w:id="59"/>
+    <w:bookmarkEnd w:id="60"/>
     <w:sectPr>
       <w:footnotePr>
         <w:numRestart w:val="eachSect"/>
@@ -14260,6 +14589,9 @@
     <w:abstractNumId w:val="991"/>
   </w:num>
   <w:num w:numId="1012">
+    <w:abstractNumId w:val="991"/>
+  </w:num>
+  <w:num w:numId="1013">
     <w:abstractNumId w:val="991"/>
   </w:num>
 </w:numbering>

</xml_diff>

<commit_message>
Deploying to gh-pages from @ Morrison-Lab/psw@7fe9c545edb09eb12c6dac6e6ec6d46c0a2ee597 🚀
</commit_message>
<xml_diff>
--- a/chapters/notation.docx
+++ b/chapters/notation.docx
@@ -15,7 +15,7 @@
         <w:pStyle w:val="Date"/>
       </w:pPr>
       <w:r>
-        <w:t xml:space="preserve">Last modified: 2026-10-17 03:00:38 (PDT)</w:t>
+        <w:t xml:space="preserve">Last modified: 2026-10-17 16:26:16 (PDT)</w:t>
       </w:r>
     </w:p>
     <w:tbl>
@@ -7790,6 +7790,26 @@
         <w:t xml:space="preserve">say so and give its domain and codomain too.</w:t>
       </w:r>
     </w:p>
+    <w:p>
+      <w:pPr>
+        <w:pStyle w:val="BodyText"/>
+      </w:pPr>
+      <w:r>
+        <w:t xml:space="preserve">A function’s argument is not part of what specifies the function.</w:t>
+      </w:r>
+      <w:r>
+        <w:t xml:space="preserve"> </w:t>
+      </w:r>
+      <w:r>
+        <w:t xml:space="preserve">Give the argument in the definition, as the domain,</w:t>
+      </w:r>
+      <w:r>
+        <w:t xml:space="preserve"> </w:t>
+      </w:r>
+      <w:r>
+        <w:t xml:space="preserve">and list only the other inputs as what specifies the function.</w:t>
+      </w:r>
+    </w:p>
     <w:bookmarkStart w:id="35" w:name="exm-function-types"/>
     <w:p>
       <w:pPr>
@@ -7927,6 +7947,48 @@
       </w:r>
       <w:r>
         <w:t xml:space="preserve">is an acceptable input to the next.</w:t>
+      </w:r>
+    </w:p>
+    <w:p>
+      <w:pPr>
+        <w:pStyle w:val="BlockText"/>
+      </w:pPr>
+      <w:r>
+        <w:t xml:space="preserve">❌ A fitting procedure is specified by the data set it is fitted to,</w:t>
+      </w:r>
+      <w:r>
+        <w:t xml:space="preserve"> </w:t>
+      </w:r>
+      <w:r>
+        <w:t xml:space="preserve">its model family and its objective function.</w:t>
+      </w:r>
+    </w:p>
+    <w:p>
+      <w:pPr>
+        <w:pStyle w:val="BlockText"/>
+      </w:pPr>
+      <w:r>
+        <w:t xml:space="preserve">✅ A fitting procedure is specified by its model family and its objective function.</w:t>
+      </w:r>
+      <w:r>
+        <w:t xml:space="preserve"> </w:t>
+      </w:r>
+      <w:r>
+        <w:t xml:space="preserve">It takes a data set as its argument.</w:t>
+      </w:r>
+    </w:p>
+    <w:p>
+      <w:pPr>
+        <w:pStyle w:val="FirstParagraph"/>
+      </w:pPr>
+      <w:r>
+        <w:t xml:space="preserve">The data set is the argument of the fitting procedure,</w:t>
+      </w:r>
+      <w:r>
+        <w:t xml:space="preserve"> </w:t>
+      </w:r>
+      <w:r>
+        <w:t xml:space="preserve">so it is not one of the inputs that specify the procedure.</w:t>
       </w:r>
     </w:p>
     <w:bookmarkEnd w:id="35"/>

</xml_diff>

<commit_message>
Deploying to gh-pages from @ Morrison-Lab/psw@c8912827ccec3d1766e26e0da0915534ae6332e5 🚀
</commit_message>
<xml_diff>
--- a/chapters/notation.docx
+++ b/chapters/notation.docx
@@ -15,7 +15,7 @@
         <w:pStyle w:val="Date"/>
       </w:pPr>
       <w:r>
-        <w:t xml:space="preserve">Last modified: 2026-10-18 11:31:22 (PDT)</w:t>
+        <w:t xml:space="preserve">Last modified: 2026-10-18 13:18:24 (PDT)</w:t>
       </w:r>
     </w:p>
     <w:tbl>
@@ -11804,13 +11804,340 @@
       </w:r>
     </w:p>
     <w:bookmarkEnd w:id="53"/>
-    <w:bookmarkStart w:id="55" w:name="writing-dot-products"/>
+    <w:bookmarkStart w:id="55" w:name="abstract-unused-subexpressions"/>
     <w:p>
       <w:pPr>
         <w:pStyle w:val="Heading2"/>
       </w:pPr>
       <w:r>
-        <w:t xml:space="preserve">10 Writing dot products</w:t>
+        <w:t xml:space="preserve">10 Abstracting sub-expressions you are not manipulating</w:t>
+      </w:r>
+    </w:p>
+    <w:p>
+      <w:pPr>
+        <w:pStyle w:val="FirstParagraph"/>
+      </w:pPr>
+      <w:r>
+        <w:t xml:space="preserve">Replace each sub-expression that you are not manipulating with a symbol that stands for it.</w:t>
+      </w:r>
+      <w:r>
+        <w:t xml:space="preserve"> </w:t>
+      </w:r>
+      <w:r>
+        <w:t xml:space="preserve">Keep a sub-expression written out only on the line where you are about to apply its definition, a rule or a theorem to it.</w:t>
+      </w:r>
+      <w:r>
+        <w:t xml:space="preserve"> </w:t>
+      </w:r>
+      <w:r>
+        <w:t xml:space="preserve">Every other line shows the symbol.</w:t>
+      </w:r>
+    </w:p>
+    <w:p>
+      <w:pPr>
+        <w:pStyle w:val="BodyText"/>
+      </w:pPr>
+      <w:r>
+        <w:t xml:space="preserve">This is one case of</w:t>
+      </w:r>
+      <w:r>
+        <w:t xml:space="preserve"> </w:t>
+      </w:r>
+      <w:hyperlink w:anchor="making-expressions-concise">
+        <w:r>
+          <w:rPr>
+            <w:rStyle w:val="Hyperlink"/>
+          </w:rPr>
+          <w:t xml:space="preserve">making each expression as concise as possible</w:t>
+        </w:r>
+      </w:hyperlink>
+      <w:r>
+        <w:t xml:space="preserve">.</w:t>
+      </w:r>
+      <w:r>
+        <w:t xml:space="preserve"> </w:t>
+      </w:r>
+      <w:r>
+        <w:t xml:space="preserve">It also asks for the habit behind that advice:</w:t>
+      </w:r>
+      <w:r>
+        <w:t xml:space="preserve"> </w:t>
+      </w:r>
+      <w:r>
+        <w:t xml:space="preserve">split a long expression into short named pieces,</w:t>
+      </w:r>
+      <w:r>
+        <w:t xml:space="preserve"> </w:t>
+      </w:r>
+      <w:r>
+        <w:t xml:space="preserve">and give each piece the symbol or</w:t>
+      </w:r>
+      <w:r>
+        <w:t xml:space="preserve"> </w:t>
+      </w:r>
+      <w:hyperlink w:anchor="using-shared-macros">
+        <w:r>
+          <w:rPr>
+            <w:rStyle w:val="Hyperlink"/>
+          </w:rPr>
+          <w:t xml:space="preserve">shared macro</w:t>
+        </w:r>
+      </w:hyperlink>
+      <w:r>
+        <w:t xml:space="preserve"> </w:t>
+      </w:r>
+      <w:r>
+        <w:t xml:space="preserve">that names its concept.</w:t>
+      </w:r>
+    </w:p>
+    <w:p>
+      <w:pPr>
+        <w:pStyle w:val="BodyText"/>
+      </w:pPr>
+      <w:r>
+        <w:t xml:space="preserve">Choose the symbol to match the thing it names.</w:t>
+      </w:r>
+      <w:r>
+        <w:t xml:space="preserve"> </w:t>
+      </w:r>
+      <w:r>
+        <w:t xml:space="preserve">For the population mean</w:t>
+      </w:r>
+      <w:r>
+        <w:t xml:space="preserve"> </w:t>
+      </w:r>
+      <w:r>
+        <w:t xml:space="preserve">$\E{X}$</w:t>
+      </w:r>
+      <w:r>
+        <w:t xml:space="preserve">, write</w:t>
+      </w:r>
+      <w:r>
+        <w:t xml:space="preserve"> </w:t>
+      </w:r>
+      <m:oMath>
+        <m:r>
+          <m:t>μ</m:t>
+        </m:r>
+      </m:oMath>
+      <w:r>
+        <w:t xml:space="preserve">.</w:t>
+      </w:r>
+      <w:r>
+        <w:t xml:space="preserve"> </w:t>
+      </w:r>
+      <w:r>
+        <w:t xml:space="preserve">Add a subscript, such as</w:t>
+      </w:r>
+      <w:r>
+        <w:t xml:space="preserve"> </w:t>
+      </w:r>
+      <m:oMath>
+        <m:sSub>
+          <m:e>
+            <m:r>
+              <m:t>μ</m:t>
+            </m:r>
+          </m:e>
+          <m:sub>
+            <m:r>
+              <m:t>X</m:t>
+            </m:r>
+          </m:sub>
+        </m:sSub>
+      </m:oMath>
+      <w:r>
+        <w:t xml:space="preserve">, only when the context holds a second mean and the reader could confuse the two.</w:t>
+      </w:r>
+      <w:r>
+        <w:t xml:space="preserve"> </w:t>
+      </w:r>
+      <w:r>
+        <w:t xml:space="preserve">State the abstraction once, in a sentence such as</w:t>
+      </w:r>
+      <w:r>
+        <w:t xml:space="preserve"> </w:t>
+      </w:r>
+      <w:r>
+        <w:t xml:space="preserve">“Let</w:t>
+      </w:r>
+      <w:r>
+        <w:t xml:space="preserve"> </w:t>
+      </w:r>
+      <w:r>
+        <w:t xml:space="preserve">$\mu = \E{X}$</w:t>
+      </w:r>
+      <w:r>
+        <w:t xml:space="preserve">”</w:t>
+      </w:r>
+      <w:r>
+        <w:t xml:space="preserve">,</w:t>
+      </w:r>
+      <w:r>
+        <w:t xml:space="preserve"> </w:t>
+      </w:r>
+      <w:r>
+        <w:t xml:space="preserve">before the first line that uses the symbol.</w:t>
+      </w:r>
+    </w:p>
+    <w:bookmarkStart w:id="54" w:name="exm-abstract-unused-subexpressions"/>
+    <w:p>
+      <w:pPr>
+        <w:pStyle w:val="BodyText"/>
+      </w:pPr>
+      <w:r>
+        <w:rPr>
+          <w:b/>
+          <w:bCs/>
+        </w:rPr>
+        <w:t xml:space="preserve">Example 20 (Abstracting the population mean)</w:t>
+      </w:r>
+      <w:r>
+        <w:t xml:space="preserve"> </w:t>
+      </w:r>
+      <w:r>
+        <w:t xml:space="preserve">Suppose a derivation expands the variance of a random variable</w:t>
+      </w:r>
+      <w:r>
+        <w:t xml:space="preserve"> </w:t>
+      </w:r>
+      <m:oMath>
+        <m:r>
+          <m:t>X</m:t>
+        </m:r>
+      </m:oMath>
+      <w:r>
+        <w:t xml:space="preserve">.</w:t>
+      </w:r>
+    </w:p>
+    <w:p>
+      <w:pPr>
+        <w:pStyle w:val="BlockText"/>
+      </w:pPr>
+      <w:r>
+        <w:t xml:space="preserve">❌</w:t>
+      </w:r>
+    </w:p>
+    <w:p>
+      <w:pPr>
+        <w:pStyle w:val="BlockText"/>
+      </w:pPr>
+      <w:r>
+        <w:t xml:space="preserve">$$
+    \begin{aligned}
+    \E{\paren{X - \E{X}}^2}
+    &amp;= \E{X^2 - 2 X \E{X} + \E{X}^2}\\
+    &amp;= \E{X^2} - 2 \E{X} \E{X} + \E{X}^2
+    \end{aligned}
+    $$</w:t>
+      </w:r>
+    </w:p>
+    <w:p>
+      <w:pPr>
+        <w:pStyle w:val="BlockText"/>
+      </w:pPr>
+      <w:r>
+        <w:t xml:space="preserve">✅ Let</w:t>
+      </w:r>
+      <w:r>
+        <w:t xml:space="preserve"> </w:t>
+      </w:r>
+      <w:r>
+        <w:t xml:space="preserve">$\mu = \E{X}$</w:t>
+      </w:r>
+      <w:r>
+        <w:t xml:space="preserve">.</w:t>
+      </w:r>
+    </w:p>
+    <w:p>
+      <w:pPr>
+        <w:pStyle w:val="BlockText"/>
+      </w:pPr>
+      <w:r>
+        <w:t xml:space="preserve">$$
+    \begin{aligned}
+    \E{\paren{X - \mu}^2}
+    &amp;= \E{X^2 - 2 \mu X + \mu^2}
+    &amp;&amp; \text{(expand the square)}\\
+    &amp;= \E{X^2} - 2 \mu \E{X} + \mu^2
+    &amp;&amp; \text{(linearity of expectation)}\\
+    &amp;= \E{X^2} - 2 \mu \mu + \mu^2
+    &amp;&amp; \text{(definition of } \mu \text{)}\\
+    &amp;= \E{X^2} - \mu^2
+    &amp;&amp; \text{(combine like terms)}
+    \end{aligned}
+    $$</w:t>
+      </w:r>
+    </w:p>
+    <w:p>
+      <w:pPr>
+        <w:pStyle w:val="FirstParagraph"/>
+      </w:pPr>
+      <w:r>
+        <w:t xml:space="preserve">In the ❌ version,</w:t>
+      </w:r>
+      <w:r>
+        <w:t xml:space="preserve"> </w:t>
+      </w:r>
+      <w:r>
+        <w:t xml:space="preserve">$\E{X}$</w:t>
+      </w:r>
+      <w:r>
+        <w:t xml:space="preserve"> </w:t>
+      </w:r>
+      <w:r>
+        <w:t xml:space="preserve">is a constant that no step manipulates until the last one,</w:t>
+      </w:r>
+      <w:r>
+        <w:t xml:space="preserve"> </w:t>
+      </w:r>
+      <w:r>
+        <w:t xml:space="preserve">yet it clutters every line.</w:t>
+      </w:r>
+      <w:r>
+        <w:t xml:space="preserve"> </w:t>
+      </w:r>
+      <w:r>
+        <w:t xml:space="preserve">In the ✅ version, only the line that uses the definition of</w:t>
+      </w:r>
+      <w:r>
+        <w:t xml:space="preserve"> </w:t>
+      </w:r>
+      <m:oMath>
+        <m:r>
+          <m:t>μ</m:t>
+        </m:r>
+      </m:oMath>
+      <w:r>
+        <w:t xml:space="preserve"> </w:t>
+      </w:r>
+      <w:r>
+        <w:t xml:space="preserve">needs to know what</w:t>
+      </w:r>
+      <w:r>
+        <w:t xml:space="preserve"> </w:t>
+      </w:r>
+      <m:oMath>
+        <m:r>
+          <m:t>μ</m:t>
+        </m:r>
+      </m:oMath>
+      <w:r>
+        <w:t xml:space="preserve"> </w:t>
+      </w:r>
+      <w:r>
+        <w:t xml:space="preserve">stands for.</w:t>
+      </w:r>
+    </w:p>
+    <w:bookmarkEnd w:id="54"/>
+    <w:bookmarkEnd w:id="55"/>
+    <w:bookmarkStart w:id="57" w:name="writing-dot-products"/>
+    <w:p>
+      <w:pPr>
+        <w:pStyle w:val="Heading2"/>
+      </w:pPr>
+      <w:r>
+        <w:t xml:space="preserve">11 Writing dot products</w:t>
       </w:r>
     </w:p>
     <w:p>
@@ -11977,7 +12304,7 @@
         <w:t xml:space="preserve">and to work out that the result is a single number.</w:t>
       </w:r>
     </w:p>
-    <w:bookmarkStart w:id="54" w:name="exm-dot-product"/>
+    <w:bookmarkStart w:id="56" w:name="exm-dot-product"/>
     <w:p>
       <w:pPr>
         <w:pStyle w:val="BodyText"/>
@@ -11987,7 +12314,7 @@
           <w:b/>
           <w:bCs/>
         </w:rPr>
-        <w:t xml:space="preserve">Example 20 (Writing a dot product)</w:t>
+        <w:t xml:space="preserve">Example 21 (Writing a dot product)</w:t>
       </w:r>
       <w:r>
         <w:t xml:space="preserve"> </w:t>
@@ -12206,7 +12533,7 @@
         <w:t xml:space="preserve">.</w:t>
       </w:r>
     </w:p>
-    <w:bookmarkEnd w:id="54"/>
+    <w:bookmarkEnd w:id="56"/>
     <w:p>
       <w:pPr>
         <w:pStyle w:val="BodyText"/>
@@ -12365,14 +12692,14 @@
         <w:t xml:space="preserve">such as a definition of an inner product space.</w:t>
       </w:r>
     </w:p>
-    <w:bookmarkEnd w:id="55"/>
-    <w:bookmarkStart w:id="58" w:name="writing-out-notational-shorthands"/>
+    <w:bookmarkEnd w:id="57"/>
+    <w:bookmarkStart w:id="60" w:name="writing-out-notational-shorthands"/>
     <w:p>
       <w:pPr>
         <w:pStyle w:val="Heading2"/>
       </w:pPr>
       <w:r>
-        <w:t xml:space="preserve">11 Writing out notational shorthands</w:t>
+        <w:t xml:space="preserve">12 Writing out notational shorthands</w:t>
       </w:r>
     </w:p>
     <w:p>
@@ -12805,7 +13132,7 @@
       <w:r>
         <w:t xml:space="preserve"> </w:t>
       </w:r>
-      <w:hyperlink r:id="rId56">
+      <w:hyperlink r:id="rId58">
         <w:r>
           <w:rPr>
             <w:rStyle w:val="Hyperlink"/>
@@ -12846,7 +13173,7 @@
         <w:t xml:space="preserve">catalogs common shorthands and their full forms.</w:t>
       </w:r>
     </w:p>
-    <w:bookmarkStart w:id="57" w:name="exm-notational-shorthand"/>
+    <w:bookmarkStart w:id="59" w:name="exm-notational-shorthand"/>
     <w:p>
       <w:pPr>
         <w:pStyle w:val="BodyText"/>
@@ -12856,7 +13183,7 @@
           <w:b/>
           <w:bCs/>
         </w:rPr>
-        <w:t xml:space="preserve">Example 21 (Writing out the limits of a sum and the range of an index)</w:t>
+        <w:t xml:space="preserve">Example 22 (Writing out the limits of a sum and the range of an index)</w:t>
       </w:r>
       <w:r>
         <w:t xml:space="preserve"> </w:t>
@@ -13413,15 +13740,15 @@
         <w:t xml:space="preserve">observations.</w:t>
       </w:r>
     </w:p>
-    <w:bookmarkEnd w:id="57"/>
-    <w:bookmarkEnd w:id="58"/>
-    <w:bookmarkStart w:id="60" w:name="stating-assumptions-before-using-them"/>
+    <w:bookmarkEnd w:id="59"/>
+    <w:bookmarkEnd w:id="60"/>
+    <w:bookmarkStart w:id="62" w:name="stating-assumptions-before-using-them"/>
     <w:p>
       <w:pPr>
         <w:pStyle w:val="Heading2"/>
       </w:pPr>
       <w:r>
-        <w:t xml:space="preserve">12 Stating assumptions before using them</w:t>
+        <w:t xml:space="preserve">13 Stating assumptions before using them</w:t>
       </w:r>
     </w:p>
     <w:p>
@@ -13605,7 +13932,7 @@
         <w:t xml:space="preserve">cite it in the justification on that line.</w:t>
       </w:r>
     </w:p>
-    <w:bookmarkStart w:id="59" w:name="exm-assumptions-first"/>
+    <w:bookmarkStart w:id="61" w:name="exm-assumptions-first"/>
     <w:p>
       <w:pPr>
         <w:pStyle w:val="BodyText"/>
@@ -13615,7 +13942,7 @@
           <w:b/>
           <w:bCs/>
         </w:rPr>
-        <w:t xml:space="preserve">Example 22 (Stating the restriction on</w:t>
+        <w:t xml:space="preserve">Example 23 (Stating the restriction on</w:t>
       </w:r>
       <w:r>
         <w:rPr>
@@ -14287,8 +14614,8 @@
         <w:t xml:space="preserve">and the justification says exactly where the condition is used.</w:t>
       </w:r>
     </w:p>
-    <w:bookmarkEnd w:id="59"/>
-    <w:bookmarkEnd w:id="60"/>
+    <w:bookmarkEnd w:id="61"/>
+    <w:bookmarkEnd w:id="62"/>
     <w:sectPr>
       <w:footnotePr>
         <w:numRestart w:val="eachSect"/>

</xml_diff>

<commit_message>
Deploying to gh-pages from @ Morrison-Lab/psw@772006e9376d767dfc4c0aedd88f4c6650f3dfa7 🚀
</commit_message>
<xml_diff>
--- a/chapters/notation.docx
+++ b/chapters/notation.docx
@@ -15,7 +15,7 @@
         <w:pStyle w:val="Date"/>
       </w:pPr>
       <w:r>
-        <w:t xml:space="preserve">Last modified: 2026-10-18 23:56:20 (PDT)</w:t>
+        <w:t xml:space="preserve">Last modified: 2026-10-19 00:03:25 (PDT)</w:t>
       </w:r>
     </w:p>
     <w:tbl>
@@ -8019,7 +8019,7 @@
       </w:r>
     </w:p>
     <w:bookmarkEnd w:id="36"/>
-    <w:bookmarkStart w:id="38" w:name="random-variables-and-their-values"/>
+    <w:bookmarkStart w:id="39" w:name="random-variables-and-their-values"/>
     <w:p>
       <w:pPr>
         <w:pStyle w:val="Heading2"/>
@@ -8951,6 +8951,346 @@
         <w:pStyle w:val="FirstParagraph"/>
       </w:pPr>
       <w:r>
+        <w:t xml:space="preserve">Name the kind of object in the words, too, not only in the symbol.</w:t>
+      </w:r>
+      <w:r>
+        <w:t xml:space="preserve"> </w:t>
+      </w:r>
+      <w:r>
+        <w:t xml:space="preserve">Call a random variable a</w:t>
+      </w:r>
+      <w:r>
+        <w:t xml:space="preserve"> </w:t>
+      </w:r>
+      <w:r>
+        <w:t xml:space="preserve">“variable”</w:t>
+      </w:r>
+      <w:r>
+        <w:t xml:space="preserve">, such as</w:t>
+      </w:r>
+      <w:r>
+        <w:t xml:space="preserve"> </w:t>
+      </w:r>
+      <w:r>
+        <w:t xml:space="preserve">“the output variable</w:t>
+      </w:r>
+      <w:r>
+        <w:t xml:space="preserve"> </w:t>
+      </w:r>
+      <w:r>
+        <w:t xml:space="preserve">$\Outvar$</w:t>
+      </w:r>
+      <w:r>
+        <w:t xml:space="preserve">”</w:t>
+      </w:r>
+      <w:r>
+        <w:t xml:space="preserve">,</w:t>
+      </w:r>
+      <w:r>
+        <w:t xml:space="preserve"> </w:t>
+      </w:r>
+      <w:r>
+        <w:t xml:space="preserve">and call a number a</w:t>
+      </w:r>
+      <w:r>
+        <w:t xml:space="preserve"> </w:t>
+      </w:r>
+      <w:r>
+        <w:t xml:space="preserve">“value”</w:t>
+      </w:r>
+      <w:r>
+        <w:t xml:space="preserve">, such as</w:t>
+      </w:r>
+      <w:r>
+        <w:t xml:space="preserve"> </w:t>
+      </w:r>
+      <w:r>
+        <w:t xml:space="preserve">“the input value</w:t>
+      </w:r>
+      <w:r>
+        <w:t xml:space="preserve"> </w:t>
+      </w:r>
+      <w:r>
+        <w:t xml:space="preserve">$\predvar$</w:t>
+      </w:r>
+      <w:r>
+        <w:t xml:space="preserve">”</w:t>
+      </w:r>
+      <w:r>
+        <w:t xml:space="preserve"> </w:t>
+      </w:r>
+      <w:r>
+        <w:t xml:space="preserve">or</w:t>
+      </w:r>
+      <w:r>
+        <w:t xml:space="preserve"> </w:t>
+      </w:r>
+      <w:r>
+        <w:t xml:space="preserve">“the observed value</w:t>
+      </w:r>
+      <w:r>
+        <w:t xml:space="preserve"> </w:t>
+      </w:r>
+      <w:r>
+        <w:t xml:space="preserve">$\outvar$</w:t>
+      </w:r>
+      <w:r>
+        <w:t xml:space="preserve">”</w:t>
+      </w:r>
+      <w:r>
+        <w:t xml:space="preserve">.</w:t>
+      </w:r>
+      <w:r>
+        <w:t xml:space="preserve"> </w:t>
+      </w:r>
+      <w:r>
+        <w:t xml:space="preserve">Do not say</w:t>
+      </w:r>
+      <w:r>
+        <w:t xml:space="preserve"> </w:t>
+      </w:r>
+      <w:r>
+        <w:t xml:space="preserve">“fix</w:t>
+      </w:r>
+      <w:r>
+        <w:t xml:space="preserve"> </w:t>
+      </w:r>
+      <w:r>
+        <w:t xml:space="preserve">$\predvar$</w:t>
+      </w:r>
+      <w:r>
+        <w:t xml:space="preserve">”</w:t>
+      </w:r>
+      <w:r>
+        <w:t xml:space="preserve"> </w:t>
+      </w:r>
+      <w:r>
+        <w:t xml:space="preserve">or</w:t>
+      </w:r>
+      <w:r>
+        <w:t xml:space="preserve"> </w:t>
+      </w:r>
+      <w:r>
+        <w:t xml:space="preserve">“let</w:t>
+      </w:r>
+      <w:r>
+        <w:t xml:space="preserve"> </w:t>
+      </w:r>
+      <w:r>
+        <w:t xml:space="preserve">$\predvar$</w:t>
+      </w:r>
+      <w:r>
+        <w:t xml:space="preserve"> </w:t>
+      </w:r>
+      <w:r>
+        <w:t xml:space="preserve">be fixed”</w:t>
+      </w:r>
+      <w:r>
+        <w:t xml:space="preserve">.</w:t>
+      </w:r>
+      <w:r>
+        <w:t xml:space="preserve"> </w:t>
+      </w:r>
+      <w:r>
+        <w:t xml:space="preserve">It does not say whether</w:t>
+      </w:r>
+      <w:r>
+        <w:t xml:space="preserve"> </w:t>
+      </w:r>
+      <w:r>
+        <w:t xml:space="preserve">$\predvar$</w:t>
+      </w:r>
+      <w:r>
+        <w:t xml:space="preserve"> </w:t>
+      </w:r>
+      <w:r>
+        <w:t xml:space="preserve">is a variable held constant or a value you chose.</w:t>
+      </w:r>
+      <w:r>
+        <w:t xml:space="preserve"> </w:t>
+      </w:r>
+      <w:r>
+        <w:t xml:space="preserve">Say</w:t>
+      </w:r>
+      <w:r>
+        <w:t xml:space="preserve"> </w:t>
+      </w:r>
+      <w:r>
+        <w:t xml:space="preserve">“choose an input value</w:t>
+      </w:r>
+      <w:r>
+        <w:t xml:space="preserve"> </w:t>
+      </w:r>
+      <w:r>
+        <w:t xml:space="preserve">$\predvar$</w:t>
+      </w:r>
+      <w:r>
+        <w:t xml:space="preserve">”</w:t>
+      </w:r>
+      <w:r>
+        <w:t xml:space="preserve">,</w:t>
+      </w:r>
+      <w:r>
+        <w:t xml:space="preserve"> </w:t>
+      </w:r>
+      <w:r>
+        <w:t xml:space="preserve">or</w:t>
+      </w:r>
+      <w:r>
+        <w:t xml:space="preserve"> </w:t>
+      </w:r>
+      <w:r>
+        <w:t xml:space="preserve">“take the observed value</w:t>
+      </w:r>
+      <w:r>
+        <w:t xml:space="preserve"> </w:t>
+      </w:r>
+      <w:r>
+        <w:t xml:space="preserve">$\outvar$</w:t>
+      </w:r>
+      <w:r>
+        <w:t xml:space="preserve"> </w:t>
+      </w:r>
+      <w:r>
+        <w:t xml:space="preserve">as given”</w:t>
+      </w:r>
+      <w:r>
+        <w:t xml:space="preserve">.</w:t>
+      </w:r>
+    </w:p>
+    <w:bookmarkStart w:id="38" w:name="exm-variable-vs-value-in-words"/>
+    <w:p>
+      <w:pPr>
+        <w:pStyle w:val="BodyText"/>
+      </w:pPr>
+      <w:r>
+        <w:rPr>
+          <w:b/>
+          <w:bCs/>
+        </w:rPr>
+        <w:t xml:space="preserve">Example 10 (Naming a variable and its value in the words)</w:t>
+      </w:r>
+      <w:r>
+        <w:t xml:space="preserve"> </w:t>
+      </w:r>
+      <w:r>
+        <w:t xml:space="preserve"> </w:t>
+      </w:r>
+    </w:p>
+    <w:p>
+      <w:pPr>
+        <w:pStyle w:val="BlockText"/>
+      </w:pPr>
+      <w:r>
+        <w:t xml:space="preserve">❌ Fix an input</w:t>
+      </w:r>
+      <w:r>
+        <w:t xml:space="preserve"> </w:t>
+      </w:r>
+      <w:r>
+        <w:t xml:space="preserve">$\predvar$</w:t>
+      </w:r>
+      <w:r>
+        <w:t xml:space="preserve">, and let</w:t>
+      </w:r>
+      <w:r>
+        <w:t xml:space="preserve"> </w:t>
+      </w:r>
+      <w:r>
+        <w:t xml:space="preserve">$\Outvar = \truemeanfnf{\predvar} + \noise$</w:t>
+      </w:r>
+      <w:r>
+        <w:t xml:space="preserve">.</w:t>
+      </w:r>
+    </w:p>
+    <w:p>
+      <w:pPr>
+        <w:pStyle w:val="BlockText"/>
+      </w:pPr>
+      <w:r>
+        <w:t xml:space="preserve">✅ Choose an input value</w:t>
+      </w:r>
+      <w:r>
+        <w:t xml:space="preserve"> </w:t>
+      </w:r>
+      <w:r>
+        <w:t xml:space="preserve">$\predvar$</w:t>
+      </w:r>
+      <w:r>
+        <w:t xml:space="preserve">,</w:t>
+      </w:r>
+      <w:r>
+        <w:t xml:space="preserve"> </w:t>
+      </w:r>
+      <w:r>
+        <w:t xml:space="preserve">and let the output variable</w:t>
+      </w:r>
+      <w:r>
+        <w:t xml:space="preserve"> </w:t>
+      </w:r>
+      <w:r>
+        <w:t xml:space="preserve">$\Outvar = \truemeanfnf{\predvar} + \noise$</w:t>
+      </w:r>
+      <w:r>
+        <w:t xml:space="preserve">.</w:t>
+      </w:r>
+    </w:p>
+    <w:p>
+      <w:pPr>
+        <w:pStyle w:val="FirstParagraph"/>
+      </w:pPr>
+      <w:r>
+        <w:t xml:space="preserve">The ❌ version leaves the reader to work out</w:t>
+      </w:r>
+      <w:r>
+        <w:t xml:space="preserve"> </w:t>
+      </w:r>
+      <w:r>
+        <w:t xml:space="preserve">that</w:t>
+      </w:r>
+      <w:r>
+        <w:t xml:space="preserve"> </w:t>
+      </w:r>
+      <w:r>
+        <w:t xml:space="preserve">$\predvar$</w:t>
+      </w:r>
+      <w:r>
+        <w:t xml:space="preserve"> </w:t>
+      </w:r>
+      <w:r>
+        <w:t xml:space="preserve">is a number you choose and</w:t>
+      </w:r>
+      <w:r>
+        <w:t xml:space="preserve"> </w:t>
+      </w:r>
+      <w:r>
+        <w:t xml:space="preserve">$\Outvar$</w:t>
+      </w:r>
+      <w:r>
+        <w:t xml:space="preserve"> </w:t>
+      </w:r>
+      <w:r>
+        <w:t xml:space="preserve">is random.</w:t>
+      </w:r>
+      <w:r>
+        <w:t xml:space="preserve"> </w:t>
+      </w:r>
+      <w:r>
+        <w:t xml:space="preserve">The ✅ version names the input as a value and the output as a variable,</w:t>
+      </w:r>
+      <w:r>
+        <w:t xml:space="preserve"> </w:t>
+      </w:r>
+      <w:r>
+        <w:t xml:space="preserve">which is what the symbols say.</w:t>
+      </w:r>
+    </w:p>
+    <w:bookmarkEnd w:id="38"/>
+    <w:p>
+      <w:pPr>
+        <w:pStyle w:val="BodyText"/>
+      </w:pPr>
+      <w:r>
         <w:t xml:space="preserve">Some fields reserve capital letters for matrices,</w:t>
       </w:r>
       <w:r>
@@ -9039,8 +9379,8 @@
         <w:t xml:space="preserve">.</w:t>
       </w:r>
     </w:p>
-    <w:bookmarkEnd w:id="38"/>
-    <w:bookmarkStart w:id="41" w:name="matching-names-and-notation"/>
+    <w:bookmarkEnd w:id="39"/>
+    <w:bookmarkStart w:id="42" w:name="matching-names-and-notation"/>
     <w:p>
       <w:pPr>
         <w:pStyle w:val="Heading2"/>
@@ -9151,7 +9491,7 @@
       <w:r>
         <w:t xml:space="preserve"> </w:t>
       </w:r>
-      <w:hyperlink r:id="rId39">
+      <w:hyperlink r:id="rId40">
         <w:r>
           <w:rPr>
             <w:rStyle w:val="Hyperlink"/>
@@ -9163,7 +9503,7 @@
         <w:t xml:space="preserve">).</w:t>
       </w:r>
     </w:p>
-    <w:bookmarkStart w:id="40" w:name="exm-name-matches-notation"/>
+    <w:bookmarkStart w:id="41" w:name="exm-name-matches-notation"/>
     <w:p>
       <w:pPr>
         <w:pStyle w:val="BodyText"/>
@@ -9173,7 +9513,7 @@
           <w:b/>
           <w:bCs/>
         </w:rPr>
-        <w:t xml:space="preserve">Example 10 (Matching a name to its notation)</w:t>
+        <w:t xml:space="preserve">Example 11 (Matching a name to its notation)</w:t>
       </w:r>
       <w:r>
         <w:t xml:space="preserve"> </w:t>
@@ -9656,7 +9996,7 @@
         <w:t xml:space="preserve">.</w:t>
       </w:r>
     </w:p>
-    <w:bookmarkEnd w:id="40"/>
+    <w:bookmarkEnd w:id="41"/>
     <w:p>
       <w:pPr>
         <w:pStyle w:val="BodyText"/>
@@ -9677,8 +10017,8 @@
         <w:t xml:space="preserve">and make them agree.</w:t>
       </w:r>
     </w:p>
-    <w:bookmarkEnd w:id="41"/>
-    <w:bookmarkStart w:id="50" w:name="using-shared-macros"/>
+    <w:bookmarkEnd w:id="42"/>
+    <w:bookmarkStart w:id="51" w:name="using-shared-macros"/>
     <w:p>
       <w:pPr>
         <w:pStyle w:val="Heading2"/>
@@ -9751,7 +10091,7 @@
         <w:t xml:space="preserve">so the next document finds it.</w:t>
       </w:r>
     </w:p>
-    <w:bookmarkStart w:id="42" w:name="exm-use-shared-macro"/>
+    <w:bookmarkStart w:id="43" w:name="exm-use-shared-macro"/>
     <w:p>
       <w:pPr>
         <w:pStyle w:val="BodyText"/>
@@ -9761,7 +10101,7 @@
           <w:b/>
           <w:bCs/>
         </w:rPr>
-        <w:t xml:space="preserve">Example 11 (Using a shared macro)</w:t>
+        <w:t xml:space="preserve">Example 12 (Using a shared macro)</w:t>
       </w:r>
       <w:r>
         <w:t xml:space="preserve"> </w:t>
@@ -9836,7 +10176,7 @@
         <w:t xml:space="preserve">every document that uses the macro changes with it.</w:t>
       </w:r>
     </w:p>
-    <w:bookmarkEnd w:id="42"/>
+    <w:bookmarkEnd w:id="43"/>
     <w:p>
       <w:pPr>
         <w:pStyle w:val="BodyText"/>
@@ -10038,7 +10378,7 @@
         <w:t xml:space="preserve">and the rule for Latin letters below says when that applies.</w:t>
       </w:r>
     </w:p>
-    <w:bookmarkStart w:id="43" w:name="exm-semantic-macro-name"/>
+    <w:bookmarkStart w:id="44" w:name="exm-semantic-macro-name"/>
     <w:p>
       <w:pPr>
         <w:pStyle w:val="BodyText"/>
@@ -10048,7 +10388,7 @@
           <w:b/>
           <w:bCs/>
         </w:rPr>
-        <w:t xml:space="preserve">Example 12 (Naming a macro for its meaning)</w:t>
+        <w:t xml:space="preserve">Example 13 (Naming a macro for its meaning)</w:t>
       </w:r>
       <w:r>
         <w:t xml:space="preserve"> </w:t>
@@ -10117,7 +10457,7 @@
         <w:t xml:space="preserve">changes one line in the shared file.</w:t>
       </w:r>
     </w:p>
-    <w:bookmarkEnd w:id="43"/>
+    <w:bookmarkEnd w:id="44"/>
     <w:p>
       <w:pPr>
         <w:pStyle w:val="BodyText"/>
@@ -10239,7 +10579,7 @@
         <w:t xml:space="preserve">existing hats are converted in separate sweeps.</w:t>
       </w:r>
     </w:p>
-    <w:bookmarkStart w:id="44" w:name="exm-semantic-decorator"/>
+    <w:bookmarkStart w:id="45" w:name="exm-semantic-decorator"/>
     <w:p>
       <w:pPr>
         <w:pStyle w:val="BodyText"/>
@@ -10249,7 +10589,7 @@
           <w:b/>
           <w:bCs/>
         </w:rPr>
-        <w:t xml:space="preserve">Example 13 (Naming a decorator for its meaning)</w:t>
+        <w:t xml:space="preserve">Example 14 (Naming a decorator for its meaning)</w:t>
       </w:r>
       <w:r>
         <w:t xml:space="preserve"> </w:t>
@@ -10327,7 +10667,7 @@
         <w:t xml:space="preserve">changes.</w:t>
       </w:r>
     </w:p>
-    <w:bookmarkEnd w:id="44"/>
+    <w:bookmarkEnd w:id="45"/>
     <w:p>
       <w:pPr>
         <w:pStyle w:val="BodyText"/>
@@ -10516,7 +10856,7 @@
         <w:t xml:space="preserve">may write the font command directly.</w:t>
       </w:r>
     </w:p>
-    <w:bookmarkStart w:id="45" w:name="exm-semantic-font"/>
+    <w:bookmarkStart w:id="46" w:name="exm-semantic-font"/>
     <w:p>
       <w:pPr>
         <w:pStyle w:val="BodyText"/>
@@ -10526,7 +10866,7 @@
           <w:b/>
           <w:bCs/>
         </w:rPr>
-        <w:t xml:space="preserve">Example 14 (Naming a set for its meaning)</w:t>
+        <w:t xml:space="preserve">Example 15 (Naming a set for its meaning)</w:t>
       </w:r>
       <w:r>
         <w:t xml:space="preserve"> </w:t>
@@ -10604,7 +10944,7 @@
         <w:t xml:space="preserve">changes.</w:t>
       </w:r>
     </w:p>
-    <w:bookmarkEnd w:id="45"/>
+    <w:bookmarkEnd w:id="46"/>
     <w:p>
       <w:pPr>
         <w:pStyle w:val="BodyText"/>
@@ -10973,7 +11313,7 @@
         <w:t xml:space="preserve">.</w:t>
       </w:r>
     </w:p>
-    <w:bookmarkStart w:id="46" w:name="exm-semantic-latin-letter"/>
+    <w:bookmarkStart w:id="47" w:name="exm-semantic-latin-letter"/>
     <w:p>
       <w:pPr>
         <w:pStyle w:val="BodyText"/>
@@ -10983,7 +11323,7 @@
           <w:b/>
           <w:bCs/>
         </w:rPr>
-        <w:t xml:space="preserve">Example 15 (Naming a variable for its role)</w:t>
+        <w:t xml:space="preserve">Example 16 (Naming a variable for its role)</w:t>
       </w:r>
       <w:r>
         <w:t xml:space="preserve"> </w:t>
@@ -11063,7 +11403,7 @@
         <w:t xml:space="preserve">which letter is the outcome and which is the residual.</w:t>
       </w:r>
     </w:p>
-    <w:bookmarkEnd w:id="46"/>
+    <w:bookmarkEnd w:id="47"/>
     <w:p>
       <w:pPr>
         <w:pStyle w:val="BodyText"/>
@@ -11090,7 +11430,7 @@
         <w:t xml:space="preserve">and a reader sees which quantity it is about.</w:t>
       </w:r>
     </w:p>
-    <w:bookmarkStart w:id="47" w:name="exm-named-quantity"/>
+    <w:bookmarkStart w:id="48" w:name="exm-named-quantity"/>
     <w:p>
       <w:pPr>
         <w:pStyle w:val="BodyText"/>
@@ -11100,7 +11440,7 @@
           <w:b/>
           <w:bCs/>
         </w:rPr>
-        <w:t xml:space="preserve">Example 16 (Writing a named quantity by its name)</w:t>
+        <w:t xml:space="preserve">Example 17 (Writing a named quantity by its name)</w:t>
       </w:r>
       <w:r>
         <w:t xml:space="preserve"> </w:t>
@@ -11202,7 +11542,7 @@
         <w:t xml:space="preserve">and it names the quantity the gradient depends on.</w:t>
       </w:r>
     </w:p>
-    <w:bookmarkEnd w:id="47"/>
+    <w:bookmarkEnd w:id="48"/>
     <w:p>
       <w:pPr>
         <w:pStyle w:val="BodyText"/>
@@ -11364,7 +11704,7 @@
         <w:t xml:space="preserve">are not delimiters.</w:t>
       </w:r>
     </w:p>
-    <w:bookmarkStart w:id="48" w:name="exm-semantic-delimiter"/>
+    <w:bookmarkStart w:id="49" w:name="exm-semantic-delimiter"/>
     <w:p>
       <w:pPr>
         <w:pStyle w:val="BodyText"/>
@@ -11374,7 +11714,7 @@
           <w:b/>
           <w:bCs/>
         </w:rPr>
-        <w:t xml:space="preserve">Example 17 (Letting the macro size the bracket)</w:t>
+        <w:t xml:space="preserve">Example 18 (Letting the macro size the bracket)</w:t>
       </w:r>
       <w:r>
         <w:t xml:space="preserve"> </w:t>
@@ -11443,7 +11783,7 @@
         <w:t xml:space="preserve">edits one definition in the shared file.</w:t>
       </w:r>
     </w:p>
-    <w:bookmarkEnd w:id="48"/>
+    <w:bookmarkEnd w:id="49"/>
     <w:p>
       <w:pPr>
         <w:pStyle w:val="BodyText"/>
@@ -11482,7 +11822,7 @@
         <w:t xml:space="preserve">with its meaning.</w:t>
       </w:r>
     </w:p>
-    <w:bookmarkStart w:id="49" w:name="exm-describe-symbol-not-macro"/>
+    <w:bookmarkStart w:id="50" w:name="exm-describe-symbol-not-macro"/>
     <w:p>
       <w:pPr>
         <w:pStyle w:val="BodyText"/>
@@ -11492,7 +11832,7 @@
           <w:b/>
           <w:bCs/>
         </w:rPr>
-        <w:t xml:space="preserve">Example 18 (Describing the symbol, not the macro)</w:t>
+        <w:t xml:space="preserve">Example 19 (Describing the symbol, not the macro)</w:t>
       </w:r>
       <w:r>
         <w:t xml:space="preserve"> </w:t>
@@ -11555,9 +11895,9 @@
         <w:t xml:space="preserve">and the symbol has its own row in the notation table.</w:t>
       </w:r>
     </w:p>
-    <w:bookmarkEnd w:id="49"/>
     <w:bookmarkEnd w:id="50"/>
-    <w:bookmarkStart w:id="53" w:name="making-expressions-concise"/>
+    <w:bookmarkEnd w:id="51"/>
+    <w:bookmarkStart w:id="54" w:name="making-expressions-concise"/>
     <w:p>
       <w:pPr>
         <w:pStyle w:val="Heading2"/>
@@ -11588,7 +11928,7 @@
       <w:r>
         <w:t xml:space="preserve"> </w:t>
       </w:r>
-      <w:hyperlink r:id="rId51">
+      <w:hyperlink r:id="rId52">
         <w:r>
           <w:rPr>
             <w:rStyle w:val="Hyperlink"/>
@@ -11656,7 +11996,7 @@
         <w:t xml:space="preserve">and write the macro everywhere the chunk appears.</w:t>
       </w:r>
     </w:p>
-    <w:bookmarkStart w:id="52" w:name="exm-concise-expression"/>
+    <w:bookmarkStart w:id="53" w:name="exm-concise-expression"/>
     <w:p>
       <w:pPr>
         <w:pStyle w:val="BodyText"/>
@@ -11666,7 +12006,7 @@
           <w:b/>
           <w:bCs/>
         </w:rPr>
-        <w:t xml:space="preserve">Example 19 (Naming a repeated chunk)</w:t>
+        <w:t xml:space="preserve">Example 20 (Naming a repeated chunk)</w:t>
       </w:r>
       <w:r>
         <w:t xml:space="preserve"> </w:t>
@@ -11750,7 +12090,7 @@
         <w:t xml:space="preserve">and each formula shows at a glance what it is built from.</w:t>
       </w:r>
     </w:p>
-    <w:bookmarkEnd w:id="52"/>
+    <w:bookmarkEnd w:id="53"/>
     <w:p>
       <w:pPr>
         <w:pStyle w:val="BodyText"/>
@@ -11803,8 +12143,8 @@
         <w:t xml:space="preserve">.</w:t>
       </w:r>
     </w:p>
-    <w:bookmarkEnd w:id="53"/>
-    <w:bookmarkStart w:id="55" w:name="abstract-unused-subexpressions"/>
+    <w:bookmarkEnd w:id="54"/>
+    <w:bookmarkStart w:id="56" w:name="abstract-unused-subexpressions"/>
     <w:p>
       <w:pPr>
         <w:pStyle w:val="Heading2"/>
@@ -11980,7 +12320,7 @@
         <w:t xml:space="preserve">before the first line that uses the symbol.</w:t>
       </w:r>
     </w:p>
-    <w:bookmarkStart w:id="54" w:name="exm-abstract-unused-subexpressions"/>
+    <w:bookmarkStart w:id="55" w:name="exm-abstract-unused-subexpressions"/>
     <w:p>
       <w:pPr>
         <w:pStyle w:val="BodyText"/>
@@ -11990,7 +12330,7 @@
           <w:b/>
           <w:bCs/>
         </w:rPr>
-        <w:t xml:space="preserve">Example 20 (Abstracting the population mean)</w:t>
+        <w:t xml:space="preserve">Example 21 (Abstracting the population mean)</w:t>
       </w:r>
       <w:r>
         <w:t xml:space="preserve"> </w:t>
@@ -12129,9 +12469,9 @@
         <w:t xml:space="preserve">stands for.</w:t>
       </w:r>
     </w:p>
-    <w:bookmarkEnd w:id="54"/>
     <w:bookmarkEnd w:id="55"/>
-    <w:bookmarkStart w:id="57" w:name="writing-dot-products"/>
+    <w:bookmarkEnd w:id="56"/>
+    <w:bookmarkStart w:id="58" w:name="writing-dot-products"/>
     <w:p>
       <w:pPr>
         <w:pStyle w:val="Heading2"/>
@@ -12304,7 +12644,7 @@
         <w:t xml:space="preserve">and to work out that the result is a single number.</w:t>
       </w:r>
     </w:p>
-    <w:bookmarkStart w:id="56" w:name="exm-dot-product"/>
+    <w:bookmarkStart w:id="57" w:name="exm-dot-product"/>
     <w:p>
       <w:pPr>
         <w:pStyle w:val="BodyText"/>
@@ -12314,7 +12654,7 @@
           <w:b/>
           <w:bCs/>
         </w:rPr>
-        <w:t xml:space="preserve">Example 21 (Writing a dot product)</w:t>
+        <w:t xml:space="preserve">Example 22 (Writing a dot product)</w:t>
       </w:r>
       <w:r>
         <w:t xml:space="preserve"> </w:t>
@@ -12533,7 +12873,7 @@
         <w:t xml:space="preserve">.</w:t>
       </w:r>
     </w:p>
-    <w:bookmarkEnd w:id="56"/>
+    <w:bookmarkEnd w:id="57"/>
     <w:p>
       <w:pPr>
         <w:pStyle w:val="BodyText"/>
@@ -12692,8 +13032,8 @@
         <w:t xml:space="preserve">such as a definition of an inner product space.</w:t>
       </w:r>
     </w:p>
-    <w:bookmarkEnd w:id="57"/>
-    <w:bookmarkStart w:id="60" w:name="writing-out-notational-shorthands"/>
+    <w:bookmarkEnd w:id="58"/>
+    <w:bookmarkStart w:id="61" w:name="writing-out-notational-shorthands"/>
     <w:p>
       <w:pPr>
         <w:pStyle w:val="Heading2"/>
@@ -13132,7 +13472,7 @@
       <w:r>
         <w:t xml:space="preserve"> </w:t>
       </w:r>
-      <w:hyperlink r:id="rId58">
+      <w:hyperlink r:id="rId59">
         <w:r>
           <w:rPr>
             <w:rStyle w:val="Hyperlink"/>
@@ -13173,7 +13513,7 @@
         <w:t xml:space="preserve">catalogs common shorthands and their full forms.</w:t>
       </w:r>
     </w:p>
-    <w:bookmarkStart w:id="59" w:name="exm-notational-shorthand"/>
+    <w:bookmarkStart w:id="60" w:name="exm-notational-shorthand"/>
     <w:p>
       <w:pPr>
         <w:pStyle w:val="BodyText"/>
@@ -13183,7 +13523,7 @@
           <w:b/>
           <w:bCs/>
         </w:rPr>
-        <w:t xml:space="preserve">Example 22 (Writing out the limits of a sum and the range of an index)</w:t>
+        <w:t xml:space="preserve">Example 23 (Writing out the limits of a sum and the range of an index)</w:t>
       </w:r>
       <w:r>
         <w:t xml:space="preserve"> </w:t>
@@ -13740,9 +14080,9 @@
         <w:t xml:space="preserve">observations.</w:t>
       </w:r>
     </w:p>
-    <w:bookmarkEnd w:id="59"/>
     <w:bookmarkEnd w:id="60"/>
-    <w:bookmarkStart w:id="62" w:name="stating-assumptions-before-using-them"/>
+    <w:bookmarkEnd w:id="61"/>
+    <w:bookmarkStart w:id="63" w:name="stating-assumptions-before-using-them"/>
     <w:p>
       <w:pPr>
         <w:pStyle w:val="Heading2"/>
@@ -13932,7 +14272,7 @@
         <w:t xml:space="preserve">cite it in the justification on that line.</w:t>
       </w:r>
     </w:p>
-    <w:bookmarkStart w:id="61" w:name="exm-assumptions-first"/>
+    <w:bookmarkStart w:id="62" w:name="exm-assumptions-first"/>
     <w:p>
       <w:pPr>
         <w:pStyle w:val="BodyText"/>
@@ -13942,7 +14282,7 @@
           <w:b/>
           <w:bCs/>
         </w:rPr>
-        <w:t xml:space="preserve">Example 23 (Stating the restriction on</w:t>
+        <w:t xml:space="preserve">Example 24 (Stating the restriction on</w:t>
       </w:r>
       <w:r>
         <w:rPr>
@@ -14614,8 +14954,8 @@
         <w:t xml:space="preserve">and the justification says exactly where the condition is used.</w:t>
       </w:r>
     </w:p>
-    <w:bookmarkEnd w:id="61"/>
     <w:bookmarkEnd w:id="62"/>
+    <w:bookmarkEnd w:id="63"/>
     <w:sectPr>
       <w:footnotePr>
         <w:numRestart w:val="eachSect"/>

</xml_diff>

<commit_message>
Deploying to gh-pages from @ Morrison-Lab/psw@9ed9bc93b4f038413a234f3abdcec7ba78ff9a29 🚀
</commit_message>
<xml_diff>
--- a/chapters/notation.docx
+++ b/chapters/notation.docx
@@ -15,7 +15,7 @@
         <w:pStyle w:val="Date"/>
       </w:pPr>
       <w:r>
-        <w:t xml:space="preserve">Last modified: 2026-10-19 00:16:56 (PDT)</w:t>
+        <w:t xml:space="preserve">Last modified: 2026-10-19 00:24:16 (PDT)</w:t>
       </w:r>
     </w:p>
     <w:tbl>
@@ -14082,7 +14082,7 @@
     </w:p>
     <w:bookmarkEnd w:id="60"/>
     <w:bookmarkEnd w:id="61"/>
-    <w:bookmarkStart w:id="63" w:name="stating-assumptions-before-using-them"/>
+    <w:bookmarkStart w:id="65" w:name="stating-assumptions-before-using-them"/>
     <w:p>
       <w:pPr>
         <w:pStyle w:val="Heading2"/>
@@ -14270,6 +14270,112 @@
       </w:r>
       <w:r>
         <w:t xml:space="preserve">cite it in the justification on that line.</w:t>
+      </w:r>
+    </w:p>
+    <w:p>
+      <w:pPr>
+        <w:pStyle w:val="BodyText"/>
+      </w:pPr>
+      <w:r>
+        <w:t xml:space="preserve">An assumptions list and a notation list are different lists:</w:t>
+      </w:r>
+    </w:p>
+    <w:p>
+      <w:pPr>
+        <w:pStyle w:val="Compact"/>
+        <w:numPr>
+          <w:ilvl w:val="0"/>
+          <w:numId w:val="1014"/>
+        </w:numPr>
+      </w:pPr>
+      <w:r>
+        <w:t xml:space="preserve">An assumptions list states conditions that the result depends on.</w:t>
+      </w:r>
+      <w:r>
+        <w:t xml:space="preserve"> </w:t>
+      </w:r>
+      <w:r>
+        <w:t xml:space="preserve">Write it as a bullet list under</w:t>
+      </w:r>
+      <w:r>
+        <w:t xml:space="preserve"> </w:t>
+      </w:r>
+      <w:r>
+        <w:t xml:space="preserve">“Assume:”</w:t>
+      </w:r>
+      <w:r>
+        <w:t xml:space="preserve">.</w:t>
+      </w:r>
+    </w:p>
+    <w:p>
+      <w:pPr>
+        <w:pStyle w:val="Compact"/>
+        <w:numPr>
+          <w:ilvl w:val="0"/>
+          <w:numId w:val="1014"/>
+        </w:numPr>
+      </w:pPr>
+      <w:r>
+        <w:t xml:space="preserve">A notation list names objects.</w:t>
+      </w:r>
+      <w:r>
+        <w:t xml:space="preserve"> </w:t>
+      </w:r>
+      <w:r>
+        <w:t xml:space="preserve">Write it as a bullet list under</w:t>
+      </w:r>
+      <w:r>
+        <w:t xml:space="preserve"> </w:t>
+      </w:r>
+      <w:r>
+        <w:t xml:space="preserve">“Let:”</w:t>
+      </w:r>
+      <w:r>
+        <w:t xml:space="preserve">.</w:t>
+      </w:r>
+    </w:p>
+    <w:p>
+      <w:pPr>
+        <w:pStyle w:val="FirstParagraph"/>
+      </w:pPr>
+      <w:r>
+        <w:t xml:space="preserve">Write the lead-in word once, before the list,</w:t>
+      </w:r>
+      <w:r>
+        <w:t xml:space="preserve"> </w:t>
+      </w:r>
+      <w:r>
+        <w:t xml:space="preserve">and make each bullet complete the lead-in sentence.</w:t>
+      </w:r>
+      <w:r>
+        <w:t xml:space="preserve"> </w:t>
+      </w:r>
+      <w:r>
+        <w:t xml:space="preserve">Do not repeat the word in every bullet,</w:t>
+      </w:r>
+      <w:r>
+        <w:t xml:space="preserve"> </w:t>
+      </w:r>
+      <w:r>
+        <w:t xml:space="preserve">and do not mix the two kinds of list in one list.</w:t>
+      </w:r>
+      <w:r>
+        <w:t xml:space="preserve"> </w:t>
+      </w:r>
+      <w:r>
+        <w:t xml:space="preserve">When both are needed,</w:t>
+      </w:r>
+      <w:r>
+        <w:t xml:space="preserve"> </w:t>
+      </w:r>
+      <w:r>
+        <w:t xml:space="preserve">write the notation list first,</w:t>
+      </w:r>
+      <w:r>
+        <w:t xml:space="preserve"> </w:t>
+      </w:r>
+      <w:r>
+        <w:t xml:space="preserve">because the assumptions use the names it introduces.</w:t>
       </w:r>
     </w:p>
     <w:bookmarkStart w:id="62" w:name="exm-assumptions-first"/>
@@ -14955,7 +15061,428 @@
       </w:r>
     </w:p>
     <w:bookmarkEnd w:id="62"/>
+    <w:bookmarkStart w:id="63" w:name="exm-assumptions-bullet-list"/>
+    <w:p>
+      <w:pPr>
+        <w:pStyle w:val="BodyText"/>
+      </w:pPr>
+      <w:r>
+        <w:rPr>
+          <w:b/>
+          <w:bCs/>
+        </w:rPr>
+        <w:t xml:space="preserve">Example 25 (Writing several assumptions as one list)</w:t>
+      </w:r>
+      <w:r>
+        <w:t xml:space="preserve"> </w:t>
+      </w:r>
+      <w:r>
+        <w:t xml:space="preserve"> </w:t>
+      </w:r>
+    </w:p>
+    <w:p>
+      <w:pPr>
+        <w:pStyle w:val="BlockText"/>
+      </w:pPr>
+      <w:r>
+        <w:t xml:space="preserve">❌ Assume the sample size</w:t>
+      </w:r>
+      <w:r>
+        <w:t xml:space="preserve"> </w:t>
+      </w:r>
+      <m:oMath>
+        <m:r>
+          <m:t>n</m:t>
+        </m:r>
+      </m:oMath>
+      <w:r>
+        <w:t xml:space="preserve"> </w:t>
+      </w:r>
+      <w:r>
+        <w:t xml:space="preserve">is larger than</w:t>
+      </w:r>
+      <w:r>
+        <w:t xml:space="preserve"> </w:t>
+      </w:r>
+      <m:oMath>
+        <m:r>
+          <m:t>30</m:t>
+        </m:r>
+      </m:oMath>
+      <w:r>
+        <w:t xml:space="preserve">.</w:t>
+      </w:r>
+      <w:r>
+        <w:t xml:space="preserve"> </w:t>
+      </w:r>
+      <w:r>
+        <w:t xml:space="preserve">Assume the observations are independent.</w:t>
+      </w:r>
+      <w:r>
+        <w:t xml:space="preserve"> </w:t>
+      </w:r>
+      <w:r>
+        <w:t xml:space="preserve">Assume the population variance</w:t>
+      </w:r>
+      <w:r>
+        <w:t xml:space="preserve"> </w:t>
+      </w:r>
+      <m:oMath>
+        <m:sSup>
+          <m:e>
+            <m:r>
+              <m:t>σ</m:t>
+            </m:r>
+          </m:e>
+          <m:sup>
+            <m:r>
+              <m:t>2</m:t>
+            </m:r>
+          </m:sup>
+        </m:sSup>
+      </m:oMath>
+      <w:r>
+        <w:t xml:space="preserve"> </w:t>
+      </w:r>
+      <w:r>
+        <w:t xml:space="preserve">is finite.</w:t>
+      </w:r>
+    </w:p>
+    <w:p>
+      <w:pPr>
+        <w:pStyle w:val="BlockText"/>
+      </w:pPr>
+      <w:r>
+        <w:t xml:space="preserve">✅ Assume:</w:t>
+      </w:r>
+    </w:p>
+    <w:p>
+      <w:pPr>
+        <w:pStyle w:val="Compact"/>
+        <w:numPr>
+          <w:ilvl w:val="0"/>
+          <w:numId w:val="1015"/>
+        </w:numPr>
+      </w:pPr>
+      <w:r>
+        <w:t xml:space="preserve">the sample size</w:t>
+      </w:r>
+      <w:r>
+        <w:t xml:space="preserve"> </w:t>
+      </w:r>
+      <m:oMath>
+        <m:r>
+          <m:t>n</m:t>
+        </m:r>
+      </m:oMath>
+      <w:r>
+        <w:t xml:space="preserve"> </w:t>
+      </w:r>
+      <w:r>
+        <w:t xml:space="preserve">is larger than</w:t>
+      </w:r>
+      <w:r>
+        <w:t xml:space="preserve"> </w:t>
+      </w:r>
+      <m:oMath>
+        <m:r>
+          <m:t>30</m:t>
+        </m:r>
+      </m:oMath>
+      <w:r>
+        <w:t xml:space="preserve">,</w:t>
+      </w:r>
+    </w:p>
+    <w:p>
+      <w:pPr>
+        <w:pStyle w:val="Compact"/>
+        <w:numPr>
+          <w:ilvl w:val="0"/>
+          <w:numId w:val="1015"/>
+        </w:numPr>
+      </w:pPr>
+      <w:r>
+        <w:t xml:space="preserve">the observations are independent, and</w:t>
+      </w:r>
+    </w:p>
+    <w:p>
+      <w:pPr>
+        <w:pStyle w:val="Compact"/>
+        <w:numPr>
+          <w:ilvl w:val="0"/>
+          <w:numId w:val="1015"/>
+        </w:numPr>
+      </w:pPr>
+      <w:r>
+        <w:t xml:space="preserve">the population variance</w:t>
+      </w:r>
+      <w:r>
+        <w:t xml:space="preserve"> </w:t>
+      </w:r>
+      <m:oMath>
+        <m:sSup>
+          <m:e>
+            <m:r>
+              <m:t>σ</m:t>
+            </m:r>
+          </m:e>
+          <m:sup>
+            <m:r>
+              <m:t>2</m:t>
+            </m:r>
+          </m:sup>
+        </m:sSup>
+      </m:oMath>
+      <w:r>
+        <w:t xml:space="preserve"> </w:t>
+      </w:r>
+      <w:r>
+        <w:t xml:space="preserve">is finite.</w:t>
+      </w:r>
+    </w:p>
+    <w:p>
+      <w:pPr>
+        <w:pStyle w:val="FirstParagraph"/>
+      </w:pPr>
+      <w:r>
+        <w:t xml:space="preserve">The ✅ version writes</w:t>
+      </w:r>
+      <w:r>
+        <w:t xml:space="preserve"> </w:t>
+      </w:r>
+      <w:r>
+        <w:t xml:space="preserve">“Assume”</w:t>
+      </w:r>
+      <w:r>
+        <w:t xml:space="preserve"> </w:t>
+      </w:r>
+      <w:r>
+        <w:t xml:space="preserve">once,</w:t>
+      </w:r>
+      <w:r>
+        <w:t xml:space="preserve"> </w:t>
+      </w:r>
+      <w:r>
+        <w:t xml:space="preserve">and the bullets show that the three assumptions are parallel and separate.</w:t>
+      </w:r>
+    </w:p>
     <w:bookmarkEnd w:id="63"/>
+    <w:bookmarkStart w:id="64" w:name="exm-notation-bullet-list"/>
+    <w:p>
+      <w:pPr>
+        <w:pStyle w:val="BodyText"/>
+      </w:pPr>
+      <w:r>
+        <w:rPr>
+          <w:b/>
+          <w:bCs/>
+        </w:rPr>
+        <w:t xml:space="preserve">Example 26 (Writing several names as one list)</w:t>
+      </w:r>
+      <w:r>
+        <w:t xml:space="preserve"> </w:t>
+      </w:r>
+      <w:r>
+        <w:t xml:space="preserve"> </w:t>
+      </w:r>
+    </w:p>
+    <w:p>
+      <w:pPr>
+        <w:pStyle w:val="BlockText"/>
+      </w:pPr>
+      <w:r>
+        <w:t xml:space="preserve">❌ Let</w:t>
+      </w:r>
+      <w:r>
+        <w:t xml:space="preserve"> </w:t>
+      </w:r>
+      <m:oMath>
+        <m:r>
+          <m:t>n</m:t>
+        </m:r>
+      </m:oMath>
+      <w:r>
+        <w:t xml:space="preserve"> </w:t>
+      </w:r>
+      <w:r>
+        <w:t xml:space="preserve">be the sample size.</w:t>
+      </w:r>
+      <w:r>
+        <w:t xml:space="preserve"> </w:t>
+      </w:r>
+      <w:r>
+        <w:t xml:space="preserve">Let</w:t>
+      </w:r>
+      <w:r>
+        <w:t xml:space="preserve"> </w:t>
+      </w:r>
+      <m:oMath>
+        <m:acc>
+          <m:accPr>
+            <m:chr m:val="‾"/>
+          </m:accPr>
+          <m:e>
+            <m:r>
+              <m:t>y</m:t>
+            </m:r>
+          </m:e>
+        </m:acc>
+      </m:oMath>
+      <w:r>
+        <w:t xml:space="preserve"> </w:t>
+      </w:r>
+      <w:r>
+        <w:t xml:space="preserve">be the sample mean.</w:t>
+      </w:r>
+      <w:r>
+        <w:t xml:space="preserve"> </w:t>
+      </w:r>
+      <w:r>
+        <w:t xml:space="preserve">Let</w:t>
+      </w:r>
+      <w:r>
+        <w:t xml:space="preserve"> </w:t>
+      </w:r>
+      <m:oMath>
+        <m:r>
+          <m:t>s</m:t>
+        </m:r>
+      </m:oMath>
+      <w:r>
+        <w:t xml:space="preserve"> </w:t>
+      </w:r>
+      <w:r>
+        <w:t xml:space="preserve">be the sample standard deviation.</w:t>
+      </w:r>
+    </w:p>
+    <w:p>
+      <w:pPr>
+        <w:pStyle w:val="BlockText"/>
+      </w:pPr>
+      <w:r>
+        <w:t xml:space="preserve">✅ Let:</w:t>
+      </w:r>
+    </w:p>
+    <w:p>
+      <w:pPr>
+        <w:pStyle w:val="Compact"/>
+        <w:numPr>
+          <w:ilvl w:val="0"/>
+          <w:numId w:val="1016"/>
+        </w:numPr>
+      </w:pPr>
+      <m:oMath>
+        <m:r>
+          <m:t>n</m:t>
+        </m:r>
+      </m:oMath>
+      <w:r>
+        <w:t xml:space="preserve"> </w:t>
+      </w:r>
+      <w:r>
+        <w:t xml:space="preserve">be the sample size,</w:t>
+      </w:r>
+    </w:p>
+    <w:p>
+      <w:pPr>
+        <w:pStyle w:val="Compact"/>
+        <w:numPr>
+          <w:ilvl w:val="0"/>
+          <w:numId w:val="1016"/>
+        </w:numPr>
+      </w:pPr>
+      <m:oMath>
+        <m:acc>
+          <m:accPr>
+            <m:chr m:val="‾"/>
+          </m:accPr>
+          <m:e>
+            <m:r>
+              <m:t>y</m:t>
+            </m:r>
+          </m:e>
+        </m:acc>
+      </m:oMath>
+      <w:r>
+        <w:t xml:space="preserve"> </w:t>
+      </w:r>
+      <w:r>
+        <w:t xml:space="preserve">be the sample mean, and</w:t>
+      </w:r>
+    </w:p>
+    <w:p>
+      <w:pPr>
+        <w:pStyle w:val="Compact"/>
+        <w:numPr>
+          <w:ilvl w:val="0"/>
+          <w:numId w:val="1016"/>
+        </w:numPr>
+      </w:pPr>
+      <m:oMath>
+        <m:r>
+          <m:t>s</m:t>
+        </m:r>
+      </m:oMath>
+      <w:r>
+        <w:t xml:space="preserve"> </w:t>
+      </w:r>
+      <w:r>
+        <w:t xml:space="preserve">be the sample standard deviation.</w:t>
+      </w:r>
+    </w:p>
+    <w:p>
+      <w:pPr>
+        <w:pStyle w:val="FirstParagraph"/>
+      </w:pPr>
+      <w:r>
+        <w:t xml:space="preserve">These bullets name objects and assume nothing about them,</w:t>
+      </w:r>
+      <w:r>
+        <w:t xml:space="preserve"> </w:t>
+      </w:r>
+      <w:r>
+        <w:t xml:space="preserve">so this is a notation list.</w:t>
+      </w:r>
+      <w:r>
+        <w:t xml:space="preserve"> </w:t>
+      </w:r>
+      <w:r>
+        <w:t xml:space="preserve">If the result also needed a condition such as a sample size</w:t>
+      </w:r>
+      <w:r>
+        <w:t xml:space="preserve"> </w:t>
+      </w:r>
+      <m:oMath>
+        <m:r>
+          <m:t>n</m:t>
+        </m:r>
+      </m:oMath>
+      <w:r>
+        <w:t xml:space="preserve"> </w:t>
+      </w:r>
+      <w:r>
+        <w:t xml:space="preserve">larger than</w:t>
+      </w:r>
+      <w:r>
+        <w:t xml:space="preserve"> </w:t>
+      </w:r>
+      <m:oMath>
+        <m:r>
+          <m:t>30</m:t>
+        </m:r>
+      </m:oMath>
+      <w:r>
+        <w:t xml:space="preserve">,</w:t>
+      </w:r>
+      <w:r>
+        <w:t xml:space="preserve"> </w:t>
+      </w:r>
+      <w:r>
+        <w:t xml:space="preserve">a separate assumptions list after this one would state it.</w:t>
+      </w:r>
+    </w:p>
+    <w:bookmarkEnd w:id="64"/>
+    <w:bookmarkEnd w:id="65"/>
     <w:sectPr>
       <w:footnotePr>
         <w:numRestart w:val="eachSect"/>
@@ -15321,6 +15848,15 @@
     <w:abstractNumId w:val="991"/>
   </w:num>
   <w:num w:numId="1013">
+    <w:abstractNumId w:val="991"/>
+  </w:num>
+  <w:num w:numId="1014">
+    <w:abstractNumId w:val="991"/>
+  </w:num>
+  <w:num w:numId="1015">
+    <w:abstractNumId w:val="991"/>
+  </w:num>
+  <w:num w:numId="1016">
     <w:abstractNumId w:val="991"/>
   </w:num>
 </w:numbering>

</xml_diff>

<commit_message>
Deploying to gh-pages from @ Morrison-Lab/psw@2267cf3a72c4ab5719fdac80aad6dba9a626dce2 🚀
</commit_message>
<xml_diff>
--- a/chapters/notation.docx
+++ b/chapters/notation.docx
@@ -15,7 +15,7 @@
         <w:pStyle w:val="Date"/>
       </w:pPr>
       <w:r>
-        <w:t xml:space="preserve">Last modified: 2026-10-19 00:24:16 (PDT)</w:t>
+        <w:t xml:space="preserve">Last modified: 2026-10-19 00:31:38 (PDT)</w:t>
       </w:r>
     </w:p>
     <w:tbl>
@@ -9380,7 +9380,7 @@
       </w:r>
     </w:p>
     <w:bookmarkEnd w:id="39"/>
-    <w:bookmarkStart w:id="42" w:name="matching-names-and-notation"/>
+    <w:bookmarkStart w:id="44" w:name="matching-names-and-notation"/>
     <w:p>
       <w:pPr>
         <w:pStyle w:val="Heading2"/>
@@ -10017,14 +10017,13 @@
         <w:t xml:space="preserve">and make them agree.</w:t>
       </w:r>
     </w:p>
-    <w:bookmarkEnd w:id="42"/>
-    <w:bookmarkStart w:id="51" w:name="using-shared-macros"/>
-    <w:p>
-      <w:pPr>
-        <w:pStyle w:val="Heading2"/>
-      </w:pPr>
-      <w:r>
-        <w:t xml:space="preserve">8 Using shared macros</w:t>
+    <w:bookmarkStart w:id="43" w:name="label-every-inline-symbol"/>
+    <w:p>
+      <w:pPr>
+        <w:pStyle w:val="Heading3"/>
+      </w:pPr>
+      <w:r>
+        <w:t xml:space="preserve">7.1 Label every inline symbol</w:t>
       </w:r>
     </w:p>
     <w:p>
@@ -10032,66 +10031,57 @@
         <w:pStyle w:val="FirstParagraph"/>
       </w:pPr>
       <w:r>
-        <w:t xml:space="preserve">Write each symbol through a shared macro file,</w:t>
-      </w:r>
-      <w:r>
-        <w:t xml:space="preserve"> </w:t>
-      </w:r>
-      <w:r>
-        <w:t xml:space="preserve">and write the macro everywhere the symbol appears.</w:t>
-      </w:r>
-      <w:r>
-        <w:t xml:space="preserve"> </w:t>
-      </w:r>
-      <w:r>
-        <w:t xml:space="preserve">A group that writes the same quantity in raw LaTeX in one document</w:t>
-      </w:r>
-      <w:r>
-        <w:t xml:space="preserve"> </w:t>
-      </w:r>
-      <w:r>
-        <w:t xml:space="preserve">and with a macro in another ends up with two notations for one quantity.</w:t>
-      </w:r>
-      <w:r>
-        <w:t xml:space="preserve"> </w:t>
-      </w:r>
-      <w:r>
-        <w:t xml:space="preserve">Changing a convention then means editing every document by hand.</w:t>
-      </w:r>
-    </w:p>
-    <w:p>
-      <w:pPr>
-        <w:pStyle w:val="BodyText"/>
-      </w:pPr>
-      <w:r>
-        <w:t xml:space="preserve">Before you write any symbol,</w:t>
-      </w:r>
-      <w:r>
-        <w:t xml:space="preserve"> </w:t>
-      </w:r>
-      <w:r>
-        <w:t xml:space="preserve">search the group’s shared macro file for the concept it names.</w:t>
-      </w:r>
-      <w:r>
-        <w:t xml:space="preserve"> </w:t>
-      </w:r>
-      <w:r>
-        <w:t xml:space="preserve">If a macro names the concept, use it.</w:t>
-      </w:r>
-      <w:r>
-        <w:t xml:space="preserve"> </w:t>
-      </w:r>
-      <w:r>
-        <w:t xml:space="preserve">If none does, add one to the shared file before you use the symbol,</w:t>
-      </w:r>
-      <w:r>
-        <w:t xml:space="preserve"> </w:t>
-      </w:r>
-      <w:r>
-        <w:t xml:space="preserve">so the next document finds it.</w:t>
-      </w:r>
-    </w:p>
-    <w:bookmarkStart w:id="43" w:name="exm-use-shared-macro"/>
+        <w:t xml:space="preserve">In prose, write a text label next to every inline math symbol.</w:t>
+      </w:r>
+      <w:r>
+        <w:t xml:space="preserve"> </w:t>
+      </w:r>
+      <w:r>
+        <w:t xml:space="preserve">The label tells the reader what the symbol stands for</w:t>
+      </w:r>
+      <w:r>
+        <w:t xml:space="preserve"> </w:t>
+      </w:r>
+      <w:r>
+        <w:t xml:space="preserve">without making them search for its definition.</w:t>
+      </w:r>
+      <w:r>
+        <w:t xml:space="preserve"> </w:t>
+      </w:r>
+      <w:r>
+        <w:t xml:space="preserve">Put the label before the symbol, as in</w:t>
+      </w:r>
+      <w:r>
+        <w:t xml:space="preserve"> </w:t>
+      </w:r>
+      <w:r>
+        <w:t xml:space="preserve">“the population noise variance,</w:t>
+      </w:r>
+      <w:r>
+        <w:t xml:space="preserve"> </w:t>
+      </w:r>
+      <m:oMath>
+        <m:sSup>
+          <m:e>
+            <m:r>
+              <m:t>σ</m:t>
+            </m:r>
+          </m:e>
+          <m:sup>
+            <m:r>
+              <m:t>2</m:t>
+            </m:r>
+          </m:sup>
+        </m:sSup>
+      </m:oMath>
+      <w:r>
+        <w:t xml:space="preserve">”</w:t>
+      </w:r>
+      <w:r>
+        <w:t xml:space="preserve">.</w:t>
+      </w:r>
+    </w:p>
+    <w:bookmarkStart w:id="42" w:name="exm-label-inline-symbol"/>
     <w:p>
       <w:pPr>
         <w:pStyle w:val="BodyText"/>
@@ -10101,7 +10091,267 @@
           <w:b/>
           <w:bCs/>
         </w:rPr>
-        <w:t xml:space="preserve">Example 12 (Using a shared macro)</w:t>
+        <w:t xml:space="preserve">Example 12 (Labeling a symbol in a list of quantities)</w:t>
+      </w:r>
+      <w:r>
+        <w:t xml:space="preserve"> </w:t>
+      </w:r>
+      <w:r>
+        <w:t xml:space="preserve"> </w:t>
+      </w:r>
+    </w:p>
+    <w:p>
+      <w:pPr>
+        <w:pStyle w:val="BlockText"/>
+      </w:pPr>
+      <w:r>
+        <w:t xml:space="preserve">❌ Which of the three quantities</w:t>
+      </w:r>
+      <w:r>
+        <w:t xml:space="preserve"> </w:t>
+      </w:r>
+      <w:r>
+        <w:t xml:space="preserve">(squared bias, variance of</w:t>
+      </w:r>
+      <w:r>
+        <w:t xml:space="preserve"> </w:t>
+      </w:r>
+      <m:oMath>
+        <m:acc>
+          <m:accPr>
+            <m:chr m:val="̂"/>
+          </m:accPr>
+          <m:e>
+            <m:r>
+              <m:t>y</m:t>
+            </m:r>
+          </m:e>
+        </m:acc>
+      </m:oMath>
+      <w:r>
+        <w:t xml:space="preserve">,</w:t>
+      </w:r>
+      <w:r>
+        <w:t xml:space="preserve"> </w:t>
+      </w:r>
+      <m:oMath>
+        <m:sSup>
+          <m:e>
+            <m:r>
+              <m:t>σ</m:t>
+            </m:r>
+          </m:e>
+          <m:sup>
+            <m:r>
+              <m:t>2</m:t>
+            </m:r>
+          </m:sup>
+        </m:sSup>
+      </m:oMath>
+      <w:r>
+        <w:t xml:space="preserve">)</w:t>
+      </w:r>
+      <w:r>
+        <w:t xml:space="preserve"> </w:t>
+      </w:r>
+      <w:r>
+        <w:t xml:space="preserve">can a better prediction method reduce?</w:t>
+      </w:r>
+    </w:p>
+    <w:p>
+      <w:pPr>
+        <w:pStyle w:val="BlockText"/>
+      </w:pPr>
+      <w:r>
+        <w:t xml:space="preserve">✅ Which of the three quantities</w:t>
+      </w:r>
+      <w:r>
+        <w:t xml:space="preserve"> </w:t>
+      </w:r>
+      <w:r>
+        <w:t xml:space="preserve">(the squared bias, the variance of the prediction</w:t>
+      </w:r>
+      <w:r>
+        <w:t xml:space="preserve"> </w:t>
+      </w:r>
+      <m:oMath>
+        <m:acc>
+          <m:accPr>
+            <m:chr m:val="̂"/>
+          </m:accPr>
+          <m:e>
+            <m:r>
+              <m:t>y</m:t>
+            </m:r>
+          </m:e>
+        </m:acc>
+      </m:oMath>
+      <w:r>
+        <w:t xml:space="preserve">,</w:t>
+      </w:r>
+      <w:r>
+        <w:t xml:space="preserve"> </w:t>
+      </w:r>
+      <w:r>
+        <w:t xml:space="preserve">and the population noise variance</w:t>
+      </w:r>
+      <w:r>
+        <w:t xml:space="preserve"> </w:t>
+      </w:r>
+      <m:oMath>
+        <m:sSup>
+          <m:e>
+            <m:r>
+              <m:t>σ</m:t>
+            </m:r>
+          </m:e>
+          <m:sup>
+            <m:r>
+              <m:t>2</m:t>
+            </m:r>
+          </m:sup>
+        </m:sSup>
+      </m:oMath>
+      <w:r>
+        <w:t xml:space="preserve">)</w:t>
+      </w:r>
+      <w:r>
+        <w:t xml:space="preserve"> </w:t>
+      </w:r>
+      <w:r>
+        <w:t xml:space="preserve">can a better prediction method reduce?</w:t>
+      </w:r>
+    </w:p>
+    <w:p>
+      <w:pPr>
+        <w:pStyle w:val="FirstParagraph"/>
+      </w:pPr>
+      <w:r>
+        <w:t xml:space="preserve">In the ❌ version, the reader sees</w:t>
+      </w:r>
+      <w:r>
+        <w:t xml:space="preserve"> </w:t>
+      </w:r>
+      <m:oMath>
+        <m:sSup>
+          <m:e>
+            <m:r>
+              <m:t>σ</m:t>
+            </m:r>
+          </m:e>
+          <m:sup>
+            <m:r>
+              <m:t>2</m:t>
+            </m:r>
+          </m:sup>
+        </m:sSup>
+      </m:oMath>
+      <w:r>
+        <w:t xml:space="preserve"> </w:t>
+      </w:r>
+      <w:r>
+        <w:t xml:space="preserve">with no word for it.</w:t>
+      </w:r>
+      <w:r>
+        <w:t xml:space="preserve"> </w:t>
+      </w:r>
+      <w:r>
+        <w:t xml:space="preserve">In the ✅ version, each quantity has a label,</w:t>
+      </w:r>
+      <w:r>
+        <w:t xml:space="preserve"> </w:t>
+      </w:r>
+      <w:r>
+        <w:t xml:space="preserve">and the symbol that follows the label confirms which quantity is meant.</w:t>
+      </w:r>
+    </w:p>
+    <w:bookmarkEnd w:id="42"/>
+    <w:bookmarkEnd w:id="43"/>
+    <w:bookmarkEnd w:id="44"/>
+    <w:bookmarkStart w:id="53" w:name="using-shared-macros"/>
+    <w:p>
+      <w:pPr>
+        <w:pStyle w:val="Heading2"/>
+      </w:pPr>
+      <w:r>
+        <w:t xml:space="preserve">8 Using shared macros</w:t>
+      </w:r>
+    </w:p>
+    <w:p>
+      <w:pPr>
+        <w:pStyle w:val="FirstParagraph"/>
+      </w:pPr>
+      <w:r>
+        <w:t xml:space="preserve">Write each symbol through a shared macro file,</w:t>
+      </w:r>
+      <w:r>
+        <w:t xml:space="preserve"> </w:t>
+      </w:r>
+      <w:r>
+        <w:t xml:space="preserve">and write the macro everywhere the symbol appears.</w:t>
+      </w:r>
+      <w:r>
+        <w:t xml:space="preserve"> </w:t>
+      </w:r>
+      <w:r>
+        <w:t xml:space="preserve">A group that writes the same quantity in raw LaTeX in one document</w:t>
+      </w:r>
+      <w:r>
+        <w:t xml:space="preserve"> </w:t>
+      </w:r>
+      <w:r>
+        <w:t xml:space="preserve">and with a macro in another ends up with two notations for one quantity.</w:t>
+      </w:r>
+      <w:r>
+        <w:t xml:space="preserve"> </w:t>
+      </w:r>
+      <w:r>
+        <w:t xml:space="preserve">Changing a convention then means editing every document by hand.</w:t>
+      </w:r>
+    </w:p>
+    <w:p>
+      <w:pPr>
+        <w:pStyle w:val="BodyText"/>
+      </w:pPr>
+      <w:r>
+        <w:t xml:space="preserve">Before you write any symbol,</w:t>
+      </w:r>
+      <w:r>
+        <w:t xml:space="preserve"> </w:t>
+      </w:r>
+      <w:r>
+        <w:t xml:space="preserve">search the group’s shared macro file for the concept it names.</w:t>
+      </w:r>
+      <w:r>
+        <w:t xml:space="preserve"> </w:t>
+      </w:r>
+      <w:r>
+        <w:t xml:space="preserve">If a macro names the concept, use it.</w:t>
+      </w:r>
+      <w:r>
+        <w:t xml:space="preserve"> </w:t>
+      </w:r>
+      <w:r>
+        <w:t xml:space="preserve">If none does, add one to the shared file before you use the symbol,</w:t>
+      </w:r>
+      <w:r>
+        <w:t xml:space="preserve"> </w:t>
+      </w:r>
+      <w:r>
+        <w:t xml:space="preserve">so the next document finds it.</w:t>
+      </w:r>
+    </w:p>
+    <w:bookmarkStart w:id="45" w:name="exm-use-shared-macro"/>
+    <w:p>
+      <w:pPr>
+        <w:pStyle w:val="BodyText"/>
+      </w:pPr>
+      <w:r>
+        <w:rPr>
+          <w:b/>
+          <w:bCs/>
+        </w:rPr>
+        <w:t xml:space="preserve">Example 13 (Using a shared macro)</w:t>
       </w:r>
       <w:r>
         <w:t xml:space="preserve"> </w:t>
@@ -10176,7 +10426,7 @@
         <w:t xml:space="preserve">every document that uses the macro changes with it.</w:t>
       </w:r>
     </w:p>
-    <w:bookmarkEnd w:id="43"/>
+    <w:bookmarkEnd w:id="45"/>
     <w:p>
       <w:pPr>
         <w:pStyle w:val="BodyText"/>
@@ -10378,7 +10628,7 @@
         <w:t xml:space="preserve">and the rule for Latin letters below says when that applies.</w:t>
       </w:r>
     </w:p>
-    <w:bookmarkStart w:id="44" w:name="exm-semantic-macro-name"/>
+    <w:bookmarkStart w:id="46" w:name="exm-semantic-macro-name"/>
     <w:p>
       <w:pPr>
         <w:pStyle w:val="BodyText"/>
@@ -10388,7 +10638,7 @@
           <w:b/>
           <w:bCs/>
         </w:rPr>
-        <w:t xml:space="preserve">Example 13 (Naming a macro for its meaning)</w:t>
+        <w:t xml:space="preserve">Example 14 (Naming a macro for its meaning)</w:t>
       </w:r>
       <w:r>
         <w:t xml:space="preserve"> </w:t>
@@ -10457,7 +10707,7 @@
         <w:t xml:space="preserve">changes one line in the shared file.</w:t>
       </w:r>
     </w:p>
-    <w:bookmarkEnd w:id="44"/>
+    <w:bookmarkEnd w:id="46"/>
     <w:p>
       <w:pPr>
         <w:pStyle w:val="BodyText"/>
@@ -10579,7 +10829,7 @@
         <w:t xml:space="preserve">existing hats are converted in separate sweeps.</w:t>
       </w:r>
     </w:p>
-    <w:bookmarkStart w:id="45" w:name="exm-semantic-decorator"/>
+    <w:bookmarkStart w:id="47" w:name="exm-semantic-decorator"/>
     <w:p>
       <w:pPr>
         <w:pStyle w:val="BodyText"/>
@@ -10589,7 +10839,7 @@
           <w:b/>
           <w:bCs/>
         </w:rPr>
-        <w:t xml:space="preserve">Example 14 (Naming a decorator for its meaning)</w:t>
+        <w:t xml:space="preserve">Example 15 (Naming a decorator for its meaning)</w:t>
       </w:r>
       <w:r>
         <w:t xml:space="preserve"> </w:t>
@@ -10667,7 +10917,7 @@
         <w:t xml:space="preserve">changes.</w:t>
       </w:r>
     </w:p>
-    <w:bookmarkEnd w:id="45"/>
+    <w:bookmarkEnd w:id="47"/>
     <w:p>
       <w:pPr>
         <w:pStyle w:val="BodyText"/>
@@ -10856,7 +11106,7 @@
         <w:t xml:space="preserve">may write the font command directly.</w:t>
       </w:r>
     </w:p>
-    <w:bookmarkStart w:id="46" w:name="exm-semantic-font"/>
+    <w:bookmarkStart w:id="48" w:name="exm-semantic-font"/>
     <w:p>
       <w:pPr>
         <w:pStyle w:val="BodyText"/>
@@ -10866,7 +11116,7 @@
           <w:b/>
           <w:bCs/>
         </w:rPr>
-        <w:t xml:space="preserve">Example 15 (Naming a set for its meaning)</w:t>
+        <w:t xml:space="preserve">Example 16 (Naming a set for its meaning)</w:t>
       </w:r>
       <w:r>
         <w:t xml:space="preserve"> </w:t>
@@ -10944,7 +11194,7 @@
         <w:t xml:space="preserve">changes.</w:t>
       </w:r>
     </w:p>
-    <w:bookmarkEnd w:id="46"/>
+    <w:bookmarkEnd w:id="48"/>
     <w:p>
       <w:pPr>
         <w:pStyle w:val="BodyText"/>
@@ -11313,7 +11563,7 @@
         <w:t xml:space="preserve">.</w:t>
       </w:r>
     </w:p>
-    <w:bookmarkStart w:id="47" w:name="exm-semantic-latin-letter"/>
+    <w:bookmarkStart w:id="49" w:name="exm-semantic-latin-letter"/>
     <w:p>
       <w:pPr>
         <w:pStyle w:val="BodyText"/>
@@ -11323,7 +11573,7 @@
           <w:b/>
           <w:bCs/>
         </w:rPr>
-        <w:t xml:space="preserve">Example 16 (Naming a variable for its role)</w:t>
+        <w:t xml:space="preserve">Example 17 (Naming a variable for its role)</w:t>
       </w:r>
       <w:r>
         <w:t xml:space="preserve"> </w:t>
@@ -11403,7 +11653,7 @@
         <w:t xml:space="preserve">which letter is the outcome and which is the residual.</w:t>
       </w:r>
     </w:p>
-    <w:bookmarkEnd w:id="47"/>
+    <w:bookmarkEnd w:id="49"/>
     <w:p>
       <w:pPr>
         <w:pStyle w:val="BodyText"/>
@@ -11430,7 +11680,7 @@
         <w:t xml:space="preserve">and a reader sees which quantity it is about.</w:t>
       </w:r>
     </w:p>
-    <w:bookmarkStart w:id="48" w:name="exm-named-quantity"/>
+    <w:bookmarkStart w:id="50" w:name="exm-named-quantity"/>
     <w:p>
       <w:pPr>
         <w:pStyle w:val="BodyText"/>
@@ -11440,7 +11690,7 @@
           <w:b/>
           <w:bCs/>
         </w:rPr>
-        <w:t xml:space="preserve">Example 17 (Writing a named quantity by its name)</w:t>
+        <w:t xml:space="preserve">Example 18 (Writing a named quantity by its name)</w:t>
       </w:r>
       <w:r>
         <w:t xml:space="preserve"> </w:t>
@@ -11542,7 +11792,7 @@
         <w:t xml:space="preserve">and it names the quantity the gradient depends on.</w:t>
       </w:r>
     </w:p>
-    <w:bookmarkEnd w:id="48"/>
+    <w:bookmarkEnd w:id="50"/>
     <w:p>
       <w:pPr>
         <w:pStyle w:val="BodyText"/>
@@ -11704,7 +11954,7 @@
         <w:t xml:space="preserve">are not delimiters.</w:t>
       </w:r>
     </w:p>
-    <w:bookmarkStart w:id="49" w:name="exm-semantic-delimiter"/>
+    <w:bookmarkStart w:id="51" w:name="exm-semantic-delimiter"/>
     <w:p>
       <w:pPr>
         <w:pStyle w:val="BodyText"/>
@@ -11714,7 +11964,7 @@
           <w:b/>
           <w:bCs/>
         </w:rPr>
-        <w:t xml:space="preserve">Example 18 (Letting the macro size the bracket)</w:t>
+        <w:t xml:space="preserve">Example 19 (Letting the macro size the bracket)</w:t>
       </w:r>
       <w:r>
         <w:t xml:space="preserve"> </w:t>
@@ -11783,7 +12033,7 @@
         <w:t xml:space="preserve">edits one definition in the shared file.</w:t>
       </w:r>
     </w:p>
-    <w:bookmarkEnd w:id="49"/>
+    <w:bookmarkEnd w:id="51"/>
     <w:p>
       <w:pPr>
         <w:pStyle w:val="BodyText"/>
@@ -11822,7 +12072,7 @@
         <w:t xml:space="preserve">with its meaning.</w:t>
       </w:r>
     </w:p>
-    <w:bookmarkStart w:id="50" w:name="exm-describe-symbol-not-macro"/>
+    <w:bookmarkStart w:id="52" w:name="exm-describe-symbol-not-macro"/>
     <w:p>
       <w:pPr>
         <w:pStyle w:val="BodyText"/>
@@ -11832,7 +12082,7 @@
           <w:b/>
           <w:bCs/>
         </w:rPr>
-        <w:t xml:space="preserve">Example 19 (Describing the symbol, not the macro)</w:t>
+        <w:t xml:space="preserve">Example 20 (Describing the symbol, not the macro)</w:t>
       </w:r>
       <w:r>
         <w:t xml:space="preserve"> </w:t>
@@ -11895,9 +12145,9 @@
         <w:t xml:space="preserve">and the symbol has its own row in the notation table.</w:t>
       </w:r>
     </w:p>
-    <w:bookmarkEnd w:id="50"/>
-    <w:bookmarkEnd w:id="51"/>
-    <w:bookmarkStart w:id="54" w:name="making-expressions-concise"/>
+    <w:bookmarkEnd w:id="52"/>
+    <w:bookmarkEnd w:id="53"/>
+    <w:bookmarkStart w:id="56" w:name="making-expressions-concise"/>
     <w:p>
       <w:pPr>
         <w:pStyle w:val="Heading2"/>
@@ -11928,7 +12178,7 @@
       <w:r>
         <w:t xml:space="preserve"> </w:t>
       </w:r>
-      <w:hyperlink r:id="rId52">
+      <w:hyperlink r:id="rId54">
         <w:r>
           <w:rPr>
             <w:rStyle w:val="Hyperlink"/>
@@ -11996,7 +12246,7 @@
         <w:t xml:space="preserve">and write the macro everywhere the chunk appears.</w:t>
       </w:r>
     </w:p>
-    <w:bookmarkStart w:id="53" w:name="exm-concise-expression"/>
+    <w:bookmarkStart w:id="55" w:name="exm-concise-expression"/>
     <w:p>
       <w:pPr>
         <w:pStyle w:val="BodyText"/>
@@ -12006,7 +12256,7 @@
           <w:b/>
           <w:bCs/>
         </w:rPr>
-        <w:t xml:space="preserve">Example 20 (Naming a repeated chunk)</w:t>
+        <w:t xml:space="preserve">Example 21 (Naming a repeated chunk)</w:t>
       </w:r>
       <w:r>
         <w:t xml:space="preserve"> </w:t>
@@ -12090,7 +12340,7 @@
         <w:t xml:space="preserve">and each formula shows at a glance what it is built from.</w:t>
       </w:r>
     </w:p>
-    <w:bookmarkEnd w:id="53"/>
+    <w:bookmarkEnd w:id="55"/>
     <w:p>
       <w:pPr>
         <w:pStyle w:val="BodyText"/>
@@ -12143,8 +12393,8 @@
         <w:t xml:space="preserve">.</w:t>
       </w:r>
     </w:p>
-    <w:bookmarkEnd w:id="54"/>
-    <w:bookmarkStart w:id="56" w:name="abstract-unused-subexpressions"/>
+    <w:bookmarkEnd w:id="56"/>
+    <w:bookmarkStart w:id="58" w:name="abstract-unused-subexpressions"/>
     <w:p>
       <w:pPr>
         <w:pStyle w:val="Heading2"/>
@@ -12320,7 +12570,7 @@
         <w:t xml:space="preserve">before the first line that uses the symbol.</w:t>
       </w:r>
     </w:p>
-    <w:bookmarkStart w:id="55" w:name="exm-abstract-unused-subexpressions"/>
+    <w:bookmarkStart w:id="57" w:name="exm-abstract-unused-subexpressions"/>
     <w:p>
       <w:pPr>
         <w:pStyle w:val="BodyText"/>
@@ -12330,7 +12580,7 @@
           <w:b/>
           <w:bCs/>
         </w:rPr>
-        <w:t xml:space="preserve">Example 21 (Abstracting the population mean)</w:t>
+        <w:t xml:space="preserve">Example 22 (Abstracting the population mean)</w:t>
       </w:r>
       <w:r>
         <w:t xml:space="preserve"> </w:t>
@@ -12469,9 +12719,9 @@
         <w:t xml:space="preserve">stands for.</w:t>
       </w:r>
     </w:p>
-    <w:bookmarkEnd w:id="55"/>
-    <w:bookmarkEnd w:id="56"/>
-    <w:bookmarkStart w:id="58" w:name="writing-dot-products"/>
+    <w:bookmarkEnd w:id="57"/>
+    <w:bookmarkEnd w:id="58"/>
+    <w:bookmarkStart w:id="60" w:name="writing-dot-products"/>
     <w:p>
       <w:pPr>
         <w:pStyle w:val="Heading2"/>
@@ -12644,7 +12894,7 @@
         <w:t xml:space="preserve">and to work out that the result is a single number.</w:t>
       </w:r>
     </w:p>
-    <w:bookmarkStart w:id="57" w:name="exm-dot-product"/>
+    <w:bookmarkStart w:id="59" w:name="exm-dot-product"/>
     <w:p>
       <w:pPr>
         <w:pStyle w:val="BodyText"/>
@@ -12654,7 +12904,7 @@
           <w:b/>
           <w:bCs/>
         </w:rPr>
-        <w:t xml:space="preserve">Example 22 (Writing a dot product)</w:t>
+        <w:t xml:space="preserve">Example 23 (Writing a dot product)</w:t>
       </w:r>
       <w:r>
         <w:t xml:space="preserve"> </w:t>
@@ -12873,7 +13123,7 @@
         <w:t xml:space="preserve">.</w:t>
       </w:r>
     </w:p>
-    <w:bookmarkEnd w:id="57"/>
+    <w:bookmarkEnd w:id="59"/>
     <w:p>
       <w:pPr>
         <w:pStyle w:val="BodyText"/>
@@ -13032,8 +13282,8 @@
         <w:t xml:space="preserve">such as a definition of an inner product space.</w:t>
       </w:r>
     </w:p>
-    <w:bookmarkEnd w:id="58"/>
-    <w:bookmarkStart w:id="61" w:name="writing-out-notational-shorthands"/>
+    <w:bookmarkEnd w:id="60"/>
+    <w:bookmarkStart w:id="63" w:name="writing-out-notational-shorthands"/>
     <w:p>
       <w:pPr>
         <w:pStyle w:val="Heading2"/>
@@ -13472,7 +13722,7 @@
       <w:r>
         <w:t xml:space="preserve"> </w:t>
       </w:r>
-      <w:hyperlink r:id="rId59">
+      <w:hyperlink r:id="rId61">
         <w:r>
           <w:rPr>
             <w:rStyle w:val="Hyperlink"/>
@@ -13513,7 +13763,7 @@
         <w:t xml:space="preserve">catalogs common shorthands and their full forms.</w:t>
       </w:r>
     </w:p>
-    <w:bookmarkStart w:id="60" w:name="exm-notational-shorthand"/>
+    <w:bookmarkStart w:id="62" w:name="exm-notational-shorthand"/>
     <w:p>
       <w:pPr>
         <w:pStyle w:val="BodyText"/>
@@ -13523,7 +13773,7 @@
           <w:b/>
           <w:bCs/>
         </w:rPr>
-        <w:t xml:space="preserve">Example 23 (Writing out the limits of a sum and the range of an index)</w:t>
+        <w:t xml:space="preserve">Example 24 (Writing out the limits of a sum and the range of an index)</w:t>
       </w:r>
       <w:r>
         <w:t xml:space="preserve"> </w:t>
@@ -14080,9 +14330,9 @@
         <w:t xml:space="preserve">observations.</w:t>
       </w:r>
     </w:p>
-    <w:bookmarkEnd w:id="60"/>
-    <w:bookmarkEnd w:id="61"/>
-    <w:bookmarkStart w:id="65" w:name="stating-assumptions-before-using-them"/>
+    <w:bookmarkEnd w:id="62"/>
+    <w:bookmarkEnd w:id="63"/>
+    <w:bookmarkStart w:id="67" w:name="stating-assumptions-before-using-them"/>
     <w:p>
       <w:pPr>
         <w:pStyle w:val="Heading2"/>
@@ -14378,7 +14628,7 @@
         <w:t xml:space="preserve">because the assumptions use the names it introduces.</w:t>
       </w:r>
     </w:p>
-    <w:bookmarkStart w:id="62" w:name="exm-assumptions-first"/>
+    <w:bookmarkStart w:id="64" w:name="exm-assumptions-first"/>
     <w:p>
       <w:pPr>
         <w:pStyle w:val="BodyText"/>
@@ -14388,7 +14638,7 @@
           <w:b/>
           <w:bCs/>
         </w:rPr>
-        <w:t xml:space="preserve">Example 24 (Stating the restriction on</w:t>
+        <w:t xml:space="preserve">Example 25 (Stating the restriction on</w:t>
       </w:r>
       <w:r>
         <w:rPr>
@@ -15060,8 +15310,8 @@
         <w:t xml:space="preserve">and the justification says exactly where the condition is used.</w:t>
       </w:r>
     </w:p>
-    <w:bookmarkEnd w:id="62"/>
-    <w:bookmarkStart w:id="63" w:name="exm-assumptions-bullet-list"/>
+    <w:bookmarkEnd w:id="64"/>
+    <w:bookmarkStart w:id="65" w:name="exm-assumptions-bullet-list"/>
     <w:p>
       <w:pPr>
         <w:pStyle w:val="BodyText"/>
@@ -15071,7 +15321,7 @@
           <w:b/>
           <w:bCs/>
         </w:rPr>
-        <w:t xml:space="preserve">Example 25 (Writing several assumptions as one list)</w:t>
+        <w:t xml:space="preserve">Example 26 (Writing several assumptions as one list)</w:t>
       </w:r>
       <w:r>
         <w:t xml:space="preserve"> </w:t>
@@ -15266,8 +15516,8 @@
         <w:t xml:space="preserve">and the bullets show that the three assumptions are parallel and separate.</w:t>
       </w:r>
     </w:p>
-    <w:bookmarkEnd w:id="63"/>
-    <w:bookmarkStart w:id="64" w:name="exm-notation-bullet-list"/>
+    <w:bookmarkEnd w:id="65"/>
+    <w:bookmarkStart w:id="66" w:name="exm-notation-bullet-list"/>
     <w:p>
       <w:pPr>
         <w:pStyle w:val="BodyText"/>
@@ -15277,7 +15527,7 @@
           <w:b/>
           <w:bCs/>
         </w:rPr>
-        <w:t xml:space="preserve">Example 26 (Writing several names as one list)</w:t>
+        <w:t xml:space="preserve">Example 27 (Writing several names as one list)</w:t>
       </w:r>
       <w:r>
         <w:t xml:space="preserve"> </w:t>
@@ -15481,8 +15731,8 @@
         <w:t xml:space="preserve">a separate assumptions list after this one would state it.</w:t>
       </w:r>
     </w:p>
-    <w:bookmarkEnd w:id="64"/>
-    <w:bookmarkEnd w:id="65"/>
+    <w:bookmarkEnd w:id="66"/>
+    <w:bookmarkEnd w:id="67"/>
     <w:sectPr>
       <w:footnotePr>
         <w:numRestart w:val="eachSect"/>

</xml_diff>

<commit_message>
Deploying to gh-pages from @ Morrison-Lab/psw@da2339f564aa7ecb82b0d437609ab7aa3749129f 🚀
</commit_message>
<xml_diff>
--- a/chapters/notation.docx
+++ b/chapters/notation.docx
@@ -15,7 +15,7 @@
         <w:pStyle w:val="Date"/>
       </w:pPr>
       <w:r>
-        <w:t xml:space="preserve">Last modified: 2026-10-19 00:51:56 (PDT)</w:t>
+        <w:t xml:space="preserve">Last modified: 2026-10-19 01:18:03 (PDT)</w:t>
       </w:r>
     </w:p>
     <w:tbl>
@@ -9197,7 +9197,7 @@
         <w:t xml:space="preserve"> </w:t>
       </w:r>
       <w:r>
-        <w:t xml:space="preserve">$\Outvar = \truemeanfnf{\predvar} + \noise$</w:t>
+        <w:t xml:space="preserve">$\Outvar = \truemeanf{\predvar} + \noise$</w:t>
       </w:r>
       <w:r>
         <w:t xml:space="preserve">.</w:t>
@@ -9229,7 +9229,7 @@
         <w:t xml:space="preserve"> </w:t>
       </w:r>
       <w:r>
-        <w:t xml:space="preserve">$\Outvar = \truemeanfnf{\predvar} + \noise$</w:t>
+        <w:t xml:space="preserve">$\Outvar = \truemeanf{\predvar} + \noise$</w:t>
       </w:r>
       <w:r>
         <w:t xml:space="preserve">.</w:t>
@@ -14332,7 +14332,7 @@
     </w:p>
     <w:bookmarkEnd w:id="62"/>
     <w:bookmarkEnd w:id="63"/>
-    <w:bookmarkStart w:id="67" w:name="stating-assumptions-before-using-them"/>
+    <w:bookmarkStart w:id="68" w:name="stating-assumptions-before-using-them"/>
     <w:p>
       <w:pPr>
         <w:pStyle w:val="Heading2"/>
@@ -14587,6 +14587,53 @@
     <w:p>
       <w:pPr>
         <w:pStyle w:val="FirstParagraph"/>
+      </w:pPr>
+      <w:r>
+        <w:t xml:space="preserve">A condition that can fail is an assumption.</w:t>
+      </w:r>
+      <w:r>
+        <w:t xml:space="preserve"> </w:t>
+      </w:r>
+      <w:r>
+        <w:t xml:space="preserve">A parametrization is not:</w:t>
+      </w:r>
+      <w:r>
+        <w:t xml:space="preserve"> </w:t>
+      </w:r>
+      <w:r>
+        <w:t xml:space="preserve">it writes a quantity in terms of named parameters or pieces,</w:t>
+      </w:r>
+      <w:r>
+        <w:t xml:space="preserve"> </w:t>
+      </w:r>
+      <w:r>
+        <w:t xml:space="preserve">so it holds by definition and goes under</w:t>
+      </w:r>
+      <w:r>
+        <w:t xml:space="preserve"> </w:t>
+      </w:r>
+      <w:r>
+        <w:t xml:space="preserve">“Let:”</w:t>
+      </w:r>
+      <w:r>
+        <w:t xml:space="preserve">.</w:t>
+      </w:r>
+      <w:r>
+        <w:t xml:space="preserve"> </w:t>
+      </w:r>
+      <w:r>
+        <w:t xml:space="preserve">Do not label a parametrization as an assumption,</w:t>
+      </w:r>
+      <w:r>
+        <w:t xml:space="preserve"> </w:t>
+      </w:r>
+      <w:r>
+        <w:t xml:space="preserve">because that tells the reader a condition is being imposed when none is.</w:t>
+      </w:r>
+    </w:p>
+    <w:p>
+      <w:pPr>
+        <w:pStyle w:val="BodyText"/>
       </w:pPr>
       <w:r>
         <w:t xml:space="preserve">Write the lead-in word once, before the list,</w:t>
@@ -15732,7 +15779,303 @@
       </w:r>
     </w:p>
     <w:bookmarkEnd w:id="66"/>
+    <w:bookmarkStart w:id="67" w:name="exm-parametrization-is-notation"/>
+    <w:p>
+      <w:pPr>
+        <w:pStyle w:val="BodyText"/>
+      </w:pPr>
+      <w:r>
+        <w:rPr>
+          <w:b/>
+          <w:bCs/>
+        </w:rPr>
+        <w:t xml:space="preserve">Example 28 (Defining the noise is a parametrization, not an assumption)</w:t>
+      </w:r>
+      <w:r>
+        <w:t xml:space="preserve"> </w:t>
+      </w:r>
+      <w:r>
+        <w:t xml:space="preserve"> </w:t>
+      </w:r>
+    </w:p>
+    <w:p>
+      <w:pPr>
+        <w:pStyle w:val="BlockText"/>
+      </w:pPr>
+      <w:r>
+        <w:t xml:space="preserve">❌ Assume:</w:t>
+      </w:r>
+    </w:p>
+    <w:p>
+      <w:pPr>
+        <w:pStyle w:val="Compact"/>
+        <w:numPr>
+          <w:ilvl w:val="0"/>
+          <w:numId w:val="1017"/>
+        </w:numPr>
+      </w:pPr>
+      <w:r>
+        <w:t xml:space="preserve">the outcome variable is</w:t>
+      </w:r>
+      <w:r>
+        <w:t xml:space="preserve"> </w:t>
+      </w:r>
+      <w:r>
+        <w:t xml:space="preserve">$\Outvar = \truemeanf{\predvar} + \noise$</w:t>
+      </w:r>
+      <w:r>
+        <w:t xml:space="preserve">, and</w:t>
+      </w:r>
+    </w:p>
+    <w:p>
+      <w:pPr>
+        <w:pStyle w:val="Compact"/>
+        <w:numPr>
+          <w:ilvl w:val="0"/>
+          <w:numId w:val="1017"/>
+        </w:numPr>
+      </w:pPr>
+      <w:r>
+        <w:t xml:space="preserve">the noise variable</w:t>
+      </w:r>
+      <w:r>
+        <w:t xml:space="preserve"> </w:t>
+      </w:r>
+      <w:r>
+        <w:t xml:space="preserve">$\noise$</w:t>
+      </w:r>
+      <w:r>
+        <w:t xml:space="preserve"> </w:t>
+      </w:r>
+      <w:r>
+        <w:t xml:space="preserve">has population mean</w:t>
+      </w:r>
+      <w:r>
+        <w:t xml:space="preserve"> </w:t>
+      </w:r>
+      <m:oMath>
+        <m:r>
+          <m:t>0</m:t>
+        </m:r>
+      </m:oMath>
+      <w:r>
+        <w:t xml:space="preserve">.</w:t>
+      </w:r>
+    </w:p>
+    <w:p>
+      <w:pPr>
+        <w:pStyle w:val="BlockText"/>
+      </w:pPr>
+      <w:r>
+        <w:t xml:space="preserve">✅ Let:</w:t>
+      </w:r>
+    </w:p>
+    <w:p>
+      <w:pPr>
+        <w:pStyle w:val="Compact"/>
+        <w:numPr>
+          <w:ilvl w:val="0"/>
+          <w:numId w:val="1018"/>
+        </w:numPr>
+      </w:pPr>
+      <w:r>
+        <w:t xml:space="preserve">$\truemeanf{\predvar}$</w:t>
+      </w:r>
+      <w:r>
+        <w:t xml:space="preserve"> </w:t>
+      </w:r>
+      <w:r>
+        <w:t xml:space="preserve">be the population mean of the outcome variable</w:t>
+      </w:r>
+      <w:r>
+        <w:t xml:space="preserve"> </w:t>
+      </w:r>
+      <w:r>
+        <w:t xml:space="preserve">$\Outvar$</w:t>
+      </w:r>
+      <w:r>
+        <w:t xml:space="preserve"> </w:t>
+      </w:r>
+      <w:r>
+        <w:t xml:space="preserve">given the input value</w:t>
+      </w:r>
+      <w:r>
+        <w:t xml:space="preserve"> </w:t>
+      </w:r>
+      <w:r>
+        <w:t xml:space="preserve">$\predvar$</w:t>
+      </w:r>
+      <w:r>
+        <w:t xml:space="preserve">, and</w:t>
+      </w:r>
+    </w:p>
+    <w:p>
+      <w:pPr>
+        <w:pStyle w:val="Compact"/>
+        <w:numPr>
+          <w:ilvl w:val="0"/>
+          <w:numId w:val="1018"/>
+        </w:numPr>
+      </w:pPr>
+      <w:r>
+        <w:t xml:space="preserve">$\noise = \Outvar - \truemeanf{\predvar}$</w:t>
+      </w:r>
+      <w:r>
+        <w:t xml:space="preserve"> </w:t>
+      </w:r>
+      <w:r>
+        <w:t xml:space="preserve">be the noise variable.</w:t>
+      </w:r>
+    </w:p>
+    <w:p>
+      <w:pPr>
+        <w:pStyle w:val="BlockText"/>
+      </w:pPr>
+      <w:r>
+        <w:t xml:space="preserve">Then</w:t>
+      </w:r>
+      <w:r>
+        <w:t xml:space="preserve"> </w:t>
+      </w:r>
+      <w:r>
+        <w:t xml:space="preserve">$\Outvar = \truemeanf{\predvar} + \noise$</w:t>
+      </w:r>
+      <w:r>
+        <w:t xml:space="preserve">,</w:t>
+      </w:r>
+      <w:r>
+        <w:t xml:space="preserve"> </w:t>
+      </w:r>
+      <w:r>
+        <w:t xml:space="preserve">and the population mean of</w:t>
+      </w:r>
+      <w:r>
+        <w:t xml:space="preserve"> </w:t>
+      </w:r>
+      <w:r>
+        <w:t xml:space="preserve">$\noise$</w:t>
+      </w:r>
+      <w:r>
+        <w:t xml:space="preserve"> </w:t>
+      </w:r>
+      <w:r>
+        <w:t xml:space="preserve">given</w:t>
+      </w:r>
+      <w:r>
+        <w:t xml:space="preserve"> </w:t>
+      </w:r>
+      <w:r>
+        <w:t xml:space="preserve">$\predvar$</w:t>
+      </w:r>
+      <w:r>
+        <w:t xml:space="preserve"> </w:t>
+      </w:r>
+      <w:r>
+        <w:t xml:space="preserve">is</w:t>
+      </w:r>
+      <w:r>
+        <w:t xml:space="preserve"> </w:t>
+      </w:r>
+      <m:oMath>
+        <m:r>
+          <m:t>0</m:t>
+        </m:r>
+      </m:oMath>
+      <w:r>
+        <w:t xml:space="preserve">.</w:t>
+      </w:r>
+    </w:p>
+    <w:p>
+      <w:pPr>
+        <w:pStyle w:val="FirstParagraph"/>
+      </w:pPr>
+      <w:r>
+        <w:t xml:space="preserve">In the ❌ version, the reader is told that the decomposition and the zero mean are conditions on the data.</w:t>
+      </w:r>
+      <w:r>
+        <w:t xml:space="preserve"> </w:t>
+      </w:r>
+      <w:r>
+        <w:t xml:space="preserve">They are not.</w:t>
+      </w:r>
+      <w:r>
+        <w:t xml:space="preserve"> </w:t>
+      </w:r>
+      <w:r>
+        <w:t xml:space="preserve">Defining</w:t>
+      </w:r>
+      <w:r>
+        <w:t xml:space="preserve"> </w:t>
+      </w:r>
+      <w:r>
+        <w:t xml:space="preserve">$\noise = \Outvar - \truemeanf{\predvar}$</w:t>
+      </w:r>
+      <w:r>
+        <w:t xml:space="preserve"> </w:t>
+      </w:r>
+      <w:r>
+        <w:t xml:space="preserve">makes both statements true</w:t>
+      </w:r>
+      <w:r>
+        <w:t xml:space="preserve"> </w:t>
+      </w:r>
+      <w:r>
+        <w:t xml:space="preserve">for every distribution of</w:t>
+      </w:r>
+      <w:r>
+        <w:t xml:space="preserve"> </w:t>
+      </w:r>
+      <w:r>
+        <w:t xml:space="preserve">$\Outvar$</w:t>
+      </w:r>
+      <w:r>
+        <w:t xml:space="preserve"> </w:t>
+      </w:r>
+      <w:r>
+        <w:t xml:space="preserve">that has a finite population mean.</w:t>
+      </w:r>
+      <w:r>
+        <w:t xml:space="preserve"> </w:t>
+      </w:r>
+      <w:r>
+        <w:t xml:space="preserve">The ✅ version puts the definitions under</w:t>
+      </w:r>
+      <w:r>
+        <w:t xml:space="preserve"> </w:t>
+      </w:r>
+      <w:r>
+        <w:t xml:space="preserve">“Let:”</w:t>
+      </w:r>
+      <w:r>
+        <w:t xml:space="preserve"> </w:t>
+      </w:r>
+      <w:r>
+        <w:t xml:space="preserve">and derives the zero mean.</w:t>
+      </w:r>
+      <w:r>
+        <w:t xml:space="preserve"> </w:t>
+      </w:r>
+      <w:r>
+        <w:t xml:space="preserve">A real assumption, such as the noise variable being independent of the input value,</w:t>
+      </w:r>
+      <w:r>
+        <w:t xml:space="preserve"> </w:t>
+      </w:r>
+      <w:r>
+        <w:t xml:space="preserve">can fail, so it belongs under</w:t>
+      </w:r>
+      <w:r>
+        <w:t xml:space="preserve"> </w:t>
+      </w:r>
+      <w:r>
+        <w:t xml:space="preserve">“Assume:”</w:t>
+      </w:r>
+      <w:r>
+        <w:t xml:space="preserve">.</w:t>
+      </w:r>
+    </w:p>
     <w:bookmarkEnd w:id="67"/>
+    <w:bookmarkEnd w:id="68"/>
     <w:sectPr>
       <w:footnotePr>
         <w:numRestart w:val="eachSect"/>
@@ -16107,6 +16450,12 @@
     <w:abstractNumId w:val="991"/>
   </w:num>
   <w:num w:numId="1016">
+    <w:abstractNumId w:val="991"/>
+  </w:num>
+  <w:num w:numId="1017">
+    <w:abstractNumId w:val="991"/>
+  </w:num>
+  <w:num w:numId="1018">
     <w:abstractNumId w:val="991"/>
   </w:num>
 </w:numbering>

</xml_diff>

<commit_message>
Deploying to gh-pages from @ Morrison-Lab/psw@af2155594acd95059fea9619b2bd2b393243d102 🚀
</commit_message>
<xml_diff>
--- a/chapters/notation.docx
+++ b/chapters/notation.docx
@@ -15,7 +15,7 @@
         <w:pStyle w:val="Date"/>
       </w:pPr>
       <w:r>
-        <w:t xml:space="preserve">Last modified: 2026-10-26 02:09:13 (PDT)</w:t>
+        <w:t xml:space="preserve">Last modified: 2026-10-26 09:06:18 (PDT)</w:t>
       </w:r>
     </w:p>
     <w:tbl>
@@ -12473,6 +12473,107 @@
       </w:r>
       <w:r>
         <w:t xml:space="preserve">instead of expanding them inside the formula.</w:t>
+      </w:r>
+    </w:p>
+    <w:p>
+      <w:pPr>
+        <w:pStyle w:val="BodyText"/>
+      </w:pPr>
+      <w:r>
+        <w:t xml:space="preserve">Search the shared macros for the chunk before you write it by hand.</w:t>
+      </w:r>
+      <w:r>
+        <w:t xml:space="preserve"> </w:t>
+      </w:r>
+      <w:r>
+        <w:t xml:space="preserve">A macro often exists already,</w:t>
+      </w:r>
+      <w:r>
+        <w:t xml:space="preserve"> </w:t>
+      </w:r>
+      <w:r>
+        <w:t xml:space="preserve">and any expression spelled out in full that a macro or a shorter form could say</w:t>
+      </w:r>
+      <w:r>
+        <w:t xml:space="preserve"> </w:t>
+      </w:r>
+      <w:r>
+        <w:t xml:space="preserve">is the sign that nobody looked.</w:t>
+      </w:r>
+      <w:r>
+        <w:t xml:space="preserve"> </w:t>
+      </w:r>
+      <w:r>
+        <w:t xml:space="preserve">A difference is only the commonest case.</w:t>
+      </w:r>
+      <w:r>
+        <w:t xml:space="preserve"> </w:t>
+      </w:r>
+      <w:r>
+        <w:t xml:space="preserve">For example, an exercise wrote the left side of the bias–variance decomposition as</w:t>
+      </w:r>
+      <w:r>
+        <w:t xml:space="preserve"> </w:t>
+      </w:r>
+      <w:r>
+        <w:rPr>
+          <w:rStyle w:val="VerbatimChar"/>
+        </w:rPr>
+        <w:t xml:space="preserve">\E{\paren{\newoutvar - \predvalf{\newpredval}}^2}</w:t>
+      </w:r>
+      <w:r>
+        <w:t xml:space="preserve">,</w:t>
+      </w:r>
+      <w:r>
+        <w:t xml:space="preserve"> </w:t>
+      </w:r>
+      <w:r>
+        <w:t xml:space="preserve">when</w:t>
+      </w:r>
+      <w:r>
+        <w:t xml:space="preserve"> </w:t>
+      </w:r>
+      <w:r>
+        <w:rPr>
+          <w:rStyle w:val="VerbatimChar"/>
+        </w:rPr>
+        <w:t xml:space="preserve">\prederrf{\predvalf{\newpredval}}</w:t>
+      </w:r>
+      <w:r>
+        <w:t xml:space="preserve"> </w:t>
+      </w:r>
+      <w:r>
+        <w:t xml:space="preserve">names the same prediction error,</w:t>
+      </w:r>
+      <w:r>
+        <w:t xml:space="preserve"> </w:t>
+      </w:r>
+      <w:r>
+        <w:t xml:space="preserve">and the squared bias, written out the same way, has</w:t>
+      </w:r>
+      <w:r>
+        <w:t xml:space="preserve"> </w:t>
+      </w:r>
+      <w:r>
+        <w:rPr>
+          <w:rStyle w:val="VerbatimChar"/>
+        </w:rPr>
+        <w:t xml:space="preserve">\biassymf</w:t>
+      </w:r>
+      <w:r>
+        <w:t xml:space="preserve">.</w:t>
+      </w:r>
+      <w:r>
+        <w:t xml:space="preserve"> </w:t>
+      </w:r>
+      <w:r>
+        <w:t xml:space="preserve">When you find one such chunk, sweep the other notes repositories for it,</w:t>
+      </w:r>
+      <w:r>
+        <w:t xml:space="preserve"> </w:t>
+      </w:r>
+      <w:r>
+        <w:t xml:space="preserve">in small batches of one repository each.</w:t>
       </w:r>
     </w:p>
     <w:p>

</xml_diff>

<commit_message>
Deploying to gh-pages from @ Morrison-Lab/psw@16fd4e235af68cda335356315195e633dda677bb 🚀
</commit_message>
<xml_diff>
--- a/chapters/notation.docx
+++ b/chapters/notation.docx
@@ -15,7 +15,7 @@
         <w:pStyle w:val="Date"/>
       </w:pPr>
       <w:r>
-        <w:t xml:space="preserve">Last modified: 2026-10-28 18:26:29 (PDT)</w:t>
+        <w:t xml:space="preserve">Last modified: 2026-10-28 18:32:23 (PDT)</w:t>
       </w:r>
     </w:p>
     <w:tbl>
@@ -16935,13 +16935,438 @@
     </w:p>
     <w:bookmarkEnd w:id="70"/>
     <w:bookmarkEnd w:id="71"/>
-    <w:bookmarkStart w:id="74" w:name="writing-out-notational-shorthands"/>
+    <w:bookmarkStart w:id="74" w:name="writing-the-log-odds"/>
     <w:p>
       <w:pPr>
         <w:pStyle w:val="Heading2"/>
       </w:pPr>
       <w:r>
-        <w:t xml:space="preserve">16 Writing out notational shorthands</w:t>
+        <w:t xml:space="preserve">16 Writing the log-odds</w:t>
+      </w:r>
+    </w:p>
+    <w:p>
+      <w:pPr>
+        <w:pStyle w:val="FirstParagraph"/>
+      </w:pPr>
+      <w:r>
+        <w:t xml:space="preserve">Use</w:t>
+      </w:r>
+      <w:r>
+        <w:t xml:space="preserve"> </w:t>
+      </w:r>
+      <m:oMath>
+        <m:r>
+          <m:t>η</m:t>
+        </m:r>
+      </m:oMath>
+      <w:r>
+        <w:t xml:space="preserve"> </w:t>
+      </w:r>
+      <w:r>
+        <w:t xml:space="preserve">(the Greek letter eta) for the log-odds, not</w:t>
+      </w:r>
+      <w:r>
+        <w:t xml:space="preserve"> </w:t>
+      </w:r>
+      <m:oMath>
+        <m:r>
+          <m:t>z</m:t>
+        </m:r>
+      </m:oMath>
+      <w:r>
+        <w:t xml:space="preserve"> </w:t>
+      </w:r>
+      <w:r>
+        <w:t xml:space="preserve">or another letter.</w:t>
+      </w:r>
+      <w:r>
+        <w:t xml:space="preserve"> </w:t>
+      </w:r>
+      <w:r>
+        <w:t xml:space="preserve">In a group that uses shared macros (see</w:t>
+      </w:r>
+      <w:r>
+        <w:t xml:space="preserve"> </w:t>
+      </w:r>
+      <w:hyperlink w:anchor="using-shared-macros">
+        <w:r>
+          <w:rPr>
+            <w:rStyle w:val="Hyperlink"/>
+          </w:rPr>
+          <w:t xml:space="preserve">Using shared macros</w:t>
+        </w:r>
+      </w:hyperlink>
+      <w:r>
+        <w:t xml:space="preserve">),</w:t>
+      </w:r>
+      <w:r>
+        <w:t xml:space="preserve"> </w:t>
+      </w:r>
+      <w:r>
+        <w:t xml:space="preserve">write it</w:t>
+      </w:r>
+      <w:r>
+        <w:t xml:space="preserve"> </w:t>
+      </w:r>
+      <w:r>
+        <w:rPr>
+          <w:rStyle w:val="VerbatimChar"/>
+        </w:rPr>
+        <w:t xml:space="preserve">\logodds</w:t>
+      </w:r>
+      <w:r>
+        <w:t xml:space="preserve">.</w:t>
+      </w:r>
+      <w:r>
+        <w:t xml:space="preserve"> </w:t>
+      </w:r>
+      <w:r>
+        <w:t xml:space="preserve">Use it wherever the quantity is the log-odds, including the argument of the logistic</w:t>
+      </w:r>
+      <w:r>
+        <w:t xml:space="preserve"> </w:t>
+      </w:r>
+      <w:hyperlink r:id="rId24">
+        <w:r>
+          <w:rPr>
+            <w:rStyle w:val="Hyperlink"/>
+          </w:rPr>
+          <w:t xml:space="preserve">function</w:t>
+        </w:r>
+      </w:hyperlink>
+      <w:r>
+        <w:t xml:space="preserve">,</w:t>
+      </w:r>
+      <w:r>
+        <w:t xml:space="preserve"> </w:t>
+      </w:r>
+      <w:r>
+        <w:t xml:space="preserve">so that the same quantity has one symbol in every chapter and figure.</w:t>
+      </w:r>
+      <w:r>
+        <w:t xml:space="preserve"> </w:t>
+      </w:r>
+      <w:r>
+        <w:t xml:space="preserve">Label a figure axis that shows it</w:t>
+      </w:r>
+      <w:r>
+        <w:t xml:space="preserve"> </w:t>
+      </w:r>
+      <w:r>
+        <w:t xml:space="preserve">“Log-odds,</w:t>
+      </w:r>
+      <w:r>
+        <w:t xml:space="preserve"> </w:t>
+      </w:r>
+      <m:oMath>
+        <m:r>
+          <m:t>η</m:t>
+        </m:r>
+      </m:oMath>
+      <w:r>
+        <w:t xml:space="preserve">”</w:t>
+      </w:r>
+      <w:r>
+        <w:t xml:space="preserve"> </w:t>
+      </w:r>
+      <w:r>
+        <w:t xml:space="preserve">(see</w:t>
+      </w:r>
+      <w:r>
+        <w:t xml:space="preserve"> </w:t>
+      </w:r>
+      <w:hyperlink r:id="rId72">
+        <w:r>
+          <w:rPr>
+            <w:rStyle w:val="Hyperlink"/>
+          </w:rPr>
+          <w:t xml:space="preserve">Scientific figures</w:t>
+        </w:r>
+      </w:hyperlink>
+      <w:r>
+        <w:t xml:space="preserve">).</w:t>
+      </w:r>
+    </w:p>
+    <w:bookmarkStart w:id="73" w:name="exm-log-odds-symbol"/>
+    <w:p>
+      <w:pPr>
+        <w:pStyle w:val="BodyText"/>
+      </w:pPr>
+      <w:r>
+        <w:rPr>
+          <w:b/>
+          <w:bCs/>
+        </w:rPr>
+        <w:t xml:space="preserve">Example 27 (Argument of the logistic function)</w:t>
+      </w:r>
+      <w:r>
+        <w:t xml:space="preserve"> </w:t>
+      </w:r>
+      <w:r>
+        <w:t xml:space="preserve"> </w:t>
+      </w:r>
+    </w:p>
+    <w:p>
+      <w:pPr>
+        <w:pStyle w:val="BlockText"/>
+      </w:pPr>
+      <w:r>
+        <w:t xml:space="preserve">❌ The logistic</w:t>
+      </w:r>
+      <w:r>
+        <w:t xml:space="preserve"> </w:t>
+      </w:r>
+      <w:hyperlink r:id="rId24">
+        <w:r>
+          <w:rPr>
+            <w:rStyle w:val="Hyperlink"/>
+          </w:rPr>
+          <w:t xml:space="preserve">function</w:t>
+        </w:r>
+      </w:hyperlink>
+      <w:r>
+        <w:t xml:space="preserve"> </w:t>
+      </w:r>
+      <w:r>
+        <w:t xml:space="preserve">is</w:t>
+      </w:r>
+      <w:r>
+        <w:t xml:space="preserve"> </w:t>
+      </w:r>
+      <m:oMath>
+        <m:r>
+          <m:t>σ</m:t>
+        </m:r>
+        <m:r>
+          <m:rPr>
+            <m:sty m:val="p"/>
+          </m:rPr>
+          <m:t>(</m:t>
+        </m:r>
+        <m:r>
+          <m:t>z</m:t>
+        </m:r>
+        <m:r>
+          <m:rPr>
+            <m:sty m:val="p"/>
+          </m:rPr>
+          <m:t>)</m:t>
+        </m:r>
+        <m:r>
+          <m:rPr>
+            <m:sty m:val="p"/>
+          </m:rPr>
+          <m:t>=</m:t>
+        </m:r>
+        <m:r>
+          <m:t>1</m:t>
+        </m:r>
+        <m:r>
+          <m:rPr>
+            <m:sty m:val="p"/>
+          </m:rPr>
+          <m:t>/</m:t>
+        </m:r>
+        <m:r>
+          <m:rPr>
+            <m:sty m:val="p"/>
+          </m:rPr>
+          <m:t>(</m:t>
+        </m:r>
+        <m:r>
+          <m:t>1</m:t>
+        </m:r>
+        <m:r>
+          <m:rPr>
+            <m:sty m:val="p"/>
+          </m:rPr>
+          <m:t>+</m:t>
+        </m:r>
+        <m:sSup>
+          <m:e>
+            <m:r>
+              <m:t>e</m:t>
+            </m:r>
+          </m:e>
+          <m:sup>
+            <m:r>
+              <m:rPr>
+                <m:sty m:val="p"/>
+              </m:rPr>
+              <m:t>−</m:t>
+            </m:r>
+            <m:r>
+              <m:t>z</m:t>
+            </m:r>
+          </m:sup>
+        </m:sSup>
+        <m:r>
+          <m:rPr>
+            <m:sty m:val="p"/>
+          </m:rPr>
+          <m:t>)</m:t>
+        </m:r>
+      </m:oMath>
+      <w:r>
+        <w:t xml:space="preserve">, evaluated at the log-odds</w:t>
+      </w:r>
+      <w:r>
+        <w:t xml:space="preserve"> </w:t>
+      </w:r>
+      <m:oMath>
+        <m:r>
+          <m:t>z</m:t>
+        </m:r>
+      </m:oMath>
+      <w:r>
+        <w:t xml:space="preserve">.</w:t>
+      </w:r>
+    </w:p>
+    <w:p>
+      <w:pPr>
+        <w:pStyle w:val="BlockText"/>
+      </w:pPr>
+      <w:r>
+        <w:t xml:space="preserve">✅ The logistic function is</w:t>
+      </w:r>
+      <w:r>
+        <w:t xml:space="preserve"> </w:t>
+      </w:r>
+      <m:oMath>
+        <m:r>
+          <m:rPr>
+            <m:sty m:val="p"/>
+          </m:rPr>
+          <m:t>expit</m:t>
+        </m:r>
+        <m:r>
+          <m:t>​</m:t>
+        </m:r>
+        <m:d>
+          <m:dPr>
+            <m:begChr m:val="("/>
+            <m:sepChr m:val=""/>
+            <m:endChr m:val=")"/>
+            <m:grow/>
+          </m:dPr>
+          <m:e>
+            <m:r>
+              <m:t>η</m:t>
+            </m:r>
+          </m:e>
+        </m:d>
+        <m:r>
+          <m:t>​</m:t>
+        </m:r>
+        <m:limUpp>
+          <m:e>
+            <m:r>
+              <m:rPr>
+                <m:sty m:val="p"/>
+              </m:rPr>
+              <m:t>=</m:t>
+            </m:r>
+          </m:e>
+          <m:lim>
+            <m:r>
+              <m:rPr>
+                <m:nor/>
+                <m:sty m:val="p"/>
+              </m:rPr>
+              <m:t>def</m:t>
+            </m:r>
+          </m:lim>
+        </m:limUpp>
+        <m:f>
+          <m:fPr>
+            <m:type m:val="bar"/>
+          </m:fPr>
+          <m:num>
+            <m:r>
+              <m:t>1</m:t>
+            </m:r>
+          </m:num>
+          <m:den>
+            <m:r>
+              <m:t>1</m:t>
+            </m:r>
+            <m:r>
+              <m:rPr>
+                <m:sty m:val="p"/>
+              </m:rPr>
+              <m:t>+</m:t>
+            </m:r>
+            <m:sSup>
+              <m:e>
+                <m:r>
+                  <m:rPr>
+                    <m:nor/>
+                    <m:sty m:val="p"/>
+                  </m:rPr>
+                  <m:t>e</m:t>
+                </m:r>
+              </m:e>
+              <m:sup>
+                <m:r>
+                  <m:rPr>
+                    <m:sty m:val="p"/>
+                  </m:rPr>
+                  <m:t>−</m:t>
+                </m:r>
+                <m:r>
+                  <m:t>η</m:t>
+                </m:r>
+              </m:sup>
+            </m:sSup>
+          </m:den>
+        </m:f>
+      </m:oMath>
+      <w:r>
+        <w:t xml:space="preserve">, evaluated at the log-odds</w:t>
+      </w:r>
+      <w:r>
+        <w:t xml:space="preserve"> </w:t>
+      </w:r>
+      <m:oMath>
+        <m:r>
+          <m:t>η</m:t>
+        </m:r>
+      </m:oMath>
+      <w:r>
+        <w:t xml:space="preserve">.</w:t>
+      </w:r>
+    </w:p>
+    <w:p>
+      <w:pPr>
+        <w:pStyle w:val="FirstParagraph"/>
+      </w:pPr>
+      <w:r>
+        <w:t xml:space="preserve">The ✅ version uses the lab’s symbol for the log-odds, so a reader who has seen</w:t>
+      </w:r>
+      <w:r>
+        <w:t xml:space="preserve"> </w:t>
+      </w:r>
+      <m:oMath>
+        <m:r>
+          <m:t>η</m:t>
+        </m:r>
+      </m:oMath>
+      <w:r>
+        <w:t xml:space="preserve"> </w:t>
+      </w:r>
+      <w:r>
+        <w:t xml:space="preserve">elsewhere recognizes it here.</w:t>
+      </w:r>
+    </w:p>
+    <w:bookmarkEnd w:id="73"/>
+    <w:bookmarkEnd w:id="74"/>
+    <w:bookmarkStart w:id="77" w:name="writing-out-notational-shorthands"/>
+    <w:p>
+      <w:pPr>
+        <w:pStyle w:val="Heading2"/>
+      </w:pPr>
+      <w:r>
+        <w:t xml:space="preserve">17 Writing out notational shorthands</w:t>
       </w:r>
     </w:p>
     <w:p>
@@ -17374,7 +17799,7 @@
       <w:r>
         <w:t xml:space="preserve"> </w:t>
       </w:r>
-      <w:hyperlink r:id="rId72">
+      <w:hyperlink r:id="rId75">
         <w:r>
           <w:rPr>
             <w:rStyle w:val="Hyperlink"/>
@@ -17415,7 +17840,7 @@
         <w:t xml:space="preserve">catalogs common shorthands and their full forms.</w:t>
       </w:r>
     </w:p>
-    <w:bookmarkStart w:id="73" w:name="exm-notational-shorthand"/>
+    <w:bookmarkStart w:id="76" w:name="exm-notational-shorthand"/>
     <w:p>
       <w:pPr>
         <w:pStyle w:val="BodyText"/>
@@ -17425,7 +17850,7 @@
           <w:b/>
           <w:bCs/>
         </w:rPr>
-        <w:t xml:space="preserve">Example 27 (Writing out the limits of a sum and the range of an index)</w:t>
+        <w:t xml:space="preserve">Example 28 (Writing out the limits of a sum and the range of an index)</w:t>
       </w:r>
       <w:r>
         <w:t xml:space="preserve"> </w:t>
@@ -17982,15 +18407,15 @@
         <w:t xml:space="preserve">observations.</w:t>
       </w:r>
     </w:p>
-    <w:bookmarkEnd w:id="73"/>
-    <w:bookmarkEnd w:id="74"/>
-    <w:bookmarkStart w:id="79" w:name="stating-assumptions-before-using-them"/>
+    <w:bookmarkEnd w:id="76"/>
+    <w:bookmarkEnd w:id="77"/>
+    <w:bookmarkStart w:id="82" w:name="stating-assumptions-before-using-them"/>
     <w:p>
       <w:pPr>
         <w:pStyle w:val="Heading2"/>
       </w:pPr>
       <w:r>
-        <w:t xml:space="preserve">17 Stating assumptions before using them</w:t>
+        <w:t xml:space="preserve">18 Stating assumptions before using them</w:t>
       </w:r>
     </w:p>
     <w:p>
@@ -18330,7 +18755,7 @@
         <w:t xml:space="preserve">because the assumptions use the names it introduces.</w:t>
       </w:r>
     </w:p>
-    <w:bookmarkStart w:id="75" w:name="exm-assumptions-first"/>
+    <w:bookmarkStart w:id="78" w:name="exm-assumptions-first"/>
     <w:p>
       <w:pPr>
         <w:pStyle w:val="BodyText"/>
@@ -18340,7 +18765,7 @@
           <w:b/>
           <w:bCs/>
         </w:rPr>
-        <w:t xml:space="preserve">Example 28 (Stating the restriction on</w:t>
+        <w:t xml:space="preserve">Example 29 (Stating the restriction on</w:t>
       </w:r>
       <w:r>
         <w:rPr>
@@ -19012,8 +19437,8 @@
         <w:t xml:space="preserve">and the justification says exactly where the condition is used.</w:t>
       </w:r>
     </w:p>
-    <w:bookmarkEnd w:id="75"/>
-    <w:bookmarkStart w:id="76" w:name="exm-assumptions-bullet-list"/>
+    <w:bookmarkEnd w:id="78"/>
+    <w:bookmarkStart w:id="79" w:name="exm-assumptions-bullet-list"/>
     <w:p>
       <w:pPr>
         <w:pStyle w:val="BodyText"/>
@@ -19023,7 +19448,7 @@
           <w:b/>
           <w:bCs/>
         </w:rPr>
-        <w:t xml:space="preserve">Example 29 (Writing several assumptions as one list)</w:t>
+        <w:t xml:space="preserve">Example 30 (Writing several assumptions as one list)</w:t>
       </w:r>
       <w:r>
         <w:t xml:space="preserve"> </w:t>
@@ -19221,8 +19646,8 @@
         <w:t xml:space="preserve">and the bullets show that the three assumptions are parallel and separate.</w:t>
       </w:r>
     </w:p>
-    <w:bookmarkEnd w:id="76"/>
-    <w:bookmarkStart w:id="77" w:name="exm-notation-bullet-list"/>
+    <w:bookmarkEnd w:id="79"/>
+    <w:bookmarkStart w:id="80" w:name="exm-notation-bullet-list"/>
     <w:p>
       <w:pPr>
         <w:pStyle w:val="BodyText"/>
@@ -19232,7 +19657,7 @@
           <w:b/>
           <w:bCs/>
         </w:rPr>
-        <w:t xml:space="preserve">Example 30 (Writing several names as one list)</w:t>
+        <w:t xml:space="preserve">Example 31 (Writing several names as one list)</w:t>
       </w:r>
       <w:r>
         <w:t xml:space="preserve"> </w:t>
@@ -19439,8 +19864,8 @@
         <w:t xml:space="preserve">a separate assumptions list after this one would state it.</w:t>
       </w:r>
     </w:p>
-    <w:bookmarkEnd w:id="77"/>
-    <w:bookmarkStart w:id="78" w:name="exm-parametrization-is-notation"/>
+    <w:bookmarkEnd w:id="80"/>
+    <w:bookmarkStart w:id="81" w:name="exm-parametrization-is-notation"/>
     <w:p>
       <w:pPr>
         <w:pStyle w:val="BodyText"/>
@@ -19450,7 +19875,7 @@
           <w:b/>
           <w:bCs/>
         </w:rPr>
-        <w:t xml:space="preserve">Example 31 (Defining the noise is a parametrization, not an assumption)</w:t>
+        <w:t xml:space="preserve">Example 32 (Defining the noise is a parametrization, not an assumption)</w:t>
       </w:r>
       <w:r>
         <w:t xml:space="preserve"> </w:t>
@@ -19927,8 +20352,8 @@
         <w:t xml:space="preserve">.</w:t>
       </w:r>
     </w:p>
-    <w:bookmarkEnd w:id="78"/>
-    <w:bookmarkEnd w:id="79"/>
+    <w:bookmarkEnd w:id="81"/>
+    <w:bookmarkEnd w:id="82"/>
     <w:sectPr>
       <w:footnotePr>
         <w:numRestart w:val="eachSect"/>

</xml_diff>